<commit_message>
start creating balance sheet
</commit_message>
<xml_diff>
--- a/Complete FINANCIAL REPORTING AND FINANCIAL ANALYSIS USING POWER BI.docx
+++ b/Complete FINANCIAL REPORTING AND FINANCIAL ANALYSIS USING POWER BI.docx
@@ -1119,6 +1119,7 @@
           <w:bCs/>
           <w:sz w:val="52"/>
           <w:szCs w:val="52"/>
+          <w:u w:val="single"/>
         </w:rPr>
       </w:pPr>
       <w:r>
@@ -1127,6 +1128,8 @@
           <w:bCs/>
           <w:sz w:val="52"/>
           <w:szCs w:val="52"/>
+          <w:highlight w:val="green"/>
+          <w:u w:val="single"/>
         </w:rPr>
         <w:t>PROFIT AND LOSS</w:t>
       </w:r>
@@ -1136,6 +1139,8 @@
           <w:bCs/>
           <w:sz w:val="52"/>
           <w:szCs w:val="52"/>
+          <w:highlight w:val="green"/>
+          <w:u w:val="single"/>
         </w:rPr>
         <w:t xml:space="preserve"> STATEMENT:</w:t>
       </w:r>
@@ -3619,105 +3624,52 @@
       <w:pPr>
         <w:pStyle w:val="ListParagraph"/>
         <w:rPr>
-          <w:lang w:val="en-PK"/>
-        </w:rPr>
-      </w:pPr>
-      <w:r>
-        <w:rPr>
-          <w:lang w:val="en-PK"/>
-        </w:rPr>
-        <w:t>Revenue</w:t>
-      </w:r>
-      <w:r>
-        <w:rPr>
-          <w:lang w:val="en-PK"/>
-        </w:rPr>
-        <w:t xml:space="preserve"> </w:t>
-      </w:r>
-      <w:r>
-        <w:rPr>
-          <w:lang w:val="en-PK"/>
-        </w:rPr>
-        <w:t>– COGS</w:t>
-      </w:r>
-      <w:r>
-        <w:rPr>
-          <w:lang w:val="en-PK"/>
-        </w:rPr>
-        <w:t xml:space="preserve"> </w:t>
-      </w:r>
-      <w:r>
-        <w:rPr>
-          <w:lang w:val="en-PK"/>
-        </w:rPr>
-        <w:t>= Gross Profit</w:t>
+          <w:highlight w:val="yellow"/>
+          <w:lang w:val="en-PK"/>
+        </w:rPr>
+      </w:pPr>
+      <w:r>
+        <w:rPr>
+          <w:highlight w:val="yellow"/>
+          <w:lang w:val="en-PK"/>
+        </w:rPr>
+        <w:t>Revenue – COGS = Gross Profit</w:t>
       </w:r>
     </w:p>
     <w:p>
       <w:pPr>
         <w:pStyle w:val="ListParagraph"/>
         <w:rPr>
-          <w:lang w:val="en-PK"/>
-        </w:rPr>
-      </w:pPr>
-      <w:r>
-        <w:rPr>
-          <w:lang w:val="en-PK"/>
-        </w:rPr>
-        <w:t>Gross Profit</w:t>
-      </w:r>
-      <w:r>
-        <w:rPr>
-          <w:lang w:val="en-PK"/>
-        </w:rPr>
-        <w:t xml:space="preserve"> </w:t>
-      </w:r>
-      <w:r>
-        <w:rPr>
-          <w:lang w:val="en-PK"/>
-        </w:rPr>
-        <w:t>– Operating Expenses (including D&amp;A)</w:t>
-      </w:r>
-      <w:r>
-        <w:rPr>
-          <w:lang w:val="en-PK"/>
-        </w:rPr>
-        <w:t xml:space="preserve"> </w:t>
-      </w:r>
-      <w:r>
-        <w:rPr>
-          <w:lang w:val="en-PK"/>
-        </w:rPr>
-        <w:t>= EBIT</w:t>
+          <w:highlight w:val="yellow"/>
+          <w:lang w:val="en-PK"/>
+        </w:rPr>
+      </w:pPr>
+      <w:r>
+        <w:rPr>
+          <w:highlight w:val="yellow"/>
+          <w:lang w:val="en-PK"/>
+        </w:rPr>
+        <w:t>Gross Profit – Operating Expenses (including D&amp;A) = EBIT</w:t>
       </w:r>
     </w:p>
     <w:p>
       <w:pPr>
         <w:pStyle w:val="ListParagraph"/>
         <w:rPr>
-          <w:lang w:val="en-PK"/>
-        </w:rPr>
-      </w:pPr>
-      <w:r>
-        <w:rPr>
-          <w:lang w:val="en-PK"/>
-        </w:rPr>
-        <w:t xml:space="preserve">EBIT </w:t>
-      </w:r>
-      <w:r>
-        <w:rPr>
-          <w:lang w:val="en-PK"/>
-        </w:rPr>
-        <w:t>–</w:t>
-      </w:r>
-      <w:r>
-        <w:rPr>
-          <w:lang w:val="en-PK"/>
-        </w:rPr>
-        <w:t xml:space="preserve"> non-operating expenses </w:t>
-      </w:r>
-      <w:r>
-        <w:rPr>
+          <w:highlight w:val="yellow"/>
+          <w:lang w:val="en-PK"/>
+        </w:rPr>
+      </w:pPr>
+      <w:r>
+        <w:rPr>
+          <w:highlight w:val="yellow"/>
+          <w:lang w:val="en-PK"/>
+        </w:rPr>
+        <w:t xml:space="preserve">EBIT – non-operating expenses </w:t>
+      </w:r>
+      <w:r>
+        <w:rPr>
+          <w:highlight w:val="yellow"/>
           <w:lang w:val="en-PK"/>
         </w:rPr>
         <w:t>(</w:t>
@@ -3725,6 +3677,7 @@
       <w:proofErr w:type="spellStart"/>
       <w:r>
         <w:rPr>
+          <w:highlight w:val="yellow"/>
           <w:lang w:val="en-PK"/>
         </w:rPr>
         <w:t>othr</w:t>
@@ -3732,18 +3685,21 @@
       <w:proofErr w:type="spellEnd"/>
       <w:r>
         <w:rPr>
+          <w:highlight w:val="yellow"/>
           <w:lang w:val="en-PK"/>
         </w:rPr>
         <w:t xml:space="preserve"> than interest and tax)</w:t>
       </w:r>
       <w:r>
         <w:rPr>
+          <w:highlight w:val="yellow"/>
           <w:lang w:val="en-PK"/>
         </w:rPr>
         <w:t xml:space="preserve"> = PBT </w:t>
       </w:r>
       <w:r>
         <w:rPr>
+          <w:highlight w:val="yellow"/>
           <w:lang w:val="en-PK"/>
         </w:rPr>
         <w:t xml:space="preserve">(PBT m s </w:t>
@@ -3751,6 +3707,7 @@
       <w:proofErr w:type="spellStart"/>
       <w:r>
         <w:rPr>
+          <w:highlight w:val="yellow"/>
           <w:lang w:val="en-PK"/>
         </w:rPr>
         <w:t>abhi</w:t>
@@ -3758,13 +3715,15 @@
       <w:proofErr w:type="spellEnd"/>
       <w:r>
         <w:rPr>
-          <w:lang w:val="en-PK"/>
-        </w:rPr>
-        <w:t xml:space="preserve"> </w:t>
-      </w:r>
-      <w:proofErr w:type="spellStart"/>
-      <w:r>
-        <w:rPr>
+          <w:highlight w:val="yellow"/>
+          <w:lang w:val="en-PK"/>
+        </w:rPr>
+        <w:t xml:space="preserve"> </w:t>
+      </w:r>
+      <w:proofErr w:type="spellStart"/>
+      <w:r>
+        <w:rPr>
+          <w:highlight w:val="yellow"/>
           <w:lang w:val="en-PK"/>
         </w:rPr>
         <w:t>tk</w:t>
@@ -3772,13 +3731,15 @@
       <w:proofErr w:type="spellEnd"/>
       <w:r>
         <w:rPr>
-          <w:lang w:val="en-PK"/>
-        </w:rPr>
-        <w:t xml:space="preserve"> </w:t>
-      </w:r>
-      <w:proofErr w:type="spellStart"/>
-      <w:r>
-        <w:rPr>
+          <w:highlight w:val="yellow"/>
+          <w:lang w:val="en-PK"/>
+        </w:rPr>
+        <w:t xml:space="preserve"> </w:t>
+      </w:r>
+      <w:proofErr w:type="spellStart"/>
+      <w:r>
+        <w:rPr>
+          <w:highlight w:val="yellow"/>
           <w:lang w:val="en-PK"/>
         </w:rPr>
         <w:t>interst</w:t>
@@ -3786,6 +3747,7 @@
       <w:proofErr w:type="spellEnd"/>
       <w:r>
         <w:rPr>
+          <w:highlight w:val="yellow"/>
           <w:lang w:val="en-PK"/>
         </w:rPr>
         <w:t xml:space="preserve"> and tax k </w:t>
@@ -3793,6 +3755,7 @@
       <w:proofErr w:type="spellStart"/>
       <w:r>
         <w:rPr>
+          <w:highlight w:val="yellow"/>
           <w:lang w:val="en-PK"/>
         </w:rPr>
         <w:t>pesy</w:t>
@@ -3800,6 +3763,7 @@
       <w:proofErr w:type="spellEnd"/>
       <w:r>
         <w:rPr>
+          <w:highlight w:val="yellow"/>
           <w:lang w:val="en-PK"/>
         </w:rPr>
         <w:t xml:space="preserve"> deduct </w:t>
@@ -3807,6 +3771,7 @@
       <w:proofErr w:type="spellStart"/>
       <w:r>
         <w:rPr>
+          <w:highlight w:val="yellow"/>
           <w:lang w:val="en-PK"/>
         </w:rPr>
         <w:t>nhi</w:t>
@@ -3814,13 +3779,15 @@
       <w:proofErr w:type="spellEnd"/>
       <w:r>
         <w:rPr>
-          <w:lang w:val="en-PK"/>
-        </w:rPr>
-        <w:t xml:space="preserve"> </w:t>
-      </w:r>
-      <w:proofErr w:type="spellStart"/>
-      <w:r>
-        <w:rPr>
+          <w:highlight w:val="yellow"/>
+          <w:lang w:val="en-PK"/>
+        </w:rPr>
+        <w:t xml:space="preserve"> </w:t>
+      </w:r>
+      <w:proofErr w:type="spellStart"/>
+      <w:r>
+        <w:rPr>
+          <w:highlight w:val="yellow"/>
           <w:lang w:val="en-PK"/>
         </w:rPr>
         <w:t>huy</w:t>
@@ -3828,13 +3795,15 @@
       <w:proofErr w:type="spellEnd"/>
       <w:r>
         <w:rPr>
-          <w:lang w:val="en-PK"/>
-        </w:rPr>
-        <w:t xml:space="preserve"> </w:t>
-      </w:r>
-      <w:proofErr w:type="spellStart"/>
-      <w:r>
-        <w:rPr>
+          <w:highlight w:val="yellow"/>
+          <w:lang w:val="en-PK"/>
+        </w:rPr>
+        <w:t xml:space="preserve"> </w:t>
+      </w:r>
+      <w:proofErr w:type="spellStart"/>
+      <w:r>
+        <w:rPr>
+          <w:highlight w:val="yellow"/>
           <w:lang w:val="en-PK"/>
         </w:rPr>
         <w:t>huy</w:t>
@@ -3842,6 +3811,7 @@
       <w:proofErr w:type="spellEnd"/>
       <w:r>
         <w:rPr>
+          <w:highlight w:val="yellow"/>
           <w:lang w:val="en-PK"/>
         </w:rPr>
         <w:t>)</w:t>
@@ -3851,30 +3821,21 @@
       <w:pPr>
         <w:pStyle w:val="ListParagraph"/>
         <w:rPr>
-          <w:lang w:val="en-PK"/>
-        </w:rPr>
-      </w:pPr>
-      <w:r>
-        <w:rPr>
-          <w:lang w:val="en-PK"/>
-        </w:rPr>
-        <w:t xml:space="preserve">PBT </w:t>
-      </w:r>
-      <w:r>
-        <w:rPr>
-          <w:lang w:val="en-PK"/>
-        </w:rPr>
-        <w:t>–</w:t>
-      </w:r>
-      <w:r>
-        <w:rPr>
-          <w:lang w:val="en-PK"/>
-        </w:rPr>
-        <w:t xml:space="preserve"> Interest and Tax  = Net profit (</w:t>
-      </w:r>
-      <w:proofErr w:type="spellStart"/>
-      <w:r>
-        <w:rPr>
+          <w:highlight w:val="yellow"/>
+          <w:lang w:val="en-PK"/>
+        </w:rPr>
+      </w:pPr>
+      <w:r>
+        <w:rPr>
+          <w:highlight w:val="yellow"/>
+          <w:lang w:val="en-PK"/>
+        </w:rPr>
+        <w:t>PBT – Interest and Tax  = Net profit (</w:t>
+      </w:r>
+      <w:proofErr w:type="spellStart"/>
+      <w:r>
+        <w:rPr>
+          <w:highlight w:val="yellow"/>
           <w:lang w:val="en-PK"/>
         </w:rPr>
         <w:t>yani</w:t>
@@ -3882,72 +3843,35 @@
       <w:proofErr w:type="spellEnd"/>
       <w:r>
         <w:rPr>
+          <w:highlight w:val="yellow"/>
           <w:lang w:val="en-PK"/>
         </w:rPr>
         <w:t xml:space="preserve"> overall </w:t>
       </w:r>
       <w:r>
         <w:rPr>
-          <w:lang w:val="en-PK"/>
-        </w:rPr>
-        <w:t>EBIT</w:t>
-      </w:r>
-      <w:r>
-        <w:rPr>
-          <w:lang w:val="en-PK"/>
-        </w:rPr>
-        <w:t xml:space="preserve"> </w:t>
-      </w:r>
-      <w:r>
-        <w:rPr>
-          <w:lang w:val="en-PK"/>
-        </w:rPr>
-        <w:t>– Interest</w:t>
-      </w:r>
-      <w:r>
-        <w:rPr>
-          <w:lang w:val="en-PK"/>
-        </w:rPr>
-        <w:t xml:space="preserve"> </w:t>
-      </w:r>
-      <w:r>
-        <w:rPr>
-          <w:lang w:val="en-PK"/>
-        </w:rPr>
-        <w:t>– Tax</w:t>
-      </w:r>
-      <w:r>
-        <w:rPr>
-          <w:lang w:val="en-PK"/>
-        </w:rPr>
-        <w:t xml:space="preserve"> </w:t>
-      </w:r>
-      <w:r>
-        <w:rPr>
-          <w:lang w:val="en-PK"/>
-        </w:rPr>
-        <w:t>–</w:t>
-      </w:r>
-      <w:r>
-        <w:rPr>
-          <w:lang w:val="en-PK"/>
-        </w:rPr>
-        <w:t xml:space="preserve"> other non-operating expenses </w:t>
-      </w:r>
-      <w:r>
-        <w:rPr>
-          <w:lang w:val="en-PK"/>
-        </w:rPr>
-        <w:t xml:space="preserve"> </w:t>
-      </w:r>
-      <w:r>
-        <w:rPr>
-          <w:lang w:val="en-PK"/>
-        </w:rPr>
-        <w:t>= Net Profit</w:t>
-      </w:r>
-      <w:r>
-        <w:rPr>
+          <w:highlight w:val="yellow"/>
+          <w:lang w:val="en-PK"/>
+        </w:rPr>
+        <w:t>EBIT – Interest – Tax</w:t>
+      </w:r>
+      <w:r>
+        <w:rPr>
+          <w:highlight w:val="yellow"/>
+          <w:lang w:val="en-PK"/>
+        </w:rPr>
+        <w:t xml:space="preserve"> – other non-operating expenses </w:t>
+      </w:r>
+      <w:r>
+        <w:rPr>
+          <w:highlight w:val="yellow"/>
+          <w:lang w:val="en-PK"/>
+        </w:rPr>
+        <w:t xml:space="preserve"> = Net Profit</w:t>
+      </w:r>
+      <w:r>
+        <w:rPr>
+          <w:highlight w:val="yellow"/>
           <w:lang w:val="en-PK"/>
         </w:rPr>
         <w:t xml:space="preserve">) </w:t>
@@ -3957,11 +3881,13 @@
       <w:pPr>
         <w:pStyle w:val="ListParagraph"/>
         <w:rPr>
-          <w:lang w:val="en-PK"/>
-        </w:rPr>
-      </w:pPr>
-      <w:r>
-        <w:rPr>
+          <w:highlight w:val="yellow"/>
+          <w:lang w:val="en-PK"/>
+        </w:rPr>
+      </w:pPr>
+      <w:r>
+        <w:rPr>
+          <w:highlight w:val="yellow"/>
           <w:lang w:val="en-PK"/>
         </w:rPr>
         <w:t>OR</w:t>
@@ -3971,11 +3897,13 @@
       <w:pPr>
         <w:pStyle w:val="ListParagraph"/>
         <w:rPr>
-          <w:lang w:val="en-PK"/>
-        </w:rPr>
-      </w:pPr>
-      <w:r>
-        <w:rPr>
+          <w:highlight w:val="yellow"/>
+          <w:lang w:val="en-PK"/>
+        </w:rPr>
+      </w:pPr>
+      <w:r>
+        <w:rPr>
+          <w:highlight w:val="yellow"/>
           <w:lang w:val="en-PK"/>
         </w:rPr>
         <w:t>EBIT + D&amp;A = EBITDA</w:t>
@@ -3984,8 +3912,14 @@
     <w:p>
       <w:pPr>
         <w:pStyle w:val="ListParagraph"/>
-      </w:pPr>
-      <w:r>
+        <w:rPr>
+          <w:highlight w:val="yellow"/>
+        </w:rPr>
+      </w:pPr>
+      <w:r>
+        <w:rPr>
+          <w:highlight w:val="yellow"/>
+        </w:rPr>
         <w:t xml:space="preserve"> </w:t>
       </w:r>
     </w:p>
@@ -3993,115 +3927,24 @@
       <w:pPr>
         <w:pStyle w:val="ListParagraph"/>
         <w:rPr>
-          <w:lang w:val="en-PK"/>
-        </w:rPr>
-      </w:pPr>
-      <w:r>
-        <w:rPr>
-          <w:lang w:val="en-PK"/>
-        </w:rPr>
-        <w:t>Revenue</w:t>
-      </w:r>
-      <w:r>
-        <w:rPr>
-          <w:lang w:val="en-PK"/>
-        </w:rPr>
-        <w:t xml:space="preserve"> </w:t>
-      </w:r>
-      <w:r>
-        <w:rPr>
-          <w:lang w:val="en-PK"/>
-        </w:rPr>
-        <w:t>– COGS</w:t>
-      </w:r>
-      <w:r>
-        <w:rPr>
-          <w:lang w:val="en-PK"/>
-        </w:rPr>
-        <w:t xml:space="preserve"> </w:t>
-      </w:r>
-      <w:r>
-        <w:rPr>
-          <w:lang w:val="en-PK"/>
-        </w:rPr>
-        <w:t>= Gross Profit</w:t>
-      </w:r>
-      <w:r>
-        <w:rPr>
-          <w:lang w:val="en-PK"/>
-        </w:rPr>
-        <w:t xml:space="preserve"> </w:t>
-      </w:r>
-      <w:r>
-        <w:rPr>
-          <w:lang w:val="en-PK"/>
-        </w:rPr>
-        <w:t>– Operating Expenses (including D&amp;A)</w:t>
-      </w:r>
-      <w:r>
-        <w:rPr>
-          <w:lang w:val="en-PK"/>
-        </w:rPr>
-        <w:t xml:space="preserve"> </w:t>
-      </w:r>
-      <w:r>
-        <w:rPr>
-          <w:lang w:val="en-PK"/>
-        </w:rPr>
-        <w:t>= EBIT</w:t>
-      </w:r>
-      <w:r>
-        <w:rPr>
-          <w:lang w:val="en-PK"/>
-        </w:rPr>
-        <w:t xml:space="preserve"> </w:t>
-      </w:r>
-      <w:r>
-        <w:rPr>
-          <w:lang w:val="en-PK"/>
-        </w:rPr>
-        <w:t>± Non-operating items</w:t>
-      </w:r>
-      <w:r>
-        <w:rPr>
-          <w:lang w:val="en-PK"/>
-        </w:rPr>
-        <w:t xml:space="preserve"> </w:t>
-      </w:r>
-      <w:r>
-        <w:rPr>
-          <w:lang w:val="en-PK"/>
-        </w:rPr>
-        <w:t>= Profit Before Ta</w:t>
-      </w:r>
-      <w:r>
-        <w:rPr>
-          <w:lang w:val="en-PK"/>
-        </w:rPr>
-        <w:t xml:space="preserve">x </w:t>
-      </w:r>
-      <w:r>
-        <w:rPr>
-          <w:lang w:val="en-PK"/>
-        </w:rPr>
-        <w:t>– Tax</w:t>
-      </w:r>
-      <w:r>
-        <w:rPr>
-          <w:lang w:val="en-PK"/>
-        </w:rPr>
-        <w:t xml:space="preserve"> </w:t>
-      </w:r>
-      <w:r>
-        <w:rPr>
-          <w:lang w:val="en-PK"/>
-        </w:rPr>
-        <w:t>= Net Profit</w:t>
+          <w:highlight w:val="yellow"/>
+          <w:lang w:val="en-PK"/>
+        </w:rPr>
+      </w:pPr>
+      <w:r>
+        <w:rPr>
+          <w:highlight w:val="yellow"/>
+          <w:lang w:val="en-PK"/>
+        </w:rPr>
+        <w:t>Revenue – COGS = Gross Profit – Operating Expenses (including D&amp;A) = EBIT ± Non-operating items = Profit Before Tax – Tax = Net Profit</w:t>
       </w:r>
     </w:p>
     <w:p>
       <w:pPr>
         <w:pStyle w:val="ListParagraph"/>
+        <w:rPr>
+          <w:highlight w:val="yellow"/>
+        </w:rPr>
       </w:pPr>
     </w:p>
     <w:p>
@@ -4109,111 +3952,195 @@
         <w:pStyle w:val="ListParagraph"/>
       </w:pPr>
       <w:r>
+        <w:rPr>
+          <w:highlight w:val="yellow"/>
+        </w:rPr>
         <w:t xml:space="preserve">PBT (profit before tax) m s sara </w:t>
       </w:r>
       <w:proofErr w:type="spellStart"/>
       <w:r>
+        <w:rPr>
+          <w:highlight w:val="yellow"/>
+        </w:rPr>
         <w:t>kuch</w:t>
       </w:r>
       <w:proofErr w:type="spellEnd"/>
       <w:r>
-        <w:t xml:space="preserve"> </w:t>
-      </w:r>
-      <w:proofErr w:type="spellStart"/>
-      <w:r>
+        <w:rPr>
+          <w:highlight w:val="yellow"/>
+        </w:rPr>
+        <w:t xml:space="preserve"> </w:t>
+      </w:r>
+      <w:proofErr w:type="spellStart"/>
+      <w:r>
+        <w:rPr>
+          <w:highlight w:val="yellow"/>
+        </w:rPr>
         <w:t>yani</w:t>
       </w:r>
       <w:proofErr w:type="spellEnd"/>
       <w:r>
+        <w:rPr>
+          <w:highlight w:val="yellow"/>
+        </w:rPr>
         <w:t xml:space="preserve"> operating expenses and other </w:t>
       </w:r>
       <w:proofErr w:type="spellStart"/>
       <w:r>
+        <w:rPr>
+          <w:highlight w:val="yellow"/>
+        </w:rPr>
         <w:t>non operating</w:t>
       </w:r>
       <w:proofErr w:type="spellEnd"/>
       <w:r>
+        <w:rPr>
+          <w:highlight w:val="yellow"/>
+        </w:rPr>
         <w:t xml:space="preserve"> expenses </w:t>
       </w:r>
       <w:proofErr w:type="spellStart"/>
       <w:r>
+        <w:rPr>
+          <w:highlight w:val="yellow"/>
+        </w:rPr>
         <w:t>nikly</w:t>
       </w:r>
       <w:proofErr w:type="spellEnd"/>
       <w:r>
-        <w:t xml:space="preserve"> </w:t>
-      </w:r>
-      <w:proofErr w:type="spellStart"/>
-      <w:r>
+        <w:rPr>
+          <w:highlight w:val="yellow"/>
+        </w:rPr>
+        <w:t xml:space="preserve"> </w:t>
+      </w:r>
+      <w:proofErr w:type="spellStart"/>
+      <w:r>
+        <w:rPr>
+          <w:highlight w:val="yellow"/>
+        </w:rPr>
         <w:t>huy</w:t>
       </w:r>
       <w:proofErr w:type="spellEnd"/>
       <w:r>
-        <w:t xml:space="preserve"> </w:t>
-      </w:r>
-      <w:proofErr w:type="spellStart"/>
-      <w:r>
+        <w:rPr>
+          <w:highlight w:val="yellow"/>
+        </w:rPr>
+        <w:t xml:space="preserve"> </w:t>
+      </w:r>
+      <w:proofErr w:type="spellStart"/>
+      <w:r>
+        <w:rPr>
+          <w:highlight w:val="yellow"/>
+        </w:rPr>
         <w:t>hn</w:t>
       </w:r>
       <w:proofErr w:type="spellEnd"/>
       <w:r>
+        <w:rPr>
+          <w:highlight w:val="yellow"/>
+        </w:rPr>
         <w:t xml:space="preserve"> bs interest and tax </w:t>
       </w:r>
       <w:proofErr w:type="spellStart"/>
       <w:r>
+        <w:rPr>
+          <w:highlight w:val="yellow"/>
+        </w:rPr>
         <w:t>nhi</w:t>
       </w:r>
       <w:proofErr w:type="spellEnd"/>
       <w:r>
-        <w:t xml:space="preserve"> </w:t>
-      </w:r>
-      <w:proofErr w:type="spellStart"/>
-      <w:r>
+        <w:rPr>
+          <w:highlight w:val="yellow"/>
+        </w:rPr>
+        <w:t xml:space="preserve"> </w:t>
+      </w:r>
+      <w:proofErr w:type="spellStart"/>
+      <w:r>
+        <w:rPr>
+          <w:highlight w:val="yellow"/>
+        </w:rPr>
         <w:t>nikla</w:t>
       </w:r>
       <w:proofErr w:type="spellEnd"/>
       <w:r>
-        <w:t xml:space="preserve"> </w:t>
-      </w:r>
-      <w:proofErr w:type="spellStart"/>
-      <w:r>
+        <w:rPr>
+          <w:highlight w:val="yellow"/>
+        </w:rPr>
+        <w:t xml:space="preserve"> </w:t>
+      </w:r>
+      <w:proofErr w:type="spellStart"/>
+      <w:r>
+        <w:rPr>
+          <w:highlight w:val="yellow"/>
+        </w:rPr>
         <w:t>hua</w:t>
       </w:r>
       <w:proofErr w:type="spellEnd"/>
       <w:r>
+        <w:rPr>
+          <w:highlight w:val="yellow"/>
+        </w:rPr>
         <w:t xml:space="preserve">, </w:t>
       </w:r>
       <w:proofErr w:type="spellStart"/>
       <w:r>
+        <w:rPr>
+          <w:highlight w:val="yellow"/>
+        </w:rPr>
         <w:t>yani</w:t>
       </w:r>
       <w:proofErr w:type="spellEnd"/>
       <w:r>
+        <w:rPr>
+          <w:highlight w:val="yellow"/>
+        </w:rPr>
         <w:t xml:space="preserve"> in peso m s bs interest and tax k </w:t>
       </w:r>
       <w:proofErr w:type="spellStart"/>
       <w:r>
+        <w:rPr>
+          <w:highlight w:val="yellow"/>
+        </w:rPr>
         <w:t>pesy</w:t>
       </w:r>
       <w:proofErr w:type="spellEnd"/>
       <w:r>
-        <w:t xml:space="preserve"> </w:t>
-      </w:r>
-      <w:proofErr w:type="spellStart"/>
-      <w:r>
+        <w:rPr>
+          <w:highlight w:val="yellow"/>
+        </w:rPr>
+        <w:t xml:space="preserve"> </w:t>
+      </w:r>
+      <w:proofErr w:type="spellStart"/>
+      <w:r>
+        <w:rPr>
+          <w:highlight w:val="yellow"/>
+        </w:rPr>
         <w:t>nikalny</w:t>
       </w:r>
       <w:proofErr w:type="spellEnd"/>
       <w:r>
+        <w:rPr>
+          <w:highlight w:val="yellow"/>
+        </w:rPr>
         <w:t xml:space="preserve"> s </w:t>
       </w:r>
       <w:proofErr w:type="spellStart"/>
       <w:r>
+        <w:rPr>
+          <w:highlight w:val="yellow"/>
+        </w:rPr>
         <w:t>hmy</w:t>
       </w:r>
       <w:proofErr w:type="spellEnd"/>
       <w:r>
-        <w:t xml:space="preserve"> net profit mil jay ga </w:t>
+        <w:rPr>
+          <w:highlight w:val="yellow"/>
+        </w:rPr>
+        <w:t xml:space="preserve"> net profit mil jay ga</w:t>
+      </w:r>
+      <w:r>
+        <w:t xml:space="preserve"> </w:t>
       </w:r>
     </w:p>
     <w:p>
@@ -4272,7 +4199,31 @@
         <w:t xml:space="preserve"> different hi consider kia h</w:t>
       </w:r>
     </w:p>
-    <w:p/>
+    <w:p>
+      <w:r>
+        <w:t xml:space="preserve">The yellow ones are actually the lecture from </w:t>
+      </w:r>
+      <w:proofErr w:type="spellStart"/>
+      <w:r>
+        <w:t>udemy</w:t>
+      </w:r>
+      <w:proofErr w:type="spellEnd"/>
+      <w:r>
+        <w:t xml:space="preserve"> , but in reality and in most cases, EBIT AND PBIT are same and the different thing is PBT (Profit before TAX), the complete process is that revenue – COGS = Gross profit – operating expenses = </w:t>
+      </w:r>
+      <w:r>
+        <w:t>PBIT/</w:t>
+      </w:r>
+      <w:r>
+        <w:t xml:space="preserve">EBIT ± non-operating items − interest </w:t>
+      </w:r>
+      <w:r>
+        <w:t xml:space="preserve">= </w:t>
+      </w:r>
+      <w:r>
+        <w:t>PBT (Profit before tax) – tax = Net profit</w:t>
+      </w:r>
+    </w:p>
     <w:p>
       <w:pPr>
         <w:rPr>
@@ -4399,7 +4350,6 @@
         <w:pStyle w:val="ListParagraph"/>
       </w:pPr>
       <w:r>
-        <w:lastRenderedPageBreak/>
         <w:t xml:space="preserve">THE BEST WAY IS “IN”, because OR 2 s </w:t>
       </w:r>
       <w:proofErr w:type="spellStart"/>
@@ -4499,11 +4449,15 @@
       <w:pPr>
         <w:ind w:left="360"/>
         <w:rPr>
-          <w:lang w:val="en-PK"/>
-        </w:rPr>
-      </w:pPr>
-      <w:r>
-        <w:rPr>
+          <w:b/>
+          <w:bCs/>
+          <w:lang w:val="en-PK"/>
+        </w:rPr>
+      </w:pPr>
+      <w:r>
+        <w:rPr>
+          <w:b/>
+          <w:bCs/>
           <w:lang w:val="en-PK"/>
         </w:rPr>
         <w:t>Net profit margin tells us how much profit a company earns from every $1 of sales.</w:t>
@@ -4527,14 +4481,24 @@
       <w:pPr>
         <w:ind w:left="360"/>
         <w:rPr>
-          <w:lang w:val="en-PK"/>
-        </w:rPr>
-      </w:pPr>
-      <w:r>
-        <w:rPr>
-          <w:lang w:val="en-PK"/>
-        </w:rPr>
-        <w:t>Similarly, gross profit margin tells us how much profit the company earns from its sales after deducting only COGS (Cost of Goods Sold).</w:t>
+          <w:b/>
+          <w:bCs/>
+          <w:lang w:val="en-PK"/>
+        </w:rPr>
+      </w:pPr>
+      <w:r>
+        <w:rPr>
+          <w:lang w:val="en-PK"/>
+        </w:rPr>
+        <w:t>Similarly</w:t>
+      </w:r>
+      <w:r>
+        <w:rPr>
+          <w:b/>
+          <w:bCs/>
+          <w:lang w:val="en-PK"/>
+        </w:rPr>
+        <w:t>, gross profit margin tells us how much profit the company earns from its sales after deducting only COGS (Cost of Goods Sold).</w:t>
       </w:r>
     </w:p>
     <w:p>
@@ -4849,6 +4813,7 @@
           <w:iCs/>
           <w:u w:val="single"/>
         </w:rPr>
+        <w:lastRenderedPageBreak/>
         <w:t>DIFFERENCE BETWEE</w:t>
       </w:r>
       <w:r>
@@ -4878,7 +4843,6 @@
       </w:pPr>
       <w:proofErr w:type="spellStart"/>
       <w:r>
-        <w:lastRenderedPageBreak/>
         <w:t>Calenderauto</w:t>
       </w:r>
       <w:proofErr w:type="spellEnd"/>
@@ -5865,6 +5829,7 @@
           <w:rFonts w:ascii="Segoe UI Emoji" w:hAnsi="Segoe UI Emoji" w:cs="Segoe UI Emoji"/>
           <w:lang w:val="en-PK"/>
         </w:rPr>
+        <w:lastRenderedPageBreak/>
         <w:t>👉</w:t>
       </w:r>
       <w:r>
@@ -5893,7 +5858,6 @@
         <w:rPr>
           <w:lang w:val="en-PK"/>
         </w:rPr>
-        <w:lastRenderedPageBreak/>
         <w:t>Examples:</w:t>
       </w:r>
     </w:p>
@@ -6422,6 +6386,7 @@
         <w:rPr>
           <w:lang w:val="en-PK"/>
         </w:rPr>
+        <w:lastRenderedPageBreak/>
         <w:t>Electricity</w:t>
       </w:r>
     </w:p>
@@ -6439,7 +6404,6 @@
         <w:rPr>
           <w:lang w:val="en-PK"/>
         </w:rPr>
-        <w:lastRenderedPageBreak/>
         <w:t>Marketing</w:t>
       </w:r>
     </w:p>
@@ -6950,6 +6914,7 @@
         <w:rPr>
           <w:lang w:val="en-PK"/>
         </w:rPr>
+        <w:lastRenderedPageBreak/>
         <w:pict w14:anchorId="2E3E2015">
           <v:rect id="_x0000_i1032" style="width:0;height:1.5pt" o:hralign="center" o:hrstd="t" o:hr="t" fillcolor="#a0a0a0" stroked="f"/>
         </w:pict>
@@ -6971,7 +6936,6 @@
           <w:bCs/>
           <w:lang w:val="en-PK"/>
         </w:rPr>
-        <w:lastRenderedPageBreak/>
         <w:t>🌟</w:t>
       </w:r>
       <w:r>
@@ -7421,6 +7385,12 @@
           <w:lang w:val="en-PK"/>
         </w:rPr>
         <w:br/>
+      </w:r>
+      <w:r>
+        <w:rPr>
+          <w:lang w:val="en-PK"/>
+        </w:rPr>
+        <w:lastRenderedPageBreak/>
         <w:t>Equity → Owner’s money</w:t>
       </w:r>
       <w:r>
@@ -7428,12 +7398,6 @@
           <w:lang w:val="en-PK"/>
         </w:rPr>
         <w:br/>
-      </w:r>
-      <w:r>
-        <w:rPr>
-          <w:lang w:val="en-PK"/>
-        </w:rPr>
-        <w:lastRenderedPageBreak/>
         <w:t>Revenue → Money earned</w:t>
       </w:r>
       <w:r>
@@ -8189,7 +8153,14 @@
         <w:rPr>
           <w:lang w:val="en-PK"/>
         </w:rPr>
-        <w:t xml:space="preserve">, liability( such as bank loan, debts etc) and Equity (jo amount ap n invest ki hui h),, y </w:t>
+        <w:t xml:space="preserve">, liability( such as bank loan, debts etc) and Equity (jo amount ap n </w:t>
+      </w:r>
+      <w:r>
+        <w:rPr>
+          <w:lang w:val="en-PK"/>
+        </w:rPr>
+        <w:lastRenderedPageBreak/>
+        <w:t xml:space="preserve">invest ki hui h),, y </w:t>
       </w:r>
       <w:proofErr w:type="spellStart"/>
       <w:r>
@@ -8245,14 +8216,7 @@
         <w:rPr>
           <w:lang w:val="en-PK"/>
         </w:rPr>
-        <w:t xml:space="preserve">: CREDIT and DEBIT,,, If the category is </w:t>
-      </w:r>
-      <w:r>
-        <w:rPr>
-          <w:lang w:val="en-PK"/>
-        </w:rPr>
-        <w:lastRenderedPageBreak/>
-        <w:t xml:space="preserve">DEBIT means expenses or assets of the company </w:t>
+        <w:t xml:space="preserve">: CREDIT and DEBIT,,, If the category is DEBIT means expenses or assets of the company </w:t>
       </w:r>
       <w:proofErr w:type="spellStart"/>
       <w:r>
@@ -8929,20 +8893,43 @@
           <w:ilvl w:val="0"/>
           <w:numId w:val="1"/>
         </w:numPr>
-      </w:pPr>
-      <w:r>
-        <w:t xml:space="preserve"> </w:t>
-      </w:r>
-      <w:r>
-        <w:t xml:space="preserve">Amount m negative sign </w:t>
-      </w:r>
-      <w:proofErr w:type="spellStart"/>
-      <w:r>
-        <w:t>lagaya</w:t>
-      </w:r>
-      <w:proofErr w:type="spellEnd"/>
-      <w:r>
-        <w:t xml:space="preserve"> </w:t>
+        <w:rPr>
+          <w:b/>
+          <w:bCs/>
+          <w:i/>
+          <w:iCs/>
+          <w:u w:val="single"/>
+        </w:rPr>
+      </w:pPr>
+      <w:r>
+        <w:t xml:space="preserve"> </w:t>
+      </w:r>
+      <w:r>
+        <w:t>Account m amount -</w:t>
+      </w:r>
+      <w:proofErr w:type="spellStart"/>
+      <w:r>
+        <w:t>ve</w:t>
+      </w:r>
+      <w:proofErr w:type="spellEnd"/>
+      <w:r>
+        <w:t xml:space="preserve"> m h, </w:t>
+      </w:r>
+      <w:proofErr w:type="spellStart"/>
+      <w:r>
+        <w:t>yani</w:t>
+      </w:r>
+      <w:proofErr w:type="spellEnd"/>
+      <w:r>
+        <w:t xml:space="preserve"> </w:t>
+      </w:r>
+      <w:proofErr w:type="spellStart"/>
+      <w:r>
+        <w:t>ya</w:t>
+      </w:r>
+      <w:proofErr w:type="spellEnd"/>
+      <w:r>
+        <w:t xml:space="preserve"> to liability, equity or revenue increase </w:t>
       </w:r>
       <w:proofErr w:type="spellStart"/>
       <w:r>
@@ -8950,7 +8937,15 @@
       </w:r>
       <w:proofErr w:type="spellEnd"/>
       <w:r>
-        <w:t xml:space="preserve"> </w:t>
+        <w:t xml:space="preserve"> h </w:t>
+      </w:r>
+      <w:proofErr w:type="spellStart"/>
+      <w:r>
+        <w:t>ya</w:t>
+      </w:r>
+      <w:proofErr w:type="spellEnd"/>
+      <w:r>
+        <w:t xml:space="preserve"> assets and expenditures decrease </w:t>
       </w:r>
       <w:proofErr w:type="spellStart"/>
       <w:r>
@@ -8958,284 +8953,51 @@
       </w:r>
       <w:proofErr w:type="spellEnd"/>
       <w:r>
-        <w:t xml:space="preserve"> hm n to </w:t>
-      </w:r>
-      <w:r>
-        <w:t xml:space="preserve">means it </w:t>
-      </w:r>
-      <w:proofErr w:type="spellStart"/>
-      <w:r>
-        <w:t>simpy</w:t>
-      </w:r>
-      <w:proofErr w:type="spellEnd"/>
-      <w:r>
-        <w:t xml:space="preserve"> shows k koi account km </w:t>
-      </w:r>
-      <w:proofErr w:type="spellStart"/>
-      <w:r>
-        <w:t>hua</w:t>
-      </w:r>
-      <w:proofErr w:type="spellEnd"/>
-      <w:r>
-        <w:t xml:space="preserve"> h, ab </w:t>
-      </w:r>
-      <w:proofErr w:type="spellStart"/>
-      <w:r>
-        <w:t>chahy</w:t>
-      </w:r>
-      <w:proofErr w:type="spellEnd"/>
-      <w:r>
-        <w:t xml:space="preserve"> ho debit ka assets and expenditure km </w:t>
-      </w:r>
-      <w:proofErr w:type="spellStart"/>
-      <w:r>
-        <w:t>hua</w:t>
-      </w:r>
-      <w:proofErr w:type="spellEnd"/>
-      <w:r>
         <w:t xml:space="preserve"> h, </w:t>
       </w:r>
       <w:proofErr w:type="spellStart"/>
       <w:r>
-        <w:t>ya</w:t>
-      </w:r>
-      <w:proofErr w:type="spellEnd"/>
-      <w:r>
-        <w:t xml:space="preserve"> credit ka liability, revenue or equity km </w:t>
-      </w:r>
-      <w:proofErr w:type="spellStart"/>
-      <w:r>
-        <w:t>hua</w:t>
-      </w:r>
-      <w:proofErr w:type="spellEnd"/>
-      <w:r>
-        <w:t xml:space="preserve"> h, jab </w:t>
-      </w:r>
-      <w:proofErr w:type="spellStart"/>
-      <w:r>
-        <w:t>tk</w:t>
-      </w:r>
-      <w:proofErr w:type="spellEnd"/>
-      <w:r>
-        <w:t xml:space="preserve"> </w:t>
-      </w:r>
-      <w:proofErr w:type="spellStart"/>
-      <w:r>
-        <w:t>ccount</w:t>
-      </w:r>
-      <w:proofErr w:type="spellEnd"/>
-      <w:r>
-        <w:t xml:space="preserve"> ka </w:t>
-      </w:r>
-      <w:proofErr w:type="spellStart"/>
-      <w:r>
-        <w:t>pta</w:t>
-      </w:r>
-      <w:proofErr w:type="spellEnd"/>
-      <w:r>
-        <w:t xml:space="preserve"> </w:t>
-      </w:r>
-      <w:proofErr w:type="spellStart"/>
-      <w:r>
-        <w:t>nhi</w:t>
-      </w:r>
-      <w:proofErr w:type="spellEnd"/>
-      <w:r>
-        <w:t xml:space="preserve"> lag </w:t>
-      </w:r>
-      <w:proofErr w:type="spellStart"/>
-      <w:r>
-        <w:t>jata</w:t>
-      </w:r>
-      <w:proofErr w:type="spellEnd"/>
-      <w:r>
-        <w:t xml:space="preserve"> hm y </w:t>
-      </w:r>
-      <w:proofErr w:type="spellStart"/>
-      <w:r>
-        <w:t>chees</w:t>
-      </w:r>
-      <w:proofErr w:type="spellEnd"/>
-      <w:r>
-        <w:t xml:space="preserve"> </w:t>
-      </w:r>
-      <w:proofErr w:type="spellStart"/>
-      <w:r>
-        <w:t>nhi</w:t>
-      </w:r>
-      <w:proofErr w:type="spellEnd"/>
-      <w:r>
-        <w:t xml:space="preserve"> </w:t>
-      </w:r>
-      <w:proofErr w:type="spellStart"/>
-      <w:r>
-        <w:t>nikal</w:t>
-      </w:r>
-      <w:proofErr w:type="spellEnd"/>
-      <w:r>
-        <w:t xml:space="preserve"> </w:t>
-      </w:r>
-      <w:proofErr w:type="spellStart"/>
-      <w:r>
-        <w:t>skty</w:t>
-      </w:r>
-      <w:proofErr w:type="spellEnd"/>
-      <w:r>
-        <w:t xml:space="preserve"> k kia km </w:t>
-      </w:r>
-      <w:proofErr w:type="spellStart"/>
-      <w:r>
-        <w:t>hua</w:t>
-      </w:r>
-      <w:proofErr w:type="spellEnd"/>
-      <w:r>
-        <w:t xml:space="preserve"> h</w:t>
-      </w:r>
-      <w:r>
-        <w:t xml:space="preserve"> or even hm y </w:t>
-      </w:r>
-      <w:proofErr w:type="spellStart"/>
-      <w:r>
-        <w:t>bhi</w:t>
-      </w:r>
-      <w:proofErr w:type="spellEnd"/>
-      <w:r>
-        <w:t xml:space="preserve"> </w:t>
-      </w:r>
-      <w:proofErr w:type="spellStart"/>
-      <w:r>
-        <w:t>nhi</w:t>
-      </w:r>
-      <w:proofErr w:type="spellEnd"/>
-      <w:r>
-        <w:t xml:space="preserve"> </w:t>
-      </w:r>
-      <w:proofErr w:type="spellStart"/>
-      <w:r>
-        <w:t>bta</w:t>
-      </w:r>
-      <w:proofErr w:type="spellEnd"/>
-      <w:r>
-        <w:t xml:space="preserve"> </w:t>
-      </w:r>
-      <w:proofErr w:type="spellStart"/>
-      <w:r>
-        <w:t>skty</w:t>
-      </w:r>
-      <w:proofErr w:type="spellEnd"/>
-      <w:r>
-        <w:t xml:space="preserve"> k credit km </w:t>
-      </w:r>
-      <w:proofErr w:type="spellStart"/>
-      <w:r>
-        <w:t>hua</w:t>
-      </w:r>
-      <w:proofErr w:type="spellEnd"/>
-      <w:r>
-        <w:t xml:space="preserve"> h </w:t>
-      </w:r>
-      <w:proofErr w:type="spellStart"/>
-      <w:r>
-        <w:t>ya</w:t>
-      </w:r>
-      <w:proofErr w:type="spellEnd"/>
-      <w:r>
-        <w:t xml:space="preserve"> debit km </w:t>
-      </w:r>
-      <w:proofErr w:type="spellStart"/>
-      <w:r>
-        <w:t>hua</w:t>
-      </w:r>
-      <w:proofErr w:type="spellEnd"/>
-      <w:r>
-        <w:t xml:space="preserve"> h, bs </w:t>
-      </w:r>
-      <w:proofErr w:type="spellStart"/>
-      <w:r>
-        <w:t>itna</w:t>
-      </w:r>
-      <w:proofErr w:type="spellEnd"/>
-      <w:r>
-        <w:t xml:space="preserve"> </w:t>
-      </w:r>
-      <w:proofErr w:type="spellStart"/>
-      <w:r>
-        <w:t>jaan</w:t>
-      </w:r>
-      <w:proofErr w:type="spellEnd"/>
-      <w:r>
-        <w:t xml:space="preserve"> lo k koi account km </w:t>
-      </w:r>
-      <w:proofErr w:type="spellStart"/>
-      <w:r>
-        <w:t>hua</w:t>
-      </w:r>
-      <w:proofErr w:type="spellEnd"/>
-      <w:r>
-        <w:t xml:space="preserve"> h</w:t>
-      </w:r>
-      <w:r>
-        <w:t xml:space="preserve"> , bs negative sign s y </w:t>
-      </w:r>
-      <w:proofErr w:type="spellStart"/>
-      <w:r>
-        <w:t>pta</w:t>
-      </w:r>
-      <w:proofErr w:type="spellEnd"/>
-      <w:r>
-        <w:t xml:space="preserve"> </w:t>
-      </w:r>
-      <w:proofErr w:type="spellStart"/>
-      <w:r>
-        <w:t>lgy</w:t>
-      </w:r>
-      <w:proofErr w:type="spellEnd"/>
-      <w:r>
-        <w:t xml:space="preserve"> ga k </w:t>
-      </w:r>
-      <w:proofErr w:type="spellStart"/>
-      <w:r>
-        <w:t>kuch</w:t>
-      </w:r>
-      <w:proofErr w:type="spellEnd"/>
-      <w:r>
-        <w:t xml:space="preserve"> km </w:t>
-      </w:r>
-      <w:proofErr w:type="spellStart"/>
-      <w:r>
-        <w:t>hua</w:t>
-      </w:r>
-      <w:proofErr w:type="spellEnd"/>
-      <w:r>
-        <w:t xml:space="preserve"> h, positive and negative signs just demonstration h, y </w:t>
-      </w:r>
-      <w:proofErr w:type="spellStart"/>
-      <w:r>
-        <w:t>acha</w:t>
-      </w:r>
-      <w:proofErr w:type="spellEnd"/>
-      <w:r>
-        <w:t xml:space="preserve"> </w:t>
-      </w:r>
-      <w:proofErr w:type="spellStart"/>
-      <w:r>
-        <w:t>ya</w:t>
-      </w:r>
-      <w:proofErr w:type="spellEnd"/>
-      <w:r>
-        <w:t xml:space="preserve"> </w:t>
-      </w:r>
-      <w:proofErr w:type="spellStart"/>
-      <w:r>
-        <w:t>bura</w:t>
-      </w:r>
-      <w:proofErr w:type="spellEnd"/>
-      <w:r>
-        <w:t xml:space="preserve"> </w:t>
-      </w:r>
-      <w:proofErr w:type="spellStart"/>
-      <w:r>
-        <w:t>nhi</w:t>
+        <w:t>yhan</w:t>
+      </w:r>
+      <w:proofErr w:type="spellEnd"/>
+      <w:r>
+        <w:t xml:space="preserve"> </w:t>
+      </w:r>
+      <w:proofErr w:type="spellStart"/>
+      <w:r>
+        <w:t>account_key</w:t>
+      </w:r>
+      <w:proofErr w:type="spellEnd"/>
+      <w:r>
+        <w:t xml:space="preserve"> 135 h, 135 pr ja </w:t>
+      </w:r>
+      <w:proofErr w:type="spellStart"/>
+      <w:r>
+        <w:t>kr</w:t>
+      </w:r>
+      <w:proofErr w:type="spellEnd"/>
+      <w:r>
+        <w:t xml:space="preserve"> </w:t>
+      </w:r>
+      <w:proofErr w:type="spellStart"/>
+      <w:r>
+        <w:t>dekho</w:t>
+      </w:r>
+      <w:proofErr w:type="spellEnd"/>
+      <w:r>
+        <w:t xml:space="preserve"> to </w:t>
+      </w:r>
+      <w:proofErr w:type="spellStart"/>
+      <w:r>
+        <w:t>chartr</w:t>
+      </w:r>
+      <w:proofErr w:type="spellEnd"/>
+      <w:r>
+        <w:t xml:space="preserve"> of account m to liability and owner’s equity </w:t>
+      </w:r>
+      <w:proofErr w:type="spellStart"/>
+      <w:r>
+        <w:t>likha</w:t>
       </w:r>
       <w:proofErr w:type="spellEnd"/>
       <w:r>
@@ -9243,67 +9005,27 @@
       </w:r>
       <w:proofErr w:type="spellStart"/>
       <w:r>
-        <w:t>hmy</w:t>
-      </w:r>
-      <w:proofErr w:type="spellEnd"/>
-      <w:r>
-        <w:t xml:space="preserve"> bs y </w:t>
-      </w:r>
-      <w:proofErr w:type="spellStart"/>
-      <w:r>
-        <w:t>janna</w:t>
-      </w:r>
-      <w:proofErr w:type="spellEnd"/>
-      <w:r>
-        <w:t xml:space="preserve"> h k credit m liabilities, revenue or </w:t>
-      </w:r>
-      <w:proofErr w:type="spellStart"/>
-      <w:r>
-        <w:t>quity</w:t>
-      </w:r>
-      <w:proofErr w:type="spellEnd"/>
-      <w:r>
-        <w:t xml:space="preserve"> increase hon </w:t>
-      </w:r>
-      <w:proofErr w:type="spellStart"/>
-      <w:r>
-        <w:t>gy</w:t>
-      </w:r>
-      <w:proofErr w:type="spellEnd"/>
-      <w:r>
-        <w:t xml:space="preserve"> and debit m </w:t>
-      </w:r>
-      <w:proofErr w:type="spellStart"/>
-      <w:r>
-        <w:t>ependitures</w:t>
-      </w:r>
-      <w:proofErr w:type="spellEnd"/>
-      <w:r>
-        <w:t xml:space="preserve"> and assets increase </w:t>
-      </w:r>
-      <w:proofErr w:type="spellStart"/>
-      <w:r>
-        <w:t>hin</w:t>
-      </w:r>
-      <w:proofErr w:type="spellEnd"/>
-      <w:r>
-        <w:t xml:space="preserve"> </w:t>
-      </w:r>
-      <w:proofErr w:type="spellStart"/>
-      <w:r>
-        <w:t>gy</w:t>
-      </w:r>
-      <w:proofErr w:type="spellEnd"/>
-      <w:r>
-        <w:t xml:space="preserve">,,,    Ab following image m </w:t>
-      </w:r>
-      <w:proofErr w:type="spellStart"/>
-      <w:r>
-        <w:t>dekho</w:t>
-      </w:r>
-      <w:proofErr w:type="spellEnd"/>
-      <w:r>
-        <w:t xml:space="preserve"> k account key 135 h and amount -</w:t>
+        <w:t>yani</w:t>
+      </w:r>
+      <w:proofErr w:type="spellEnd"/>
+      <w:r>
+        <w:t xml:space="preserve"> y </w:t>
+      </w:r>
+      <w:proofErr w:type="spellStart"/>
+      <w:r>
+        <w:t>cheezy</w:t>
+      </w:r>
+      <w:proofErr w:type="spellEnd"/>
+      <w:r>
+        <w:t xml:space="preserve"> increase hui h, is </w:t>
+      </w:r>
+      <w:proofErr w:type="spellStart"/>
+      <w:r>
+        <w:t>liye</w:t>
+      </w:r>
+      <w:proofErr w:type="spellEnd"/>
+      <w:r>
+        <w:t xml:space="preserve"> -</w:t>
       </w:r>
       <w:proofErr w:type="spellStart"/>
       <w:r>
@@ -9311,336 +9033,13 @@
       </w:r>
       <w:proofErr w:type="spellEnd"/>
       <w:r>
-        <w:t xml:space="preserve"> h, </w:t>
-      </w:r>
-      <w:proofErr w:type="spellStart"/>
-      <w:r>
-        <w:t>yani</w:t>
-      </w:r>
-      <w:proofErr w:type="spellEnd"/>
-      <w:r>
-        <w:t xml:space="preserve"> </w:t>
-      </w:r>
-      <w:proofErr w:type="spellStart"/>
-      <w:r>
-        <w:t>kuch</w:t>
-      </w:r>
-      <w:proofErr w:type="spellEnd"/>
-      <w:r>
-        <w:t xml:space="preserve"> km </w:t>
-      </w:r>
-      <w:proofErr w:type="spellStart"/>
-      <w:r>
-        <w:t>hua</w:t>
-      </w:r>
-      <w:proofErr w:type="spellEnd"/>
-      <w:r>
-        <w:t xml:space="preserve"> h, </w:t>
-      </w:r>
-      <w:proofErr w:type="spellStart"/>
-      <w:r>
-        <w:t>abhi</w:t>
-      </w:r>
-      <w:proofErr w:type="spellEnd"/>
-      <w:r>
-        <w:t xml:space="preserve"> </w:t>
-      </w:r>
-      <w:proofErr w:type="spellStart"/>
-      <w:r>
-        <w:t>tk</w:t>
-      </w:r>
-      <w:proofErr w:type="spellEnd"/>
-      <w:r>
-        <w:t xml:space="preserve"> amount </w:t>
-      </w:r>
-      <w:proofErr w:type="spellStart"/>
-      <w:r>
-        <w:t>dekh</w:t>
-      </w:r>
-      <w:proofErr w:type="spellEnd"/>
-      <w:r>
-        <w:t xml:space="preserve"> </w:t>
-      </w:r>
-      <w:proofErr w:type="spellStart"/>
-      <w:r>
-        <w:t>kr</w:t>
-      </w:r>
-      <w:proofErr w:type="spellEnd"/>
-      <w:r>
-        <w:t xml:space="preserve"> hm </w:t>
-      </w:r>
-      <w:proofErr w:type="spellStart"/>
-      <w:r>
-        <w:t>nhi</w:t>
-      </w:r>
-      <w:proofErr w:type="spellEnd"/>
-      <w:r>
-        <w:t xml:space="preserve"> </w:t>
-      </w:r>
-      <w:proofErr w:type="spellStart"/>
-      <w:r>
-        <w:t>keh</w:t>
-      </w:r>
-      <w:proofErr w:type="spellEnd"/>
-      <w:r>
-        <w:t xml:space="preserve"> </w:t>
-      </w:r>
-      <w:proofErr w:type="spellStart"/>
-      <w:r>
-        <w:t>skty</w:t>
-      </w:r>
-      <w:proofErr w:type="spellEnd"/>
-      <w:r>
-        <w:t xml:space="preserve"> k </w:t>
-      </w:r>
-      <w:proofErr w:type="spellStart"/>
-      <w:r>
-        <w:t>kon</w:t>
-      </w:r>
-      <w:proofErr w:type="spellEnd"/>
-      <w:r>
-        <w:t xml:space="preserve"> ca account km </w:t>
-      </w:r>
-      <w:proofErr w:type="spellStart"/>
-      <w:r>
-        <w:t>hua</w:t>
-      </w:r>
-      <w:proofErr w:type="spellEnd"/>
-      <w:r>
-        <w:t xml:space="preserve"> h, chart of account m ja </w:t>
-      </w:r>
-      <w:proofErr w:type="spellStart"/>
-      <w:r>
-        <w:t>lr</w:t>
-      </w:r>
-      <w:proofErr w:type="spellEnd"/>
-      <w:r>
-        <w:t xml:space="preserve"> </w:t>
-      </w:r>
-      <w:proofErr w:type="spellStart"/>
-      <w:r>
-        <w:t>dekha</w:t>
-      </w:r>
-      <w:proofErr w:type="spellEnd"/>
-      <w:r>
-        <w:t xml:space="preserve"> to key m “liabilities and owner’s equity” mention </w:t>
-      </w:r>
-      <w:proofErr w:type="spellStart"/>
-      <w:r>
-        <w:t>tha</w:t>
-      </w:r>
-      <w:proofErr w:type="spellEnd"/>
-      <w:r>
-        <w:t xml:space="preserve">, </w:t>
-      </w:r>
-      <w:proofErr w:type="spellStart"/>
-      <w:r>
-        <w:t>yani</w:t>
-      </w:r>
-      <w:proofErr w:type="spellEnd"/>
-      <w:r>
-        <w:t xml:space="preserve"> y account km </w:t>
-      </w:r>
-      <w:proofErr w:type="spellStart"/>
-      <w:r>
-        <w:t>hua</w:t>
-      </w:r>
-      <w:proofErr w:type="spellEnd"/>
-      <w:r>
-        <w:t xml:space="preserve"> h, or </w:t>
-      </w:r>
-      <w:proofErr w:type="spellStart"/>
-      <w:r>
-        <w:t>yhan</w:t>
-      </w:r>
-      <w:proofErr w:type="spellEnd"/>
-      <w:r>
-        <w:t xml:space="preserve"> s </w:t>
-      </w:r>
-      <w:proofErr w:type="spellStart"/>
-      <w:r>
-        <w:t>bhi</w:t>
-      </w:r>
-      <w:proofErr w:type="spellEnd"/>
-      <w:r>
-        <w:t xml:space="preserve"> </w:t>
-      </w:r>
-      <w:proofErr w:type="spellStart"/>
-      <w:r>
-        <w:t>dekho</w:t>
-      </w:r>
-      <w:proofErr w:type="spellEnd"/>
-      <w:r>
-        <w:t xml:space="preserve"> k liabilities and owner’s equity k </w:t>
-      </w:r>
-      <w:proofErr w:type="spellStart"/>
-      <w:r>
-        <w:t>k</w:t>
-      </w:r>
-      <w:proofErr w:type="spellEnd"/>
-      <w:r>
-        <w:t xml:space="preserve"> </w:t>
-      </w:r>
-      <w:proofErr w:type="spellStart"/>
-      <w:r>
-        <w:t>hony</w:t>
-      </w:r>
-      <w:proofErr w:type="spellEnd"/>
-      <w:r>
-        <w:t xml:space="preserve"> ka </w:t>
-      </w:r>
-      <w:proofErr w:type="spellStart"/>
-      <w:r>
-        <w:t>matlab</w:t>
-      </w:r>
-      <w:proofErr w:type="spellEnd"/>
-      <w:r>
-        <w:t xml:space="preserve"> y h k credit account km </w:t>
-      </w:r>
-      <w:proofErr w:type="spellStart"/>
-      <w:r>
-        <w:t>hua</w:t>
-      </w:r>
-      <w:proofErr w:type="spellEnd"/>
-      <w:r>
-        <w:t xml:space="preserve"> h and credit m </w:t>
-      </w:r>
-      <w:proofErr w:type="spellStart"/>
-      <w:r>
-        <w:t>dekho</w:t>
-      </w:r>
-      <w:proofErr w:type="spellEnd"/>
-      <w:r>
-        <w:t xml:space="preserve"> amount 0 </w:t>
-      </w:r>
-      <w:proofErr w:type="spellStart"/>
-      <w:r>
-        <w:t>likhi</w:t>
-      </w:r>
-      <w:proofErr w:type="spellEnd"/>
-      <w:r>
-        <w:t xml:space="preserve"> h and debit m </w:t>
-      </w:r>
-      <w:proofErr w:type="spellStart"/>
-      <w:r>
-        <w:t>kuch</w:t>
-      </w:r>
-      <w:proofErr w:type="spellEnd"/>
-      <w:r>
-        <w:t xml:space="preserve"> amount </w:t>
-      </w:r>
-      <w:proofErr w:type="spellStart"/>
-      <w:r>
-        <w:t>likhi</w:t>
-      </w:r>
-      <w:proofErr w:type="spellEnd"/>
-      <w:r>
-        <w:t xml:space="preserve"> hui h, </w:t>
-      </w:r>
-      <w:proofErr w:type="spellStart"/>
-      <w:r>
-        <w:t>yani</w:t>
-      </w:r>
-      <w:proofErr w:type="spellEnd"/>
-      <w:r>
-        <w:t xml:space="preserve"> debit account </w:t>
-      </w:r>
-      <w:proofErr w:type="spellStart"/>
-      <w:r>
-        <w:t>brha</w:t>
-      </w:r>
-      <w:proofErr w:type="spellEnd"/>
-      <w:r>
-        <w:t xml:space="preserve"> h, and liabilities and </w:t>
-      </w:r>
-      <w:proofErr w:type="spellStart"/>
-      <w:r>
-        <w:t>owner;s</w:t>
-      </w:r>
-      <w:proofErr w:type="spellEnd"/>
-      <w:r>
-        <w:t xml:space="preserve"> equity jab </w:t>
-      </w:r>
-      <w:proofErr w:type="spellStart"/>
-      <w:r>
-        <w:t>brhaty</w:t>
-      </w:r>
-      <w:proofErr w:type="spellEnd"/>
-      <w:r>
-        <w:t xml:space="preserve"> </w:t>
-      </w:r>
-      <w:proofErr w:type="spellStart"/>
-      <w:r>
-        <w:t>hn</w:t>
-      </w:r>
-      <w:proofErr w:type="spellEnd"/>
-      <w:r>
-        <w:t xml:space="preserve"> to debit account km </w:t>
-      </w:r>
-      <w:proofErr w:type="spellStart"/>
-      <w:r>
-        <w:t>hota</w:t>
-      </w:r>
-      <w:proofErr w:type="spellEnd"/>
-      <w:r>
-        <w:t xml:space="preserve"> h and is ko negative s show </w:t>
-      </w:r>
-      <w:proofErr w:type="spellStart"/>
-      <w:r>
-        <w:t>krty</w:t>
-      </w:r>
-      <w:proofErr w:type="spellEnd"/>
-      <w:r>
-        <w:t xml:space="preserve"> </w:t>
-      </w:r>
-      <w:proofErr w:type="spellStart"/>
-      <w:r>
-        <w:t>hn</w:t>
-      </w:r>
-      <w:proofErr w:type="spellEnd"/>
-      <w:r>
-        <w:t xml:space="preserve"> (just for clarity), </w:t>
-      </w:r>
-      <w:proofErr w:type="spellStart"/>
-      <w:r>
-        <w:t>yhan</w:t>
-      </w:r>
-      <w:proofErr w:type="spellEnd"/>
-      <w:r>
-        <w:t xml:space="preserve"> s </w:t>
-      </w:r>
-      <w:proofErr w:type="spellStart"/>
-      <w:r>
-        <w:t>bhi</w:t>
-      </w:r>
-      <w:proofErr w:type="spellEnd"/>
-      <w:r>
-        <w:t xml:space="preserve"> y </w:t>
-      </w:r>
-      <w:proofErr w:type="spellStart"/>
-      <w:r>
-        <w:t>baat</w:t>
-      </w:r>
-      <w:proofErr w:type="spellEnd"/>
-      <w:r>
-        <w:t xml:space="preserve"> </w:t>
-      </w:r>
-      <w:proofErr w:type="spellStart"/>
-      <w:r>
-        <w:t>vaziha</w:t>
-      </w:r>
-      <w:proofErr w:type="spellEnd"/>
-      <w:r>
-        <w:t xml:space="preserve"> </w:t>
-      </w:r>
-      <w:proofErr w:type="spellStart"/>
-      <w:r>
-        <w:t>hoti</w:t>
-      </w:r>
-      <w:proofErr w:type="spellEnd"/>
-      <w:r>
-        <w:t xml:space="preserve"> h</w:t>
-      </w:r>
+        <w:t xml:space="preserve"> sign </w:t>
+      </w:r>
+      <w:proofErr w:type="spellStart"/>
+      <w:r>
+        <w:t>aya</w:t>
+      </w:r>
+      <w:proofErr w:type="spellEnd"/>
     </w:p>
     <w:p>
       <w:pPr>
@@ -9712,7 +9111,6 @@
           <w:sz w:val="40"/>
           <w:szCs w:val="40"/>
         </w:rPr>
-        <w:lastRenderedPageBreak/>
         <w:t>Foolproof</w:t>
       </w:r>
       <w:r>
@@ -9770,7 +9168,11 @@
       </w:r>
       <w:proofErr w:type="spellEnd"/>
       <w:r>
-        <w:t xml:space="preserve"> to alphabetically sort ho jay ga but class-level sorting disturb ho jay </w:t>
+        <w:t xml:space="preserve"> to alphabetically sort ho jay ga but </w:t>
+      </w:r>
+      <w:r>
+        <w:lastRenderedPageBreak/>
+        <w:t xml:space="preserve">class-level sorting disturb ho jay </w:t>
       </w:r>
       <w:proofErr w:type="spellStart"/>
       <w:r>
@@ -9778,11 +9180,19 @@
       </w:r>
       <w:proofErr w:type="spellEnd"/>
       <w:r>
-        <w:t>, moreover, isi li</w:t>
-      </w:r>
-      <w:proofErr w:type="spellStart"/>
-      <w:r>
-        <w:t>ye</w:t>
+        <w:t xml:space="preserve">, moreover, </w:t>
+      </w:r>
+      <w:proofErr w:type="spellStart"/>
+      <w:r>
+        <w:t>isi</w:t>
+      </w:r>
+      <w:proofErr w:type="spellEnd"/>
+      <w:r>
+        <w:t xml:space="preserve"> </w:t>
+      </w:r>
+      <w:proofErr w:type="spellStart"/>
+      <w:r>
+        <w:t>liye</w:t>
       </w:r>
       <w:proofErr w:type="spellEnd"/>
       <w:r>
@@ -10479,6 +9889,1689 @@
       <w:proofErr w:type="spellEnd"/>
       <w:r>
         <w:t xml:space="preserve"> </w:t>
+      </w:r>
+    </w:p>
+    <w:p>
+      <w:pPr>
+        <w:ind w:left="360"/>
+        <w:rPr>
+          <w:b/>
+          <w:bCs/>
+          <w:sz w:val="52"/>
+          <w:szCs w:val="52"/>
+          <w:u w:val="single"/>
+        </w:rPr>
+      </w:pPr>
+      <w:r>
+        <w:rPr>
+          <w:b/>
+          <w:bCs/>
+          <w:sz w:val="52"/>
+          <w:szCs w:val="52"/>
+          <w:highlight w:val="green"/>
+          <w:u w:val="single"/>
+        </w:rPr>
+        <w:t>BALANCE SHEET:</w:t>
+      </w:r>
+    </w:p>
+    <w:p>
+      <w:pPr>
+        <w:ind w:left="360"/>
+        <w:rPr>
+          <w:lang w:val="en-PK"/>
+        </w:rPr>
+      </w:pPr>
+      <w:r>
+        <w:t xml:space="preserve">When we create a </w:t>
+      </w:r>
+      <w:r>
+        <w:t xml:space="preserve">matrix in power BI, if in columns portion, we have years (2018, 2019, 2020) then values m </w:t>
+      </w:r>
+      <w:proofErr w:type="spellStart"/>
+      <w:r>
+        <w:t>agr</w:t>
+      </w:r>
+      <w:proofErr w:type="spellEnd"/>
+      <w:r>
+        <w:t xml:space="preserve"> hm amount </w:t>
+      </w:r>
+      <w:proofErr w:type="spellStart"/>
+      <w:r>
+        <w:t>daalty</w:t>
+      </w:r>
+      <w:proofErr w:type="spellEnd"/>
+      <w:r>
+        <w:t xml:space="preserve"> </w:t>
+      </w:r>
+      <w:proofErr w:type="spellStart"/>
+      <w:r>
+        <w:t>hn</w:t>
+      </w:r>
+      <w:proofErr w:type="spellEnd"/>
+      <w:r>
+        <w:t xml:space="preserve"> to automatically filter apply </w:t>
+      </w:r>
+      <w:proofErr w:type="spellStart"/>
+      <w:r>
+        <w:t>hota</w:t>
+      </w:r>
+      <w:proofErr w:type="spellEnd"/>
+      <w:r>
+        <w:t xml:space="preserve"> h or </w:t>
+      </w:r>
+      <w:proofErr w:type="spellStart"/>
+      <w:r>
+        <w:t>hr</w:t>
+      </w:r>
+      <w:proofErr w:type="spellEnd"/>
+      <w:r>
+        <w:t xml:space="preserve"> year ki respective amount </w:t>
+      </w:r>
+      <w:proofErr w:type="spellStart"/>
+      <w:r>
+        <w:t>ati</w:t>
+      </w:r>
+      <w:proofErr w:type="spellEnd"/>
+      <w:r>
+        <w:t xml:space="preserve"> h, </w:t>
+      </w:r>
+      <w:proofErr w:type="spellStart"/>
+      <w:r>
+        <w:t>matlab</w:t>
+      </w:r>
+      <w:proofErr w:type="spellEnd"/>
+      <w:r>
+        <w:t xml:space="preserve"> 2018 m 1</w:t>
+      </w:r>
+      <w:r>
+        <w:rPr>
+          <w:vertAlign w:val="superscript"/>
+        </w:rPr>
+        <w:t>st</w:t>
+      </w:r>
+      <w:r>
+        <w:t xml:space="preserve"> </w:t>
+      </w:r>
+      <w:proofErr w:type="spellStart"/>
+      <w:r>
+        <w:t>jan</w:t>
+      </w:r>
+      <w:proofErr w:type="spellEnd"/>
+      <w:r>
+        <w:t xml:space="preserve"> 2018 to 31 dec 2018 </w:t>
+      </w:r>
+      <w:proofErr w:type="spellStart"/>
+      <w:r>
+        <w:t>tk</w:t>
+      </w:r>
+      <w:proofErr w:type="spellEnd"/>
+      <w:r>
+        <w:t xml:space="preserve"> ki amount </w:t>
+      </w:r>
+      <w:proofErr w:type="spellStart"/>
+      <w:r>
+        <w:t>ati</w:t>
+      </w:r>
+      <w:proofErr w:type="spellEnd"/>
+      <w:r>
+        <w:t xml:space="preserve"> h , similarly 2019 m </w:t>
+      </w:r>
+      <w:proofErr w:type="spellStart"/>
+      <w:r>
+        <w:t>apni</w:t>
+      </w:r>
+      <w:proofErr w:type="spellEnd"/>
+      <w:r>
+        <w:t xml:space="preserve"> and 2020 m </w:t>
+      </w:r>
+      <w:proofErr w:type="spellStart"/>
+      <w:r>
+        <w:t>apni</w:t>
+      </w:r>
+      <w:proofErr w:type="spellEnd"/>
+      <w:r>
+        <w:t xml:space="preserve">,, but we want </w:t>
+      </w:r>
+      <w:r>
+        <w:t xml:space="preserve">k </w:t>
+      </w:r>
+      <w:proofErr w:type="spellStart"/>
+      <w:r>
+        <w:t>hr</w:t>
+      </w:r>
+      <w:proofErr w:type="spellEnd"/>
+      <w:r>
+        <w:t xml:space="preserve"> year m start s le </w:t>
+      </w:r>
+      <w:proofErr w:type="spellStart"/>
+      <w:r>
+        <w:t>kr</w:t>
+      </w:r>
+      <w:proofErr w:type="spellEnd"/>
+      <w:r>
+        <w:t xml:space="preserve"> us respective year </w:t>
+      </w:r>
+      <w:proofErr w:type="spellStart"/>
+      <w:r>
+        <w:t>tk</w:t>
+      </w:r>
+      <w:proofErr w:type="spellEnd"/>
+      <w:r>
+        <w:t xml:space="preserve"> ki amount show ho </w:t>
+      </w:r>
+      <w:proofErr w:type="spellStart"/>
+      <w:r>
+        <w:t>e.g</w:t>
+      </w:r>
+      <w:proofErr w:type="spellEnd"/>
+      <w:r>
+        <w:t>: 2019 m 1</w:t>
+      </w:r>
+      <w:r>
+        <w:rPr>
+          <w:vertAlign w:val="superscript"/>
+        </w:rPr>
+        <w:t>st</w:t>
+      </w:r>
+      <w:r>
+        <w:t xml:space="preserve"> </w:t>
+      </w:r>
+      <w:proofErr w:type="spellStart"/>
+      <w:r>
+        <w:t>jan</w:t>
+      </w:r>
+      <w:proofErr w:type="spellEnd"/>
+      <w:r>
+        <w:t xml:space="preserve"> 2018 s le </w:t>
+      </w:r>
+      <w:proofErr w:type="spellStart"/>
+      <w:r>
+        <w:t>kr</w:t>
+      </w:r>
+      <w:proofErr w:type="spellEnd"/>
+      <w:r>
+        <w:t xml:space="preserve"> 31 dec 2019 </w:t>
+      </w:r>
+      <w:proofErr w:type="spellStart"/>
+      <w:r>
+        <w:t>tk</w:t>
+      </w:r>
+      <w:proofErr w:type="spellEnd"/>
+      <w:r>
+        <w:t xml:space="preserve"> ki amount, 2020 m 1</w:t>
+      </w:r>
+      <w:r>
+        <w:rPr>
+          <w:vertAlign w:val="superscript"/>
+        </w:rPr>
+        <w:t>st</w:t>
+      </w:r>
+      <w:r>
+        <w:t xml:space="preserve"> </w:t>
+      </w:r>
+      <w:proofErr w:type="spellStart"/>
+      <w:r>
+        <w:t>jan</w:t>
+      </w:r>
+      <w:proofErr w:type="spellEnd"/>
+      <w:r>
+        <w:t xml:space="preserve"> 2018 s le </w:t>
+      </w:r>
+      <w:proofErr w:type="spellStart"/>
+      <w:r>
+        <w:t>kr</w:t>
+      </w:r>
+      <w:proofErr w:type="spellEnd"/>
+      <w:r>
+        <w:t xml:space="preserve"> 31 dec 2020 </w:t>
+      </w:r>
+      <w:proofErr w:type="spellStart"/>
+      <w:r>
+        <w:t>tk</w:t>
+      </w:r>
+      <w:proofErr w:type="spellEnd"/>
+      <w:r>
+        <w:t xml:space="preserve"> ki amount show ho,, </w:t>
+      </w:r>
+      <w:proofErr w:type="spellStart"/>
+      <w:r>
+        <w:t>yani</w:t>
+      </w:r>
+      <w:proofErr w:type="spellEnd"/>
+      <w:r>
+        <w:t xml:space="preserve"> </w:t>
+      </w:r>
+      <w:proofErr w:type="spellStart"/>
+      <w:r>
+        <w:t>hmy</w:t>
+      </w:r>
+      <w:proofErr w:type="spellEnd"/>
+      <w:r>
+        <w:t xml:space="preserve"> matrix k default </w:t>
+      </w:r>
+      <w:proofErr w:type="spellStart"/>
+      <w:r>
+        <w:t>behaviour</w:t>
+      </w:r>
+      <w:proofErr w:type="spellEnd"/>
+      <w:r>
+        <w:t xml:space="preserve"> ko override </w:t>
+      </w:r>
+      <w:proofErr w:type="spellStart"/>
+      <w:r>
+        <w:t>krna</w:t>
+      </w:r>
+      <w:proofErr w:type="spellEnd"/>
+      <w:r>
+        <w:t xml:space="preserve"> h, we will do it using following measure: </w:t>
+      </w:r>
+      <w:proofErr w:type="spellStart"/>
+      <w:r>
+        <w:rPr>
+          <w:highlight w:val="cyan"/>
+          <w:lang w:val="en-PK"/>
+        </w:rPr>
+        <w:t>min_date_across</w:t>
+      </w:r>
+      <w:proofErr w:type="spellEnd"/>
+      <w:r>
+        <w:rPr>
+          <w:highlight w:val="cyan"/>
+          <w:lang w:val="en-PK"/>
+        </w:rPr>
+        <w:t xml:space="preserve"> = CALCULATE([</w:t>
+      </w:r>
+      <w:proofErr w:type="spellStart"/>
+      <w:r>
+        <w:rPr>
+          <w:highlight w:val="cyan"/>
+          <w:lang w:val="en-PK"/>
+        </w:rPr>
+        <w:t>min_date</w:t>
+      </w:r>
+      <w:proofErr w:type="spellEnd"/>
+      <w:r>
+        <w:rPr>
+          <w:highlight w:val="cyan"/>
+          <w:lang w:val="en-PK"/>
+        </w:rPr>
+        <w:t>], FILTER((ALL('Calendar'[Date].[Date])), 'Calendar'[Date].[Date]))</w:t>
+      </w:r>
+    </w:p>
+    <w:p>
+      <w:pPr>
+        <w:ind w:left="360"/>
+      </w:pPr>
+      <w:r>
+        <w:t xml:space="preserve">ALL() will remove </w:t>
+      </w:r>
+      <w:r>
+        <w:t>a</w:t>
+      </w:r>
+      <w:r>
+        <w:t xml:space="preserve">ny filter that will apply automatically by power BI into any matrix, visual </w:t>
+      </w:r>
+      <w:proofErr w:type="spellStart"/>
+      <w:r>
+        <w:t>etc</w:t>
+      </w:r>
+      <w:proofErr w:type="spellEnd"/>
+      <w:r>
+        <w:t xml:space="preserve"> </w:t>
+      </w:r>
+      <w:proofErr w:type="spellStart"/>
+      <w:r>
+        <w:t>etc</w:t>
+      </w:r>
+      <w:proofErr w:type="spellEnd"/>
+    </w:p>
+    <w:p>
+      <w:pPr>
+        <w:ind w:left="360"/>
+        <w:rPr>
+          <w:lang w:val="en-PK"/>
+        </w:rPr>
+      </w:pPr>
+      <w:r>
+        <w:t xml:space="preserve">Filter() function phly ek virtual table </w:t>
+      </w:r>
+      <w:proofErr w:type="spellStart"/>
+      <w:r>
+        <w:t>bnay</w:t>
+      </w:r>
+      <w:proofErr w:type="spellEnd"/>
+      <w:r>
+        <w:t xml:space="preserve"> ga and us table m s minimum date ko get kia jay ga,, </w:t>
+      </w:r>
+      <w:proofErr w:type="spellStart"/>
+      <w:r>
+        <w:t>agr</w:t>
+      </w:r>
+      <w:proofErr w:type="spellEnd"/>
+      <w:r>
+        <w:t xml:space="preserve"> hm y formula use </w:t>
+      </w:r>
+      <w:proofErr w:type="spellStart"/>
+      <w:r>
+        <w:t>krty</w:t>
+      </w:r>
+      <w:proofErr w:type="spellEnd"/>
+      <w:r>
+        <w:t xml:space="preserve"> </w:t>
+      </w:r>
+      <w:proofErr w:type="spellStart"/>
+      <w:r>
+        <w:t>hn</w:t>
+      </w:r>
+      <w:proofErr w:type="spellEnd"/>
+      <w:r>
+        <w:t xml:space="preserve">: </w:t>
+      </w:r>
+      <w:proofErr w:type="spellStart"/>
+      <w:r>
+        <w:rPr>
+          <w:lang w:val="en-PK"/>
+        </w:rPr>
+        <w:t>min_date_across</w:t>
+      </w:r>
+      <w:proofErr w:type="spellEnd"/>
+      <w:r>
+        <w:rPr>
+          <w:lang w:val="en-PK"/>
+        </w:rPr>
+        <w:t xml:space="preserve"> = CALCULATE([</w:t>
+      </w:r>
+      <w:proofErr w:type="spellStart"/>
+      <w:r>
+        <w:rPr>
+          <w:lang w:val="en-PK"/>
+        </w:rPr>
+        <w:t>min_date</w:t>
+      </w:r>
+      <w:proofErr w:type="spellEnd"/>
+      <w:r>
+        <w:rPr>
+          <w:lang w:val="en-PK"/>
+        </w:rPr>
+        <w:t>], ALL('Calendar'[Date].[Date]))</w:t>
+      </w:r>
+      <w:r>
+        <w:rPr>
+          <w:lang w:val="en-PK"/>
+        </w:rPr>
+        <w:t xml:space="preserve">,, to </w:t>
+      </w:r>
+      <w:proofErr w:type="spellStart"/>
+      <w:r>
+        <w:rPr>
+          <w:lang w:val="en-PK"/>
+        </w:rPr>
+        <w:t>yhan</w:t>
+      </w:r>
+      <w:proofErr w:type="spellEnd"/>
+      <w:r>
+        <w:rPr>
+          <w:lang w:val="en-PK"/>
+        </w:rPr>
+        <w:t xml:space="preserve"> pr ALL() </w:t>
+      </w:r>
+      <w:proofErr w:type="spellStart"/>
+      <w:r>
+        <w:rPr>
+          <w:lang w:val="en-PK"/>
+        </w:rPr>
+        <w:t>saary</w:t>
+      </w:r>
+      <w:proofErr w:type="spellEnd"/>
+      <w:r>
+        <w:rPr>
+          <w:lang w:val="en-PK"/>
+        </w:rPr>
+        <w:t xml:space="preserve"> k </w:t>
+      </w:r>
+      <w:proofErr w:type="spellStart"/>
+      <w:r>
+        <w:rPr>
+          <w:lang w:val="en-PK"/>
+        </w:rPr>
+        <w:t>saary</w:t>
+      </w:r>
+      <w:proofErr w:type="spellEnd"/>
+      <w:r>
+        <w:rPr>
+          <w:lang w:val="en-PK"/>
+        </w:rPr>
+        <w:t xml:space="preserve"> filters hi khatam </w:t>
+      </w:r>
+      <w:proofErr w:type="spellStart"/>
+      <w:r>
+        <w:rPr>
+          <w:lang w:val="en-PK"/>
+        </w:rPr>
+        <w:t>kr</w:t>
+      </w:r>
+      <w:proofErr w:type="spellEnd"/>
+      <w:r>
+        <w:rPr>
+          <w:lang w:val="en-PK"/>
+        </w:rPr>
+        <w:t xml:space="preserve"> de ga, </w:t>
+      </w:r>
+      <w:proofErr w:type="spellStart"/>
+      <w:r>
+        <w:rPr>
+          <w:lang w:val="en-PK"/>
+        </w:rPr>
+        <w:t>yani</w:t>
+      </w:r>
+      <w:proofErr w:type="spellEnd"/>
+      <w:r>
+        <w:rPr>
+          <w:lang w:val="en-PK"/>
+        </w:rPr>
+        <w:t xml:space="preserve"> matrix k hr value m </w:t>
+      </w:r>
+      <w:proofErr w:type="spellStart"/>
+      <w:r>
+        <w:rPr>
+          <w:lang w:val="en-PK"/>
+        </w:rPr>
+        <w:t>hmy</w:t>
+      </w:r>
+      <w:proofErr w:type="spellEnd"/>
+      <w:r>
+        <w:rPr>
+          <w:lang w:val="en-PK"/>
+        </w:rPr>
+        <w:t xml:space="preserve"> date 1st </w:t>
+      </w:r>
+      <w:proofErr w:type="spellStart"/>
+      <w:r>
+        <w:rPr>
+          <w:lang w:val="en-PK"/>
+        </w:rPr>
+        <w:t>jan</w:t>
+      </w:r>
+      <w:proofErr w:type="spellEnd"/>
+      <w:r>
+        <w:rPr>
+          <w:lang w:val="en-PK"/>
+        </w:rPr>
+        <w:t xml:space="preserve"> 2018 s le </w:t>
+      </w:r>
+      <w:proofErr w:type="spellStart"/>
+      <w:r>
+        <w:rPr>
+          <w:lang w:val="en-PK"/>
+        </w:rPr>
+        <w:t>kr</w:t>
+      </w:r>
+      <w:proofErr w:type="spellEnd"/>
+      <w:r>
+        <w:rPr>
+          <w:lang w:val="en-PK"/>
+        </w:rPr>
+        <w:t xml:space="preserve"> 31 dec 2020 </w:t>
+      </w:r>
+      <w:proofErr w:type="spellStart"/>
+      <w:r>
+        <w:rPr>
+          <w:lang w:val="en-PK"/>
+        </w:rPr>
+        <w:t>tk</w:t>
+      </w:r>
+      <w:proofErr w:type="spellEnd"/>
+      <w:r>
+        <w:rPr>
+          <w:lang w:val="en-PK"/>
+        </w:rPr>
+        <w:t xml:space="preserve"> ka data de </w:t>
+      </w:r>
+      <w:proofErr w:type="spellStart"/>
+      <w:r>
+        <w:rPr>
+          <w:lang w:val="en-PK"/>
+        </w:rPr>
+        <w:t>gi</w:t>
+      </w:r>
+      <w:proofErr w:type="spellEnd"/>
+      <w:r>
+        <w:rPr>
+          <w:lang w:val="en-PK"/>
+        </w:rPr>
+        <w:t xml:space="preserve">, but </w:t>
+      </w:r>
+      <w:proofErr w:type="spellStart"/>
+      <w:r>
+        <w:rPr>
+          <w:lang w:val="en-PK"/>
+        </w:rPr>
+        <w:t>hmy</w:t>
+      </w:r>
+      <w:proofErr w:type="spellEnd"/>
+      <w:r>
+        <w:rPr>
+          <w:lang w:val="en-PK"/>
+        </w:rPr>
+        <w:t xml:space="preserve"> hr value 1st </w:t>
+      </w:r>
+      <w:proofErr w:type="spellStart"/>
+      <w:r>
+        <w:rPr>
+          <w:lang w:val="en-PK"/>
+        </w:rPr>
+        <w:t>jan</w:t>
+      </w:r>
+      <w:proofErr w:type="spellEnd"/>
+      <w:r>
+        <w:rPr>
+          <w:lang w:val="en-PK"/>
+        </w:rPr>
+        <w:t xml:space="preserve"> 2018 s le </w:t>
+      </w:r>
+      <w:proofErr w:type="spellStart"/>
+      <w:r>
+        <w:rPr>
+          <w:lang w:val="en-PK"/>
+        </w:rPr>
+        <w:t>kr</w:t>
+      </w:r>
+      <w:proofErr w:type="spellEnd"/>
+      <w:r>
+        <w:rPr>
+          <w:lang w:val="en-PK"/>
+        </w:rPr>
+        <w:t xml:space="preserve"> us </w:t>
+      </w:r>
+      <w:proofErr w:type="spellStart"/>
+      <w:r>
+        <w:rPr>
+          <w:lang w:val="en-PK"/>
+        </w:rPr>
+        <w:t>respenctive</w:t>
+      </w:r>
+      <w:proofErr w:type="spellEnd"/>
+      <w:r>
+        <w:rPr>
+          <w:lang w:val="en-PK"/>
+        </w:rPr>
+        <w:t xml:space="preserve"> year </w:t>
+      </w:r>
+      <w:proofErr w:type="spellStart"/>
+      <w:r>
+        <w:rPr>
+          <w:lang w:val="en-PK"/>
+        </w:rPr>
+        <w:t>tk</w:t>
+      </w:r>
+      <w:proofErr w:type="spellEnd"/>
+      <w:r>
+        <w:rPr>
+          <w:lang w:val="en-PK"/>
+        </w:rPr>
+        <w:t xml:space="preserve"> show </w:t>
+      </w:r>
+      <w:proofErr w:type="spellStart"/>
+      <w:r>
+        <w:rPr>
+          <w:lang w:val="en-PK"/>
+        </w:rPr>
+        <w:t>krni</w:t>
+      </w:r>
+      <w:proofErr w:type="spellEnd"/>
+      <w:r>
+        <w:rPr>
+          <w:lang w:val="en-PK"/>
+        </w:rPr>
+        <w:t xml:space="preserve"> h, is </w:t>
+      </w:r>
+      <w:proofErr w:type="spellStart"/>
+      <w:r>
+        <w:rPr>
+          <w:lang w:val="en-PK"/>
+        </w:rPr>
+        <w:t>liye</w:t>
+      </w:r>
+      <w:proofErr w:type="spellEnd"/>
+      <w:r>
+        <w:rPr>
+          <w:lang w:val="en-PK"/>
+        </w:rPr>
+        <w:t xml:space="preserve"> filter </w:t>
+      </w:r>
+      <w:proofErr w:type="spellStart"/>
+      <w:r>
+        <w:rPr>
+          <w:lang w:val="en-PK"/>
+        </w:rPr>
+        <w:t>lgana</w:t>
+      </w:r>
+      <w:proofErr w:type="spellEnd"/>
+      <w:r>
+        <w:rPr>
+          <w:lang w:val="en-PK"/>
+        </w:rPr>
+        <w:t xml:space="preserve"> </w:t>
+      </w:r>
+      <w:proofErr w:type="spellStart"/>
+      <w:r>
+        <w:rPr>
+          <w:lang w:val="en-PK"/>
+        </w:rPr>
+        <w:t>zruri</w:t>
+      </w:r>
+      <w:proofErr w:type="spellEnd"/>
+      <w:r>
+        <w:rPr>
+          <w:lang w:val="en-PK"/>
+        </w:rPr>
+        <w:t xml:space="preserve"> h </w:t>
+      </w:r>
+      <w:r>
+        <w:rPr>
+          <w:lang w:val="en-PK"/>
+        </w:rPr>
+        <w:t xml:space="preserve">,,, and we have to use filter when we have to get </w:t>
+      </w:r>
+      <w:proofErr w:type="spellStart"/>
+      <w:r>
+        <w:rPr>
+          <w:lang w:val="en-PK"/>
+        </w:rPr>
+        <w:t>commulative</w:t>
+      </w:r>
+      <w:proofErr w:type="spellEnd"/>
+      <w:r>
+        <w:rPr>
+          <w:lang w:val="en-PK"/>
+        </w:rPr>
+        <w:t xml:space="preserve"> logic, etc </w:t>
+      </w:r>
+    </w:p>
+    <w:p>
+      <w:pPr>
+        <w:ind w:left="360"/>
+        <w:rPr>
+          <w:lang w:val="en-PK"/>
+        </w:rPr>
+      </w:pPr>
+    </w:p>
+    <w:p>
+      <w:pPr>
+        <w:ind w:left="360"/>
+        <w:jc w:val="center"/>
+        <w:rPr>
+          <w:b/>
+          <w:bCs/>
+        </w:rPr>
+      </w:pPr>
+      <w:r>
+        <w:rPr>
+          <w:b/>
+          <w:bCs/>
+        </w:rPr>
+        <w:t>A balance sheet is like a financial snapshot of a company at a specific point in time. It tells you what the company owns, owes, and the owners’ stake in the business.</w:t>
+      </w:r>
+    </w:p>
+    <w:p>
+      <w:pPr>
+        <w:ind w:left="360"/>
+        <w:rPr>
+          <w:lang w:val="en-PK"/>
+        </w:rPr>
+      </w:pPr>
+      <w:r>
+        <w:rPr>
+          <w:lang w:val="en-PK"/>
+        </w:rPr>
+        <w:t>A balance sheet is divided into 3 main parts: Liabilities, owner’s equity and assets.</w:t>
+      </w:r>
+    </w:p>
+    <w:p>
+      <w:pPr>
+        <w:ind w:left="360"/>
+        <w:rPr>
+          <w:lang w:val="en-PK"/>
+        </w:rPr>
+      </w:pPr>
+      <w:r>
+        <w:rPr>
+          <w:lang w:val="en-PK"/>
+        </w:rPr>
+        <w:lastRenderedPageBreak/>
+        <w:t>Assets = Liabilities + equity</w:t>
+      </w:r>
+      <w:r>
+        <w:rPr>
+          <w:lang w:val="en-PK"/>
+        </w:rPr>
+        <w:t xml:space="preserve">   (always assets ki amount equal </w:t>
+      </w:r>
+      <w:proofErr w:type="spellStart"/>
+      <w:r>
+        <w:rPr>
+          <w:lang w:val="en-PK"/>
+        </w:rPr>
+        <w:t>ho</w:t>
+      </w:r>
+      <w:proofErr w:type="spellEnd"/>
+      <w:r>
+        <w:rPr>
+          <w:lang w:val="en-PK"/>
+        </w:rPr>
+        <w:t xml:space="preserve"> </w:t>
+      </w:r>
+      <w:proofErr w:type="spellStart"/>
+      <w:r>
+        <w:rPr>
+          <w:lang w:val="en-PK"/>
+        </w:rPr>
+        <w:t>gi</w:t>
+      </w:r>
+      <w:proofErr w:type="spellEnd"/>
+      <w:r>
+        <w:rPr>
+          <w:lang w:val="en-PK"/>
+        </w:rPr>
+        <w:t xml:space="preserve"> us amount k jo hm liabilities an</w:t>
+      </w:r>
+      <w:r>
+        <w:rPr>
+          <w:lang w:val="en-PK"/>
+        </w:rPr>
+        <w:t xml:space="preserve">d </w:t>
+      </w:r>
+      <w:r>
+        <w:rPr>
+          <w:lang w:val="en-PK"/>
+        </w:rPr>
+        <w:t xml:space="preserve">owner’s equity ko + </w:t>
+      </w:r>
+      <w:proofErr w:type="spellStart"/>
+      <w:r>
+        <w:rPr>
+          <w:lang w:val="en-PK"/>
+        </w:rPr>
+        <w:t>kr</w:t>
+      </w:r>
+      <w:proofErr w:type="spellEnd"/>
+      <w:r>
+        <w:rPr>
+          <w:lang w:val="en-PK"/>
+        </w:rPr>
+        <w:t xml:space="preserve"> k get </w:t>
+      </w:r>
+      <w:proofErr w:type="spellStart"/>
+      <w:r>
+        <w:rPr>
+          <w:lang w:val="en-PK"/>
+        </w:rPr>
+        <w:t>kryn</w:t>
+      </w:r>
+      <w:proofErr w:type="spellEnd"/>
+      <w:r>
+        <w:rPr>
+          <w:lang w:val="en-PK"/>
+        </w:rPr>
+        <w:t xml:space="preserve"> </w:t>
+      </w:r>
+      <w:proofErr w:type="spellStart"/>
+      <w:r>
+        <w:rPr>
+          <w:lang w:val="en-PK"/>
+        </w:rPr>
+        <w:t>gy</w:t>
+      </w:r>
+      <w:proofErr w:type="spellEnd"/>
+      <w:r>
+        <w:rPr>
+          <w:lang w:val="en-PK"/>
+        </w:rPr>
+        <w:t xml:space="preserve">,, pie chart m </w:t>
+      </w:r>
+      <w:proofErr w:type="spellStart"/>
+      <w:r>
+        <w:rPr>
+          <w:lang w:val="en-PK"/>
+        </w:rPr>
+        <w:t>bhi</w:t>
+      </w:r>
+      <w:proofErr w:type="spellEnd"/>
+      <w:r>
+        <w:rPr>
+          <w:lang w:val="en-PK"/>
+        </w:rPr>
+        <w:t xml:space="preserve"> in </w:t>
+      </w:r>
+      <w:proofErr w:type="spellStart"/>
+      <w:r>
+        <w:rPr>
+          <w:lang w:val="en-PK"/>
+        </w:rPr>
+        <w:t>dono</w:t>
+      </w:r>
+      <w:proofErr w:type="spellEnd"/>
+      <w:r>
+        <w:rPr>
+          <w:lang w:val="en-PK"/>
+        </w:rPr>
+        <w:t xml:space="preserve"> ko </w:t>
+      </w:r>
+      <w:proofErr w:type="spellStart"/>
+      <w:r>
+        <w:rPr>
+          <w:lang w:val="en-PK"/>
+        </w:rPr>
+        <w:t>rkho</w:t>
+      </w:r>
+      <w:proofErr w:type="spellEnd"/>
+      <w:r>
+        <w:rPr>
+          <w:lang w:val="en-PK"/>
+        </w:rPr>
+        <w:t xml:space="preserve"> to equal </w:t>
+      </w:r>
+      <w:proofErr w:type="spellStart"/>
+      <w:r>
+        <w:rPr>
+          <w:lang w:val="en-PK"/>
+        </w:rPr>
+        <w:t>equal</w:t>
+      </w:r>
+      <w:proofErr w:type="spellEnd"/>
+      <w:r>
+        <w:rPr>
+          <w:lang w:val="en-PK"/>
+        </w:rPr>
+        <w:t xml:space="preserve"> ay ga </w:t>
+      </w:r>
+      <w:r>
+        <w:rPr>
+          <w:lang w:val="en-PK"/>
+        </w:rPr>
+        <w:t>)</w:t>
+      </w:r>
+    </w:p>
+    <w:p>
+      <w:pPr>
+        <w:ind w:left="360"/>
+        <w:rPr>
+          <w:lang w:val="en-PK"/>
+        </w:rPr>
+      </w:pPr>
+      <w:r>
+        <w:rPr>
+          <w:lang w:val="en-PK"/>
+        </w:rPr>
+        <w:t>Balance sheet tells you:</w:t>
+      </w:r>
+    </w:p>
+    <w:p>
+      <w:pPr>
+        <w:ind w:left="360"/>
+        <w:rPr>
+          <w:lang w:val="en-PK"/>
+        </w:rPr>
+      </w:pPr>
+      <w:r>
+        <w:rPr>
+          <w:lang w:val="en-PK"/>
+        </w:rPr>
+        <w:t xml:space="preserve">  </w:t>
+      </w:r>
+      <w:r>
+        <w:rPr>
+          <w:b/>
+          <w:bCs/>
+          <w:lang w:val="en-PK"/>
+        </w:rPr>
+        <w:t>Financial position</w:t>
+      </w:r>
+      <w:r>
+        <w:rPr>
+          <w:lang w:val="en-PK"/>
+        </w:rPr>
+        <w:t xml:space="preserve"> – How strong the company is in terms of assets and debts.</w:t>
+      </w:r>
+    </w:p>
+    <w:p>
+      <w:pPr>
+        <w:ind w:left="360"/>
+        <w:rPr>
+          <w:lang w:val="en-PK"/>
+        </w:rPr>
+      </w:pPr>
+      <w:r>
+        <w:rPr>
+          <w:lang w:val="en-PK"/>
+        </w:rPr>
+        <w:t xml:space="preserve">  </w:t>
+      </w:r>
+      <w:r>
+        <w:rPr>
+          <w:b/>
+          <w:bCs/>
+          <w:lang w:val="en-PK"/>
+        </w:rPr>
+        <w:t>Liquidity</w:t>
+      </w:r>
+      <w:r>
+        <w:rPr>
+          <w:lang w:val="en-PK"/>
+        </w:rPr>
+        <w:t xml:space="preserve"> – Can the company pay short-term obligations? (Check current assets vs current liabilities).</w:t>
+      </w:r>
+    </w:p>
+    <w:p>
+      <w:pPr>
+        <w:ind w:left="360"/>
+        <w:rPr>
+          <w:lang w:val="en-PK"/>
+        </w:rPr>
+      </w:pPr>
+      <w:r>
+        <w:rPr>
+          <w:lang w:val="en-PK"/>
+        </w:rPr>
+        <w:t xml:space="preserve">  </w:t>
+      </w:r>
+      <w:r>
+        <w:rPr>
+          <w:b/>
+          <w:bCs/>
+          <w:lang w:val="en-PK"/>
+        </w:rPr>
+        <w:t>Solvency</w:t>
+      </w:r>
+      <w:r>
+        <w:rPr>
+          <w:lang w:val="en-PK"/>
+        </w:rPr>
+        <w:t xml:space="preserve"> – Can the company meet long-term debts?</w:t>
+      </w:r>
+    </w:p>
+    <w:p>
+      <w:pPr>
+        <w:ind w:left="360"/>
+        <w:rPr>
+          <w:lang w:val="en-PK"/>
+        </w:rPr>
+      </w:pPr>
+      <w:r>
+        <w:rPr>
+          <w:lang w:val="en-PK"/>
+        </w:rPr>
+        <w:t xml:space="preserve">  </w:t>
+      </w:r>
+      <w:r>
+        <w:rPr>
+          <w:b/>
+          <w:bCs/>
+          <w:lang w:val="en-PK"/>
+        </w:rPr>
+        <w:t>Owner’s value</w:t>
+      </w:r>
+      <w:r>
+        <w:rPr>
+          <w:lang w:val="en-PK"/>
+        </w:rPr>
+        <w:t xml:space="preserve"> – How much of the business belongs to the owners vs creditors.</w:t>
+      </w:r>
+    </w:p>
+    <w:p>
+      <w:pPr>
+        <w:ind w:left="360"/>
+        <w:rPr>
+          <w:lang w:val="en-PK"/>
+        </w:rPr>
+      </w:pPr>
+      <w:r>
+        <w:rPr>
+          <w:lang w:val="en-PK"/>
+        </w:rPr>
+        <w:t xml:space="preserve">  </w:t>
+      </w:r>
+      <w:r>
+        <w:rPr>
+          <w:b/>
+          <w:bCs/>
+          <w:lang w:val="en-PK"/>
+        </w:rPr>
+        <w:t>Trends</w:t>
+      </w:r>
+      <w:r>
+        <w:rPr>
+          <w:lang w:val="en-PK"/>
+        </w:rPr>
+        <w:t xml:space="preserve"> – By comparing balance sheets across years, you see growth, asset increases, or rising debts.</w:t>
+      </w:r>
+    </w:p>
+    <w:p>
+      <w:pPr>
+        <w:ind w:left="360"/>
+        <w:rPr>
+          <w:lang w:val="en-PK"/>
+        </w:rPr>
+      </w:pPr>
+      <w:r>
+        <w:rPr>
+          <w:lang w:val="en-PK"/>
+        </w:rPr>
+        <w:t xml:space="preserve">In pie chart, the value that we place in the legend, the detail’s value provide more details to the value of the legend, </w:t>
+      </w:r>
+      <w:proofErr w:type="spellStart"/>
+      <w:r>
+        <w:rPr>
+          <w:lang w:val="en-PK"/>
+        </w:rPr>
+        <w:t>e.g</w:t>
+      </w:r>
+      <w:proofErr w:type="spellEnd"/>
+      <w:r>
+        <w:rPr>
+          <w:lang w:val="en-PK"/>
+        </w:rPr>
+        <w:t xml:space="preserve">: in </w:t>
+      </w:r>
+      <w:proofErr w:type="spellStart"/>
+      <w:r>
+        <w:rPr>
+          <w:lang w:val="en-PK"/>
+        </w:rPr>
+        <w:t>asaan</w:t>
+      </w:r>
+      <w:proofErr w:type="spellEnd"/>
+      <w:r>
+        <w:rPr>
+          <w:lang w:val="en-PK"/>
+        </w:rPr>
+        <w:t xml:space="preserve"> bhasha: </w:t>
+      </w:r>
+      <w:r>
+        <w:rPr>
+          <w:lang w:val="en-PK"/>
+        </w:rPr>
+        <w:t xml:space="preserve">legend m subclass (liability, assets, equity) </w:t>
+      </w:r>
+      <w:proofErr w:type="spellStart"/>
+      <w:r>
+        <w:rPr>
+          <w:lang w:val="en-PK"/>
+        </w:rPr>
+        <w:t>daal</w:t>
+      </w:r>
+      <w:proofErr w:type="spellEnd"/>
+      <w:r>
+        <w:rPr>
+          <w:lang w:val="en-PK"/>
+        </w:rPr>
+        <w:t xml:space="preserve"> </w:t>
+      </w:r>
+      <w:proofErr w:type="spellStart"/>
+      <w:r>
+        <w:rPr>
+          <w:lang w:val="en-PK"/>
+        </w:rPr>
+        <w:t>dia</w:t>
+      </w:r>
+      <w:proofErr w:type="spellEnd"/>
+      <w:r>
+        <w:rPr>
+          <w:lang w:val="en-PK"/>
+        </w:rPr>
+        <w:t xml:space="preserve">, and details m sublcass2 </w:t>
+      </w:r>
+      <w:proofErr w:type="spellStart"/>
+      <w:r>
+        <w:rPr>
+          <w:lang w:val="en-PK"/>
+        </w:rPr>
+        <w:t>daal</w:t>
+      </w:r>
+      <w:proofErr w:type="spellEnd"/>
+      <w:r>
+        <w:rPr>
+          <w:lang w:val="en-PK"/>
+        </w:rPr>
+        <w:t xml:space="preserve"> </w:t>
+      </w:r>
+      <w:proofErr w:type="spellStart"/>
+      <w:r>
+        <w:rPr>
+          <w:lang w:val="en-PK"/>
+        </w:rPr>
+        <w:t>dia</w:t>
+      </w:r>
+      <w:proofErr w:type="spellEnd"/>
+      <w:r>
+        <w:rPr>
+          <w:lang w:val="en-PK"/>
+        </w:rPr>
+        <w:t xml:space="preserve">, to liability m jo </w:t>
+      </w:r>
+      <w:proofErr w:type="spellStart"/>
+      <w:r>
+        <w:rPr>
+          <w:lang w:val="en-PK"/>
+        </w:rPr>
+        <w:t>jo</w:t>
+      </w:r>
+      <w:proofErr w:type="spellEnd"/>
+      <w:r>
+        <w:rPr>
+          <w:lang w:val="en-PK"/>
+        </w:rPr>
+        <w:t xml:space="preserve"> </w:t>
+      </w:r>
+      <w:proofErr w:type="spellStart"/>
+      <w:r>
+        <w:rPr>
+          <w:lang w:val="en-PK"/>
+        </w:rPr>
+        <w:t>maseed</w:t>
+      </w:r>
+      <w:proofErr w:type="spellEnd"/>
+      <w:r>
+        <w:rPr>
+          <w:lang w:val="en-PK"/>
+        </w:rPr>
+        <w:t xml:space="preserve"> </w:t>
+      </w:r>
+      <w:proofErr w:type="spellStart"/>
+      <w:r>
+        <w:rPr>
+          <w:lang w:val="en-PK"/>
+        </w:rPr>
+        <w:t>cheezy</w:t>
+      </w:r>
+      <w:proofErr w:type="spellEnd"/>
+      <w:r>
+        <w:rPr>
+          <w:lang w:val="en-PK"/>
+        </w:rPr>
+        <w:t xml:space="preserve"> </w:t>
+      </w:r>
+      <w:proofErr w:type="spellStart"/>
+      <w:r>
+        <w:rPr>
+          <w:lang w:val="en-PK"/>
+        </w:rPr>
+        <w:t>thi</w:t>
+      </w:r>
+      <w:proofErr w:type="spellEnd"/>
+      <w:r>
+        <w:rPr>
+          <w:lang w:val="en-PK"/>
+        </w:rPr>
+        <w:t xml:space="preserve"> jo k subclass2 m show </w:t>
+      </w:r>
+      <w:proofErr w:type="spellStart"/>
+      <w:r>
+        <w:rPr>
+          <w:lang w:val="en-PK"/>
+        </w:rPr>
+        <w:t>ho</w:t>
+      </w:r>
+      <w:proofErr w:type="spellEnd"/>
+      <w:r>
+        <w:rPr>
+          <w:lang w:val="en-PK"/>
+        </w:rPr>
+        <w:t xml:space="preserve"> </w:t>
+      </w:r>
+      <w:proofErr w:type="spellStart"/>
+      <w:r>
+        <w:rPr>
+          <w:lang w:val="en-PK"/>
+        </w:rPr>
+        <w:t>rhi</w:t>
+      </w:r>
+      <w:proofErr w:type="spellEnd"/>
+      <w:r>
+        <w:rPr>
+          <w:lang w:val="en-PK"/>
+        </w:rPr>
+        <w:t xml:space="preserve"> </w:t>
+      </w:r>
+      <w:proofErr w:type="spellStart"/>
+      <w:r>
+        <w:rPr>
+          <w:lang w:val="en-PK"/>
+        </w:rPr>
+        <w:t>thi</w:t>
+      </w:r>
+      <w:proofErr w:type="spellEnd"/>
+      <w:r>
+        <w:rPr>
+          <w:lang w:val="en-PK"/>
+        </w:rPr>
+        <w:t xml:space="preserve"> such as current liabilities and long term liabilities, y </w:t>
+      </w:r>
+      <w:proofErr w:type="spellStart"/>
+      <w:r>
+        <w:rPr>
+          <w:lang w:val="en-PK"/>
+        </w:rPr>
+        <w:t>dono</w:t>
+      </w:r>
+      <w:proofErr w:type="spellEnd"/>
+      <w:r>
+        <w:rPr>
+          <w:lang w:val="en-PK"/>
+        </w:rPr>
+        <w:t xml:space="preserve"> </w:t>
+      </w:r>
+      <w:proofErr w:type="spellStart"/>
+      <w:r>
+        <w:rPr>
+          <w:lang w:val="en-PK"/>
+        </w:rPr>
+        <w:t>isi</w:t>
+      </w:r>
+      <w:proofErr w:type="spellEnd"/>
+      <w:r>
+        <w:rPr>
+          <w:lang w:val="en-PK"/>
+        </w:rPr>
+        <w:t xml:space="preserve"> liability k </w:t>
+      </w:r>
+      <w:proofErr w:type="spellStart"/>
+      <w:r>
+        <w:rPr>
+          <w:lang w:val="en-PK"/>
+        </w:rPr>
+        <w:t>color</w:t>
+      </w:r>
+      <w:proofErr w:type="spellEnd"/>
+      <w:r>
+        <w:rPr>
+          <w:lang w:val="en-PK"/>
+        </w:rPr>
+        <w:t xml:space="preserve"> k </w:t>
+      </w:r>
+      <w:proofErr w:type="spellStart"/>
+      <w:r>
+        <w:rPr>
+          <w:lang w:val="en-PK"/>
+        </w:rPr>
+        <w:t>andr</w:t>
+      </w:r>
+      <w:proofErr w:type="spellEnd"/>
+      <w:r>
+        <w:rPr>
+          <w:lang w:val="en-PK"/>
+        </w:rPr>
+        <w:t xml:space="preserve"> </w:t>
+      </w:r>
+      <w:proofErr w:type="spellStart"/>
+      <w:r>
+        <w:rPr>
+          <w:lang w:val="en-PK"/>
+        </w:rPr>
+        <w:t>rehty</w:t>
+      </w:r>
+      <w:proofErr w:type="spellEnd"/>
+      <w:r>
+        <w:rPr>
+          <w:lang w:val="en-PK"/>
+        </w:rPr>
+        <w:t xml:space="preserve"> </w:t>
+      </w:r>
+      <w:proofErr w:type="spellStart"/>
+      <w:r>
+        <w:rPr>
+          <w:lang w:val="en-PK"/>
+        </w:rPr>
+        <w:t>huy</w:t>
+      </w:r>
+      <w:proofErr w:type="spellEnd"/>
+      <w:r>
+        <w:rPr>
+          <w:lang w:val="en-PK"/>
+        </w:rPr>
+        <w:t xml:space="preserve"> hi show </w:t>
+      </w:r>
+      <w:proofErr w:type="spellStart"/>
+      <w:r>
+        <w:rPr>
+          <w:lang w:val="en-PK"/>
+        </w:rPr>
+        <w:t>ho</w:t>
+      </w:r>
+      <w:proofErr w:type="spellEnd"/>
+      <w:r>
+        <w:rPr>
+          <w:lang w:val="en-PK"/>
+        </w:rPr>
+        <w:t xml:space="preserve"> </w:t>
+      </w:r>
+      <w:proofErr w:type="spellStart"/>
+      <w:r>
+        <w:rPr>
+          <w:lang w:val="en-PK"/>
+        </w:rPr>
+        <w:t>gi</w:t>
+      </w:r>
+      <w:proofErr w:type="spellEnd"/>
+      <w:r>
+        <w:rPr>
+          <w:lang w:val="en-PK"/>
+        </w:rPr>
+        <w:t xml:space="preserve"> beech m bs ek separate white line a jay </w:t>
+      </w:r>
+      <w:proofErr w:type="spellStart"/>
+      <w:r>
+        <w:rPr>
+          <w:lang w:val="en-PK"/>
+        </w:rPr>
+        <w:t>gi</w:t>
+      </w:r>
+      <w:proofErr w:type="spellEnd"/>
+      <w:r>
+        <w:rPr>
+          <w:lang w:val="en-PK"/>
+        </w:rPr>
+        <w:t xml:space="preserve">, </w:t>
+      </w:r>
+      <w:r>
+        <w:rPr>
+          <w:lang w:val="en-PK"/>
+        </w:rPr>
+        <w:t xml:space="preserve">same </w:t>
+      </w:r>
+      <w:proofErr w:type="spellStart"/>
+      <w:r>
+        <w:rPr>
+          <w:lang w:val="en-PK"/>
+        </w:rPr>
+        <w:t>isi</w:t>
+      </w:r>
+      <w:proofErr w:type="spellEnd"/>
+      <w:r>
+        <w:rPr>
+          <w:lang w:val="en-PK"/>
+        </w:rPr>
+        <w:t xml:space="preserve"> </w:t>
+      </w:r>
+      <w:proofErr w:type="spellStart"/>
+      <w:r>
+        <w:rPr>
+          <w:lang w:val="en-PK"/>
+        </w:rPr>
+        <w:t>trah</w:t>
+      </w:r>
+      <w:proofErr w:type="spellEnd"/>
+      <w:r>
+        <w:rPr>
+          <w:lang w:val="en-PK"/>
+        </w:rPr>
+        <w:t xml:space="preserve"> ka concept </w:t>
+      </w:r>
+      <w:proofErr w:type="spellStart"/>
+      <w:r>
+        <w:rPr>
+          <w:lang w:val="en-PK"/>
+        </w:rPr>
+        <w:t>treemap</w:t>
+      </w:r>
+      <w:proofErr w:type="spellEnd"/>
+      <w:r>
+        <w:rPr>
+          <w:lang w:val="en-PK"/>
+        </w:rPr>
+        <w:t xml:space="preserve"> m </w:t>
+      </w:r>
+      <w:proofErr w:type="spellStart"/>
+      <w:r>
+        <w:rPr>
+          <w:lang w:val="en-PK"/>
+        </w:rPr>
+        <w:t>bhi</w:t>
+      </w:r>
+      <w:proofErr w:type="spellEnd"/>
+      <w:r>
+        <w:rPr>
+          <w:lang w:val="en-PK"/>
+        </w:rPr>
+        <w:t xml:space="preserve"> h, </w:t>
+      </w:r>
+    </w:p>
+    <w:p>
+      <w:pPr>
+        <w:ind w:left="360"/>
+        <w:rPr>
+          <w:lang w:val="en-PK"/>
+        </w:rPr>
+      </w:pPr>
+      <w:r>
+        <w:rPr>
+          <w:lang w:val="en-PK"/>
+        </w:rPr>
+        <w:drawing>
+          <wp:anchor distT="0" distB="0" distL="114300" distR="114300" simplePos="0" relativeHeight="251658240" behindDoc="0" locked="0" layoutInCell="1" allowOverlap="1" wp14:anchorId="65570087" wp14:editId="5293F5AF">
+            <wp:simplePos x="1144988" y="4488511"/>
+            <wp:positionH relativeFrom="column">
+              <wp:align>left</wp:align>
+            </wp:positionH>
+            <wp:positionV relativeFrom="paragraph">
+              <wp:align>top</wp:align>
+            </wp:positionV>
+            <wp:extent cx="1626042" cy="1273386"/>
+            <wp:effectExtent l="0" t="0" r="0" b="3175"/>
+            <wp:wrapSquare wrapText="bothSides"/>
+            <wp:docPr id="627653713" name="Picture 1"/>
+            <wp:cNvGraphicFramePr>
+              <a:graphicFrameLocks xmlns:a="http://schemas.openxmlformats.org/drawingml/2006/main" noChangeAspect="1"/>
+            </wp:cNvGraphicFramePr>
+            <a:graphic xmlns:a="http://schemas.openxmlformats.org/drawingml/2006/main">
+              <a:graphicData uri="http://schemas.openxmlformats.org/drawingml/2006/picture">
+                <pic:pic xmlns:pic="http://schemas.openxmlformats.org/drawingml/2006/picture">
+                  <pic:nvPicPr>
+                    <pic:cNvPr id="627653713" name=""/>
+                    <pic:cNvPicPr/>
+                  </pic:nvPicPr>
+                  <pic:blipFill>
+                    <a:blip r:embed="rId10" cstate="print">
+                      <a:extLst>
+                        <a:ext uri="{28A0092B-C50C-407E-A947-70E740481C1C}">
+                          <a14:useLocalDpi xmlns:a14="http://schemas.microsoft.com/office/drawing/2010/main" val="0"/>
+                        </a:ext>
+                      </a:extLst>
+                    </a:blip>
+                    <a:stretch>
+                      <a:fillRect/>
+                    </a:stretch>
+                  </pic:blipFill>
+                  <pic:spPr>
+                    <a:xfrm>
+                      <a:off x="0" y="0"/>
+                      <a:ext cx="1626042" cy="1273386"/>
+                    </a:xfrm>
+                    <a:prstGeom prst="rect">
+                      <a:avLst/>
+                    </a:prstGeom>
+                  </pic:spPr>
+                </pic:pic>
+              </a:graphicData>
+            </a:graphic>
+          </wp:anchor>
+        </w:drawing>
+      </w:r>
+    </w:p>
+    <w:p>
+      <w:pPr>
+        <w:rPr>
+          <w:lang w:val="en-PK"/>
+        </w:rPr>
+      </w:pPr>
+    </w:p>
+    <w:p>
+      <w:pPr>
+        <w:rPr>
+          <w:lang w:val="en-PK"/>
+        </w:rPr>
+      </w:pPr>
+    </w:p>
+    <w:p>
+      <w:pPr>
+        <w:ind w:left="360"/>
+        <w:rPr>
+          <w:lang w:val="en-PK"/>
+        </w:rPr>
+      </w:pPr>
+    </w:p>
+    <w:p>
+      <w:pPr>
+        <w:ind w:left="360"/>
+        <w:rPr>
+          <w:lang w:val="en-PK"/>
+        </w:rPr>
+      </w:pPr>
+      <w:r>
+        <w:rPr>
+          <w:lang w:val="en-PK"/>
+        </w:rPr>
+        <w:t xml:space="preserve">As you can see k liabilities k orange </w:t>
+      </w:r>
+      <w:proofErr w:type="spellStart"/>
+      <w:r>
+        <w:rPr>
+          <w:lang w:val="en-PK"/>
+        </w:rPr>
+        <w:t>color</w:t>
+      </w:r>
+      <w:proofErr w:type="spellEnd"/>
+      <w:r>
+        <w:rPr>
+          <w:lang w:val="en-PK"/>
+        </w:rPr>
+        <w:t xml:space="preserve"> m </w:t>
+      </w:r>
+      <w:proofErr w:type="spellStart"/>
+      <w:r>
+        <w:rPr>
+          <w:lang w:val="en-PK"/>
+        </w:rPr>
+        <w:t>rehty</w:t>
+      </w:r>
+      <w:proofErr w:type="spellEnd"/>
+      <w:r>
+        <w:rPr>
+          <w:lang w:val="en-PK"/>
+        </w:rPr>
+        <w:t xml:space="preserve"> </w:t>
+      </w:r>
+      <w:proofErr w:type="spellStart"/>
+      <w:r>
+        <w:rPr>
+          <w:lang w:val="en-PK"/>
+        </w:rPr>
+        <w:t>huy</w:t>
+      </w:r>
+      <w:proofErr w:type="spellEnd"/>
+      <w:r>
+        <w:rPr>
+          <w:lang w:val="en-PK"/>
+        </w:rPr>
+        <w:t xml:space="preserve"> hi </w:t>
+      </w:r>
+      <w:proofErr w:type="spellStart"/>
+      <w:r>
+        <w:rPr>
+          <w:lang w:val="en-PK"/>
+        </w:rPr>
+        <w:t>maseed</w:t>
+      </w:r>
+      <w:proofErr w:type="spellEnd"/>
+      <w:r>
+        <w:rPr>
+          <w:lang w:val="en-PK"/>
+        </w:rPr>
+        <w:t xml:space="preserve"> </w:t>
+      </w:r>
+      <w:proofErr w:type="spellStart"/>
+      <w:r>
+        <w:rPr>
+          <w:lang w:val="en-PK"/>
+        </w:rPr>
+        <w:t>currect</w:t>
+      </w:r>
+      <w:proofErr w:type="spellEnd"/>
+      <w:r>
+        <w:rPr>
+          <w:lang w:val="en-PK"/>
+        </w:rPr>
+        <w:t xml:space="preserve"> liabilities and long tern liabilities jo k sub-class2 column m mention h show </w:t>
+      </w:r>
+      <w:proofErr w:type="spellStart"/>
+      <w:r>
+        <w:rPr>
+          <w:lang w:val="en-PK"/>
+        </w:rPr>
+        <w:t>ho</w:t>
+      </w:r>
+      <w:proofErr w:type="spellEnd"/>
+      <w:r>
+        <w:rPr>
+          <w:lang w:val="en-PK"/>
+        </w:rPr>
+        <w:t xml:space="preserve"> </w:t>
+      </w:r>
+      <w:proofErr w:type="spellStart"/>
+      <w:r>
+        <w:rPr>
+          <w:lang w:val="en-PK"/>
+        </w:rPr>
+        <w:t>rha</w:t>
+      </w:r>
+      <w:proofErr w:type="spellEnd"/>
+      <w:r>
+        <w:rPr>
+          <w:lang w:val="en-PK"/>
+        </w:rPr>
+        <w:t xml:space="preserve"> h, q k hm n details m subclass2 </w:t>
+      </w:r>
+      <w:proofErr w:type="spellStart"/>
+      <w:r>
+        <w:rPr>
+          <w:lang w:val="en-PK"/>
+        </w:rPr>
+        <w:t>daala</w:t>
+      </w:r>
+      <w:proofErr w:type="spellEnd"/>
+      <w:r>
+        <w:rPr>
+          <w:lang w:val="en-PK"/>
+        </w:rPr>
+        <w:t xml:space="preserve"> </w:t>
+      </w:r>
+      <w:proofErr w:type="spellStart"/>
+      <w:r>
+        <w:rPr>
+          <w:lang w:val="en-PK"/>
+        </w:rPr>
+        <w:t>hua</w:t>
+      </w:r>
+      <w:proofErr w:type="spellEnd"/>
+      <w:r>
+        <w:rPr>
+          <w:lang w:val="en-PK"/>
+        </w:rPr>
+        <w:t xml:space="preserve"> h</w:t>
+      </w:r>
+    </w:p>
+    <w:p>
+      <w:pPr>
+        <w:ind w:left="360"/>
+        <w:rPr>
+          <w:lang w:val="en-PK"/>
+        </w:rPr>
+      </w:pPr>
+      <w:r>
+        <w:rPr>
+          <w:lang w:val="en-PK"/>
+        </w:rPr>
+        <w:br w:type="textWrapping" w:clear="all"/>
       </w:r>
     </w:p>
     <w:sectPr>
@@ -12977,7 +14070,6 @@
   <w:style w:type="character" w:default="1" w:styleId="DefaultParagraphFont">
     <w:name w:val="Default Paragraph Font"/>
     <w:uiPriority w:val="1"/>
-    <w:semiHidden/>
     <w:unhideWhenUsed/>
   </w:style>
   <w:style w:type="table" w:default="1" w:styleId="TableNormal">

</xml_diff>

<commit_message>
add ratios such as current, quick, gearing etc
</commit_message>
<xml_diff>
--- a/Complete FINANCIAL REPORTING AND FINANCIAL ANALYSIS USING POWER BI.docx
+++ b/Complete FINANCIAL REPORTING AND FINANCIAL ANALYSIS USING POWER BI.docx
@@ -10057,7 +10057,15 @@
       </w:r>
       <w:proofErr w:type="spellEnd"/>
       <w:r>
-        <w:t xml:space="preserve"> ki amount show ho </w:t>
+        <w:t xml:space="preserve"> ki amount show </w:t>
+      </w:r>
+      <w:proofErr w:type="spellStart"/>
+      <w:r>
+        <w:t>ho</w:t>
+      </w:r>
+      <w:proofErr w:type="spellEnd"/>
+      <w:r>
+        <w:t xml:space="preserve"> </w:t>
       </w:r>
       <w:proofErr w:type="spellStart"/>
       <w:r>
@@ -10636,6 +10644,7 @@
       </w:pPr>
       <w:r>
         <w:rPr>
+          <w:highlight w:val="yellow"/>
           <w:lang w:val="en-PK"/>
         </w:rPr>
         <w:lastRenderedPageBreak/>
@@ -11345,6 +11354,7 @@
       </w:pPr>
       <w:r>
         <w:rPr>
+          <w:noProof/>
           <w:lang w:val="en-PK"/>
         </w:rPr>
         <w:drawing>
@@ -11564,14 +11574,1631 @@
       <w:pPr>
         <w:ind w:left="360"/>
         <w:rPr>
-          <w:lang w:val="en-PK"/>
-        </w:rPr>
-      </w:pPr>
-      <w:r>
-        <w:rPr>
-          <w:lang w:val="en-PK"/>
-        </w:rPr>
-        <w:br w:type="textWrapping" w:clear="all"/>
+          <w:b/>
+          <w:bCs/>
+          <w:sz w:val="32"/>
+          <w:szCs w:val="32"/>
+          <w:u w:val="single"/>
+          <w:lang w:val="en-PK"/>
+        </w:rPr>
+      </w:pPr>
+      <w:r>
+        <w:rPr>
+          <w:b/>
+          <w:bCs/>
+          <w:sz w:val="32"/>
+          <w:szCs w:val="32"/>
+          <w:u w:val="single"/>
+          <w:lang w:val="en-PK"/>
+        </w:rPr>
+        <w:t>Liquidity</w:t>
+      </w:r>
+      <w:r>
+        <w:rPr>
+          <w:b/>
+          <w:bCs/>
+          <w:sz w:val="32"/>
+          <w:szCs w:val="32"/>
+          <w:u w:val="single"/>
+          <w:lang w:val="en-PK"/>
+        </w:rPr>
+        <w:t>:</w:t>
+      </w:r>
+    </w:p>
+    <w:p>
+      <w:pPr>
+        <w:ind w:left="360"/>
+        <w:rPr>
+          <w:lang w:val="en-PK"/>
+        </w:rPr>
+      </w:pPr>
+      <w:r>
+        <w:rPr>
+          <w:lang w:val="en-PK"/>
+        </w:rPr>
+        <w:t xml:space="preserve">Liquidity indicates how easily an asset can be converted into cash, because cash ko hm immediately use </w:t>
+      </w:r>
+      <w:proofErr w:type="spellStart"/>
+      <w:r>
+        <w:rPr>
+          <w:lang w:val="en-PK"/>
+        </w:rPr>
+        <w:t>kr</w:t>
+      </w:r>
+      <w:proofErr w:type="spellEnd"/>
+      <w:r>
+        <w:rPr>
+          <w:lang w:val="en-PK"/>
+        </w:rPr>
+        <w:t xml:space="preserve"> </w:t>
+      </w:r>
+      <w:proofErr w:type="spellStart"/>
+      <w:r>
+        <w:rPr>
+          <w:lang w:val="en-PK"/>
+        </w:rPr>
+        <w:t>skty</w:t>
+      </w:r>
+      <w:proofErr w:type="spellEnd"/>
+      <w:r>
+        <w:rPr>
+          <w:lang w:val="en-PK"/>
+        </w:rPr>
+        <w:t xml:space="preserve"> </w:t>
+      </w:r>
+      <w:proofErr w:type="spellStart"/>
+      <w:r>
+        <w:rPr>
+          <w:lang w:val="en-PK"/>
+        </w:rPr>
+        <w:t>hn.Following</w:t>
+      </w:r>
+      <w:proofErr w:type="spellEnd"/>
+      <w:r>
+        <w:rPr>
+          <w:lang w:val="en-PK"/>
+        </w:rPr>
+        <w:t xml:space="preserve"> assets can be converted into cash quickly and easily</w:t>
+      </w:r>
+    </w:p>
+    <w:p>
+      <w:pPr>
+        <w:ind w:left="360"/>
+        <w:rPr>
+          <w:lang w:val="en-PK"/>
+        </w:rPr>
+      </w:pPr>
+      <w:r>
+        <w:rPr>
+          <w:lang w:val="en-PK"/>
+        </w:rPr>
+        <w:t xml:space="preserve">Cash (highest liquidity), bank balance (high liquidity), </w:t>
+      </w:r>
+      <w:r>
+        <w:rPr>
+          <w:lang w:val="en-PK"/>
+        </w:rPr>
+        <w:t xml:space="preserve">marketable securities such as treasury bills (high liquidity </w:t>
+      </w:r>
+      <w:r>
+        <w:rPr>
+          <w:lang w:val="en-PK"/>
+        </w:rPr>
+        <w:t>b</w:t>
+      </w:r>
+      <w:r>
+        <w:rPr>
+          <w:lang w:val="en-PK"/>
+        </w:rPr>
+        <w:t xml:space="preserve">ecause can be sold within minutes and we can get cash), customer </w:t>
+      </w:r>
+      <w:proofErr w:type="spellStart"/>
+      <w:r>
+        <w:rPr>
+          <w:lang w:val="en-PK"/>
+        </w:rPr>
+        <w:t>returnables</w:t>
+      </w:r>
+      <w:proofErr w:type="spellEnd"/>
+      <w:r>
+        <w:rPr>
+          <w:lang w:val="en-PK"/>
+        </w:rPr>
+        <w:t xml:space="preserve"> (medium liquidity),,,,,, </w:t>
+      </w:r>
+      <w:r>
+        <w:rPr>
+          <w:lang w:val="en-PK"/>
+        </w:rPr>
+        <w:t xml:space="preserve">company building, </w:t>
+      </w:r>
+      <w:r>
+        <w:rPr>
+          <w:lang w:val="en-PK"/>
+        </w:rPr>
+        <w:t xml:space="preserve">land, </w:t>
+      </w:r>
+      <w:r>
+        <w:rPr>
+          <w:lang w:val="en-PK"/>
+        </w:rPr>
+        <w:t>machines, inventory etc have low liquidity because these things take time to convert into cash</w:t>
+      </w:r>
+      <w:r>
+        <w:rPr>
+          <w:lang w:val="en-PK"/>
+        </w:rPr>
+        <w:t>.</w:t>
+      </w:r>
+    </w:p>
+    <w:p>
+      <w:pPr>
+        <w:ind w:left="360"/>
+        <w:rPr>
+          <w:lang w:val="en-PK"/>
+        </w:rPr>
+      </w:pPr>
+      <w:r>
+        <w:rPr>
+          <w:lang w:val="en-PK"/>
+        </w:rPr>
+        <w:t>--</w:t>
+      </w:r>
+      <w:r>
+        <w:rPr>
+          <w:lang w:val="en-PK"/>
+        </w:rPr>
+        <w:sym w:font="Wingdings" w:char="F0E0"/>
+      </w:r>
+      <w:r>
+        <w:rPr>
+          <w:lang w:val="en-PK"/>
+        </w:rPr>
+        <w:t xml:space="preserve">  CONCEPTUALLY hm y </w:t>
+      </w:r>
+      <w:proofErr w:type="spellStart"/>
+      <w:r>
+        <w:rPr>
+          <w:lang w:val="en-PK"/>
+        </w:rPr>
+        <w:t>baat</w:t>
+      </w:r>
+      <w:proofErr w:type="spellEnd"/>
+      <w:r>
+        <w:rPr>
+          <w:lang w:val="en-PK"/>
+        </w:rPr>
+        <w:t xml:space="preserve"> </w:t>
+      </w:r>
+      <w:proofErr w:type="spellStart"/>
+      <w:r>
+        <w:rPr>
+          <w:lang w:val="en-PK"/>
+        </w:rPr>
+        <w:t>keh</w:t>
+      </w:r>
+      <w:proofErr w:type="spellEnd"/>
+      <w:r>
+        <w:rPr>
+          <w:lang w:val="en-PK"/>
+        </w:rPr>
+        <w:t xml:space="preserve"> </w:t>
+      </w:r>
+      <w:proofErr w:type="spellStart"/>
+      <w:r>
+        <w:rPr>
+          <w:lang w:val="en-PK"/>
+        </w:rPr>
+        <w:t>skty</w:t>
+      </w:r>
+      <w:proofErr w:type="spellEnd"/>
+      <w:r>
+        <w:rPr>
+          <w:lang w:val="en-PK"/>
+        </w:rPr>
+        <w:t xml:space="preserve"> </w:t>
+      </w:r>
+      <w:proofErr w:type="spellStart"/>
+      <w:r>
+        <w:rPr>
+          <w:lang w:val="en-PK"/>
+        </w:rPr>
+        <w:t>hn</w:t>
+      </w:r>
+      <w:proofErr w:type="spellEnd"/>
+      <w:r>
+        <w:rPr>
+          <w:lang w:val="en-PK"/>
+        </w:rPr>
+        <w:t xml:space="preserve"> k there are 2 types of assets : liquid and non </w:t>
+      </w:r>
+      <w:proofErr w:type="spellStart"/>
+      <w:r>
+        <w:rPr>
+          <w:lang w:val="en-PK"/>
+        </w:rPr>
+        <w:t>liguid</w:t>
+      </w:r>
+      <w:proofErr w:type="spellEnd"/>
+      <w:r>
+        <w:rPr>
+          <w:lang w:val="en-PK"/>
+        </w:rPr>
+        <w:t xml:space="preserve"> assets but finance m hm y terms use </w:t>
+      </w:r>
+      <w:proofErr w:type="spellStart"/>
+      <w:r>
+        <w:rPr>
+          <w:lang w:val="en-PK"/>
+        </w:rPr>
+        <w:t>nhi</w:t>
+      </w:r>
+      <w:proofErr w:type="spellEnd"/>
+      <w:r>
+        <w:rPr>
+          <w:lang w:val="en-PK"/>
+        </w:rPr>
+        <w:t xml:space="preserve"> </w:t>
+      </w:r>
+      <w:proofErr w:type="spellStart"/>
+      <w:r>
+        <w:rPr>
+          <w:lang w:val="en-PK"/>
+        </w:rPr>
+        <w:t>krty</w:t>
+      </w:r>
+      <w:proofErr w:type="spellEnd"/>
+      <w:r>
+        <w:rPr>
+          <w:lang w:val="en-PK"/>
+        </w:rPr>
+        <w:t xml:space="preserve">, hm </w:t>
+      </w:r>
+      <w:proofErr w:type="spellStart"/>
+      <w:r>
+        <w:rPr>
+          <w:lang w:val="en-PK"/>
+        </w:rPr>
+        <w:t>yhi</w:t>
+      </w:r>
+      <w:proofErr w:type="spellEnd"/>
+      <w:r>
+        <w:rPr>
+          <w:lang w:val="en-PK"/>
+        </w:rPr>
+        <w:t xml:space="preserve"> </w:t>
+      </w:r>
+      <w:proofErr w:type="spellStart"/>
+      <w:r>
+        <w:rPr>
+          <w:lang w:val="en-PK"/>
+        </w:rPr>
+        <w:t>kehty</w:t>
+      </w:r>
+      <w:proofErr w:type="spellEnd"/>
+      <w:r>
+        <w:rPr>
+          <w:lang w:val="en-PK"/>
+        </w:rPr>
+        <w:t xml:space="preserve"> </w:t>
+      </w:r>
+      <w:proofErr w:type="spellStart"/>
+      <w:r>
+        <w:rPr>
+          <w:lang w:val="en-PK"/>
+        </w:rPr>
+        <w:t>hn</w:t>
+      </w:r>
+      <w:proofErr w:type="spellEnd"/>
+      <w:r>
+        <w:rPr>
+          <w:lang w:val="en-PK"/>
+        </w:rPr>
+        <w:t xml:space="preserve"> k highly liquid assets (which are current assets ) and less liquid assets (which are l</w:t>
+      </w:r>
+      <w:r>
+        <w:rPr>
+          <w:lang w:val="en-PK"/>
+        </w:rPr>
+        <w:t>o</w:t>
+      </w:r>
+      <w:r>
+        <w:rPr>
+          <w:lang w:val="en-PK"/>
+        </w:rPr>
+        <w:t>ng term assets)</w:t>
+      </w:r>
+      <w:r>
+        <w:rPr>
+          <w:lang w:val="en-PK"/>
+        </w:rPr>
+        <w:t xml:space="preserve">,,, inventory is a current assets but it is slow as compared to other current assets in terms of converting to cash. </w:t>
+      </w:r>
+    </w:p>
+    <w:p>
+      <w:pPr>
+        <w:ind w:left="360"/>
+        <w:rPr>
+          <w:b/>
+          <w:bCs/>
+          <w:sz w:val="32"/>
+          <w:szCs w:val="32"/>
+          <w:u w:val="single"/>
+          <w:lang w:val="en-PK"/>
+        </w:rPr>
+      </w:pPr>
+      <w:r>
+        <w:rPr>
+          <w:b/>
+          <w:bCs/>
+          <w:sz w:val="32"/>
+          <w:szCs w:val="32"/>
+          <w:u w:val="single"/>
+          <w:lang w:val="en-PK"/>
+        </w:rPr>
+        <w:t>CURRENT RATIO:</w:t>
+      </w:r>
+    </w:p>
+    <w:p>
+      <w:pPr>
+        <w:ind w:left="360"/>
+        <w:rPr>
+          <w:lang w:val="en-PK"/>
+        </w:rPr>
+      </w:pPr>
+      <w:r>
+        <w:rPr>
+          <w:lang w:val="en-PK"/>
+        </w:rPr>
+        <w:lastRenderedPageBreak/>
+        <w:t>Determines whether a company can pay its short term liabilities using short term assets.</w:t>
+      </w:r>
+    </w:p>
+    <w:p>
+      <w:pPr>
+        <w:ind w:left="360"/>
+        <w:rPr>
+          <w:lang w:val="en-PK"/>
+        </w:rPr>
+      </w:pPr>
+      <w:r>
+        <w:rPr>
+          <w:lang w:val="en-PK"/>
+        </w:rPr>
+        <w:t>CURRENT RATIO = CURRENT ASSETS/CURRENT LIABILITIES</w:t>
+      </w:r>
+    </w:p>
+    <w:p>
+      <w:pPr>
+        <w:ind w:left="360"/>
+        <w:rPr>
+          <w:lang w:val="en-PK"/>
+        </w:rPr>
+      </w:pPr>
+      <w:r>
+        <w:rPr>
+          <w:lang w:val="en-PK"/>
+        </w:rPr>
+        <w:t xml:space="preserve">If ratio  = 1, means company have equal assets and liabilities and just </w:t>
+      </w:r>
+      <w:proofErr w:type="spellStart"/>
+      <w:r>
+        <w:rPr>
+          <w:lang w:val="en-PK"/>
+        </w:rPr>
+        <w:t>itna</w:t>
+      </w:r>
+      <w:proofErr w:type="spellEnd"/>
+      <w:r>
+        <w:rPr>
+          <w:lang w:val="en-PK"/>
+        </w:rPr>
+        <w:t xml:space="preserve"> hi </w:t>
+      </w:r>
+      <w:proofErr w:type="spellStart"/>
+      <w:r>
+        <w:rPr>
+          <w:lang w:val="en-PK"/>
+        </w:rPr>
+        <w:t>pesa</w:t>
+      </w:r>
+      <w:proofErr w:type="spellEnd"/>
+      <w:r>
+        <w:rPr>
+          <w:lang w:val="en-PK"/>
+        </w:rPr>
+        <w:t xml:space="preserve"> h k </w:t>
+      </w:r>
+      <w:proofErr w:type="spellStart"/>
+      <w:r>
+        <w:rPr>
+          <w:lang w:val="en-PK"/>
+        </w:rPr>
+        <w:t>vo</w:t>
+      </w:r>
+      <w:proofErr w:type="spellEnd"/>
+      <w:r>
+        <w:rPr>
+          <w:lang w:val="en-PK"/>
+        </w:rPr>
+        <w:t xml:space="preserve"> bs liabilities ko cover </w:t>
+      </w:r>
+      <w:proofErr w:type="spellStart"/>
+      <w:r>
+        <w:rPr>
+          <w:lang w:val="en-PK"/>
+        </w:rPr>
+        <w:t>kr</w:t>
+      </w:r>
+      <w:proofErr w:type="spellEnd"/>
+      <w:r>
+        <w:rPr>
+          <w:lang w:val="en-PK"/>
+        </w:rPr>
+        <w:t xml:space="preserve"> </w:t>
+      </w:r>
+      <w:proofErr w:type="spellStart"/>
+      <w:r>
+        <w:rPr>
+          <w:lang w:val="en-PK"/>
+        </w:rPr>
+        <w:t>skti</w:t>
+      </w:r>
+      <w:proofErr w:type="spellEnd"/>
+      <w:r>
+        <w:rPr>
+          <w:lang w:val="en-PK"/>
+        </w:rPr>
+        <w:t xml:space="preserve"> h</w:t>
+      </w:r>
+    </w:p>
+    <w:p>
+      <w:pPr>
+        <w:ind w:left="360"/>
+        <w:rPr>
+          <w:lang w:val="en-PK"/>
+        </w:rPr>
+      </w:pPr>
+      <w:r>
+        <w:rPr>
+          <w:lang w:val="en-PK"/>
+        </w:rPr>
+        <w:t>If ratio&gt; 1, means company have more assets compared to liabilities and can pay liabilities easily, means company is financially safe.</w:t>
+      </w:r>
+    </w:p>
+    <w:p>
+      <w:pPr>
+        <w:ind w:left="360"/>
+        <w:rPr>
+          <w:lang w:val="en-PK"/>
+        </w:rPr>
+      </w:pPr>
+      <w:r>
+        <w:rPr>
+          <w:lang w:val="en-PK"/>
+        </w:rPr>
+        <w:t>If ratio &lt;1 , means company cannot pay current liabilities such as current debts and is in bad condition financially, indicate liquidity problems.</w:t>
+      </w:r>
+    </w:p>
+    <w:p>
+      <w:pPr>
+        <w:ind w:left="360"/>
+      </w:pPr>
+      <w:r>
+        <w:rPr>
+          <w:b/>
+          <w:bCs/>
+        </w:rPr>
+        <w:t>Very high (like 4 or 5)</w:t>
+      </w:r>
+      <w:r>
+        <w:t xml:space="preserve"> → Might mean inefficient use of assets (too much idle cash or inventory)</w:t>
+      </w:r>
+    </w:p>
+    <w:p>
+      <w:pPr>
+        <w:ind w:left="360"/>
+        <w:rPr>
+          <w:b/>
+          <w:bCs/>
+          <w:sz w:val="32"/>
+          <w:szCs w:val="32"/>
+          <w:u w:val="single"/>
+          <w:lang w:val="en-PK"/>
+        </w:rPr>
+      </w:pPr>
+      <w:r>
+        <w:rPr>
+          <w:b/>
+          <w:bCs/>
+          <w:sz w:val="32"/>
+          <w:szCs w:val="32"/>
+          <w:u w:val="single"/>
+          <w:lang w:val="en-PK"/>
+        </w:rPr>
+        <w:t>Quick</w:t>
+      </w:r>
+      <w:r>
+        <w:rPr>
+          <w:b/>
+          <w:bCs/>
+          <w:sz w:val="32"/>
+          <w:szCs w:val="32"/>
+          <w:u w:val="single"/>
+          <w:lang w:val="en-PK"/>
+        </w:rPr>
+        <w:t xml:space="preserve"> RATIO</w:t>
+      </w:r>
+      <w:r>
+        <w:rPr>
+          <w:b/>
+          <w:bCs/>
+          <w:sz w:val="32"/>
+          <w:szCs w:val="32"/>
+          <w:u w:val="single"/>
+          <w:lang w:val="en-PK"/>
+        </w:rPr>
+        <w:t>/</w:t>
+      </w:r>
+      <w:proofErr w:type="spellStart"/>
+      <w:r>
+        <w:rPr>
+          <w:b/>
+          <w:bCs/>
+          <w:sz w:val="32"/>
+          <w:szCs w:val="32"/>
+          <w:u w:val="single"/>
+          <w:lang w:val="en-PK"/>
+        </w:rPr>
+        <w:t>Acit</w:t>
+      </w:r>
+      <w:proofErr w:type="spellEnd"/>
+      <w:r>
+        <w:rPr>
+          <w:b/>
+          <w:bCs/>
+          <w:sz w:val="32"/>
+          <w:szCs w:val="32"/>
+          <w:u w:val="single"/>
+          <w:lang w:val="en-PK"/>
+        </w:rPr>
+        <w:t xml:space="preserve"> test ratio</w:t>
+      </w:r>
+      <w:r>
+        <w:rPr>
+          <w:b/>
+          <w:bCs/>
+          <w:sz w:val="32"/>
+          <w:szCs w:val="32"/>
+          <w:u w:val="single"/>
+          <w:lang w:val="en-PK"/>
+        </w:rPr>
+        <w:t>:</w:t>
+      </w:r>
+    </w:p>
+    <w:p>
+      <w:pPr>
+        <w:ind w:left="360"/>
+        <w:rPr>
+          <w:lang w:val="en-PK"/>
+        </w:rPr>
+      </w:pPr>
+      <w:r>
+        <w:rPr>
+          <w:lang w:val="en-PK"/>
+        </w:rPr>
+        <w:t>Tells whether a company can pay its current liabilities using only high liquid assets, now Inventory is not a high liquid asset</w:t>
+      </w:r>
+      <w:r>
+        <w:rPr>
+          <w:lang w:val="en-PK"/>
+        </w:rPr>
+        <w:t xml:space="preserve">, so we are removing it and then dividing the value with current liability, means bs </w:t>
+      </w:r>
+      <w:proofErr w:type="spellStart"/>
+      <w:r>
+        <w:rPr>
+          <w:lang w:val="en-PK"/>
+        </w:rPr>
+        <w:t>yhi</w:t>
+      </w:r>
+      <w:proofErr w:type="spellEnd"/>
+      <w:r>
+        <w:rPr>
+          <w:lang w:val="en-PK"/>
+        </w:rPr>
+        <w:t xml:space="preserve"> check </w:t>
+      </w:r>
+      <w:proofErr w:type="spellStart"/>
+      <w:r>
+        <w:rPr>
+          <w:lang w:val="en-PK"/>
+        </w:rPr>
+        <w:t>krna</w:t>
+      </w:r>
+      <w:proofErr w:type="spellEnd"/>
+      <w:r>
+        <w:rPr>
+          <w:lang w:val="en-PK"/>
+        </w:rPr>
+        <w:t xml:space="preserve"> h k kia high liquid assets k </w:t>
+      </w:r>
+      <w:proofErr w:type="spellStart"/>
+      <w:r>
+        <w:rPr>
+          <w:lang w:val="en-PK"/>
+        </w:rPr>
+        <w:t>zrye</w:t>
+      </w:r>
+      <w:proofErr w:type="spellEnd"/>
+      <w:r>
+        <w:rPr>
+          <w:lang w:val="en-PK"/>
+        </w:rPr>
+        <w:t xml:space="preserve"> hm </w:t>
+      </w:r>
+      <w:proofErr w:type="spellStart"/>
+      <w:r>
+        <w:rPr>
+          <w:lang w:val="en-PK"/>
+        </w:rPr>
+        <w:t>apni</w:t>
+      </w:r>
+      <w:proofErr w:type="spellEnd"/>
+      <w:r>
+        <w:rPr>
+          <w:lang w:val="en-PK"/>
+        </w:rPr>
+        <w:t xml:space="preserve"> </w:t>
+      </w:r>
+      <w:r>
+        <w:rPr>
+          <w:lang w:val="en-PK"/>
+        </w:rPr>
+        <w:t>liability</w:t>
+      </w:r>
+      <w:r>
+        <w:rPr>
+          <w:lang w:val="en-PK"/>
+        </w:rPr>
+        <w:t xml:space="preserve"> pay </w:t>
+      </w:r>
+      <w:proofErr w:type="spellStart"/>
+      <w:r>
+        <w:rPr>
+          <w:lang w:val="en-PK"/>
+        </w:rPr>
+        <w:t>kr</w:t>
+      </w:r>
+      <w:proofErr w:type="spellEnd"/>
+      <w:r>
+        <w:rPr>
+          <w:lang w:val="en-PK"/>
+        </w:rPr>
+        <w:t xml:space="preserve"> </w:t>
+      </w:r>
+      <w:proofErr w:type="spellStart"/>
+      <w:r>
+        <w:rPr>
+          <w:lang w:val="en-PK"/>
+        </w:rPr>
+        <w:t>slty</w:t>
+      </w:r>
+      <w:proofErr w:type="spellEnd"/>
+      <w:r>
+        <w:rPr>
+          <w:lang w:val="en-PK"/>
+        </w:rPr>
+        <w:t xml:space="preserve"> </w:t>
+      </w:r>
+      <w:proofErr w:type="spellStart"/>
+      <w:r>
+        <w:rPr>
+          <w:lang w:val="en-PK"/>
+        </w:rPr>
+        <w:t>hn</w:t>
+      </w:r>
+      <w:proofErr w:type="spellEnd"/>
+      <w:r>
+        <w:rPr>
+          <w:lang w:val="en-PK"/>
+        </w:rPr>
+        <w:t xml:space="preserve"> </w:t>
+      </w:r>
+      <w:proofErr w:type="spellStart"/>
+      <w:r>
+        <w:rPr>
+          <w:lang w:val="en-PK"/>
+        </w:rPr>
+        <w:t>ya</w:t>
+      </w:r>
+      <w:proofErr w:type="spellEnd"/>
+      <w:r>
+        <w:rPr>
+          <w:lang w:val="en-PK"/>
+        </w:rPr>
+        <w:t xml:space="preserve"> </w:t>
+      </w:r>
+      <w:proofErr w:type="spellStart"/>
+      <w:r>
+        <w:rPr>
+          <w:lang w:val="en-PK"/>
+        </w:rPr>
+        <w:t>nhi</w:t>
+      </w:r>
+      <w:proofErr w:type="spellEnd"/>
+      <w:r>
+        <w:rPr>
+          <w:lang w:val="en-PK"/>
+        </w:rPr>
+        <w:t xml:space="preserve">,, this ratio is more strict as compared to current ratio. </w:t>
+      </w:r>
+    </w:p>
+    <w:p>
+      <w:pPr>
+        <w:ind w:left="360"/>
+        <w:rPr>
+          <w:lang w:val="en-PK"/>
+        </w:rPr>
+      </w:pPr>
+      <w:r>
+        <w:rPr>
+          <w:lang w:val="en-PK"/>
+        </w:rPr>
+        <w:t>Quick ratio = (Current assets – inventory) / current liabilities</w:t>
+      </w:r>
+    </w:p>
+    <w:p>
+      <w:pPr>
+        <w:ind w:left="360"/>
+        <w:rPr>
+          <w:lang w:val="en-PK"/>
+        </w:rPr>
+      </w:pPr>
+      <w:r>
+        <w:rPr>
+          <w:lang w:val="en-PK"/>
+        </w:rPr>
+        <w:t>Quick Ratio &gt; 1</w:t>
+      </w:r>
+    </w:p>
+    <w:p>
+      <w:pPr>
+        <w:ind w:left="360"/>
+        <w:rPr>
+          <w:lang w:val="en-PK"/>
+        </w:rPr>
+      </w:pPr>
+      <w:r>
+        <w:rPr>
+          <w:lang w:val="en-PK"/>
+        </w:rPr>
+        <w:t>Company can pay short-term obligations without selling inventory.</w:t>
+      </w:r>
+    </w:p>
+    <w:p>
+      <w:pPr>
+        <w:ind w:left="360"/>
+        <w:rPr>
+          <w:lang w:val="en-PK"/>
+        </w:rPr>
+      </w:pPr>
+      <w:r>
+        <w:rPr>
+          <w:lang w:val="en-PK"/>
+        </w:rPr>
+        <w:t>Quick Ratio = 1</w:t>
+      </w:r>
+    </w:p>
+    <w:p>
+      <w:pPr>
+        <w:ind w:left="360"/>
+        <w:rPr>
+          <w:lang w:val="en-PK"/>
+        </w:rPr>
+      </w:pPr>
+      <w:r>
+        <w:rPr>
+          <w:lang w:val="en-PK"/>
+        </w:rPr>
+        <w:t>Company has exactly enough liquid assets.</w:t>
+      </w:r>
+    </w:p>
+    <w:p>
+      <w:pPr>
+        <w:ind w:left="360"/>
+        <w:rPr>
+          <w:lang w:val="en-PK"/>
+        </w:rPr>
+      </w:pPr>
+      <w:r>
+        <w:rPr>
+          <w:lang w:val="en-PK"/>
+        </w:rPr>
+        <w:t>Quick Ratio &lt; 1</w:t>
+      </w:r>
+    </w:p>
+    <w:p>
+      <w:pPr>
+        <w:ind w:left="360"/>
+        <w:rPr>
+          <w:lang w:val="en-PK"/>
+        </w:rPr>
+      </w:pPr>
+      <w:r>
+        <w:rPr>
+          <w:lang w:val="en-PK"/>
+        </w:rPr>
+        <w:t>Company may struggle to pay debts quickly.</w:t>
+      </w:r>
+    </w:p>
+    <w:p>
+      <w:pPr>
+        <w:ind w:left="360"/>
+        <w:rPr>
+          <w:b/>
+          <w:bCs/>
+          <w:sz w:val="32"/>
+          <w:szCs w:val="32"/>
+          <w:u w:val="single"/>
+          <w:lang w:val="en-PK"/>
+        </w:rPr>
+      </w:pPr>
+      <w:r>
+        <w:rPr>
+          <w:b/>
+          <w:bCs/>
+          <w:sz w:val="32"/>
+          <w:szCs w:val="32"/>
+          <w:u w:val="single"/>
+          <w:lang w:val="en-PK"/>
+        </w:rPr>
+        <w:t xml:space="preserve">Gearing </w:t>
+      </w:r>
+      <w:r>
+        <w:rPr>
+          <w:b/>
+          <w:bCs/>
+          <w:sz w:val="32"/>
+          <w:szCs w:val="32"/>
+          <w:u w:val="single"/>
+          <w:lang w:val="en-PK"/>
+        </w:rPr>
+        <w:t>ratio</w:t>
+      </w:r>
+      <w:r>
+        <w:rPr>
+          <w:b/>
+          <w:bCs/>
+          <w:sz w:val="32"/>
+          <w:szCs w:val="32"/>
+          <w:u w:val="single"/>
+          <w:lang w:val="en-PK"/>
+        </w:rPr>
+        <w:t>:</w:t>
+      </w:r>
+    </w:p>
+    <w:p>
+      <w:pPr>
+        <w:ind w:left="360"/>
+        <w:rPr>
+          <w:lang w:val="en-PK"/>
+        </w:rPr>
+      </w:pPr>
+      <w:r>
+        <w:rPr>
+          <w:lang w:val="en-PK"/>
+        </w:rPr>
+        <w:t xml:space="preserve">It is a relationship between debt and equity, it tells how much of company’s financing comes from debt compared to owner’s equity, means k company debts pr </w:t>
+      </w:r>
+      <w:proofErr w:type="spellStart"/>
+      <w:r>
+        <w:rPr>
+          <w:lang w:val="en-PK"/>
+        </w:rPr>
+        <w:t>kitni</w:t>
+      </w:r>
+      <w:proofErr w:type="spellEnd"/>
+      <w:r>
+        <w:rPr>
+          <w:lang w:val="en-PK"/>
+        </w:rPr>
+        <w:t xml:space="preserve"> dependent h</w:t>
+      </w:r>
+    </w:p>
+    <w:p>
+      <w:pPr>
+        <w:ind w:left="360"/>
+        <w:rPr>
+          <w:lang w:val="en-PK"/>
+        </w:rPr>
+      </w:pPr>
+      <w:r>
+        <w:rPr>
+          <w:lang w:val="en-PK"/>
+        </w:rPr>
+        <w:t xml:space="preserve">Gearing ratio = </w:t>
+      </w:r>
+      <w:r>
+        <w:rPr>
+          <w:lang w:val="en-PK"/>
+        </w:rPr>
+        <w:t>debt / owner’s equity</w:t>
+      </w:r>
+    </w:p>
+    <w:p>
+      <w:pPr>
+        <w:ind w:left="360"/>
+        <w:rPr>
+          <w:lang w:val="en-PK"/>
+        </w:rPr>
+      </w:pPr>
+      <w:r>
+        <w:rPr>
+          <w:lang w:val="en-PK"/>
+        </w:rPr>
+        <w:t xml:space="preserve">High gearing ratio means company mostly dependent on debts and low means </w:t>
+      </w:r>
+      <w:proofErr w:type="spellStart"/>
+      <w:r>
+        <w:rPr>
+          <w:lang w:val="en-PK"/>
+        </w:rPr>
+        <w:t>ziada</w:t>
+      </w:r>
+      <w:proofErr w:type="spellEnd"/>
+      <w:r>
+        <w:rPr>
+          <w:lang w:val="en-PK"/>
+        </w:rPr>
+        <w:t xml:space="preserve"> tr finances equity pr dependent </w:t>
+      </w:r>
+      <w:proofErr w:type="spellStart"/>
+      <w:r>
+        <w:rPr>
+          <w:lang w:val="en-PK"/>
+        </w:rPr>
+        <w:t>hn</w:t>
+      </w:r>
+      <w:proofErr w:type="spellEnd"/>
+      <w:r>
+        <w:rPr>
+          <w:lang w:val="en-PK"/>
+        </w:rPr>
+        <w:t xml:space="preserve">,, bank </w:t>
+      </w:r>
+      <w:proofErr w:type="spellStart"/>
+      <w:r>
+        <w:rPr>
+          <w:lang w:val="en-PK"/>
+        </w:rPr>
+        <w:t>valy</w:t>
+      </w:r>
+      <w:proofErr w:type="spellEnd"/>
+      <w:r>
+        <w:rPr>
+          <w:lang w:val="en-PK"/>
+        </w:rPr>
+        <w:t xml:space="preserve"> loan deny s phly gearing ratio ko </w:t>
+      </w:r>
+      <w:proofErr w:type="spellStart"/>
+      <w:r>
+        <w:rPr>
+          <w:lang w:val="en-PK"/>
+        </w:rPr>
+        <w:t>dekhty</w:t>
+      </w:r>
+      <w:proofErr w:type="spellEnd"/>
+      <w:r>
+        <w:rPr>
+          <w:lang w:val="en-PK"/>
+        </w:rPr>
+        <w:t xml:space="preserve"> </w:t>
+      </w:r>
+      <w:proofErr w:type="spellStart"/>
+      <w:r>
+        <w:rPr>
+          <w:lang w:val="en-PK"/>
+        </w:rPr>
+        <w:t>hn</w:t>
+      </w:r>
+      <w:proofErr w:type="spellEnd"/>
+      <w:r>
+        <w:rPr>
+          <w:lang w:val="en-PK"/>
+        </w:rPr>
+        <w:t xml:space="preserve"> k kia y loan repay </w:t>
+      </w:r>
+      <w:proofErr w:type="spellStart"/>
+      <w:r>
+        <w:rPr>
+          <w:lang w:val="en-PK"/>
+        </w:rPr>
+        <w:t>krny</w:t>
+      </w:r>
+      <w:proofErr w:type="spellEnd"/>
+      <w:r>
+        <w:rPr>
+          <w:lang w:val="en-PK"/>
+        </w:rPr>
+        <w:t xml:space="preserve"> k </w:t>
+      </w:r>
+      <w:proofErr w:type="spellStart"/>
+      <w:r>
+        <w:rPr>
+          <w:lang w:val="en-PK"/>
+        </w:rPr>
+        <w:t>kabil</w:t>
+      </w:r>
+      <w:proofErr w:type="spellEnd"/>
+      <w:r>
+        <w:rPr>
+          <w:lang w:val="en-PK"/>
+        </w:rPr>
+        <w:t xml:space="preserve"> h </w:t>
+      </w:r>
+      <w:proofErr w:type="spellStart"/>
+      <w:r>
+        <w:rPr>
+          <w:lang w:val="en-PK"/>
+        </w:rPr>
+        <w:t>ya</w:t>
+      </w:r>
+      <w:proofErr w:type="spellEnd"/>
+      <w:r>
+        <w:rPr>
+          <w:lang w:val="en-PK"/>
+        </w:rPr>
+        <w:t xml:space="preserve"> </w:t>
+      </w:r>
+      <w:proofErr w:type="spellStart"/>
+      <w:r>
+        <w:rPr>
+          <w:lang w:val="en-PK"/>
+        </w:rPr>
+        <w:t>nhi</w:t>
+      </w:r>
+      <w:proofErr w:type="spellEnd"/>
+      <w:r>
+        <w:rPr>
+          <w:lang w:val="en-PK"/>
+        </w:rPr>
+        <w:t xml:space="preserve">, </w:t>
+      </w:r>
+      <w:r>
+        <w:rPr>
+          <w:lang w:val="en-PK"/>
+        </w:rPr>
+        <w:t xml:space="preserve">investors </w:t>
+      </w:r>
+      <w:proofErr w:type="spellStart"/>
+      <w:r>
+        <w:rPr>
+          <w:lang w:val="en-PK"/>
+        </w:rPr>
+        <w:t>bhi</w:t>
+      </w:r>
+      <w:proofErr w:type="spellEnd"/>
+      <w:r>
+        <w:rPr>
+          <w:lang w:val="en-PK"/>
+        </w:rPr>
+        <w:t xml:space="preserve"> gearing ratio ko hi </w:t>
+      </w:r>
+      <w:proofErr w:type="spellStart"/>
+      <w:r>
+        <w:rPr>
+          <w:lang w:val="en-PK"/>
+        </w:rPr>
+        <w:t>dekhty</w:t>
+      </w:r>
+      <w:proofErr w:type="spellEnd"/>
+      <w:r>
+        <w:rPr>
+          <w:lang w:val="en-PK"/>
+        </w:rPr>
+        <w:t xml:space="preserve"> </w:t>
+      </w:r>
+      <w:proofErr w:type="spellStart"/>
+      <w:r>
+        <w:rPr>
+          <w:lang w:val="en-PK"/>
+        </w:rPr>
+        <w:t>hn</w:t>
+      </w:r>
+      <w:proofErr w:type="spellEnd"/>
+      <w:r>
+        <w:rPr>
+          <w:lang w:val="en-PK"/>
+        </w:rPr>
+        <w:t xml:space="preserve"> to check long term financial </w:t>
+      </w:r>
+      <w:proofErr w:type="spellStart"/>
+      <w:r>
+        <w:rPr>
+          <w:lang w:val="en-PK"/>
+        </w:rPr>
+        <w:t>stabitlity</w:t>
+      </w:r>
+      <w:proofErr w:type="spellEnd"/>
+      <w:r>
+        <w:rPr>
+          <w:lang w:val="en-PK"/>
+        </w:rPr>
+        <w:t xml:space="preserve">. </w:t>
+      </w:r>
+    </w:p>
+    <w:p>
+      <w:pPr>
+        <w:ind w:left="360"/>
+        <w:rPr>
+          <w:b/>
+          <w:bCs/>
+          <w:color w:val="FFFFFF" w:themeColor="background1"/>
+          <w:sz w:val="32"/>
+          <w:szCs w:val="32"/>
+          <w:highlight w:val="blue"/>
+          <w:u w:val="single"/>
+          <w:lang w:val="en-PK"/>
+        </w:rPr>
+      </w:pPr>
+      <w:r>
+        <w:rPr>
+          <w:b/>
+          <w:bCs/>
+          <w:color w:val="FFFFFF" w:themeColor="background1"/>
+          <w:sz w:val="32"/>
+          <w:szCs w:val="32"/>
+          <w:highlight w:val="blue"/>
+          <w:u w:val="single"/>
+          <w:lang w:val="en-PK"/>
+        </w:rPr>
+        <w:t>Assets turnover</w:t>
+      </w:r>
+      <w:r>
+        <w:rPr>
+          <w:b/>
+          <w:bCs/>
+          <w:color w:val="FFFFFF" w:themeColor="background1"/>
+          <w:sz w:val="32"/>
+          <w:szCs w:val="32"/>
+          <w:highlight w:val="blue"/>
+          <w:u w:val="single"/>
+          <w:lang w:val="en-PK"/>
+        </w:rPr>
+        <w:t>:</w:t>
+      </w:r>
+      <w:r>
+        <w:rPr>
+          <w:b/>
+          <w:bCs/>
+          <w:color w:val="FFFFFF" w:themeColor="background1"/>
+          <w:sz w:val="32"/>
+          <w:szCs w:val="32"/>
+          <w:highlight w:val="blue"/>
+          <w:u w:val="single"/>
+          <w:lang w:val="en-PK"/>
+        </w:rPr>
+        <w:t xml:space="preserve">   (WILL DO IT LATER !!!!!!!!!!!!!!!!!!!!!!!!!!!!!!!!!!!)</w:t>
+      </w:r>
+    </w:p>
+    <w:p>
+      <w:pPr>
+        <w:ind w:left="360"/>
+        <w:rPr>
+          <w:color w:val="FFFFFF" w:themeColor="background1"/>
+          <w:highlight w:val="blue"/>
+          <w:lang w:val="en-PK"/>
+        </w:rPr>
+      </w:pPr>
+      <w:r>
+        <w:rPr>
+          <w:color w:val="FFFFFF" w:themeColor="background1"/>
+          <w:highlight w:val="blue"/>
+          <w:lang w:val="en-PK"/>
+        </w:rPr>
+        <w:t>Shows how efficiently company uses its assets to generate sales or revenue</w:t>
+      </w:r>
+      <w:r>
+        <w:rPr>
+          <w:color w:val="FFFFFF" w:themeColor="background1"/>
+          <w:highlight w:val="blue"/>
+          <w:lang w:val="en-PK"/>
+        </w:rPr>
+        <w:t>.</w:t>
+      </w:r>
+      <w:r>
+        <w:rPr>
+          <w:color w:val="FFFFFF" w:themeColor="background1"/>
+          <w:highlight w:val="blue"/>
+          <w:lang w:val="en-PK"/>
+        </w:rPr>
+        <w:t xml:space="preserve"> </w:t>
+      </w:r>
+    </w:p>
+    <w:p>
+      <w:pPr>
+        <w:ind w:left="360"/>
+        <w:rPr>
+          <w:color w:val="FFFFFF" w:themeColor="background1"/>
+          <w:highlight w:val="blue"/>
+          <w:lang w:val="en-PK"/>
+        </w:rPr>
+      </w:pPr>
+      <w:r>
+        <w:rPr>
+          <w:color w:val="FFFFFF" w:themeColor="background1"/>
+          <w:highlight w:val="blue"/>
+          <w:lang w:val="en-PK"/>
+        </w:rPr>
+        <w:lastRenderedPageBreak/>
+        <w:t xml:space="preserve">Assets turnover = sales or revenue / assets </w:t>
+      </w:r>
+    </w:p>
+    <w:p>
+      <w:pPr>
+        <w:ind w:left="360"/>
+        <w:rPr>
+          <w:color w:val="FFFFFF" w:themeColor="background1"/>
+          <w:highlight w:val="blue"/>
+          <w:lang w:val="en-PK"/>
+        </w:rPr>
+      </w:pPr>
+      <w:proofErr w:type="spellStart"/>
+      <w:r>
+        <w:rPr>
+          <w:color w:val="FFFFFF" w:themeColor="background1"/>
+          <w:highlight w:val="blue"/>
+          <w:lang w:val="en-PK"/>
+        </w:rPr>
+        <w:t>Matlab</w:t>
+      </w:r>
+      <w:proofErr w:type="spellEnd"/>
+      <w:r>
+        <w:rPr>
+          <w:color w:val="FFFFFF" w:themeColor="background1"/>
+          <w:highlight w:val="blue"/>
+          <w:lang w:val="en-PK"/>
+        </w:rPr>
+        <w:t xml:space="preserve"> hr 1$ assets pr company n </w:t>
+      </w:r>
+      <w:proofErr w:type="spellStart"/>
+      <w:r>
+        <w:rPr>
+          <w:color w:val="FFFFFF" w:themeColor="background1"/>
+          <w:highlight w:val="blue"/>
+          <w:lang w:val="en-PK"/>
+        </w:rPr>
+        <w:t>kitna</w:t>
+      </w:r>
+      <w:proofErr w:type="spellEnd"/>
+      <w:r>
+        <w:rPr>
+          <w:color w:val="FFFFFF" w:themeColor="background1"/>
+          <w:highlight w:val="blue"/>
+          <w:lang w:val="en-PK"/>
+        </w:rPr>
+        <w:t xml:space="preserve"> revenue generate kia</w:t>
+      </w:r>
+    </w:p>
+    <w:p>
+      <w:pPr>
+        <w:ind w:left="360"/>
+        <w:rPr>
+          <w:color w:val="FFFFFF" w:themeColor="background1"/>
+          <w:lang w:val="en-PK"/>
+        </w:rPr>
+      </w:pPr>
+      <w:r>
+        <w:rPr>
+          <w:color w:val="FFFFFF" w:themeColor="background1"/>
+          <w:highlight w:val="blue"/>
+          <w:lang w:val="en-PK"/>
+        </w:rPr>
+        <w:t>High value indicates that a company is using assets efficiently,, if a company have sales of 50,000 and assets of 25,000 then assets turnover = 2, means every 1$ of assets, the company is generating 2$ of revenue.</w:t>
+      </w:r>
+    </w:p>
+    <w:p>
+      <w:pPr>
+        <w:ind w:left="360"/>
+        <w:rPr>
+          <w:b/>
+          <w:bCs/>
+          <w:sz w:val="32"/>
+          <w:szCs w:val="32"/>
+          <w:u w:val="single"/>
+          <w:lang w:val="en-PK"/>
+        </w:rPr>
+      </w:pPr>
+      <w:r>
+        <w:rPr>
+          <w:b/>
+          <w:bCs/>
+          <w:sz w:val="32"/>
+          <w:szCs w:val="32"/>
+          <w:u w:val="single"/>
+          <w:lang w:val="en-PK"/>
+        </w:rPr>
+        <w:t>Return over capital employed (ROCE)</w:t>
+      </w:r>
+      <w:r>
+        <w:rPr>
+          <w:b/>
+          <w:bCs/>
+          <w:sz w:val="32"/>
+          <w:szCs w:val="32"/>
+          <w:u w:val="single"/>
+          <w:lang w:val="en-PK"/>
+        </w:rPr>
+        <w:t>:</w:t>
+      </w:r>
+    </w:p>
+    <w:p>
+      <w:pPr>
+        <w:ind w:left="360"/>
+        <w:rPr>
+          <w:lang w:val="en-PK"/>
+        </w:rPr>
+      </w:pPr>
+      <w:r>
+        <w:rPr>
+          <w:lang w:val="en-PK"/>
+        </w:rPr>
+        <w:t>Tells how efficiently a company uses its cap</w:t>
+      </w:r>
+      <w:r>
+        <w:rPr>
+          <w:lang w:val="en-PK"/>
+        </w:rPr>
+        <w:t>it</w:t>
+      </w:r>
+      <w:r>
+        <w:rPr>
+          <w:lang w:val="en-PK"/>
+        </w:rPr>
+        <w:t>al to generate profit</w:t>
+      </w:r>
+      <w:r>
+        <w:rPr>
+          <w:lang w:val="en-PK"/>
+        </w:rPr>
+        <w:t xml:space="preserve">. </w:t>
+      </w:r>
+    </w:p>
+    <w:p>
+      <w:pPr>
+        <w:ind w:left="360"/>
+        <w:rPr>
+          <w:lang w:val="en-PK"/>
+        </w:rPr>
+      </w:pPr>
+      <w:r>
+        <w:rPr>
+          <w:lang w:val="en-PK"/>
+        </w:rPr>
+        <w:t xml:space="preserve">Means 1$ jo company n invest kia us m s </w:t>
+      </w:r>
+      <w:proofErr w:type="spellStart"/>
+      <w:r>
+        <w:rPr>
+          <w:lang w:val="en-PK"/>
+        </w:rPr>
+        <w:t>kitna</w:t>
+      </w:r>
+      <w:proofErr w:type="spellEnd"/>
+      <w:r>
+        <w:rPr>
+          <w:lang w:val="en-PK"/>
+        </w:rPr>
+        <w:t xml:space="preserve"> profit generate </w:t>
+      </w:r>
+      <w:proofErr w:type="spellStart"/>
+      <w:r>
+        <w:rPr>
+          <w:lang w:val="en-PK"/>
+        </w:rPr>
+        <w:t>hua</w:t>
+      </w:r>
+      <w:proofErr w:type="spellEnd"/>
+    </w:p>
+    <w:p>
+      <w:pPr>
+        <w:ind w:left="360"/>
+        <w:rPr>
+          <w:lang w:val="en-PK"/>
+        </w:rPr>
+      </w:pPr>
+      <w:r>
+        <w:rPr>
+          <w:lang w:val="en-PK"/>
+        </w:rPr>
+        <w:t xml:space="preserve">ROCE = Operating profit /capital employed </w:t>
+      </w:r>
+    </w:p>
+    <w:p>
+      <w:pPr>
+        <w:ind w:left="360"/>
+        <w:rPr>
+          <w:lang w:val="en-PK"/>
+        </w:rPr>
+      </w:pPr>
+      <w:r>
+        <w:rPr>
+          <w:lang w:val="en-PK"/>
+        </w:rPr>
+        <w:t>You already know operating profit and capital employed is</w:t>
+      </w:r>
+      <w:r>
+        <w:rPr>
+          <w:lang w:val="en-PK"/>
+        </w:rPr>
+        <w:t xml:space="preserve"> the total money used to run the </w:t>
+      </w:r>
+      <w:proofErr w:type="spellStart"/>
+      <w:r>
+        <w:rPr>
+          <w:lang w:val="en-PK"/>
+        </w:rPr>
+        <w:t>businesss</w:t>
+      </w:r>
+      <w:proofErr w:type="spellEnd"/>
+      <w:r>
+        <w:rPr>
+          <w:lang w:val="en-PK"/>
+        </w:rPr>
+        <w:t xml:space="preserve"> and it can be</w:t>
+      </w:r>
+      <w:r>
+        <w:rPr>
+          <w:lang w:val="en-PK"/>
+        </w:rPr>
+        <w:t xml:space="preserve"> </w:t>
+      </w:r>
+      <w:r>
+        <w:rPr>
+          <w:lang w:val="en-PK"/>
+        </w:rPr>
+        <w:t>(</w:t>
+      </w:r>
+      <w:r>
+        <w:rPr>
+          <w:lang w:val="en-PK"/>
+        </w:rPr>
+        <w:t>equity + long-term debts</w:t>
+      </w:r>
+      <w:r>
+        <w:rPr>
+          <w:lang w:val="en-PK"/>
+        </w:rPr>
+        <w:t>) or (assets – liabilities )</w:t>
+      </w:r>
+      <w:r>
+        <w:rPr>
+          <w:lang w:val="en-PK"/>
+        </w:rPr>
+        <w:t xml:space="preserve">, we will use first formula </w:t>
+      </w:r>
+      <w:r>
+        <w:rPr>
+          <w:lang w:val="en-PK"/>
+        </w:rPr>
+        <w:t xml:space="preserve"> </w:t>
+      </w:r>
+    </w:p>
+    <w:p>
+      <w:pPr>
+        <w:ind w:left="360"/>
+        <w:rPr>
+          <w:lang w:val="en-PK"/>
+        </w:rPr>
+      </w:pPr>
+      <w:proofErr w:type="spellStart"/>
+      <w:r>
+        <w:rPr>
+          <w:lang w:val="en-PK"/>
+        </w:rPr>
+        <w:t>Conceptualy</w:t>
+      </w:r>
+      <w:proofErr w:type="spellEnd"/>
+      <w:r>
+        <w:rPr>
+          <w:lang w:val="en-PK"/>
+        </w:rPr>
+        <w:t xml:space="preserve"> it combines 2 things: </w:t>
+      </w:r>
+      <w:r>
+        <w:rPr>
+          <w:b/>
+          <w:bCs/>
+          <w:u w:val="single"/>
+          <w:lang w:val="en-PK"/>
+        </w:rPr>
+        <w:t>profit margin x assets turnover</w:t>
+      </w:r>
+      <w:r>
+        <w:rPr>
+          <w:b/>
+          <w:bCs/>
+          <w:u w:val="single"/>
+          <w:lang w:val="en-PK"/>
+        </w:rPr>
+        <w:t xml:space="preserve"> </w:t>
+      </w:r>
+      <w:r>
+        <w:rPr>
+          <w:lang w:val="en-PK"/>
+        </w:rPr>
+        <w:t xml:space="preserve"> and we can increase ROCE by increasing profit margin or efficiently using assets. </w:t>
+      </w:r>
+    </w:p>
+    <w:p>
+      <w:pPr>
+        <w:pStyle w:val="ListParagraph"/>
+        <w:numPr>
+          <w:ilvl w:val="0"/>
+          <w:numId w:val="1"/>
+        </w:numPr>
+        <w:rPr>
+          <w:lang w:val="en-PK"/>
+        </w:rPr>
+      </w:pPr>
+      <w:r>
+        <w:rPr>
+          <w:lang w:val="en-PK"/>
+        </w:rPr>
+        <w:t xml:space="preserve">We have calculated capital employed </w:t>
+      </w:r>
+      <w:proofErr w:type="spellStart"/>
+      <w:r>
+        <w:rPr>
+          <w:lang w:val="en-PK"/>
+        </w:rPr>
+        <w:t>commulativbe</w:t>
+      </w:r>
+      <w:proofErr w:type="spellEnd"/>
+      <w:r>
+        <w:rPr>
+          <w:lang w:val="en-PK"/>
+        </w:rPr>
+        <w:t xml:space="preserve"> but operating profit separate because </w:t>
+      </w:r>
+      <w:r>
+        <w:t>We do not use cumulative operating profit because profit belongs to a specific year. Each year has its own profit. However, assets and liabilities represent the total position of the company at a certain time. For example, if the company had 10 debt in 2018 and took 5 more in 2019, then the total debt in 2019 becomes 15. That is why assets and liabilities are considered cumulative values.</w:t>
+      </w:r>
+      <w:r>
+        <w:t xml:space="preserve">,, same case implemented to different rations such as current ratio, quick ratio, gearing ratio  </w:t>
+      </w:r>
+      <w:proofErr w:type="spellStart"/>
+      <w:r>
+        <w:t>etc</w:t>
+      </w:r>
+      <w:proofErr w:type="spellEnd"/>
+      <w:r>
+        <w:t xml:space="preserve"> </w:t>
+      </w:r>
+      <w:proofErr w:type="spellStart"/>
+      <w:r>
+        <w:t>etc</w:t>
+      </w:r>
+      <w:proofErr w:type="spellEnd"/>
+      <w:r>
+        <w:t xml:space="preserve"> k hm n </w:t>
+      </w:r>
+      <w:proofErr w:type="spellStart"/>
+      <w:r>
+        <w:t>commulative</w:t>
+      </w:r>
+      <w:proofErr w:type="spellEnd"/>
+      <w:r>
+        <w:t xml:space="preserve"> q </w:t>
+      </w:r>
+      <w:proofErr w:type="spellStart"/>
+      <w:r>
+        <w:t>liye</w:t>
+      </w:r>
+      <w:proofErr w:type="spellEnd"/>
+      <w:r>
+        <w:t xml:space="preserve"> </w:t>
       </w:r>
     </w:p>
     <w:sectPr>
@@ -13866,7 +15493,7 @@
   <w:style w:type="paragraph" w:default="1" w:styleId="Normal">
     <w:name w:val="Normal"/>
     <w:qFormat/>
-    <w:rsid w:val="00EA4A98"/>
+    <w:rsid w:val="007D4F24"/>
   </w:style>
   <w:style w:type="paragraph" w:styleId="Heading1">
     <w:name w:val="heading 1"/>

</xml_diff>

<commit_message>
created trial balance report
</commit_message>
<xml_diff>
--- a/Complete FINANCIAL REPORTING AND FINANCIAL ANALYSIS USING POWER BI.docx
+++ b/Complete FINANCIAL REPORTING AND FINANCIAL ANALYSIS USING POWER BI.docx
@@ -451,7 +451,15 @@
       </w:r>
       <w:proofErr w:type="spellEnd"/>
       <w:r>
-        <w:t xml:space="preserve"> amount sales s generate </w:t>
+        <w:t xml:space="preserve"> amount sales s </w:t>
+      </w:r>
+      <w:proofErr w:type="gramStart"/>
+      <w:r>
+        <w:t>generate</w:t>
+      </w:r>
+      <w:proofErr w:type="gramEnd"/>
+      <w:r>
+        <w:t xml:space="preserve"> </w:t>
       </w:r>
       <w:proofErr w:type="spellStart"/>
       <w:r>
@@ -599,7 +607,15 @@
       </w:r>
       <w:proofErr w:type="spellEnd"/>
       <w:r>
-        <w:t xml:space="preserve"> do to hierarchy create ho </w:t>
+        <w:t xml:space="preserve"> </w:t>
+      </w:r>
+      <w:proofErr w:type="gramStart"/>
+      <w:r>
+        <w:t>do</w:t>
+      </w:r>
+      <w:proofErr w:type="gramEnd"/>
+      <w:r>
+        <w:t xml:space="preserve"> to hierarchy create ho </w:t>
       </w:r>
       <w:proofErr w:type="spellStart"/>
       <w:r>
@@ -723,6 +739,7 @@
         <w:t xml:space="preserve"> </w:t>
       </w:r>
       <w:proofErr w:type="spellStart"/>
+      <w:proofErr w:type="gramStart"/>
       <w:r>
         <w:t>etc</w:t>
       </w:r>
@@ -731,7 +748,11 @@
         <w:t xml:space="preserve"> </w:t>
       </w:r>
       <w:r>
-        <w:t xml:space="preserve">. NOW we have 3 years, </w:t>
+        <w:t>.</w:t>
+      </w:r>
+      <w:proofErr w:type="gramEnd"/>
+      <w:r>
+        <w:t xml:space="preserve"> NOW we have 3 years, </w:t>
       </w:r>
       <w:r>
         <w:t>then</w:t>
@@ -1569,10 +1590,18 @@
       </w:r>
       <w:proofErr w:type="spellEnd"/>
       <w:r>
-        <w:t xml:space="preserve"> khud hi mil jay ga </w:t>
-      </w:r>
-      <w:r>
-        <w:t xml:space="preserve">,, </w:t>
+        <w:t xml:space="preserve"> khud hi mil jay </w:t>
+      </w:r>
+      <w:proofErr w:type="gramStart"/>
+      <w:r>
+        <w:t xml:space="preserve">ga </w:t>
+      </w:r>
+      <w:r>
+        <w:t>,</w:t>
+      </w:r>
+      <w:proofErr w:type="gramEnd"/>
+      <w:r>
+        <w:t xml:space="preserve">, </w:t>
       </w:r>
       <w:proofErr w:type="spellStart"/>
       <w:r>
@@ -1668,7 +1697,15 @@
       </w:r>
       <w:proofErr w:type="spellEnd"/>
       <w:r>
-        <w:t xml:space="preserve"> ga,, ab TRADING ACCOUNT ki total amount ko </w:t>
+        <w:t xml:space="preserve"> </w:t>
+      </w:r>
+      <w:proofErr w:type="gramStart"/>
+      <w:r>
+        <w:t>ga,,</w:t>
+      </w:r>
+      <w:proofErr w:type="gramEnd"/>
+      <w:r>
+        <w:t xml:space="preserve"> ab TRADING ACCOUNT ki total amount ko </w:t>
       </w:r>
       <w:proofErr w:type="spellStart"/>
       <w:r>
@@ -2587,7 +2624,15 @@
       </w:r>
       <w:proofErr w:type="spellEnd"/>
       <w:r>
-        <w:t xml:space="preserve"> k )) </w:t>
+        <w:t xml:space="preserve"> </w:t>
+      </w:r>
+      <w:proofErr w:type="gramStart"/>
+      <w:r>
+        <w:t>k )</w:t>
+      </w:r>
+      <w:proofErr w:type="gramEnd"/>
+      <w:r>
+        <w:t xml:space="preserve">) </w:t>
       </w:r>
       <w:proofErr w:type="spellStart"/>
       <w:r>
@@ -2774,12 +2819,17 @@
         <w:t xml:space="preserve"> other values such as cost of sales and other expenses minus hon </w:t>
       </w:r>
       <w:proofErr w:type="spellStart"/>
+      <w:proofErr w:type="gramStart"/>
       <w:r>
         <w:t>gy</w:t>
       </w:r>
       <w:proofErr w:type="spellEnd"/>
       <w:r>
-        <w:t xml:space="preserve"> , </w:t>
+        <w:t xml:space="preserve"> ,</w:t>
+      </w:r>
+      <w:proofErr w:type="gramEnd"/>
+      <w:r>
+        <w:t xml:space="preserve"> </w:t>
       </w:r>
       <w:proofErr w:type="spellStart"/>
       <w:r>
@@ -3143,7 +3193,15 @@
       </w:r>
       <w:proofErr w:type="spellEnd"/>
       <w:r>
-        <w:t xml:space="preserve"> s  operating profit </w:t>
+        <w:t xml:space="preserve"> </w:t>
+      </w:r>
+      <w:proofErr w:type="gramStart"/>
+      <w:r>
+        <w:t>s  operating</w:t>
+      </w:r>
+      <w:proofErr w:type="gramEnd"/>
+      <w:r>
+        <w:t xml:space="preserve"> profit </w:t>
       </w:r>
       <w:proofErr w:type="spellStart"/>
       <w:r>
@@ -3548,12 +3606,17 @@
         <w:t xml:space="preserve"> just </w:t>
       </w:r>
       <w:proofErr w:type="spellStart"/>
+      <w:proofErr w:type="gramStart"/>
       <w:r>
         <w:t>Amortisation</w:t>
       </w:r>
       <w:proofErr w:type="spellEnd"/>
       <w:r>
-        <w:t xml:space="preserve">  and Depreciation ko </w:t>
+        <w:t xml:space="preserve">  and</w:t>
+      </w:r>
+      <w:proofErr w:type="gramEnd"/>
+      <w:r>
+        <w:t xml:space="preserve"> Depreciation ko </w:t>
       </w:r>
       <w:proofErr w:type="spellStart"/>
       <w:r>
@@ -3585,7 +3648,15 @@
       </w:r>
       <w:proofErr w:type="spellEnd"/>
       <w:r>
-        <w:t xml:space="preserve"> (EBIT + A&amp;D  EBITDA)</w:t>
+        <w:t xml:space="preserve"> (EBIT + A&amp;</w:t>
+      </w:r>
+      <w:proofErr w:type="gramStart"/>
+      <w:r>
+        <w:t>D  EBITDA</w:t>
+      </w:r>
+      <w:proofErr w:type="gramEnd"/>
+      <w:r>
+        <w:t>)</w:t>
       </w:r>
       <w:r>
         <w:t xml:space="preserve">, </w:t>
@@ -3876,14 +3947,30 @@
           <w:highlight w:val="yellow"/>
           <w:lang w:val="en-PK"/>
         </w:rPr>
-        <w:t>PBT – Interest and Tax  = Net profit (</w:t>
-      </w:r>
-      <w:proofErr w:type="spellStart"/>
+        <w:t xml:space="preserve">PBT – Interest and </w:t>
+      </w:r>
+      <w:proofErr w:type="gramStart"/>
       <w:r>
         <w:rPr>
           <w:highlight w:val="yellow"/>
           <w:lang w:val="en-PK"/>
         </w:rPr>
+        <w:t>Tax  =</w:t>
+      </w:r>
+      <w:proofErr w:type="gramEnd"/>
+      <w:r>
+        <w:rPr>
+          <w:highlight w:val="yellow"/>
+          <w:lang w:val="en-PK"/>
+        </w:rPr>
+        <w:t xml:space="preserve"> Net profit (</w:t>
+      </w:r>
+      <w:proofErr w:type="spellStart"/>
+      <w:r>
+        <w:rPr>
+          <w:highlight w:val="yellow"/>
+          <w:lang w:val="en-PK"/>
+        </w:rPr>
         <w:t>yani</w:t>
       </w:r>
       <w:proofErr w:type="spellEnd"/>
@@ -3906,20 +3993,36 @@
           <w:highlight w:val="yellow"/>
           <w:lang w:val="en-PK"/>
         </w:rPr>
-        <w:t xml:space="preserve"> – other non-operating expenses </w:t>
-      </w:r>
+        <w:t xml:space="preserve"> – other non-operating </w:t>
+      </w:r>
+      <w:proofErr w:type="gramStart"/>
       <w:r>
         <w:rPr>
           <w:highlight w:val="yellow"/>
           <w:lang w:val="en-PK"/>
         </w:rPr>
-        <w:t xml:space="preserve"> = Net Profit</w:t>
+        <w:t xml:space="preserve">expenses </w:t>
       </w:r>
       <w:r>
         <w:rPr>
           <w:highlight w:val="yellow"/>
           <w:lang w:val="en-PK"/>
         </w:rPr>
+        <w:t xml:space="preserve"> =</w:t>
+      </w:r>
+      <w:proofErr w:type="gramEnd"/>
+      <w:r>
+        <w:rPr>
+          <w:highlight w:val="yellow"/>
+          <w:lang w:val="en-PK"/>
+        </w:rPr>
+        <w:t xml:space="preserve"> Net Profit</w:t>
+      </w:r>
+      <w:r>
+        <w:rPr>
+          <w:highlight w:val="yellow"/>
+          <w:lang w:val="en-PK"/>
+        </w:rPr>
         <w:t xml:space="preserve">) </w:t>
       </w:r>
     </w:p>
@@ -3982,7 +4085,23 @@
           <w:highlight w:val="yellow"/>
           <w:lang w:val="en-PK"/>
         </w:rPr>
-        <w:t>Revenue – COGS = Gross Profit – Operating Expenses (including D&amp;A) = EBIT ± Non-operating items = Profit Before Tax – Tax = Net Profit</w:t>
+        <w:t xml:space="preserve">Revenue – COGS = Gross Profit – Operating Expenses (including D&amp;A) = EBIT ± </w:t>
+      </w:r>
+      <w:proofErr w:type="gramStart"/>
+      <w:r>
+        <w:rPr>
+          <w:highlight w:val="yellow"/>
+          <w:lang w:val="en-PK"/>
+        </w:rPr>
+        <w:t>Non-operating</w:t>
+      </w:r>
+      <w:proofErr w:type="gramEnd"/>
+      <w:r>
+        <w:rPr>
+          <w:highlight w:val="yellow"/>
+          <w:lang w:val="en-PK"/>
+        </w:rPr>
+        <w:t xml:space="preserve"> items = Profit Before Tax – Tax = Net Profit</w:t>
       </w:r>
     </w:p>
     <w:p>
@@ -4203,16 +4322,40 @@
         </w:numPr>
       </w:pPr>
       <w:r>
-        <w:t xml:space="preserve">Interest and tax is </w:t>
+        <w:t xml:space="preserve">Interest and tax </w:t>
+      </w:r>
+      <w:proofErr w:type="gramStart"/>
+      <w:r>
+        <w:t>is</w:t>
+      </w:r>
+      <w:proofErr w:type="gramEnd"/>
+      <w:r>
+        <w:t xml:space="preserve"> </w:t>
       </w:r>
       <w:r>
         <w:t>generally considered a</w:t>
       </w:r>
       <w:r>
-        <w:t xml:space="preserve"> part of non-operating expenses </w:t>
-      </w:r>
-      <w:r>
-        <w:t xml:space="preserve">, but sometimes they can be different , </w:t>
+        <w:t xml:space="preserve"> part of non-operating </w:t>
+      </w:r>
+      <w:proofErr w:type="gramStart"/>
+      <w:r>
+        <w:t xml:space="preserve">expenses </w:t>
+      </w:r>
+      <w:r>
+        <w:t>,</w:t>
+      </w:r>
+      <w:proofErr w:type="gramEnd"/>
+      <w:r>
+        <w:t xml:space="preserve"> but sometimes they can be </w:t>
+      </w:r>
+      <w:proofErr w:type="gramStart"/>
+      <w:r>
+        <w:t>different ,</w:t>
+      </w:r>
+      <w:proofErr w:type="gramEnd"/>
+      <w:r>
+        <w:t xml:space="preserve"> </w:t>
       </w:r>
       <w:proofErr w:type="spellStart"/>
       <w:r>
@@ -4250,12 +4393,25 @@
         <w:t xml:space="preserve">The yellow ones are actually the lecture from </w:t>
       </w:r>
       <w:proofErr w:type="spellStart"/>
+      <w:proofErr w:type="gramStart"/>
       <w:r>
         <w:t>udemy</w:t>
       </w:r>
       <w:proofErr w:type="spellEnd"/>
       <w:r>
-        <w:t xml:space="preserve"> , but in reality and in most cases, EBIT AND PBIT are same and the different thing is PBT (Profit before TAX), the complete process is that revenue – COGS = Gross profit – operating expenses = </w:t>
+        <w:t xml:space="preserve"> ,</w:t>
+      </w:r>
+      <w:proofErr w:type="gramEnd"/>
+      <w:r>
+        <w:t xml:space="preserve"> but in </w:t>
+      </w:r>
+      <w:proofErr w:type="gramStart"/>
+      <w:r>
+        <w:t>reality</w:t>
+      </w:r>
+      <w:proofErr w:type="gramEnd"/>
+      <w:r>
+        <w:t xml:space="preserve"> and in most cases, EBIT AND PBIT are same and the different thing is PBT (Profit before TAX), the complete process is that revenue – COGS = Gross profit – operating expenses = </w:t>
       </w:r>
       <w:r>
         <w:t>PBIT/</w:t>
@@ -4396,7 +4552,21 @@
         <w:rPr>
           <w:lang w:val="en-PK"/>
         </w:rPr>
-        <w:t xml:space="preserve">PBIT = CALCULATE(SUM(GL[Amount]), 'Chart of Accounts'[Class] IN {"Trading account", "Operating account", "Non-operating"}) </w:t>
+        <w:t>PBIT = CALCULATE(SUM(GL[Amount]), 'Chart of Accounts'[Class] IN {"Trading account", "Operating account", "</w:t>
+      </w:r>
+      <w:proofErr w:type="gramStart"/>
+      <w:r>
+        <w:rPr>
+          <w:lang w:val="en-PK"/>
+        </w:rPr>
+        <w:t>Non-operating</w:t>
+      </w:r>
+      <w:proofErr w:type="gramEnd"/>
+      <w:r>
+        <w:rPr>
+          <w:lang w:val="en-PK"/>
+        </w:rPr>
+        <w:t xml:space="preserve">"}) </w:t>
       </w:r>
     </w:p>
     <w:p>
@@ -4774,7 +4944,15 @@
       </w:r>
       <w:proofErr w:type="spellEnd"/>
       <w:r>
-        <w:t xml:space="preserve"> year are same, it start from January to December)</w:t>
+        <w:t xml:space="preserve"> year are same, it </w:t>
+      </w:r>
+      <w:proofErr w:type="gramStart"/>
+      <w:r>
+        <w:t>start</w:t>
+      </w:r>
+      <w:proofErr w:type="gramEnd"/>
+      <w:r>
+        <w:t xml:space="preserve"> from January to December)</w:t>
       </w:r>
       <w:r>
         <w:t>,</w:t>
@@ -4785,13 +4963,21 @@
         <w:ind w:left="360"/>
       </w:pPr>
       <w:r>
-        <w:t xml:space="preserve">Means according to financial or fiscal year, the </w:t>
-      </w:r>
-      <w:r>
-        <w:t xml:space="preserve"> </w:t>
-      </w:r>
-      <w:r>
-        <w:t xml:space="preserve">fiscal month of January is 7 (we are considering Pakistani fiscal/financial year that start from </w:t>
+        <w:t xml:space="preserve">Means according to financial or fiscal year, </w:t>
+      </w:r>
+      <w:proofErr w:type="gramStart"/>
+      <w:r>
+        <w:t xml:space="preserve">the </w:t>
+      </w:r>
+      <w:r>
+        <w:t xml:space="preserve"> </w:t>
+      </w:r>
+      <w:r>
+        <w:t>fiscal</w:t>
+      </w:r>
+      <w:proofErr w:type="gramEnd"/>
+      <w:r>
+        <w:t xml:space="preserve"> month of January is 7 (we are considering Pakistani fiscal/financial year that start from </w:t>
       </w:r>
       <w:r>
         <w:t>1</w:t>
@@ -4831,7 +5017,15 @@
         <w:t xml:space="preserve"> year and fiscal year, we can do it in excel and in power BI as well,</w:t>
       </w:r>
       <w:r>
-        <w:t xml:space="preserve"> for POWER BI, we created a new file named DATE HANDLING , </w:t>
+        <w:t xml:space="preserve"> for POWER BI, we created a new file named DATE </w:t>
+      </w:r>
+      <w:proofErr w:type="gramStart"/>
+      <w:r>
+        <w:t>HANDLING ,</w:t>
+      </w:r>
+      <w:proofErr w:type="gramEnd"/>
+      <w:r>
+        <w:t xml:space="preserve"> </w:t>
       </w:r>
       <w:proofErr w:type="spellStart"/>
       <w:r>
@@ -4845,7 +5039,15 @@
         <w:t xml:space="preserve">C drive k </w:t>
       </w:r>
       <w:r>
-        <w:t xml:space="preserve">folder m hi ,, </w:t>
+        <w:t xml:space="preserve">folder m </w:t>
+      </w:r>
+      <w:proofErr w:type="gramStart"/>
+      <w:r>
+        <w:t>hi ,</w:t>
+      </w:r>
+      <w:proofErr w:type="gramEnd"/>
+      <w:r>
+        <w:t xml:space="preserve">, </w:t>
       </w:r>
     </w:p>
     <w:p>
@@ -4888,7 +5090,51 @@
           <w:iCs/>
           <w:u w:val="single"/>
         </w:rPr>
-        <w:t xml:space="preserve"> CALENDER() AND CALENDERAUTO()</w:t>
+        <w:t xml:space="preserve"> </w:t>
+      </w:r>
+      <w:proofErr w:type="gramStart"/>
+      <w:r>
+        <w:rPr>
+          <w:b/>
+          <w:bCs/>
+          <w:i/>
+          <w:iCs/>
+          <w:u w:val="single"/>
+        </w:rPr>
+        <w:t>CALENDER(</w:t>
+      </w:r>
+      <w:proofErr w:type="gramEnd"/>
+      <w:r>
+        <w:rPr>
+          <w:b/>
+          <w:bCs/>
+          <w:i/>
+          <w:iCs/>
+          <w:u w:val="single"/>
+        </w:rPr>
+        <w:t xml:space="preserve">) AND </w:t>
+      </w:r>
+      <w:proofErr w:type="gramStart"/>
+      <w:r>
+        <w:rPr>
+          <w:b/>
+          <w:bCs/>
+          <w:i/>
+          <w:iCs/>
+          <w:u w:val="single"/>
+        </w:rPr>
+        <w:t>CALENDERAUTO(</w:t>
+      </w:r>
+      <w:proofErr w:type="gramEnd"/>
+      <w:r>
+        <w:rPr>
+          <w:b/>
+          <w:bCs/>
+          <w:i/>
+          <w:iCs/>
+          <w:u w:val="single"/>
+        </w:rPr>
+        <w:t>)</w:t>
       </w:r>
     </w:p>
     <w:p>
@@ -4896,12 +5142,17 @@
         <w:ind w:left="360"/>
       </w:pPr>
       <w:proofErr w:type="spellStart"/>
+      <w:proofErr w:type="gramStart"/>
       <w:r>
         <w:t>Calenderauto</w:t>
       </w:r>
       <w:proofErr w:type="spellEnd"/>
       <w:r>
-        <w:t xml:space="preserve">() s ek new table </w:t>
+        <w:t>(</w:t>
+      </w:r>
+      <w:proofErr w:type="gramEnd"/>
+      <w:r>
+        <w:t xml:space="preserve">) s ek new table </w:t>
       </w:r>
       <w:proofErr w:type="spellStart"/>
       <w:r>
@@ -5059,7 +5310,15 @@
       </w:r>
       <w:proofErr w:type="spellEnd"/>
       <w:r>
-        <w:t xml:space="preserve"> to we can use CALENDER() function and manually pass dates like</w:t>
+        <w:t xml:space="preserve"> to we can use </w:t>
+      </w:r>
+      <w:proofErr w:type="gramStart"/>
+      <w:r>
+        <w:t>CALENDER(</w:t>
+      </w:r>
+      <w:proofErr w:type="gramEnd"/>
+      <w:r>
+        <w:t>) function and manually pass dates like</w:t>
       </w:r>
       <w:r>
         <w:rPr>
@@ -5085,13 +5344,55 @@
         <w:rPr>
           <w:lang w:val="en-PK"/>
         </w:rPr>
-        <w:t>Table = CALENDAR(DATE(2018,01,01), DATE(2020, 01,01))</w:t>
-      </w:r>
-      <w:r>
-        <w:rPr>
-          <w:lang w:val="en-PK"/>
-        </w:rPr>
-        <w:t xml:space="preserve">,,  This is </w:t>
+        <w:t>Table = CALENDAR(</w:t>
+      </w:r>
+      <w:proofErr w:type="gramStart"/>
+      <w:r>
+        <w:rPr>
+          <w:lang w:val="en-PK"/>
+        </w:rPr>
+        <w:t>DATE(</w:t>
+      </w:r>
+      <w:proofErr w:type="gramEnd"/>
+      <w:r>
+        <w:rPr>
+          <w:lang w:val="en-PK"/>
+        </w:rPr>
+        <w:t xml:space="preserve">2018,01,01), </w:t>
+      </w:r>
+      <w:proofErr w:type="gramStart"/>
+      <w:r>
+        <w:rPr>
+          <w:lang w:val="en-PK"/>
+        </w:rPr>
+        <w:t>DATE(</w:t>
+      </w:r>
+      <w:proofErr w:type="gramEnd"/>
+      <w:r>
+        <w:rPr>
+          <w:lang w:val="en-PK"/>
+        </w:rPr>
+        <w:t>2020, 01,</w:t>
+      </w:r>
+      <w:proofErr w:type="gramStart"/>
+      <w:r>
+        <w:rPr>
+          <w:lang w:val="en-PK"/>
+        </w:rPr>
+        <w:t>01))</w:t>
+      </w:r>
+      <w:r>
+        <w:rPr>
+          <w:lang w:val="en-PK"/>
+        </w:rPr>
+        <w:t>,,</w:t>
+      </w:r>
+      <w:proofErr w:type="gramEnd"/>
+      <w:r>
+        <w:rPr>
+          <w:lang w:val="en-PK"/>
+        </w:rPr>
+        <w:t xml:space="preserve">  This is </w:t>
       </w:r>
       <w:proofErr w:type="spellStart"/>
       <w:r>
@@ -7482,7 +7783,15 @@
           <w:highlight w:val="yellow"/>
           <w:lang w:val="en-PK"/>
         </w:rPr>
-        <w:t xml:space="preserve">    </w:t>
+        <w:t xml:space="preserve"> </w:t>
+      </w:r>
+      <w:proofErr w:type="gramStart"/>
+      <w:r>
+        <w:rPr>
+          <w:highlight w:val="yellow"/>
+          <w:lang w:val="en-PK"/>
+        </w:rPr>
+        <w:t xml:space="preserve">   </w:t>
       </w:r>
       <w:r>
         <w:rPr>
@@ -7526,7 +7835,16 @@
           <w:highlight w:val="yellow"/>
           <w:lang w:val="en-PK"/>
         </w:rPr>
-        <w:t xml:space="preserve">  means Debit increase Expenses and assets)</w:t>
+        <w:t xml:space="preserve">  means</w:t>
+      </w:r>
+      <w:proofErr w:type="gramEnd"/>
+      <w:r>
+        <w:rPr>
+          <w:color w:val="EE0000"/>
+          <w:highlight w:val="yellow"/>
+          <w:lang w:val="en-PK"/>
+        </w:rPr>
+        <w:t xml:space="preserve"> Debit increase Expenses and assets)</w:t>
       </w:r>
       <w:r>
         <w:rPr>
@@ -8662,21 +8980,7 @@
         <w:rPr>
           <w:lang w:val="en-PK"/>
         </w:rPr>
-        <w:t xml:space="preserve"> </w:t>
-      </w:r>
-      <w:proofErr w:type="spellStart"/>
-      <w:r>
-        <w:rPr>
-          <w:lang w:val="en-PK"/>
-        </w:rPr>
-        <w:t>systme</w:t>
-      </w:r>
-      <w:proofErr w:type="spellEnd"/>
-      <w:r>
-        <w:rPr>
-          <w:lang w:val="en-PK"/>
-        </w:rPr>
-        <w:t xml:space="preserve"> m debit k </w:t>
+        <w:t xml:space="preserve"> systme m debit k </w:t>
       </w:r>
       <w:proofErr w:type="spellStart"/>
       <w:r>
@@ -8946,7 +9250,21 @@
         <w:rPr>
           <w:lang w:val="en-PK"/>
         </w:rPr>
-        <w:t>IF EXPENSES INCREASE THEN IT IS DEBITED AND IF EXPENSES DECREASE THEN IT IS CREDITED, MEANS DEBITED M EXPENSES AND ASSETS INCREASE HITY HN TO YANI CREDITED M Y DONO DECREASE HOTY HN , SAME IS THE CASE WITH CREDITED, CREDIT M JO CHEEZY (REVENUE, LIABILITIES AND EQUITY) INCREASE HOTI H, DEBITED M VO DECREASE HOTY HN</w:t>
+        <w:t xml:space="preserve">IF EXPENSES INCREASE THEN IT IS DEBITED AND IF EXPENSES DECREASE THEN IT IS CREDITED, MEANS DEBITED M EXPENSES AND ASSETS INCREASE HITY HN TO YANI CREDITED M Y DONO DECREASE HOTY </w:t>
+      </w:r>
+      <w:proofErr w:type="gramStart"/>
+      <w:r>
+        <w:rPr>
+          <w:lang w:val="en-PK"/>
+        </w:rPr>
+        <w:t>HN ,</w:t>
+      </w:r>
+      <w:proofErr w:type="gramEnd"/>
+      <w:r>
+        <w:rPr>
+          <w:lang w:val="en-PK"/>
+        </w:rPr>
+        <w:t xml:space="preserve"> SAME IS THE CASE WITH CREDITED, CREDIT M JO CHEEZY (REVENUE, LIABILITIES AND EQUITY) INCREASE HOTI H, DEBITED M VO DECREASE HOTY HN</w:t>
       </w:r>
     </w:p>
     <w:p>
@@ -10286,8 +10604,13 @@
       <w:pPr>
         <w:ind w:left="360"/>
       </w:pPr>
-      <w:r>
-        <w:t xml:space="preserve">ALL() will remove </w:t>
+      <w:proofErr w:type="gramStart"/>
+      <w:r>
+        <w:t>ALL(</w:t>
+      </w:r>
+      <w:proofErr w:type="gramEnd"/>
+      <w:r>
+        <w:t xml:space="preserve">) will remove </w:t>
       </w:r>
       <w:r>
         <w:t>a</w:t>
@@ -10726,11 +11049,19 @@
         <w:lastRenderedPageBreak/>
         <w:t>Assets = Liabilities + equity</w:t>
       </w:r>
-      <w:r>
-        <w:rPr>
-          <w:lang w:val="en-PK"/>
-        </w:rPr>
-        <w:t xml:space="preserve">   (always assets ki amount equal </w:t>
+      <w:proofErr w:type="gramStart"/>
+      <w:r>
+        <w:rPr>
+          <w:lang w:val="en-PK"/>
+        </w:rPr>
+        <w:t xml:space="preserve">   (</w:t>
+      </w:r>
+      <w:proofErr w:type="gramEnd"/>
+      <w:r>
+        <w:rPr>
+          <w:lang w:val="en-PK"/>
+        </w:rPr>
+        <w:t xml:space="preserve">always assets ki amount equal </w:t>
       </w:r>
       <w:proofErr w:type="spellStart"/>
       <w:r>
@@ -10801,6 +11132,7 @@
         <w:t xml:space="preserve"> </w:t>
       </w:r>
       <w:proofErr w:type="spellStart"/>
+      <w:proofErr w:type="gramStart"/>
       <w:r>
         <w:rPr>
           <w:lang w:val="en-PK"/>
@@ -10812,7 +11144,14 @@
         <w:rPr>
           <w:lang w:val="en-PK"/>
         </w:rPr>
-        <w:t xml:space="preserve">,, pie chart m </w:t>
+        <w:t>,,</w:t>
+      </w:r>
+      <w:proofErr w:type="gramEnd"/>
+      <w:r>
+        <w:rPr>
+          <w:lang w:val="en-PK"/>
+        </w:rPr>
+        <w:t xml:space="preserve"> pie chart m </w:t>
       </w:r>
       <w:proofErr w:type="spellStart"/>
       <w:r>
@@ -10868,7 +11207,14 @@
         <w:rPr>
           <w:lang w:val="en-PK"/>
         </w:rPr>
-        <w:t xml:space="preserve"> ay ga </w:t>
+        <w:t xml:space="preserve"> ay </w:t>
+      </w:r>
+      <w:proofErr w:type="gramStart"/>
+      <w:r>
+        <w:rPr>
+          <w:lang w:val="en-PK"/>
+        </w:rPr>
+        <w:t xml:space="preserve">ga </w:t>
       </w:r>
       <w:r>
         <w:rPr>
@@ -10876,6 +11222,7 @@
         </w:rPr>
         <w:t>)</w:t>
       </w:r>
+      <w:proofErr w:type="gramEnd"/>
     </w:p>
     <w:p>
       <w:pPr>
@@ -10898,6 +11245,7 @@
           <w:lang w:val="en-PK"/>
         </w:rPr>
       </w:pPr>
+      <w:proofErr w:type="gramStart"/>
       <w:r>
         <w:rPr>
           <w:lang w:val="en-PK"/>
@@ -10910,41 +11258,22 @@
           <w:bCs/>
           <w:lang w:val="en-PK"/>
         </w:rPr>
-        <w:t>Financial position</w:t>
-      </w:r>
-      <w:r>
-        <w:rPr>
-          <w:lang w:val="en-PK"/>
-        </w:rPr>
-        <w:t xml:space="preserve"> – How strong the company is in terms of assets and debts.</w:t>
-      </w:r>
-    </w:p>
-    <w:p>
-      <w:pPr>
-        <w:ind w:left="360"/>
-        <w:rPr>
-          <w:lang w:val="en-PK"/>
-        </w:rPr>
-      </w:pPr>
-      <w:r>
-        <w:rPr>
-          <w:lang w:val="en-PK"/>
-        </w:rPr>
-        <w:t xml:space="preserve">  </w:t>
-      </w:r>
+        <w:t>Financial</w:t>
+      </w:r>
+      <w:proofErr w:type="gramEnd"/>
       <w:r>
         <w:rPr>
           <w:b/>
           <w:bCs/>
           <w:lang w:val="en-PK"/>
         </w:rPr>
-        <w:t>Liquidity</w:t>
-      </w:r>
-      <w:r>
-        <w:rPr>
-          <w:lang w:val="en-PK"/>
-        </w:rPr>
-        <w:t xml:space="preserve"> – Can the company pay short-term obligations? (Check current assets vs current liabilities).</w:t>
+        <w:t xml:space="preserve"> position</w:t>
+      </w:r>
+      <w:r>
+        <w:rPr>
+          <w:lang w:val="en-PK"/>
+        </w:rPr>
+        <w:t xml:space="preserve"> – How strong the company is in terms of assets and debts.</w:t>
       </w:r>
     </w:p>
     <w:p>
@@ -10954,6 +11283,7 @@
           <w:lang w:val="en-PK"/>
         </w:rPr>
       </w:pPr>
+      <w:proofErr w:type="gramStart"/>
       <w:r>
         <w:rPr>
           <w:lang w:val="en-PK"/>
@@ -10966,13 +11296,14 @@
           <w:bCs/>
           <w:lang w:val="en-PK"/>
         </w:rPr>
-        <w:t>Solvency</w:t>
-      </w:r>
-      <w:r>
-        <w:rPr>
-          <w:lang w:val="en-PK"/>
-        </w:rPr>
-        <w:t xml:space="preserve"> – Can the company meet long-term debts?</w:t>
+        <w:t>Liquidity</w:t>
+      </w:r>
+      <w:proofErr w:type="gramEnd"/>
+      <w:r>
+        <w:rPr>
+          <w:lang w:val="en-PK"/>
+        </w:rPr>
+        <w:t xml:space="preserve"> – Can the company pay short-term obligations? (Check current assets vs current liabilities).</w:t>
       </w:r>
     </w:p>
     <w:p>
@@ -10982,6 +11313,7 @@
           <w:lang w:val="en-PK"/>
         </w:rPr>
       </w:pPr>
+      <w:proofErr w:type="gramStart"/>
       <w:r>
         <w:rPr>
           <w:lang w:val="en-PK"/>
@@ -10994,13 +11326,14 @@
           <w:bCs/>
           <w:lang w:val="en-PK"/>
         </w:rPr>
-        <w:t>Owner’s value</w:t>
-      </w:r>
-      <w:r>
-        <w:rPr>
-          <w:lang w:val="en-PK"/>
-        </w:rPr>
-        <w:t xml:space="preserve"> – How much of the business belongs to the owners vs creditors.</w:t>
+        <w:t>Solvency</w:t>
+      </w:r>
+      <w:proofErr w:type="gramEnd"/>
+      <w:r>
+        <w:rPr>
+          <w:lang w:val="en-PK"/>
+        </w:rPr>
+        <w:t xml:space="preserve"> – Can the company meet long-term debts?</w:t>
       </w:r>
     </w:p>
     <w:p>
@@ -11010,6 +11343,7 @@
           <w:lang w:val="en-PK"/>
         </w:rPr>
       </w:pPr>
+      <w:proofErr w:type="gramStart"/>
       <w:r>
         <w:rPr>
           <w:lang w:val="en-PK"/>
@@ -11022,8 +11356,61 @@
           <w:bCs/>
           <w:lang w:val="en-PK"/>
         </w:rPr>
+        <w:t>Owner’s</w:t>
+      </w:r>
+      <w:proofErr w:type="gramEnd"/>
+      <w:r>
+        <w:rPr>
+          <w:b/>
+          <w:bCs/>
+          <w:lang w:val="en-PK"/>
+        </w:rPr>
+        <w:t xml:space="preserve"> value</w:t>
+      </w:r>
+      <w:r>
+        <w:rPr>
+          <w:lang w:val="en-PK"/>
+        </w:rPr>
+        <w:t xml:space="preserve"> – How much of the business belongs to the </w:t>
+      </w:r>
+      <w:proofErr w:type="gramStart"/>
+      <w:r>
+        <w:rPr>
+          <w:lang w:val="en-PK"/>
+        </w:rPr>
+        <w:t>owners</w:t>
+      </w:r>
+      <w:proofErr w:type="gramEnd"/>
+      <w:r>
+        <w:rPr>
+          <w:lang w:val="en-PK"/>
+        </w:rPr>
+        <w:t xml:space="preserve"> vs creditors.</w:t>
+      </w:r>
+    </w:p>
+    <w:p>
+      <w:pPr>
+        <w:ind w:left="360"/>
+        <w:rPr>
+          <w:lang w:val="en-PK"/>
+        </w:rPr>
+      </w:pPr>
+      <w:proofErr w:type="gramStart"/>
+      <w:r>
+        <w:rPr>
+          <w:lang w:val="en-PK"/>
+        </w:rPr>
+        <w:t xml:space="preserve">  </w:t>
+      </w:r>
+      <w:r>
+        <w:rPr>
+          <w:b/>
+          <w:bCs/>
+          <w:lang w:val="en-PK"/>
+        </w:rPr>
         <w:t>Trends</w:t>
       </w:r>
+      <w:proofErr w:type="gramEnd"/>
       <w:r>
         <w:rPr>
           <w:lang w:val="en-PK"/>
@@ -11723,6 +12110,7 @@
         <w:t xml:space="preserve"> </w:t>
       </w:r>
       <w:proofErr w:type="spellStart"/>
+      <w:proofErr w:type="gramStart"/>
       <w:r>
         <w:rPr>
           <w:lang w:val="en-PK"/>
@@ -11730,6 +12118,7 @@
         <w:t>hn.Following</w:t>
       </w:r>
       <w:proofErr w:type="spellEnd"/>
+      <w:proofErr w:type="gramEnd"/>
       <w:r>
         <w:rPr>
           <w:lang w:val="en-PK"/>
@@ -11780,7 +12169,21 @@
         <w:rPr>
           <w:lang w:val="en-PK"/>
         </w:rPr>
-        <w:t xml:space="preserve"> (medium liquidity),,,,,, </w:t>
+        <w:t xml:space="preserve"> (medium </w:t>
+      </w:r>
+      <w:proofErr w:type="gramStart"/>
+      <w:r>
+        <w:rPr>
+          <w:lang w:val="en-PK"/>
+        </w:rPr>
+        <w:t>liquidity),,,,,,</w:t>
+      </w:r>
+      <w:proofErr w:type="gramEnd"/>
+      <w:r>
+        <w:rPr>
+          <w:lang w:val="en-PK"/>
+        </w:rPr>
+        <w:t xml:space="preserve"> </w:t>
       </w:r>
       <w:r>
         <w:rPr>
@@ -12027,7 +12430,21 @@
           <w:lang w:val="en-PK"/>
         </w:rPr>
         <w:lastRenderedPageBreak/>
-        <w:t>Determines whether a company can pay its short term liabilities using short term assets.</w:t>
+        <w:t xml:space="preserve">Determines whether a company can pay its </w:t>
+      </w:r>
+      <w:proofErr w:type="gramStart"/>
+      <w:r>
+        <w:rPr>
+          <w:lang w:val="en-PK"/>
+        </w:rPr>
+        <w:t>short term</w:t>
+      </w:r>
+      <w:proofErr w:type="gramEnd"/>
+      <w:r>
+        <w:rPr>
+          <w:lang w:val="en-PK"/>
+        </w:rPr>
+        <w:t xml:space="preserve"> liabilities using short term assets.</w:t>
       </w:r>
     </w:p>
     <w:p>
@@ -12055,7 +12472,21 @@
         <w:rPr>
           <w:lang w:val="en-PK"/>
         </w:rPr>
-        <w:t xml:space="preserve">If ratio  = 1, means company have equal assets and liabilities and just </w:t>
+        <w:t xml:space="preserve">If </w:t>
+      </w:r>
+      <w:proofErr w:type="gramStart"/>
+      <w:r>
+        <w:rPr>
+          <w:lang w:val="en-PK"/>
+        </w:rPr>
+        <w:t>ratio  =</w:t>
+      </w:r>
+      <w:proofErr w:type="gramEnd"/>
+      <w:r>
+        <w:rPr>
+          <w:lang w:val="en-PK"/>
+        </w:rPr>
+        <w:t xml:space="preserve"> 1, means company have equal assets and liabilities and just </w:t>
       </w:r>
       <w:proofErr w:type="spellStart"/>
       <w:r>
@@ -12153,7 +12584,21 @@
         <w:rPr>
           <w:lang w:val="en-PK"/>
         </w:rPr>
-        <w:t>If ratio &lt;1 , means company cannot pay current liabilities such as current debts and is in bad condition financially, indicate liquidity problems.</w:t>
+        <w:t>If ratio &lt;</w:t>
+      </w:r>
+      <w:proofErr w:type="gramStart"/>
+      <w:r>
+        <w:rPr>
+          <w:lang w:val="en-PK"/>
+        </w:rPr>
+        <w:t>1 ,</w:t>
+      </w:r>
+      <w:proofErr w:type="gramEnd"/>
+      <w:r>
+        <w:rPr>
+          <w:lang w:val="en-PK"/>
+        </w:rPr>
+        <w:t xml:space="preserve"> means company cannot pay current liabilities such as current debts and is in bad condition financially, indicate liquidity problems.</w:t>
       </w:r>
     </w:p>
     <w:p>
@@ -12396,6 +12841,7 @@
         <w:t xml:space="preserve"> </w:t>
       </w:r>
       <w:proofErr w:type="spellStart"/>
+      <w:proofErr w:type="gramStart"/>
       <w:r>
         <w:rPr>
           <w:lang w:val="en-PK"/>
@@ -12407,7 +12853,28 @@
         <w:rPr>
           <w:lang w:val="en-PK"/>
         </w:rPr>
-        <w:t xml:space="preserve">,, this ratio is more strict as compared to current ratio. </w:t>
+        <w:t>,,</w:t>
+      </w:r>
+      <w:proofErr w:type="gramEnd"/>
+      <w:r>
+        <w:rPr>
+          <w:lang w:val="en-PK"/>
+        </w:rPr>
+        <w:t xml:space="preserve"> this ratio is </w:t>
+      </w:r>
+      <w:proofErr w:type="gramStart"/>
+      <w:r>
+        <w:rPr>
+          <w:lang w:val="en-PK"/>
+        </w:rPr>
+        <w:t>more strict</w:t>
+      </w:r>
+      <w:proofErr w:type="gramEnd"/>
+      <w:r>
+        <w:rPr>
+          <w:lang w:val="en-PK"/>
+        </w:rPr>
+        <w:t xml:space="preserve"> as compared to current ratio. </w:t>
       </w:r>
     </w:p>
     <w:p>
@@ -12619,6 +13086,7 @@
         <w:t xml:space="preserve"> tr finances equity pr dependent </w:t>
       </w:r>
       <w:proofErr w:type="spellStart"/>
+      <w:proofErr w:type="gramStart"/>
       <w:r>
         <w:rPr>
           <w:lang w:val="en-PK"/>
@@ -12630,7 +13098,14 @@
         <w:rPr>
           <w:lang w:val="en-PK"/>
         </w:rPr>
-        <w:t xml:space="preserve">,, bank </w:t>
+        <w:t>,,</w:t>
+      </w:r>
+      <w:proofErr w:type="gramEnd"/>
+      <w:r>
+        <w:rPr>
+          <w:lang w:val="en-PK"/>
+        </w:rPr>
+        <w:t xml:space="preserve"> bank </w:t>
       </w:r>
       <w:proofErr w:type="spellStart"/>
       <w:r>
@@ -12820,6 +13295,7 @@
         </w:rPr>
         <w:t>Assets turnover:</w:t>
       </w:r>
+      <w:proofErr w:type="gramStart"/>
       <w:r>
         <w:rPr>
           <w:b/>
@@ -12831,7 +13307,21 @@
           <w:u w:val="single"/>
           <w:lang w:val="en-PK"/>
         </w:rPr>
-        <w:t xml:space="preserve">   (WILL DO IT LATER !!!!!!!!!!!!!!!!!!!!!!!!!!!!!!!!!!!)</w:t>
+        <w:t xml:space="preserve">   (</w:t>
+      </w:r>
+      <w:proofErr w:type="gramEnd"/>
+      <w:r>
+        <w:rPr>
+          <w:b/>
+          <w:bCs/>
+          <w:color w:val="FFFFFF" w:themeColor="background1"/>
+          <w:sz w:val="32"/>
+          <w:szCs w:val="32"/>
+          <w:highlight w:val="blue"/>
+          <w:u w:val="single"/>
+          <w:lang w:val="en-PK"/>
+        </w:rPr>
+        <w:t>WILL DO IT LATER !!!!!!!!!!!!!!!!!!!!!!!!!!!!!!!!!!!)</w:t>
       </w:r>
     </w:p>
     <w:p>
@@ -12947,7 +13437,25 @@
           <w:highlight w:val="blue"/>
           <w:lang w:val="en-PK"/>
         </w:rPr>
-        <w:t>High value indicates that a company is using assets efficiently,, if a company have sales of 50,000 and assets of 25,000 then assets turnover = 2, means every 1$ of assets, the company is generating 2$ of revenue.</w:t>
+        <w:t xml:space="preserve">High value indicates that a company is using assets </w:t>
+      </w:r>
+      <w:proofErr w:type="gramStart"/>
+      <w:r>
+        <w:rPr>
+          <w:color w:val="FFFFFF" w:themeColor="background1"/>
+          <w:highlight w:val="blue"/>
+          <w:lang w:val="en-PK"/>
+        </w:rPr>
+        <w:t>efficiently,,</w:t>
+      </w:r>
+      <w:proofErr w:type="gramEnd"/>
+      <w:r>
+        <w:rPr>
+          <w:color w:val="FFFFFF" w:themeColor="background1"/>
+          <w:highlight w:val="blue"/>
+          <w:lang w:val="en-PK"/>
+        </w:rPr>
+        <w:t xml:space="preserve"> if a company have sales of 50,000 and assets of 25,000 then assets turnover = 2, means every 1$ of assets, the company is generating 2$ of revenue.</w:t>
       </w:r>
     </w:p>
     <w:p>
@@ -13122,8 +13630,16 @@
         <w:rPr>
           <w:lang w:val="en-PK"/>
         </w:rPr>
-        <w:t>) or (assets – liabilities )</w:t>
-      </w:r>
+        <w:t xml:space="preserve">) or (assets – </w:t>
+      </w:r>
+      <w:proofErr w:type="gramStart"/>
+      <w:r>
+        <w:rPr>
+          <w:lang w:val="en-PK"/>
+        </w:rPr>
+        <w:t>liabilities )</w:t>
+      </w:r>
+      <w:proofErr w:type="gramEnd"/>
       <w:r>
         <w:rPr>
           <w:lang w:val="en-PK"/>
@@ -13165,8 +13681,9 @@
           <w:u w:val="single"/>
           <w:lang w:val="en-PK"/>
         </w:rPr>
-        <w:t>profit margin x assets turnover</w:t>
-      </w:r>
+        <w:t xml:space="preserve">profit margin x assets </w:t>
+      </w:r>
+      <w:proofErr w:type="gramStart"/>
       <w:r>
         <w:rPr>
           <w:b/>
@@ -13174,13 +13691,29 @@
           <w:u w:val="single"/>
           <w:lang w:val="en-PK"/>
         </w:rPr>
-        <w:t xml:space="preserve"> </w:t>
-      </w:r>
-      <w:r>
-        <w:rPr>
-          <w:lang w:val="en-PK"/>
-        </w:rPr>
-        <w:t xml:space="preserve"> and we can increase ROCE by increasing profit margin or efficiently using assets. </w:t>
+        <w:t>turnover</w:t>
+      </w:r>
+      <w:r>
+        <w:rPr>
+          <w:b/>
+          <w:bCs/>
+          <w:u w:val="single"/>
+          <w:lang w:val="en-PK"/>
+        </w:rPr>
+        <w:t xml:space="preserve"> </w:t>
+      </w:r>
+      <w:r>
+        <w:rPr>
+          <w:lang w:val="en-PK"/>
+        </w:rPr>
+        <w:t xml:space="preserve"> and</w:t>
+      </w:r>
+      <w:proofErr w:type="gramEnd"/>
+      <w:r>
+        <w:rPr>
+          <w:lang w:val="en-PK"/>
+        </w:rPr>
+        <w:t xml:space="preserve"> we can increase ROCE by increasing profit margin or efficiently using assets. </w:t>
       </w:r>
     </w:p>
     <w:p>
@@ -13250,16 +13783,37 @@
         <w:t xml:space="preserve"> but operating profit separate because </w:t>
       </w:r>
       <w:r>
-        <w:t>We do not use cumulative operating profit because profit belongs to a specific year. Each year has its own profit. However, assets and liabilities represent the total position of the company at a certain time. For example, if the company had 10 debt in 2018 and took 5 more in 2019, then the total debt in 2019 becomes 15. That is why assets and liabilities are considered cumulative values.</w:t>
-      </w:r>
-      <w:r>
-        <w:t xml:space="preserve">,, same case implemented to different rations such as current ratio, quick ratio, gearing ratio  </w:t>
+        <w:t xml:space="preserve">We do not use cumulative operating profit because profit belongs to a specific year. Each year has its own profit. However, assets and liabilities represent the total position of the company at a certain time. For example, if the company had 10 </w:t>
+      </w:r>
+      <w:proofErr w:type="gramStart"/>
+      <w:r>
+        <w:t>debt</w:t>
+      </w:r>
+      <w:proofErr w:type="gramEnd"/>
+      <w:r>
+        <w:t xml:space="preserve"> in 2018 and took 5 more in 2019, then the total debt in 2019 becomes 15. That is why assets and liabilities are considered cumulative </w:t>
+      </w:r>
+      <w:proofErr w:type="gramStart"/>
+      <w:r>
+        <w:t>values.</w:t>
+      </w:r>
+      <w:r>
+        <w:t>,,</w:t>
+      </w:r>
+      <w:proofErr w:type="gramEnd"/>
+      <w:r>
+        <w:t xml:space="preserve"> same case implemented to different rations such as current ratio, quick ratio, gearing </w:t>
+      </w:r>
+      <w:proofErr w:type="gramStart"/>
+      <w:r>
+        <w:t xml:space="preserve">ratio  </w:t>
       </w:r>
       <w:proofErr w:type="spellStart"/>
       <w:r>
         <w:t>etc</w:t>
       </w:r>
       <w:proofErr w:type="spellEnd"/>
+      <w:proofErr w:type="gramEnd"/>
       <w:r>
         <w:t xml:space="preserve"> </w:t>
       </w:r>
@@ -13280,6 +13834,7 @@
         <w:t xml:space="preserve"> q </w:t>
       </w:r>
       <w:proofErr w:type="spellStart"/>
+      <w:proofErr w:type="gramStart"/>
       <w:r>
         <w:t>liye</w:t>
       </w:r>
@@ -13288,7 +13843,11 @@
         <w:t xml:space="preserve"> </w:t>
       </w:r>
       <w:r>
-        <w:t>,,,, JO CHEEZ P &amp; L KI H VO CUMMULATIVE NHI AY GI, JO CHEEZ BALANCE SHEET KI H COMMULATIVE AY GI</w:t>
+        <w:t>,</w:t>
+      </w:r>
+      <w:proofErr w:type="gramEnd"/>
+      <w:r>
+        <w:t>,,, JO CHEEZ P &amp; L KI H VO CUMMULATIVE NHI AY GI, JO CHEEZ BALANCE SHEET KI H COMMULATIVE AY GI</w:t>
       </w:r>
     </w:p>
     <w:p>
@@ -13390,6 +13949,7 @@
         <w:t xml:space="preserve"> profit </w:t>
       </w:r>
       <w:proofErr w:type="spellStart"/>
+      <w:proofErr w:type="gramStart"/>
       <w:r>
         <w:rPr>
           <w:lang w:val="en-PK"/>
@@ -13401,7 +13961,14 @@
         <w:rPr>
           <w:lang w:val="en-PK"/>
         </w:rPr>
-        <w:t>,, this is different from ROCE as ROCE m hm total capital employed (equity +</w:t>
+        <w:t>,,</w:t>
+      </w:r>
+      <w:proofErr w:type="gramEnd"/>
+      <w:r>
+        <w:rPr>
+          <w:lang w:val="en-PK"/>
+        </w:rPr>
+        <w:t xml:space="preserve"> this is different from ROCE as ROCE m hm total capital employed (equity +</w:t>
       </w:r>
       <w:proofErr w:type="spellStart"/>
       <w:r>
@@ -13471,7 +14038,21 @@
         <w:rPr>
           <w:lang w:val="en-PK"/>
         </w:rPr>
-        <w:t xml:space="preserve"> total capital profit generate </w:t>
+        <w:t xml:space="preserve"> total capital profit </w:t>
+      </w:r>
+      <w:proofErr w:type="gramStart"/>
+      <w:r>
+        <w:rPr>
+          <w:lang w:val="en-PK"/>
+        </w:rPr>
+        <w:t>generate</w:t>
+      </w:r>
+      <w:proofErr w:type="gramEnd"/>
+      <w:r>
+        <w:rPr>
+          <w:lang w:val="en-PK"/>
+        </w:rPr>
+        <w:t xml:space="preserve"> </w:t>
       </w:r>
       <w:proofErr w:type="spellStart"/>
       <w:r>
@@ -14348,7 +14929,21 @@
         <w:rPr>
           <w:lang w:val="en-PK"/>
         </w:rPr>
-        <w:t xml:space="preserve">We will use PBIT , instead of PBI (profit before interest) because tax is </w:t>
+        <w:t xml:space="preserve">We will use </w:t>
+      </w:r>
+      <w:proofErr w:type="gramStart"/>
+      <w:r>
+        <w:rPr>
+          <w:lang w:val="en-PK"/>
+        </w:rPr>
+        <w:t>PBIT ,</w:t>
+      </w:r>
+      <w:proofErr w:type="gramEnd"/>
+      <w:r>
+        <w:rPr>
+          <w:lang w:val="en-PK"/>
+        </w:rPr>
+        <w:t xml:space="preserve"> instead of PBI (profit before interest) because tax is </w:t>
       </w:r>
       <w:proofErr w:type="spellStart"/>
       <w:r>
@@ -14472,7 +15067,21 @@
         <w:rPr>
           <w:lang w:val="en-PK"/>
         </w:rPr>
-        <w:t xml:space="preserve"> nah o k tax pay </w:t>
+        <w:t xml:space="preserve"> nah o k tax </w:t>
+      </w:r>
+      <w:proofErr w:type="gramStart"/>
+      <w:r>
+        <w:rPr>
+          <w:lang w:val="en-PK"/>
+        </w:rPr>
+        <w:t>pay</w:t>
+      </w:r>
+      <w:proofErr w:type="gramEnd"/>
+      <w:r>
+        <w:rPr>
+          <w:lang w:val="en-PK"/>
+        </w:rPr>
+        <w:t xml:space="preserve"> </w:t>
       </w:r>
       <w:proofErr w:type="spellStart"/>
       <w:r>
@@ -15000,9 +15609,17 @@
         <w:rPr>
           <w:lang w:val="en-PK"/>
         </w:rPr>
-        <w:t xml:space="preserve">    (</w:t>
-      </w:r>
-      <w:proofErr w:type="spellStart"/>
+        <w:t xml:space="preserve"> </w:t>
+      </w:r>
+      <w:proofErr w:type="gramStart"/>
+      <w:r>
+        <w:rPr>
+          <w:lang w:val="en-PK"/>
+        </w:rPr>
+        <w:t xml:space="preserve">   (</w:t>
+      </w:r>
+      <w:proofErr w:type="spellStart"/>
+      <w:proofErr w:type="gramEnd"/>
       <w:r>
         <w:rPr>
           <w:lang w:val="en-PK"/>
@@ -15328,21 +15945,35 @@
         <w:rPr>
           <w:lang w:val="en-PK"/>
         </w:rPr>
-        <w:t xml:space="preserve"> customers n pay k</w:t>
-      </w:r>
-      <w:proofErr w:type="spellStart"/>
-      <w:r>
-        <w:rPr>
-          <w:lang w:val="en-PK"/>
-        </w:rPr>
-        <w:t>rni</w:t>
-      </w:r>
-      <w:proofErr w:type="spellEnd"/>
-      <w:r>
-        <w:rPr>
-          <w:lang w:val="en-PK"/>
-        </w:rPr>
-        <w:t xml:space="preserve"> h ,, </w:t>
+        <w:t xml:space="preserve"> customers n pay </w:t>
+      </w:r>
+      <w:proofErr w:type="spellStart"/>
+      <w:r>
+        <w:rPr>
+          <w:lang w:val="en-PK"/>
+        </w:rPr>
+        <w:t>krni</w:t>
+      </w:r>
+      <w:proofErr w:type="spellEnd"/>
+      <w:r>
+        <w:rPr>
+          <w:lang w:val="en-PK"/>
+        </w:rPr>
+        <w:t xml:space="preserve"> </w:t>
+      </w:r>
+      <w:proofErr w:type="gramStart"/>
+      <w:r>
+        <w:rPr>
+          <w:lang w:val="en-PK"/>
+        </w:rPr>
+        <w:t>h ,</w:t>
+      </w:r>
+      <w:proofErr w:type="gramEnd"/>
+      <w:r>
+        <w:rPr>
+          <w:lang w:val="en-PK"/>
+        </w:rPr>
+        <w:t xml:space="preserve">, </w:t>
       </w:r>
       <w:proofErr w:type="spellStart"/>
       <w:r>
@@ -15503,6 +16134,7 @@
           <w:lang w:val="en-PK"/>
         </w:rPr>
       </w:pPr>
+      <w:proofErr w:type="gramStart"/>
       <w:r>
         <w:rPr>
           <w:lang w:val="en-PK"/>
@@ -15515,48 +16147,31 @@
           <w:bCs/>
           <w:lang w:val="en-PK"/>
         </w:rPr>
-        <w:t>30 days</w:t>
-      </w:r>
-      <w:r>
-        <w:rPr>
-          <w:lang w:val="en-PK"/>
-        </w:rPr>
-        <w:t xml:space="preserve"> → very good collection</w:t>
-      </w:r>
-    </w:p>
-    <w:p>
-      <w:pPr>
-        <w:rPr>
-          <w:lang w:val="en-PK"/>
-        </w:rPr>
-      </w:pPr>
-      <w:r>
-        <w:rPr>
-          <w:lang w:val="en-PK"/>
-        </w:rPr>
-        <w:t xml:space="preserve">  </w:t>
-      </w:r>
+        <w:t>30</w:t>
+      </w:r>
+      <w:proofErr w:type="gramEnd"/>
       <w:r>
         <w:rPr>
           <w:b/>
           <w:bCs/>
           <w:lang w:val="en-PK"/>
         </w:rPr>
-        <w:t>60–90 days</w:t>
-      </w:r>
-      <w:r>
-        <w:rPr>
-          <w:lang w:val="en-PK"/>
-        </w:rPr>
-        <w:t xml:space="preserve"> → normal in many industries</w:t>
-      </w:r>
-    </w:p>
-    <w:p>
-      <w:pPr>
-        <w:rPr>
-          <w:lang w:val="en-PK"/>
-        </w:rPr>
-      </w:pPr>
+        <w:t xml:space="preserve"> days</w:t>
+      </w:r>
+      <w:r>
+        <w:rPr>
+          <w:lang w:val="en-PK"/>
+        </w:rPr>
+        <w:t xml:space="preserve"> → very good collection</w:t>
+      </w:r>
+    </w:p>
+    <w:p>
+      <w:pPr>
+        <w:rPr>
+          <w:lang w:val="en-PK"/>
+        </w:rPr>
+      </w:pPr>
+      <w:proofErr w:type="gramStart"/>
       <w:r>
         <w:rPr>
           <w:lang w:val="en-PK"/>
@@ -15569,7 +16184,53 @@
           <w:bCs/>
           <w:lang w:val="en-PK"/>
         </w:rPr>
-        <w:t>120+ days</w:t>
+        <w:t>60</w:t>
+      </w:r>
+      <w:proofErr w:type="gramEnd"/>
+      <w:r>
+        <w:rPr>
+          <w:b/>
+          <w:bCs/>
+          <w:lang w:val="en-PK"/>
+        </w:rPr>
+        <w:t>–90 days</w:t>
+      </w:r>
+      <w:r>
+        <w:rPr>
+          <w:lang w:val="en-PK"/>
+        </w:rPr>
+        <w:t xml:space="preserve"> → normal in many industries</w:t>
+      </w:r>
+    </w:p>
+    <w:p>
+      <w:pPr>
+        <w:rPr>
+          <w:lang w:val="en-PK"/>
+        </w:rPr>
+      </w:pPr>
+      <w:proofErr w:type="gramStart"/>
+      <w:r>
+        <w:rPr>
+          <w:lang w:val="en-PK"/>
+        </w:rPr>
+        <w:t xml:space="preserve">  </w:t>
+      </w:r>
+      <w:r>
+        <w:rPr>
+          <w:b/>
+          <w:bCs/>
+          <w:lang w:val="en-PK"/>
+        </w:rPr>
+        <w:t>120</w:t>
+      </w:r>
+      <w:proofErr w:type="gramEnd"/>
+      <w:r>
+        <w:rPr>
+          <w:b/>
+          <w:bCs/>
+          <w:lang w:val="en-PK"/>
+        </w:rPr>
+        <w:t>+ days</w:t>
       </w:r>
       <w:r>
         <w:rPr>
@@ -15662,13 +16323,27 @@
         <w:rPr>
           <w:lang w:val="en-PK"/>
         </w:rPr>
-        <w:t>Credit Purchases = purchases made on credit</w:t>
-      </w:r>
-      <w:r>
-        <w:rPr>
-          <w:lang w:val="en-PK"/>
-        </w:rPr>
-        <w:t xml:space="preserve">,,, </w:t>
+        <w:t xml:space="preserve">Credit Purchases = purchases made on </w:t>
+      </w:r>
+      <w:proofErr w:type="gramStart"/>
+      <w:r>
+        <w:rPr>
+          <w:lang w:val="en-PK"/>
+        </w:rPr>
+        <w:t>credit</w:t>
+      </w:r>
+      <w:r>
+        <w:rPr>
+          <w:lang w:val="en-PK"/>
+        </w:rPr>
+        <w:t>,,,</w:t>
+      </w:r>
+      <w:proofErr w:type="gramEnd"/>
+      <w:r>
+        <w:rPr>
+          <w:lang w:val="en-PK"/>
+        </w:rPr>
+        <w:t xml:space="preserve"> </w:t>
       </w:r>
       <w:proofErr w:type="spellStart"/>
       <w:r>
@@ -15754,6 +16429,7 @@
         <w:t xml:space="preserve"> total purchases jo us n credit pr ki </w:t>
       </w:r>
       <w:proofErr w:type="spellStart"/>
+      <w:proofErr w:type="gramStart"/>
       <w:r>
         <w:rPr>
           <w:lang w:val="en-PK"/>
@@ -15765,7 +16441,14 @@
         <w:rPr>
           <w:lang w:val="en-PK"/>
         </w:rPr>
-        <w:t xml:space="preserve"> , credit </w:t>
+        <w:t xml:space="preserve"> ,</w:t>
+      </w:r>
+      <w:proofErr w:type="gramEnd"/>
+      <w:r>
+        <w:rPr>
+          <w:lang w:val="en-PK"/>
+        </w:rPr>
+        <w:t xml:space="preserve"> credit </w:t>
       </w:r>
       <w:proofErr w:type="spellStart"/>
       <w:r>
@@ -15838,6 +16521,7 @@
         <w:t xml:space="preserve"> </w:t>
       </w:r>
       <w:proofErr w:type="spellStart"/>
+      <w:proofErr w:type="gramStart"/>
       <w:r>
         <w:rPr>
           <w:lang w:val="en-PK"/>
@@ -15849,7 +16533,14 @@
         <w:rPr>
           <w:lang w:val="en-PK"/>
         </w:rPr>
-        <w:t xml:space="preserve">(credit purchases) us m s </w:t>
+        <w:t>(</w:t>
+      </w:r>
+      <w:proofErr w:type="gramEnd"/>
+      <w:r>
+        <w:rPr>
+          <w:lang w:val="en-PK"/>
+        </w:rPr>
+        <w:t xml:space="preserve">credit purchases) us m s </w:t>
       </w:r>
       <w:proofErr w:type="spellStart"/>
       <w:r>
@@ -16008,16 +16699,7 @@
           <w:sz w:val="32"/>
           <w:szCs w:val="32"/>
         </w:rPr>
-        <w:t>Inventory turnover period</w:t>
-      </w:r>
-      <w:r>
-        <w:rPr>
-          <w:b/>
-          <w:bCs/>
-          <w:sz w:val="32"/>
-          <w:szCs w:val="32"/>
-        </w:rPr>
-        <w:t>:</w:t>
+        <w:t>Inventory turnover period:</w:t>
       </w:r>
     </w:p>
     <w:p>
@@ -16032,13 +16714,7 @@
     </w:p>
     <w:p>
       <w:r>
-        <w:t xml:space="preserve">Inventory turnover period = </w:t>
-      </w:r>
-      <w:r>
-        <w:t xml:space="preserve">average </w:t>
-      </w:r>
-      <w:r>
-        <w:t>inventory / cost of sales * 365</w:t>
+        <w:t>Inventory turnover period = average inventory / cost of sales * 365</w:t>
       </w:r>
     </w:p>
     <w:p/>
@@ -16230,7 +16906,23 @@
       </w:r>
       <w:proofErr w:type="spellEnd"/>
       <w:r>
-        <w:t xml:space="preserve">, lets say its name as A, jis pr hm </w:t>
+        <w:t xml:space="preserve">, </w:t>
+      </w:r>
+      <w:proofErr w:type="spellStart"/>
+      <w:r>
+        <w:t>lets</w:t>
+      </w:r>
+      <w:proofErr w:type="spellEnd"/>
+      <w:r>
+        <w:t xml:space="preserve"> say its name as A, </w:t>
+      </w:r>
+      <w:proofErr w:type="spellStart"/>
+      <w:r>
+        <w:t>jis</w:t>
+      </w:r>
+      <w:proofErr w:type="spellEnd"/>
+      <w:r>
+        <w:t xml:space="preserve"> pr hm </w:t>
       </w:r>
       <w:proofErr w:type="spellStart"/>
       <w:r>
@@ -16334,7 +17026,15 @@
       </w:r>
       <w:proofErr w:type="spellEnd"/>
       <w:r>
-        <w:t xml:space="preserve"> k click kia jay to y A </w:t>
+        <w:t xml:space="preserve"> k click kia jay </w:t>
+      </w:r>
+      <w:proofErr w:type="spellStart"/>
+      <w:r>
+        <w:t>to y</w:t>
+      </w:r>
+      <w:proofErr w:type="spellEnd"/>
+      <w:r>
+        <w:t xml:space="preserve"> A </w:t>
       </w:r>
       <w:proofErr w:type="spellStart"/>
       <w:r>
@@ -16457,7 +17157,15 @@
       </w:r>
       <w:proofErr w:type="spellEnd"/>
       <w:r>
-        <w:t xml:space="preserve"> to A open ho ga </w:t>
+        <w:t xml:space="preserve"> to </w:t>
+      </w:r>
+      <w:proofErr w:type="spellStart"/>
+      <w:r>
+        <w:t>A</w:t>
+      </w:r>
+      <w:proofErr w:type="spellEnd"/>
+      <w:r>
+        <w:t xml:space="preserve"> open ho ga </w:t>
       </w:r>
       <w:proofErr w:type="spellStart"/>
       <w:r>
@@ -16614,10 +17322,1326 @@
     </w:p>
     <w:p>
       <w:pPr>
-        <w:rPr>
-          <w:lang w:val="en-PK"/>
-        </w:rPr>
-      </w:pPr>
+        <w:ind w:left="360"/>
+        <w:rPr>
+          <w:b/>
+          <w:bCs/>
+          <w:sz w:val="52"/>
+          <w:szCs w:val="52"/>
+          <w:u w:val="single"/>
+        </w:rPr>
+      </w:pPr>
+      <w:r>
+        <w:rPr>
+          <w:b/>
+          <w:bCs/>
+          <w:sz w:val="52"/>
+          <w:szCs w:val="52"/>
+          <w:highlight w:val="green"/>
+          <w:u w:val="single"/>
+        </w:rPr>
+        <w:t>Trial Balance Report:</w:t>
+      </w:r>
+    </w:p>
+    <w:p>
+      <w:pPr>
+        <w:ind w:left="360"/>
+      </w:pPr>
+      <w:r>
+        <w:t>A Trial Balance is a simple report that shows the total balance of every account in a company at a specific date.</w:t>
+      </w:r>
+    </w:p>
+    <w:p>
+      <w:pPr>
+        <w:ind w:left="360"/>
+      </w:pPr>
+    </w:p>
+    <w:p>
+      <w:pPr>
+        <w:ind w:left="360"/>
+      </w:pPr>
+      <w:r>
+        <w:lastRenderedPageBreak/>
+        <w:t>It is basically a summary of the General Ledger.</w:t>
+      </w:r>
+    </w:p>
+    <w:p>
+      <w:pPr>
+        <w:ind w:left="360"/>
+      </w:pPr>
+      <w:r>
+        <w:t>In the General Ledger, we have all the individual transactions (each sale, expense, payment, etc.).</w:t>
+      </w:r>
+    </w:p>
+    <w:p>
+      <w:pPr>
+        <w:ind w:left="360"/>
+      </w:pPr>
+      <w:r>
+        <w:t xml:space="preserve">The Trial Balance collects those transactions and shows only the final balance of each </w:t>
+      </w:r>
+      <w:proofErr w:type="gramStart"/>
+      <w:r>
+        <w:t xml:space="preserve">account.   </w:t>
+      </w:r>
+      <w:proofErr w:type="gramEnd"/>
+      <w:r>
+        <w:t xml:space="preserve">,, </w:t>
+      </w:r>
+      <w:proofErr w:type="spellStart"/>
+      <w:r>
+        <w:t>e.g</w:t>
+      </w:r>
+      <w:proofErr w:type="spellEnd"/>
+      <w:r>
+        <w:t xml:space="preserve">: chart of account m jo </w:t>
+      </w:r>
+      <w:proofErr w:type="spellStart"/>
+      <w:r>
+        <w:t>saari</w:t>
+      </w:r>
+      <w:proofErr w:type="spellEnd"/>
+      <w:r>
+        <w:t xml:space="preserve"> subclasses mention </w:t>
+      </w:r>
+      <w:proofErr w:type="spellStart"/>
+      <w:r>
+        <w:t>thi</w:t>
+      </w:r>
+      <w:proofErr w:type="spellEnd"/>
+      <w:r>
+        <w:t xml:space="preserve">, such as assets, liabilities, </w:t>
+      </w:r>
+      <w:proofErr w:type="spellStart"/>
+      <w:proofErr w:type="gramStart"/>
+      <w:r>
+        <w:t>owners</w:t>
+      </w:r>
+      <w:proofErr w:type="spellEnd"/>
+      <w:proofErr w:type="gramEnd"/>
+      <w:r>
+        <w:t xml:space="preserve"> equity, sales </w:t>
+      </w:r>
+      <w:proofErr w:type="spellStart"/>
+      <w:r>
+        <w:t>etc</w:t>
+      </w:r>
+      <w:proofErr w:type="spellEnd"/>
+      <w:r>
+        <w:t xml:space="preserve"> </w:t>
+      </w:r>
+      <w:proofErr w:type="spellStart"/>
+      <w:r>
+        <w:t>etc</w:t>
+      </w:r>
+      <w:proofErr w:type="spellEnd"/>
+      <w:r>
+        <w:t xml:space="preserve">, and </w:t>
+      </w:r>
+      <w:r>
+        <w:t>In the General Ledger, each account key has many transaction amounts. In a trial balance, we summarize all those transactions and show one total balance for each account, so we can quickly see all accounts and their balances..</w:t>
+      </w:r>
+      <w:r>
+        <w:t xml:space="preserve"> ,, y just accounts and their balance </w:t>
+      </w:r>
+      <w:proofErr w:type="spellStart"/>
+      <w:r>
+        <w:t>tk</w:t>
+      </w:r>
+      <w:proofErr w:type="spellEnd"/>
+      <w:r>
+        <w:t xml:space="preserve"> ki limited </w:t>
+      </w:r>
+      <w:proofErr w:type="spellStart"/>
+      <w:r>
+        <w:t>nhi</w:t>
+      </w:r>
+      <w:proofErr w:type="spellEnd"/>
+      <w:r>
+        <w:t xml:space="preserve"> h, we can create trial balance report even with report level, class level, subclass </w:t>
+      </w:r>
+      <w:proofErr w:type="spellStart"/>
+      <w:r>
+        <w:t>elevel</w:t>
+      </w:r>
+      <w:proofErr w:type="spellEnd"/>
+      <w:r>
+        <w:t xml:space="preserve"> </w:t>
+      </w:r>
+      <w:proofErr w:type="spellStart"/>
+      <w:r>
+        <w:t>etc</w:t>
+      </w:r>
+      <w:proofErr w:type="spellEnd"/>
+      <w:r>
+        <w:t xml:space="preserve"> </w:t>
+      </w:r>
+      <w:proofErr w:type="spellStart"/>
+      <w:r>
+        <w:t>etc</w:t>
+      </w:r>
+      <w:proofErr w:type="spellEnd"/>
+      <w:r>
+        <w:t xml:space="preserve"> and then can also add slicer for country and year as well,,,,, is it correct</w:t>
+      </w:r>
+    </w:p>
+    <w:p>
+      <w:pPr>
+        <w:rPr>
+          <w:lang w:val="en-PK"/>
+        </w:rPr>
+      </w:pPr>
+      <w:r>
+        <w:rPr>
+          <w:lang w:val="en-PK"/>
+        </w:rPr>
+        <w:t>In our trail balance we have created following report:</w:t>
+      </w:r>
+    </w:p>
+    <w:p>
+      <w:pPr>
+        <w:rPr>
+          <w:lang w:val="en-PK"/>
+        </w:rPr>
+      </w:pPr>
+      <w:r>
+        <w:rPr>
+          <w:lang w:val="en-PK"/>
+        </w:rPr>
+        <w:drawing>
+          <wp:inline distT="0" distB="0" distL="0" distR="0" wp14:anchorId="0973A2FE" wp14:editId="3E16C166">
+            <wp:extent cx="5943600" cy="4874895"/>
+            <wp:effectExtent l="0" t="0" r="0" b="1905"/>
+            <wp:docPr id="2050775688" name="Picture 1"/>
+            <wp:cNvGraphicFramePr>
+              <a:graphicFrameLocks xmlns:a="http://schemas.openxmlformats.org/drawingml/2006/main" noChangeAspect="1"/>
+            </wp:cNvGraphicFramePr>
+            <a:graphic xmlns:a="http://schemas.openxmlformats.org/drawingml/2006/main">
+              <a:graphicData uri="http://schemas.openxmlformats.org/drawingml/2006/picture">
+                <pic:pic xmlns:pic="http://schemas.openxmlformats.org/drawingml/2006/picture">
+                  <pic:nvPicPr>
+                    <pic:cNvPr id="2050775688" name=""/>
+                    <pic:cNvPicPr/>
+                  </pic:nvPicPr>
+                  <pic:blipFill>
+                    <a:blip r:embed="rId11"/>
+                    <a:stretch>
+                      <a:fillRect/>
+                    </a:stretch>
+                  </pic:blipFill>
+                  <pic:spPr>
+                    <a:xfrm>
+                      <a:off x="0" y="0"/>
+                      <a:ext cx="5943600" cy="4874895"/>
+                    </a:xfrm>
+                    <a:prstGeom prst="rect">
+                      <a:avLst/>
+                    </a:prstGeom>
+                  </pic:spPr>
+                </pic:pic>
+              </a:graphicData>
+            </a:graphic>
+          </wp:inline>
+        </w:drawing>
+      </w:r>
+    </w:p>
+    <w:p>
+      <w:pPr>
+        <w:rPr>
+          <w:lang w:val="en-PK"/>
+        </w:rPr>
+      </w:pPr>
+      <w:r>
+        <w:rPr>
+          <w:lang w:val="en-PK"/>
+        </w:rPr>
+        <w:t xml:space="preserve">But the issue is that k FTP value (which is just the sum of total amount) is ok for p and L but not for balance sheet because </w:t>
+      </w:r>
+      <w:proofErr w:type="spellStart"/>
+      <w:r>
+        <w:rPr>
+          <w:lang w:val="en-PK"/>
+        </w:rPr>
+        <w:t>balace</w:t>
+      </w:r>
+      <w:proofErr w:type="spellEnd"/>
+      <w:r>
+        <w:rPr>
+          <w:lang w:val="en-PK"/>
+        </w:rPr>
+        <w:t xml:space="preserve"> sheet need </w:t>
+      </w:r>
+      <w:proofErr w:type="spellStart"/>
+      <w:r>
+        <w:rPr>
+          <w:lang w:val="en-PK"/>
+        </w:rPr>
+        <w:t>commulative</w:t>
+      </w:r>
+      <w:proofErr w:type="spellEnd"/>
+      <w:r>
+        <w:rPr>
+          <w:lang w:val="en-PK"/>
+        </w:rPr>
+        <w:t xml:space="preserve"> value mean</w:t>
+      </w:r>
+      <w:r>
+        <w:rPr>
+          <w:lang w:val="en-PK"/>
+        </w:rPr>
+        <w:t>s</w:t>
+      </w:r>
+      <w:r>
+        <w:rPr>
+          <w:lang w:val="en-PK"/>
+        </w:rPr>
+        <w:t xml:space="preserve"> it need total to date, so will create the following measure and put that in the report</w:t>
+      </w:r>
+      <w:r>
+        <w:rPr>
+          <w:lang w:val="en-PK"/>
+        </w:rPr>
+        <w:t>.</w:t>
+      </w:r>
+    </w:p>
+    <w:p>
+      <w:pPr>
+        <w:rPr>
+          <w:lang w:val="en-PK"/>
+        </w:rPr>
+      </w:pPr>
+    </w:p>
+    <w:p>
+      <w:pPr>
+        <w:rPr>
+          <w:rFonts w:ascii="Bell MT" w:hAnsi="Bell MT"/>
+          <w:lang w:val="en-PK"/>
+        </w:rPr>
+      </w:pPr>
+      <w:proofErr w:type="spellStart"/>
+      <w:r>
+        <w:rPr>
+          <w:rFonts w:ascii="Bell MT" w:hAnsi="Bell MT"/>
+          <w:lang w:val="en-PK"/>
+        </w:rPr>
+        <w:lastRenderedPageBreak/>
+        <w:t>total_value_alternate</w:t>
+      </w:r>
+      <w:proofErr w:type="spellEnd"/>
+      <w:r>
+        <w:rPr>
+          <w:rFonts w:ascii="Bell MT" w:hAnsi="Bell MT"/>
+          <w:lang w:val="en-PK"/>
+        </w:rPr>
+        <w:t xml:space="preserve"> = </w:t>
+      </w:r>
+      <w:proofErr w:type="gramStart"/>
+      <w:r>
+        <w:rPr>
+          <w:rFonts w:ascii="Bell MT" w:hAnsi="Bell MT"/>
+          <w:lang w:val="en-PK"/>
+        </w:rPr>
+        <w:t>COALESCE(</w:t>
+      </w:r>
+      <w:proofErr w:type="gramEnd"/>
+    </w:p>
+    <w:p>
+      <w:pPr>
+        <w:rPr>
+          <w:rFonts w:ascii="Bell MT" w:hAnsi="Bell MT"/>
+          <w:lang w:val="en-PK"/>
+        </w:rPr>
+      </w:pPr>
+      <w:r>
+        <w:rPr>
+          <w:rFonts w:ascii="Bell MT" w:hAnsi="Bell MT"/>
+          <w:lang w:val="en-PK"/>
+        </w:rPr>
+        <w:t xml:space="preserve"> CALCULATE([</w:t>
+      </w:r>
+      <w:proofErr w:type="spellStart"/>
+      <w:r>
+        <w:rPr>
+          <w:rFonts w:ascii="Bell MT" w:hAnsi="Bell MT"/>
+          <w:lang w:val="en-PK"/>
+        </w:rPr>
+        <w:t>total_to_date</w:t>
+      </w:r>
+      <w:proofErr w:type="spellEnd"/>
+      <w:r>
+        <w:rPr>
+          <w:rFonts w:ascii="Bell MT" w:hAnsi="Bell MT"/>
+          <w:lang w:val="en-PK"/>
+        </w:rPr>
+        <w:t>], 'Chart of Accounts'[Report] = "Balance Sheet"),</w:t>
+      </w:r>
+    </w:p>
+    <w:p>
+      <w:pPr>
+        <w:rPr>
+          <w:rFonts w:ascii="Bell MT" w:hAnsi="Bell MT"/>
+          <w:lang w:val="en-PK"/>
+        </w:rPr>
+      </w:pPr>
+      <w:r>
+        <w:rPr>
+          <w:rFonts w:ascii="Bell MT" w:hAnsi="Bell MT"/>
+          <w:lang w:val="en-PK"/>
+        </w:rPr>
+        <w:t xml:space="preserve"> CALCULATE([</w:t>
+      </w:r>
+      <w:proofErr w:type="spellStart"/>
+      <w:r>
+        <w:rPr>
+          <w:rFonts w:ascii="Bell MT" w:hAnsi="Bell MT"/>
+          <w:lang w:val="en-PK"/>
+        </w:rPr>
+        <w:t>total_FTP</w:t>
+      </w:r>
+      <w:proofErr w:type="spellEnd"/>
+      <w:r>
+        <w:rPr>
+          <w:rFonts w:ascii="Bell MT" w:hAnsi="Bell MT"/>
+          <w:lang w:val="en-PK"/>
+        </w:rPr>
+        <w:t>], 'Chart of Accounts'[Report] = "Profit and Loss")</w:t>
+      </w:r>
+    </w:p>
+    <w:p>
+      <w:pPr>
+        <w:rPr>
+          <w:rFonts w:ascii="Bell MT" w:hAnsi="Bell MT"/>
+          <w:lang w:val="en-PK"/>
+        </w:rPr>
+      </w:pPr>
+      <w:r>
+        <w:rPr>
+          <w:rFonts w:ascii="Bell MT" w:hAnsi="Bell MT"/>
+          <w:lang w:val="en-PK"/>
+        </w:rPr>
+        <w:t>)</w:t>
+      </w:r>
+    </w:p>
+    <w:p>
+      <w:pPr>
+        <w:rPr>
+          <w:rFonts w:cstheme="minorHAnsi"/>
+          <w:lang w:val="en-PK"/>
+        </w:rPr>
+      </w:pPr>
+      <w:r>
+        <w:rPr>
+          <w:lang w:val="en-PK"/>
+        </w:rPr>
+        <w:t xml:space="preserve">Coalesce is used when we have to use 2 measures together. This </w:t>
+      </w:r>
+      <w:proofErr w:type="spellStart"/>
+      <w:r>
+        <w:rPr>
+          <w:lang w:val="en-PK"/>
+        </w:rPr>
+        <w:t>formuyal</w:t>
+      </w:r>
+      <w:proofErr w:type="spellEnd"/>
+      <w:r>
+        <w:rPr>
+          <w:lang w:val="en-PK"/>
+        </w:rPr>
+        <w:t xml:space="preserve"> will give an error actually because of </w:t>
+      </w:r>
+      <w:proofErr w:type="spellStart"/>
+      <w:r>
+        <w:rPr>
+          <w:lang w:val="en-PK"/>
+        </w:rPr>
+        <w:t>total_to_date</w:t>
+      </w:r>
+      <w:proofErr w:type="spellEnd"/>
+      <w:r>
+        <w:rPr>
+          <w:lang w:val="en-PK"/>
+        </w:rPr>
+        <w:t xml:space="preserve"> k </w:t>
+      </w:r>
+      <w:proofErr w:type="spellStart"/>
+      <w:r>
+        <w:rPr>
+          <w:lang w:val="en-PK"/>
+        </w:rPr>
+        <w:t>andr</w:t>
+      </w:r>
+      <w:proofErr w:type="spellEnd"/>
+      <w:r>
+        <w:rPr>
+          <w:lang w:val="en-PK"/>
+        </w:rPr>
+        <w:t xml:space="preserve"> hm n </w:t>
+      </w:r>
+      <w:proofErr w:type="spellStart"/>
+      <w:r>
+        <w:rPr>
+          <w:rFonts w:ascii="Bell MT" w:hAnsi="Bell MT"/>
+          <w:lang w:val="en-PK"/>
+        </w:rPr>
+        <w:t>total_to_date</w:t>
+      </w:r>
+      <w:proofErr w:type="spellEnd"/>
+      <w:r>
+        <w:rPr>
+          <w:rFonts w:ascii="Bell MT" w:hAnsi="Bell MT"/>
+          <w:lang w:val="en-PK"/>
+        </w:rPr>
+        <w:t xml:space="preserve"> = CALCULATE(SUM(GL[Amount]), DATESBETWEEN('Calendar'[Date</w:t>
+      </w:r>
+      <w:proofErr w:type="gramStart"/>
+      <w:r>
+        <w:rPr>
+          <w:rFonts w:ascii="Bell MT" w:hAnsi="Bell MT"/>
+          <w:lang w:val="en-PK"/>
+        </w:rPr>
+        <w:t>].[</w:t>
+      </w:r>
+      <w:proofErr w:type="gramEnd"/>
+      <w:r>
+        <w:rPr>
+          <w:rFonts w:ascii="Bell MT" w:hAnsi="Bell MT"/>
+          <w:lang w:val="en-PK"/>
+        </w:rPr>
+        <w:t>Date], [</w:t>
+      </w:r>
+      <w:proofErr w:type="spellStart"/>
+      <w:r>
+        <w:rPr>
+          <w:rFonts w:ascii="Bell MT" w:hAnsi="Bell MT"/>
+          <w:lang w:val="en-PK"/>
+        </w:rPr>
+        <w:t>min_date_across</w:t>
+      </w:r>
+      <w:proofErr w:type="spellEnd"/>
+      <w:r>
+        <w:rPr>
+          <w:rFonts w:ascii="Bell MT" w:hAnsi="Bell MT"/>
+          <w:lang w:val="en-PK"/>
+        </w:rPr>
+        <w:t>], [</w:t>
+      </w:r>
+      <w:proofErr w:type="spellStart"/>
+      <w:r>
+        <w:rPr>
+          <w:rFonts w:ascii="Bell MT" w:hAnsi="Bell MT"/>
+          <w:lang w:val="en-PK"/>
+        </w:rPr>
+        <w:t>max_date</w:t>
+      </w:r>
+      <w:proofErr w:type="spellEnd"/>
+      <w:r>
+        <w:rPr>
+          <w:rFonts w:ascii="Bell MT" w:hAnsi="Bell MT"/>
+          <w:lang w:val="en-PK"/>
+        </w:rPr>
+        <w:t>]))</w:t>
+      </w:r>
+      <w:r>
+        <w:rPr>
+          <w:rFonts w:ascii="Bell MT" w:hAnsi="Bell MT"/>
+          <w:lang w:val="en-PK"/>
+        </w:rPr>
+        <w:t xml:space="preserve"> </w:t>
+      </w:r>
+      <w:r>
+        <w:rPr>
+          <w:rFonts w:cstheme="minorHAnsi"/>
+          <w:lang w:val="en-PK"/>
+        </w:rPr>
+        <w:t xml:space="preserve">y formula </w:t>
+      </w:r>
+      <w:proofErr w:type="spellStart"/>
+      <w:r>
+        <w:rPr>
+          <w:rFonts w:cstheme="minorHAnsi"/>
+          <w:lang w:val="en-PK"/>
+        </w:rPr>
+        <w:t>lgaya</w:t>
+      </w:r>
+      <w:proofErr w:type="spellEnd"/>
+      <w:r>
+        <w:rPr>
+          <w:rFonts w:cstheme="minorHAnsi"/>
+          <w:lang w:val="en-PK"/>
+        </w:rPr>
+        <w:t xml:space="preserve"> </w:t>
+      </w:r>
+      <w:proofErr w:type="spellStart"/>
+      <w:r>
+        <w:rPr>
+          <w:rFonts w:cstheme="minorHAnsi"/>
+          <w:lang w:val="en-PK"/>
+        </w:rPr>
+        <w:t>hua</w:t>
+      </w:r>
+      <w:proofErr w:type="spellEnd"/>
+      <w:r>
+        <w:rPr>
+          <w:rFonts w:cstheme="minorHAnsi"/>
+          <w:lang w:val="en-PK"/>
+        </w:rPr>
+        <w:t xml:space="preserve"> h and DATE.DATE issue create </w:t>
+      </w:r>
+      <w:proofErr w:type="spellStart"/>
+      <w:r>
+        <w:rPr>
+          <w:rFonts w:cstheme="minorHAnsi"/>
+          <w:lang w:val="en-PK"/>
+        </w:rPr>
+        <w:t>kr</w:t>
+      </w:r>
+      <w:proofErr w:type="spellEnd"/>
+      <w:r>
+        <w:rPr>
+          <w:rFonts w:cstheme="minorHAnsi"/>
+          <w:lang w:val="en-PK"/>
+        </w:rPr>
+        <w:t xml:space="preserve"> </w:t>
+      </w:r>
+      <w:proofErr w:type="spellStart"/>
+      <w:r>
+        <w:rPr>
+          <w:rFonts w:cstheme="minorHAnsi"/>
+          <w:lang w:val="en-PK"/>
+        </w:rPr>
+        <w:t>rha</w:t>
+      </w:r>
+      <w:proofErr w:type="spellEnd"/>
+      <w:r>
+        <w:rPr>
+          <w:rFonts w:cstheme="minorHAnsi"/>
+          <w:lang w:val="en-PK"/>
+        </w:rPr>
+        <w:t xml:space="preserve"> h, is </w:t>
+      </w:r>
+      <w:proofErr w:type="spellStart"/>
+      <w:r>
+        <w:rPr>
+          <w:rFonts w:cstheme="minorHAnsi"/>
+          <w:lang w:val="en-PK"/>
+        </w:rPr>
+        <w:t>liye</w:t>
+      </w:r>
+      <w:proofErr w:type="spellEnd"/>
+      <w:r>
+        <w:rPr>
+          <w:rFonts w:cstheme="minorHAnsi"/>
+          <w:lang w:val="en-PK"/>
+        </w:rPr>
+        <w:t xml:space="preserve"> hm n </w:t>
+      </w:r>
+      <w:proofErr w:type="spellStart"/>
+      <w:r>
+        <w:rPr>
+          <w:rFonts w:cstheme="minorHAnsi"/>
+          <w:lang w:val="en-PK"/>
+        </w:rPr>
+        <w:t>maseed</w:t>
+      </w:r>
+      <w:proofErr w:type="spellEnd"/>
+      <w:r>
+        <w:rPr>
+          <w:rFonts w:cstheme="minorHAnsi"/>
+          <w:lang w:val="en-PK"/>
+        </w:rPr>
+        <w:t xml:space="preserve"> .[Date] ko khatam </w:t>
+      </w:r>
+      <w:proofErr w:type="spellStart"/>
+      <w:r>
+        <w:rPr>
+          <w:rFonts w:cstheme="minorHAnsi"/>
+          <w:lang w:val="en-PK"/>
+        </w:rPr>
+        <w:t>krna</w:t>
+      </w:r>
+      <w:proofErr w:type="spellEnd"/>
+      <w:r>
+        <w:rPr>
+          <w:rFonts w:cstheme="minorHAnsi"/>
+          <w:lang w:val="en-PK"/>
+        </w:rPr>
+        <w:t xml:space="preserve"> h, </w:t>
+      </w:r>
+      <w:proofErr w:type="spellStart"/>
+      <w:r>
+        <w:rPr>
+          <w:rFonts w:cstheme="minorHAnsi"/>
+          <w:lang w:val="en-PK"/>
+        </w:rPr>
+        <w:t>yhan</w:t>
+      </w:r>
+      <w:proofErr w:type="spellEnd"/>
+      <w:r>
+        <w:rPr>
+          <w:rFonts w:cstheme="minorHAnsi"/>
+          <w:lang w:val="en-PK"/>
+        </w:rPr>
+        <w:t xml:space="preserve"> s </w:t>
+      </w:r>
+      <w:proofErr w:type="spellStart"/>
+      <w:r>
+        <w:rPr>
+          <w:rFonts w:cstheme="minorHAnsi"/>
+          <w:lang w:val="en-PK"/>
+        </w:rPr>
+        <w:t>bhi</w:t>
+      </w:r>
+      <w:proofErr w:type="spellEnd"/>
+      <w:r>
+        <w:rPr>
+          <w:rFonts w:cstheme="minorHAnsi"/>
+          <w:lang w:val="en-PK"/>
+        </w:rPr>
+        <w:t xml:space="preserve"> or min date across and max date k formula s </w:t>
+      </w:r>
+      <w:proofErr w:type="spellStart"/>
+      <w:r>
+        <w:rPr>
+          <w:rFonts w:cstheme="minorHAnsi"/>
+          <w:lang w:val="en-PK"/>
+        </w:rPr>
+        <w:t>bhi</w:t>
+      </w:r>
+      <w:proofErr w:type="spellEnd"/>
+      <w:r>
+        <w:rPr>
+          <w:rFonts w:cstheme="minorHAnsi"/>
+          <w:lang w:val="en-PK"/>
+        </w:rPr>
+        <w:t>,</w:t>
+      </w:r>
+      <w:r>
+        <w:rPr>
+          <w:rFonts w:cstheme="minorHAnsi"/>
+          <w:lang w:val="en-PK"/>
+        </w:rPr>
+        <w:t xml:space="preserve"> </w:t>
+      </w:r>
+      <w:proofErr w:type="spellStart"/>
+      <w:r>
+        <w:rPr>
+          <w:rFonts w:cstheme="minorHAnsi"/>
+          <w:lang w:val="en-PK"/>
+        </w:rPr>
+        <w:t>yani</w:t>
+      </w:r>
+      <w:proofErr w:type="spellEnd"/>
+      <w:r>
+        <w:rPr>
+          <w:rFonts w:cstheme="minorHAnsi"/>
+          <w:lang w:val="en-PK"/>
+        </w:rPr>
+        <w:t xml:space="preserve"> hr </w:t>
+      </w:r>
+      <w:proofErr w:type="spellStart"/>
+      <w:r>
+        <w:rPr>
+          <w:rFonts w:cstheme="minorHAnsi"/>
+          <w:lang w:val="en-PK"/>
+        </w:rPr>
+        <w:t>jga</w:t>
+      </w:r>
+      <w:proofErr w:type="spellEnd"/>
+      <w:r>
+        <w:rPr>
+          <w:rFonts w:cstheme="minorHAnsi"/>
+          <w:lang w:val="en-PK"/>
+        </w:rPr>
+        <w:t xml:space="preserve"> s hm n </w:t>
+      </w:r>
+      <w:proofErr w:type="spellStart"/>
+      <w:r>
+        <w:rPr>
+          <w:rFonts w:cstheme="minorHAnsi"/>
+          <w:lang w:val="en-PK"/>
+        </w:rPr>
+        <w:t>date.date</w:t>
+      </w:r>
+      <w:proofErr w:type="spellEnd"/>
+      <w:r>
+        <w:rPr>
+          <w:rFonts w:cstheme="minorHAnsi"/>
+          <w:lang w:val="en-PK"/>
+        </w:rPr>
+        <w:t xml:space="preserve"> vali </w:t>
+      </w:r>
+      <w:proofErr w:type="spellStart"/>
+      <w:r>
+        <w:rPr>
+          <w:rFonts w:cstheme="minorHAnsi"/>
+          <w:lang w:val="en-PK"/>
+        </w:rPr>
+        <w:t>doosri</w:t>
+      </w:r>
+      <w:proofErr w:type="spellEnd"/>
+      <w:r>
+        <w:rPr>
+          <w:rFonts w:cstheme="minorHAnsi"/>
+          <w:lang w:val="en-PK"/>
+        </w:rPr>
+        <w:t xml:space="preserve"> date ko </w:t>
+      </w:r>
+      <w:proofErr w:type="spellStart"/>
+      <w:r>
+        <w:rPr>
+          <w:rFonts w:cstheme="minorHAnsi"/>
+          <w:lang w:val="en-PK"/>
+        </w:rPr>
+        <w:t>htana</w:t>
+      </w:r>
+      <w:proofErr w:type="spellEnd"/>
+      <w:r>
+        <w:rPr>
+          <w:rFonts w:cstheme="minorHAnsi"/>
+          <w:lang w:val="en-PK"/>
+        </w:rPr>
+        <w:t xml:space="preserve"> h</w:t>
+      </w:r>
+      <w:r>
+        <w:rPr>
+          <w:rFonts w:cstheme="minorHAnsi"/>
+          <w:lang w:val="en-PK"/>
+        </w:rPr>
+        <w:t>,</w:t>
+      </w:r>
+      <w:r>
+        <w:rPr>
+          <w:rFonts w:cstheme="minorHAnsi"/>
+          <w:lang w:val="en-PK"/>
+        </w:rPr>
+        <w:t xml:space="preserve"> then </w:t>
+      </w:r>
+      <w:proofErr w:type="spellStart"/>
+      <w:r>
+        <w:rPr>
+          <w:rFonts w:cstheme="minorHAnsi"/>
+          <w:lang w:val="en-PK"/>
+        </w:rPr>
+        <w:t>coalscene</w:t>
+      </w:r>
+      <w:proofErr w:type="spellEnd"/>
+      <w:r>
+        <w:rPr>
+          <w:rFonts w:cstheme="minorHAnsi"/>
+          <w:lang w:val="en-PK"/>
+        </w:rPr>
+        <w:t xml:space="preserve"> </w:t>
+      </w:r>
+      <w:proofErr w:type="spellStart"/>
+      <w:r>
+        <w:rPr>
+          <w:rFonts w:cstheme="minorHAnsi"/>
+          <w:lang w:val="en-PK"/>
+        </w:rPr>
+        <w:t>vala</w:t>
+      </w:r>
+      <w:proofErr w:type="spellEnd"/>
+      <w:r>
+        <w:rPr>
+          <w:rFonts w:cstheme="minorHAnsi"/>
+          <w:lang w:val="en-PK"/>
+        </w:rPr>
+        <w:t xml:space="preserve"> formula correct value return </w:t>
+      </w:r>
+      <w:proofErr w:type="spellStart"/>
+      <w:r>
+        <w:rPr>
+          <w:rFonts w:cstheme="minorHAnsi"/>
+          <w:lang w:val="en-PK"/>
+        </w:rPr>
+        <w:t>kry</w:t>
+      </w:r>
+      <w:proofErr w:type="spellEnd"/>
+      <w:r>
+        <w:rPr>
+          <w:rFonts w:cstheme="minorHAnsi"/>
+          <w:lang w:val="en-PK"/>
+        </w:rPr>
+        <w:t xml:space="preserve"> ga </w:t>
+      </w:r>
+    </w:p>
+    <w:p>
+      <w:pPr>
+        <w:rPr>
+          <w:rFonts w:cstheme="minorHAnsi"/>
+          <w:color w:val="EE0000"/>
+          <w:lang w:val="en-PK"/>
+        </w:rPr>
+      </w:pPr>
+      <w:r>
+        <w:rPr>
+          <w:rFonts w:cstheme="minorHAnsi"/>
+          <w:lang w:val="en-PK"/>
+        </w:rPr>
+        <w:t xml:space="preserve">Lekin m n y formula khud s </w:t>
+      </w:r>
+      <w:proofErr w:type="spellStart"/>
+      <w:r>
+        <w:rPr>
+          <w:rFonts w:cstheme="minorHAnsi"/>
+          <w:lang w:val="en-PK"/>
+        </w:rPr>
+        <w:t>likha</w:t>
+      </w:r>
+      <w:proofErr w:type="spellEnd"/>
+      <w:r>
+        <w:rPr>
+          <w:rFonts w:cstheme="minorHAnsi"/>
+          <w:lang w:val="en-PK"/>
+        </w:rPr>
+        <w:t xml:space="preserve"> h and y correct result de </w:t>
+      </w:r>
+      <w:proofErr w:type="spellStart"/>
+      <w:r>
+        <w:rPr>
+          <w:rFonts w:cstheme="minorHAnsi"/>
+          <w:lang w:val="en-PK"/>
+        </w:rPr>
+        <w:t>rha</w:t>
+      </w:r>
+      <w:proofErr w:type="spellEnd"/>
+      <w:r>
+        <w:rPr>
+          <w:rFonts w:cstheme="minorHAnsi"/>
+          <w:lang w:val="en-PK"/>
+        </w:rPr>
+        <w:t xml:space="preserve"> h: </w:t>
+      </w:r>
+      <w:proofErr w:type="spellStart"/>
+      <w:r>
+        <w:rPr>
+          <w:rFonts w:ascii="Bell MT" w:hAnsi="Bell MT" w:cstheme="minorHAnsi"/>
+          <w:color w:val="EE0000"/>
+          <w:lang w:val="en-PK"/>
+        </w:rPr>
+        <w:t>total_value</w:t>
+      </w:r>
+      <w:proofErr w:type="spellEnd"/>
+      <w:r>
+        <w:rPr>
+          <w:rFonts w:ascii="Bell MT" w:hAnsi="Bell MT" w:cstheme="minorHAnsi"/>
+          <w:color w:val="EE0000"/>
+          <w:lang w:val="en-PK"/>
+        </w:rPr>
+        <w:t xml:space="preserve"> = </w:t>
+      </w:r>
+      <w:proofErr w:type="gramStart"/>
+      <w:r>
+        <w:rPr>
+          <w:rFonts w:ascii="Bell MT" w:hAnsi="Bell MT" w:cstheme="minorHAnsi"/>
+          <w:color w:val="EE0000"/>
+          <w:lang w:val="en-PK"/>
+        </w:rPr>
+        <w:t>IF( [</w:t>
+      </w:r>
+      <w:proofErr w:type="spellStart"/>
+      <w:proofErr w:type="gramEnd"/>
+      <w:r>
+        <w:rPr>
+          <w:rFonts w:ascii="Bell MT" w:hAnsi="Bell MT" w:cstheme="minorHAnsi"/>
+          <w:color w:val="EE0000"/>
+          <w:lang w:val="en-PK"/>
+        </w:rPr>
+        <w:t>balance_sheet_report_filter</w:t>
+      </w:r>
+      <w:proofErr w:type="spellEnd"/>
+      <w:r>
+        <w:rPr>
+          <w:rFonts w:ascii="Bell MT" w:hAnsi="Bell MT" w:cstheme="minorHAnsi"/>
+          <w:color w:val="EE0000"/>
+          <w:lang w:val="en-PK"/>
+        </w:rPr>
+        <w:t>], [</w:t>
+      </w:r>
+      <w:proofErr w:type="spellStart"/>
+      <w:r>
+        <w:rPr>
+          <w:rFonts w:ascii="Bell MT" w:hAnsi="Bell MT" w:cstheme="minorHAnsi"/>
+          <w:color w:val="EE0000"/>
+          <w:lang w:val="en-PK"/>
+        </w:rPr>
+        <w:t>total_to_date</w:t>
+      </w:r>
+      <w:proofErr w:type="spellEnd"/>
+      <w:r>
+        <w:rPr>
+          <w:rFonts w:ascii="Bell MT" w:hAnsi="Bell MT" w:cstheme="minorHAnsi"/>
+          <w:color w:val="EE0000"/>
+          <w:lang w:val="en-PK"/>
+        </w:rPr>
+        <w:t xml:space="preserve">], </w:t>
+      </w:r>
+      <w:proofErr w:type="gramStart"/>
+      <w:r>
+        <w:rPr>
+          <w:rFonts w:ascii="Bell MT" w:hAnsi="Bell MT" w:cstheme="minorHAnsi"/>
+          <w:color w:val="EE0000"/>
+          <w:lang w:val="en-PK"/>
+        </w:rPr>
+        <w:t>IF( [</w:t>
+      </w:r>
+      <w:proofErr w:type="spellStart"/>
+      <w:proofErr w:type="gramEnd"/>
+      <w:r>
+        <w:rPr>
+          <w:rFonts w:ascii="Bell MT" w:hAnsi="Bell MT" w:cstheme="minorHAnsi"/>
+          <w:color w:val="EE0000"/>
+          <w:lang w:val="en-PK"/>
+        </w:rPr>
+        <w:t>P_and_L_report_filter</w:t>
+      </w:r>
+      <w:proofErr w:type="spellEnd"/>
+      <w:proofErr w:type="gramStart"/>
+      <w:r>
+        <w:rPr>
+          <w:rFonts w:ascii="Bell MT" w:hAnsi="Bell MT" w:cstheme="minorHAnsi"/>
+          <w:color w:val="EE0000"/>
+          <w:lang w:val="en-PK"/>
+        </w:rPr>
+        <w:t>] ,</w:t>
+      </w:r>
+      <w:proofErr w:type="gramEnd"/>
+      <w:r>
+        <w:rPr>
+          <w:rFonts w:ascii="Bell MT" w:hAnsi="Bell MT" w:cstheme="minorHAnsi"/>
+          <w:color w:val="EE0000"/>
+          <w:lang w:val="en-PK"/>
+        </w:rPr>
+        <w:t xml:space="preserve"> [</w:t>
+      </w:r>
+      <w:proofErr w:type="spellStart"/>
+      <w:r>
+        <w:rPr>
+          <w:rFonts w:ascii="Bell MT" w:hAnsi="Bell MT" w:cstheme="minorHAnsi"/>
+          <w:color w:val="EE0000"/>
+          <w:lang w:val="en-PK"/>
+        </w:rPr>
+        <w:t>total_FTP</w:t>
+      </w:r>
+      <w:proofErr w:type="spellEnd"/>
+      <w:r>
+        <w:rPr>
+          <w:rFonts w:ascii="Bell MT" w:hAnsi="Bell MT" w:cstheme="minorHAnsi"/>
+          <w:color w:val="EE0000"/>
+          <w:lang w:val="en-PK"/>
+        </w:rPr>
+        <w:t>]))</w:t>
+      </w:r>
+      <w:r>
+        <w:rPr>
+          <w:rFonts w:cstheme="minorHAnsi"/>
+          <w:color w:val="EE0000"/>
+          <w:lang w:val="en-PK"/>
+        </w:rPr>
+        <w:t xml:space="preserve"> </w:t>
+      </w:r>
+    </w:p>
+    <w:p>
+      <w:pPr>
+        <w:rPr>
+          <w:rFonts w:ascii="Bell MT" w:hAnsi="Bell MT" w:cstheme="minorHAnsi"/>
+          <w:color w:val="EE0000"/>
+          <w:lang w:val="en-PK"/>
+        </w:rPr>
+      </w:pPr>
+      <w:r>
+        <w:rPr>
+          <w:rFonts w:cstheme="minorHAnsi"/>
+          <w:color w:val="EE0000"/>
+          <w:lang w:val="en-PK"/>
+        </w:rPr>
+        <w:t xml:space="preserve">Whereas: </w:t>
+      </w:r>
+      <w:proofErr w:type="spellStart"/>
+      <w:r>
+        <w:rPr>
+          <w:rFonts w:ascii="Bell MT" w:hAnsi="Bell MT" w:cstheme="minorHAnsi"/>
+          <w:color w:val="EE0000"/>
+          <w:lang w:val="en-PK"/>
+        </w:rPr>
+        <w:t>balance_sheet_report_filter</w:t>
+      </w:r>
+      <w:proofErr w:type="spellEnd"/>
+      <w:r>
+        <w:rPr>
+          <w:rFonts w:ascii="Bell MT" w:hAnsi="Bell MT" w:cstheme="minorHAnsi"/>
+          <w:color w:val="EE0000"/>
+          <w:lang w:val="en-PK"/>
+        </w:rPr>
+        <w:t xml:space="preserve"> = CALCULATE(SUM(GL[Amount]), 'Chart of Accounts'[Report]="Balance Sheet") </w:t>
+      </w:r>
+    </w:p>
+    <w:p>
+      <w:pPr>
+        <w:rPr>
+          <w:rFonts w:cstheme="minorHAnsi"/>
+          <w:color w:val="EE0000"/>
+          <w:lang w:val="en-PK"/>
+        </w:rPr>
+      </w:pPr>
+      <w:r>
+        <w:rPr>
+          <w:rFonts w:cstheme="minorHAnsi"/>
+          <w:color w:val="EE0000"/>
+          <w:lang w:val="en-PK"/>
+        </w:rPr>
+        <w:t xml:space="preserve">And </w:t>
+      </w:r>
+      <w:proofErr w:type="spellStart"/>
+      <w:r>
+        <w:rPr>
+          <w:rFonts w:ascii="Bell MT" w:hAnsi="Bell MT" w:cstheme="minorHAnsi"/>
+          <w:color w:val="EE0000"/>
+          <w:lang w:val="en-PK"/>
+        </w:rPr>
+        <w:t>P_and_L_report_filter</w:t>
+      </w:r>
+      <w:proofErr w:type="spellEnd"/>
+      <w:r>
+        <w:rPr>
+          <w:rFonts w:ascii="Bell MT" w:hAnsi="Bell MT" w:cstheme="minorHAnsi"/>
+          <w:color w:val="EE0000"/>
+          <w:lang w:val="en-PK"/>
+        </w:rPr>
+        <w:t xml:space="preserve"> = CALCULATE(SUM(GL[Amount]), 'Chart of Accounts'[Report]="Profit and Loss")</w:t>
+      </w:r>
+    </w:p>
+    <w:p>
+      <w:pPr>
+        <w:rPr>
+          <w:rFonts w:cstheme="minorHAnsi"/>
+          <w:lang w:val="en-PK"/>
+        </w:rPr>
+      </w:pPr>
+    </w:p>
+    <w:p>
+      <w:pPr>
+        <w:rPr>
+          <w:lang w:val="en-PK"/>
+        </w:rPr>
+      </w:pPr>
+      <w:r>
+        <w:rPr>
+          <w:lang w:val="en-PK"/>
+        </w:rPr>
+        <w:t xml:space="preserve">MY FORMULA IS </w:t>
+      </w:r>
+      <w:r>
+        <w:rPr>
+          <w:lang w:val="en-PK"/>
+        </w:rPr>
+        <w:t xml:space="preserve">CORRECT BUT </w:t>
+      </w:r>
+      <w:r>
+        <w:rPr>
+          <w:lang w:val="en-PK"/>
+        </w:rPr>
+        <w:t xml:space="preserve">NOT </w:t>
+      </w:r>
+      <w:proofErr w:type="gramStart"/>
+      <w:r>
+        <w:rPr>
+          <w:lang w:val="en-PK"/>
+        </w:rPr>
+        <w:t>RELIABLE ,</w:t>
+      </w:r>
+      <w:proofErr w:type="gramEnd"/>
+      <w:r>
+        <w:rPr>
+          <w:lang w:val="en-PK"/>
+        </w:rPr>
+        <w:t xml:space="preserve"> BETTER TO </w:t>
+      </w:r>
+      <w:proofErr w:type="gramStart"/>
+      <w:r>
+        <w:rPr>
+          <w:lang w:val="en-PK"/>
+        </w:rPr>
+        <w:t>USE :</w:t>
+      </w:r>
+      <w:proofErr w:type="gramEnd"/>
+      <w:r>
+        <w:rPr>
+          <w:lang w:val="en-PK"/>
+        </w:rPr>
+        <w:t xml:space="preserve"> </w:t>
+      </w:r>
+      <w:proofErr w:type="spellStart"/>
+      <w:r>
+        <w:rPr>
+          <w:color w:val="00B050"/>
+          <w:lang w:val="en-PK"/>
+        </w:rPr>
+        <w:t>total_value</w:t>
+      </w:r>
+      <w:proofErr w:type="spellEnd"/>
+      <w:r>
+        <w:rPr>
+          <w:color w:val="00B050"/>
+          <w:lang w:val="en-PK"/>
+        </w:rPr>
+        <w:t xml:space="preserve"> =</w:t>
+      </w:r>
+    </w:p>
+    <w:p>
+      <w:pPr>
+        <w:rPr>
+          <w:color w:val="00B050"/>
+          <w:lang w:val="en-PK"/>
+        </w:rPr>
+      </w:pPr>
+      <w:proofErr w:type="gramStart"/>
+      <w:r>
+        <w:rPr>
+          <w:color w:val="00B050"/>
+          <w:lang w:val="en-PK"/>
+        </w:rPr>
+        <w:t>IF(</w:t>
+      </w:r>
+      <w:proofErr w:type="gramEnd"/>
+    </w:p>
+    <w:p>
+      <w:pPr>
+        <w:rPr>
+          <w:color w:val="00B050"/>
+          <w:lang w:val="en-PK"/>
+        </w:rPr>
+      </w:pPr>
+      <w:r>
+        <w:rPr>
+          <w:color w:val="00B050"/>
+          <w:lang w:val="en-PK"/>
+        </w:rPr>
+        <w:t xml:space="preserve">    </w:t>
+      </w:r>
+      <w:proofErr w:type="gramStart"/>
+      <w:r>
+        <w:rPr>
+          <w:color w:val="00B050"/>
+          <w:lang w:val="en-PK"/>
+        </w:rPr>
+        <w:t>SELECTEDVALUE(</w:t>
+      </w:r>
+      <w:proofErr w:type="gramEnd"/>
+      <w:r>
+        <w:rPr>
+          <w:color w:val="00B050"/>
+          <w:lang w:val="en-PK"/>
+        </w:rPr>
+        <w:t>'Chart of Accounts'[Report]) = "Balance Sheet",</w:t>
+      </w:r>
+    </w:p>
+    <w:p>
+      <w:pPr>
+        <w:rPr>
+          <w:color w:val="00B050"/>
+          <w:lang w:val="en-PK"/>
+        </w:rPr>
+      </w:pPr>
+      <w:r>
+        <w:rPr>
+          <w:color w:val="00B050"/>
+          <w:lang w:val="en-PK"/>
+        </w:rPr>
+        <w:t xml:space="preserve">    [</w:t>
+      </w:r>
+      <w:proofErr w:type="spellStart"/>
+      <w:r>
+        <w:rPr>
+          <w:color w:val="00B050"/>
+          <w:lang w:val="en-PK"/>
+        </w:rPr>
+        <w:t>total_to_date</w:t>
+      </w:r>
+      <w:proofErr w:type="spellEnd"/>
+      <w:r>
+        <w:rPr>
+          <w:color w:val="00B050"/>
+          <w:lang w:val="en-PK"/>
+        </w:rPr>
+        <w:t>],</w:t>
+      </w:r>
+    </w:p>
+    <w:p>
+      <w:pPr>
+        <w:rPr>
+          <w:color w:val="00B050"/>
+          <w:lang w:val="en-PK"/>
+        </w:rPr>
+      </w:pPr>
+      <w:r>
+        <w:rPr>
+          <w:color w:val="00B050"/>
+          <w:lang w:val="en-PK"/>
+        </w:rPr>
+        <w:t xml:space="preserve">    [</w:t>
+      </w:r>
+      <w:proofErr w:type="spellStart"/>
+      <w:r>
+        <w:rPr>
+          <w:color w:val="00B050"/>
+          <w:lang w:val="en-PK"/>
+        </w:rPr>
+        <w:t>total_FTP</w:t>
+      </w:r>
+      <w:proofErr w:type="spellEnd"/>
+      <w:r>
+        <w:rPr>
+          <w:color w:val="00B050"/>
+          <w:lang w:val="en-PK"/>
+        </w:rPr>
+        <w:t>]</w:t>
+      </w:r>
+    </w:p>
+    <w:p>
+      <w:pPr>
+        <w:rPr>
+          <w:lang w:val="en-PK"/>
+        </w:rPr>
+      </w:pPr>
+      <w:r>
+        <w:rPr>
+          <w:color w:val="00B050"/>
+          <w:lang w:val="en-PK"/>
+        </w:rPr>
+        <w:t>)</w:t>
+      </w:r>
+      <w:r>
+        <w:rPr>
+          <w:color w:val="00B050"/>
+          <w:lang w:val="en-PK"/>
+        </w:rPr>
+        <w:t xml:space="preserve"> </w:t>
+      </w:r>
+      <w:r>
+        <w:rPr>
+          <w:lang w:val="en-PK"/>
+        </w:rPr>
+        <w:t>BECAUSE BALANCE SHEET REPORT FILTER</w:t>
+      </w:r>
+      <w:r>
+        <w:rPr>
+          <w:lang w:val="en-PK"/>
+        </w:rPr>
+        <w:t xml:space="preserve"> RETURNS A NUMBER NOT TRUE OR </w:t>
+      </w:r>
+      <w:r>
+        <w:rPr>
+          <w:lang w:val="en-PK"/>
+        </w:rPr>
+        <w:t>FALSE</w:t>
+      </w:r>
+      <w:r>
+        <w:rPr>
+          <w:lang w:val="en-PK"/>
+        </w:rPr>
+        <w:t xml:space="preserve"> VALUE </w:t>
+      </w:r>
     </w:p>
     <w:p>
       <w:pPr>
@@ -19070,7 +21094,7 @@
   <w:style w:type="paragraph" w:default="1" w:styleId="Normal">
     <w:name w:val="Normal"/>
     <w:qFormat/>
-    <w:rsid w:val="00516A3D"/>
+    <w:rsid w:val="00FD7038"/>
   </w:style>
   <w:style w:type="paragraph" w:styleId="Heading1">
     <w:name w:val="heading 1"/>

</xml_diff>

<commit_message>
infor about period and period calculation
</commit_message>
<xml_diff>
--- a/Complete FINANCIAL REPORTING AND FINANCIAL ANALYSIS USING POWER BI.docx
+++ b/Complete FINANCIAL REPORTING AND FINANCIAL ANALYSIS USING POWER BI.docx
@@ -5920,6 +5920,25 @@
       <w:pPr>
         <w:ind w:left="360"/>
         <w:rPr>
+          <w:b/>
+          <w:bCs/>
+          <w:lang w:val="en-PK"/>
+        </w:rPr>
+      </w:pPr>
+      <w:r>
+        <w:rPr>
+          <w:rFonts w:ascii="Segoe UI Emoji" w:hAnsi="Segoe UI Emoji" w:cs="Segoe UI Emoji"/>
+          <w:b/>
+          <w:bCs/>
+          <w:lang w:val="en-PK"/>
+        </w:rPr>
+        <w:t>Assets, expenses, equity, revenue, liability</w:t>
+      </w:r>
+    </w:p>
+    <w:p>
+      <w:pPr>
+        <w:ind w:left="360"/>
+        <w:rPr>
           <w:lang w:val="en-PK"/>
         </w:rPr>
       </w:pPr>
@@ -6152,6 +6171,7 @@
           <w:bCs/>
           <w:lang w:val="en-PK"/>
         </w:rPr>
+        <w:lastRenderedPageBreak/>
         <w:t>2️</w:t>
       </w:r>
       <w:r>
@@ -6184,7 +6204,6 @@
           <w:rFonts w:ascii="Segoe UI Emoji" w:hAnsi="Segoe UI Emoji" w:cs="Segoe UI Emoji"/>
           <w:lang w:val="en-PK"/>
         </w:rPr>
-        <w:lastRenderedPageBreak/>
         <w:t>👉</w:t>
       </w:r>
       <w:r>
@@ -6724,6 +6743,7 @@
         <w:rPr>
           <w:lang w:val="en-PK"/>
         </w:rPr>
+        <w:lastRenderedPageBreak/>
         <w:t>Salary</w:t>
       </w:r>
     </w:p>
@@ -6741,7 +6761,6 @@
         <w:rPr>
           <w:lang w:val="en-PK"/>
         </w:rPr>
-        <w:lastRenderedPageBreak/>
         <w:t>Electricity</w:t>
       </w:r>
     </w:p>
@@ -7255,6 +7274,7 @@
         <w:rPr>
           <w:lang w:val="en-PK"/>
         </w:rPr>
+        <w:lastRenderedPageBreak/>
         <w:t>That’s it. Just remember this.</w:t>
       </w:r>
     </w:p>
@@ -7269,7 +7289,6 @@
         <w:rPr>
           <w:lang w:val="en-PK"/>
         </w:rPr>
-        <w:lastRenderedPageBreak/>
         <w:pict w14:anchorId="2E3E2015">
           <v:rect id="_x0000_i1032" style="width:0;height:1.5pt" o:hralign="center" o:hrstd="t" o:hr="t" fillcolor="#a0a0a0" stroked="f"/>
         </w:pict>
@@ -7726,6 +7745,7 @@
         <w:rPr>
           <w:lang w:val="en-PK"/>
         </w:rPr>
+        <w:lastRenderedPageBreak/>
         <w:t>Assets → What we have</w:t>
       </w:r>
       <w:r>
@@ -7740,12 +7760,6 @@
           <w:lang w:val="en-PK"/>
         </w:rPr>
         <w:br/>
-      </w:r>
-      <w:r>
-        <w:rPr>
-          <w:lang w:val="en-PK"/>
-        </w:rPr>
-        <w:lastRenderedPageBreak/>
         <w:t>Equity → Owner’s money</w:t>
       </w:r>
       <w:r>
@@ -8511,6 +8525,7 @@
         <w:rPr>
           <w:lang w:val="en-PK"/>
         </w:rPr>
+        <w:lastRenderedPageBreak/>
         <w:t xml:space="preserve">making long story short, there are 5 different types of accounts within a business: Assets (such as cash, bank balance, inventory, machines, company building), expenses (such as labour cost, electricity bills etc etc), </w:t>
       </w:r>
       <w:proofErr w:type="spellStart"/>
@@ -8525,14 +8540,7 @@
         <w:rPr>
           <w:lang w:val="en-PK"/>
         </w:rPr>
-        <w:t xml:space="preserve">, liability( such as bank loan, debts etc) and Equity (jo amount ap n </w:t>
-      </w:r>
-      <w:r>
-        <w:rPr>
-          <w:lang w:val="en-PK"/>
-        </w:rPr>
-        <w:lastRenderedPageBreak/>
-        <w:t xml:space="preserve">invest ki hui h),, y </w:t>
+        <w:t xml:space="preserve">, liability( such as bank loan, debts etc) and Equity (jo amount ap n invest ki hui h),, y </w:t>
       </w:r>
       <w:proofErr w:type="spellStart"/>
       <w:r>
@@ -9514,7 +9522,11 @@
         <w:ind w:left="360"/>
       </w:pPr>
       <w:r>
-        <w:t xml:space="preserve">In profit and loss statement and in balance sheet, the matrix visual only sort alphabetically in power BI, but we want to sort like k sab s phly sales ay, then cost of sales, then operating expenses, then interest &amp; tax and then net profit but power BI don’t do this, moreover, we cannot do </w:t>
+        <w:t xml:space="preserve">In profit and loss statement and in balance sheet, the matrix visual only sort alphabetically in power BI, but we want to sort like k sab s phly sales ay, then cost of sales, then operating expenses, then </w:t>
+      </w:r>
+      <w:r>
+        <w:lastRenderedPageBreak/>
+        <w:t xml:space="preserve">interest &amp; tax and then net profit but power BI don’t do this, moreover, we cannot do </w:t>
       </w:r>
       <w:proofErr w:type="spellStart"/>
       <w:r>
@@ -9554,11 +9566,7 @@
       </w:r>
       <w:proofErr w:type="spellEnd"/>
       <w:r>
-        <w:t xml:space="preserve"> to alphabetically sort ho jay ga but </w:t>
-      </w:r>
-      <w:r>
-        <w:lastRenderedPageBreak/>
-        <w:t xml:space="preserve">class-level sorting disturb ho jay </w:t>
+        <w:t xml:space="preserve"> to alphabetically sort ho jay ga but class-level sorting disturb ho jay </w:t>
       </w:r>
       <w:proofErr w:type="spellStart"/>
       <w:r>
@@ -11017,6 +11025,7 @@
           <w:b/>
           <w:bCs/>
         </w:rPr>
+        <w:lastRenderedPageBreak/>
         <w:t>A balance sheet is like a financial snapshot of a company at a specific point in time. It tells you what the company owns, owes, and the owners’ stake in the business.</w:t>
       </w:r>
     </w:p>
@@ -11046,7 +11055,6 @@
           <w:highlight w:val="yellow"/>
           <w:lang w:val="en-PK"/>
         </w:rPr>
-        <w:lastRenderedPageBreak/>
         <w:t>Assets = Liabilities + equity</w:t>
       </w:r>
       <w:proofErr w:type="gramStart"/>
@@ -12373,7 +12381,14 @@
         <w:rPr>
           <w:lang w:val="en-PK"/>
         </w:rPr>
-        <w:t xml:space="preserve"> k highly liquid assets (which are current assets ) and less liquid assets (which are l</w:t>
+        <w:t xml:space="preserve"> k highly liquid assets (which are current </w:t>
+      </w:r>
+      <w:r>
+        <w:rPr>
+          <w:lang w:val="en-PK"/>
+        </w:rPr>
+        <w:lastRenderedPageBreak/>
+        <w:t>assets ) and less liquid assets (which are l</w:t>
       </w:r>
       <w:r>
         <w:rPr>
@@ -12429,7 +12444,6 @@
         <w:rPr>
           <w:lang w:val="en-PK"/>
         </w:rPr>
-        <w:lastRenderedPageBreak/>
         <w:t xml:space="preserve">Determines whether a company can pay its </w:t>
       </w:r>
       <w:proofErr w:type="gramStart"/>
@@ -13293,6 +13307,7 @@
           <w:u w:val="single"/>
           <w:lang w:val="en-PK"/>
         </w:rPr>
+        <w:lastRenderedPageBreak/>
         <w:t>Assets turnover:</w:t>
       </w:r>
       <w:proofErr w:type="gramStart"/>
@@ -13373,7 +13388,6 @@
           <w:highlight w:val="blue"/>
           <w:lang w:val="en-PK"/>
         </w:rPr>
-        <w:lastRenderedPageBreak/>
         <w:t xml:space="preserve">Assets turnover = sales or revenue / assets </w:t>
       </w:r>
     </w:p>
@@ -14458,7 +14472,6 @@
           <w:u w:val="single"/>
           <w:lang w:val="en-PK"/>
         </w:rPr>
-        <w:lastRenderedPageBreak/>
         <w:t>Interest cover</w:t>
       </w:r>
       <w:r>
@@ -16323,6 +16336,7 @@
         <w:rPr>
           <w:lang w:val="en-PK"/>
         </w:rPr>
+        <w:lastRenderedPageBreak/>
         <w:t xml:space="preserve">Credit Purchases = purchases made on </w:t>
       </w:r>
       <w:proofErr w:type="gramStart"/>
@@ -16595,7 +16609,6 @@
         <w:rPr>
           <w:lang w:val="en-PK"/>
         </w:rPr>
-        <w:lastRenderedPageBreak/>
         <w:t>A higher payable period is not always bad.</w:t>
       </w:r>
       <w:r>
@@ -17359,6 +17372,7 @@
         <w:ind w:left="360"/>
       </w:pPr>
       <w:r>
+        <w:lastRenderedPageBreak/>
         <w:t>A Trial Balance is a simple report that shows the total balance of every account in a company at a specific date.</w:t>
       </w:r>
     </w:p>
@@ -17372,7 +17386,6 @@
         <w:ind w:left="360"/>
       </w:pPr>
       <w:r>
-        <w:lastRenderedPageBreak/>
         <w:t>It is basically a summary of the General Ledger.</w:t>
       </w:r>
     </w:p>
@@ -17567,6 +17580,7 @@
         <w:rPr>
           <w:lang w:val="en-PK"/>
         </w:rPr>
+        <w:lastRenderedPageBreak/>
         <w:t xml:space="preserve">But the issue is that k FTP value (which is just the sum of total amount) is ok for p and L but not for balance sheet because </w:t>
       </w:r>
       <w:proofErr w:type="spellStart"/>
@@ -17636,7 +17650,6 @@
           <w:rFonts w:ascii="Bell MT" w:hAnsi="Bell MT"/>
           <w:lang w:val="en-PK"/>
         </w:rPr>
-        <w:lastRenderedPageBreak/>
         <w:t>total_value_alternate</w:t>
       </w:r>
       <w:proofErr w:type="spellEnd"/>
@@ -18853,7 +18866,14 @@
         <w:rPr>
           <w:lang w:val="en-PK"/>
         </w:rPr>
-        <w:t xml:space="preserve"> sum to get the total amount we have at the end of the month,, but if the dataset showing balance (</w:t>
+        <w:t xml:space="preserve"> </w:t>
+      </w:r>
+      <w:r>
+        <w:rPr>
+          <w:lang w:val="en-PK"/>
+        </w:rPr>
+        <w:lastRenderedPageBreak/>
+        <w:t>sum to get the total amount we have at the end of the month,, but if the dataset showing balance (</w:t>
       </w:r>
       <w:proofErr w:type="spellStart"/>
       <w:r>
@@ -19061,14 +19081,7 @@
         <w:rPr>
           <w:lang w:val="en-PK"/>
         </w:rPr>
-        <w:t xml:space="preserve"> </w:t>
-      </w:r>
-      <w:r>
-        <w:rPr>
-          <w:lang w:val="en-PK"/>
-        </w:rPr>
-        <w:lastRenderedPageBreak/>
-        <w:t xml:space="preserve">this value can be misleading because if we have on </w:t>
+        <w:t xml:space="preserve"> this value can be misleading because if we have on </w:t>
       </w:r>
       <w:proofErr w:type="spellStart"/>
       <w:r>
@@ -20073,6 +20086,7 @@
         <w:rPr>
           <w:lang w:val="en-PK"/>
         </w:rPr>
+        <w:lastRenderedPageBreak/>
         <w:t>Because of this:</w:t>
       </w:r>
     </w:p>
@@ -20124,7 +20138,6 @@
         <w:rPr>
           <w:lang w:val="en-PK"/>
         </w:rPr>
-        <w:lastRenderedPageBreak/>
         <w:t>outliers have less impact</w:t>
       </w:r>
     </w:p>
@@ -21347,6 +21360,7 @@
           <w:rFonts w:ascii="Bell MT" w:hAnsi="Bell MT" w:cstheme="minorHAnsi"/>
           <w:lang w:val="en-PK"/>
         </w:rPr>
+        <w:lastRenderedPageBreak/>
         <w:t>total_FTP_3_month_rolling = CALCULATE([</w:t>
       </w:r>
       <w:proofErr w:type="spellStart"/>
@@ -21466,7 +21480,6 @@
           <w:rFonts w:cstheme="minorHAnsi"/>
           <w:lang w:val="en-PK"/>
         </w:rPr>
-        <w:lastRenderedPageBreak/>
         <w:t>yani</w:t>
       </w:r>
       <w:proofErr w:type="spellEnd"/>
@@ -22644,6 +22657,3146 @@
         <w:t>avergagex</w:t>
       </w:r>
       <w:proofErr w:type="spellEnd"/>
+    </w:p>
+    <w:p>
+      <w:pPr>
+        <w:ind w:left="360"/>
+        <w:rPr>
+          <w:b/>
+          <w:bCs/>
+          <w:sz w:val="52"/>
+          <w:szCs w:val="52"/>
+          <w:u w:val="single"/>
+        </w:rPr>
+      </w:pPr>
+      <w:r>
+        <w:rPr>
+          <w:b/>
+          <w:bCs/>
+          <w:sz w:val="52"/>
+          <w:szCs w:val="52"/>
+          <w:highlight w:val="green"/>
+          <w:u w:val="single"/>
+        </w:rPr>
+        <w:lastRenderedPageBreak/>
+        <w:t xml:space="preserve">Section </w:t>
+      </w:r>
+      <w:proofErr w:type="gramStart"/>
+      <w:r>
+        <w:rPr>
+          <w:b/>
+          <w:bCs/>
+          <w:sz w:val="52"/>
+          <w:szCs w:val="52"/>
+          <w:highlight w:val="green"/>
+          <w:u w:val="single"/>
+        </w:rPr>
+        <w:t>1</w:t>
+      </w:r>
+      <w:r>
+        <w:rPr>
+          <w:b/>
+          <w:bCs/>
+          <w:sz w:val="52"/>
+          <w:szCs w:val="52"/>
+          <w:highlight w:val="green"/>
+          <w:u w:val="single"/>
+        </w:rPr>
+        <w:t>2</w:t>
+      </w:r>
+      <w:r>
+        <w:rPr>
+          <w:b/>
+          <w:bCs/>
+          <w:sz w:val="52"/>
+          <w:szCs w:val="52"/>
+          <w:highlight w:val="green"/>
+          <w:u w:val="single"/>
+        </w:rPr>
+        <w:t>:</w:t>
+      </w:r>
+      <w:r>
+        <w:rPr>
+          <w:b/>
+          <w:bCs/>
+          <w:sz w:val="52"/>
+          <w:szCs w:val="52"/>
+          <w:highlight w:val="green"/>
+          <w:u w:val="single"/>
+        </w:rPr>
+        <w:t>Calculating</w:t>
+      </w:r>
+      <w:proofErr w:type="gramEnd"/>
+      <w:r>
+        <w:rPr>
+          <w:b/>
+          <w:bCs/>
+          <w:sz w:val="52"/>
+          <w:szCs w:val="52"/>
+          <w:highlight w:val="green"/>
+          <w:u w:val="single"/>
+        </w:rPr>
+        <w:t xml:space="preserve"> dynamic period on period growth</w:t>
+      </w:r>
+      <w:r>
+        <w:rPr>
+          <w:b/>
+          <w:bCs/>
+          <w:sz w:val="52"/>
+          <w:szCs w:val="52"/>
+          <w:highlight w:val="green"/>
+          <w:u w:val="single"/>
+        </w:rPr>
+        <w:t>:</w:t>
+      </w:r>
+    </w:p>
+    <w:p>
+      <w:pPr>
+        <w:rPr>
+          <w:lang w:val="en-PK"/>
+        </w:rPr>
+      </w:pPr>
+      <w:r>
+        <w:rPr>
+          <w:lang w:val="en-PK"/>
+        </w:rPr>
+        <w:t xml:space="preserve">Yani </w:t>
+      </w:r>
+      <w:proofErr w:type="spellStart"/>
+      <w:r>
+        <w:rPr>
+          <w:lang w:val="en-PK"/>
+        </w:rPr>
+        <w:t>hmy</w:t>
+      </w:r>
+      <w:proofErr w:type="spellEnd"/>
+      <w:r>
+        <w:rPr>
+          <w:lang w:val="en-PK"/>
+        </w:rPr>
+        <w:t xml:space="preserve"> y </w:t>
+      </w:r>
+      <w:proofErr w:type="spellStart"/>
+      <w:r>
+        <w:rPr>
+          <w:lang w:val="en-PK"/>
+        </w:rPr>
+        <w:t>baat</w:t>
+      </w:r>
+      <w:proofErr w:type="spellEnd"/>
+      <w:r>
+        <w:rPr>
+          <w:lang w:val="en-PK"/>
+        </w:rPr>
+        <w:t xml:space="preserve"> check </w:t>
+      </w:r>
+      <w:proofErr w:type="spellStart"/>
+      <w:r>
+        <w:rPr>
+          <w:lang w:val="en-PK"/>
+        </w:rPr>
+        <w:t>krni</w:t>
+      </w:r>
+      <w:proofErr w:type="spellEnd"/>
+      <w:r>
+        <w:rPr>
+          <w:lang w:val="en-PK"/>
+        </w:rPr>
+        <w:t xml:space="preserve"> h k hr month, hr quarter </w:t>
+      </w:r>
+      <w:proofErr w:type="spellStart"/>
+      <w:r>
+        <w:rPr>
+          <w:lang w:val="en-PK"/>
+        </w:rPr>
+        <w:t>ya</w:t>
+      </w:r>
+      <w:proofErr w:type="spellEnd"/>
+      <w:r>
+        <w:rPr>
+          <w:lang w:val="en-PK"/>
+        </w:rPr>
+        <w:t xml:space="preserve"> hr year pr </w:t>
+      </w:r>
+      <w:proofErr w:type="spellStart"/>
+      <w:r>
+        <w:rPr>
+          <w:lang w:val="en-PK"/>
+        </w:rPr>
+        <w:t>kitni</w:t>
+      </w:r>
+      <w:proofErr w:type="spellEnd"/>
+      <w:r>
+        <w:rPr>
+          <w:lang w:val="en-PK"/>
+        </w:rPr>
+        <w:t xml:space="preserve"> growth hui previous month, quarter </w:t>
+      </w:r>
+      <w:proofErr w:type="spellStart"/>
+      <w:r>
+        <w:rPr>
+          <w:lang w:val="en-PK"/>
+        </w:rPr>
+        <w:t>ya</w:t>
+      </w:r>
+      <w:proofErr w:type="spellEnd"/>
+      <w:r>
+        <w:rPr>
+          <w:lang w:val="en-PK"/>
+        </w:rPr>
+        <w:t xml:space="preserve"> year s respectively</w:t>
+      </w:r>
+      <w:r>
+        <w:rPr>
+          <w:lang w:val="en-PK"/>
+        </w:rPr>
+        <w:t xml:space="preserve">,, </w:t>
+      </w:r>
+      <w:proofErr w:type="spellStart"/>
+      <w:r>
+        <w:rPr>
+          <w:lang w:val="en-PK"/>
+        </w:rPr>
+        <w:t>e.g</w:t>
+      </w:r>
+      <w:proofErr w:type="spellEnd"/>
+      <w:r>
+        <w:rPr>
+          <w:lang w:val="en-PK"/>
+        </w:rPr>
+        <w:t xml:space="preserve">: in January end </w:t>
+      </w:r>
+      <w:proofErr w:type="spellStart"/>
+      <w:r>
+        <w:rPr>
+          <w:lang w:val="en-PK"/>
+        </w:rPr>
+        <w:t>hmary</w:t>
+      </w:r>
+      <w:proofErr w:type="spellEnd"/>
+      <w:r>
+        <w:rPr>
+          <w:lang w:val="en-PK"/>
+        </w:rPr>
+        <w:t xml:space="preserve"> pas balance </w:t>
+      </w:r>
+      <w:proofErr w:type="spellStart"/>
+      <w:r>
+        <w:rPr>
+          <w:lang w:val="en-PK"/>
+        </w:rPr>
+        <w:t>tha</w:t>
+      </w:r>
+      <w:proofErr w:type="spellEnd"/>
+      <w:r>
+        <w:rPr>
+          <w:lang w:val="en-PK"/>
+        </w:rPr>
+        <w:t xml:space="preserve"> 1000$ and </w:t>
+      </w:r>
+      <w:proofErr w:type="spellStart"/>
+      <w:r>
+        <w:rPr>
+          <w:lang w:val="en-PK"/>
+        </w:rPr>
+        <w:t>feb</w:t>
+      </w:r>
+      <w:proofErr w:type="spellEnd"/>
+      <w:r>
+        <w:rPr>
+          <w:lang w:val="en-PK"/>
+        </w:rPr>
+        <w:t xml:space="preserve"> k end pr </w:t>
+      </w:r>
+      <w:proofErr w:type="spellStart"/>
+      <w:r>
+        <w:rPr>
+          <w:lang w:val="en-PK"/>
+        </w:rPr>
+        <w:t>hmary</w:t>
+      </w:r>
+      <w:proofErr w:type="spellEnd"/>
+      <w:r>
+        <w:rPr>
+          <w:lang w:val="en-PK"/>
+        </w:rPr>
+        <w:t xml:space="preserve"> pas balance </w:t>
+      </w:r>
+      <w:proofErr w:type="spellStart"/>
+      <w:r>
+        <w:rPr>
+          <w:lang w:val="en-PK"/>
+        </w:rPr>
+        <w:t>tha</w:t>
+      </w:r>
+      <w:proofErr w:type="spellEnd"/>
+      <w:r>
+        <w:rPr>
+          <w:lang w:val="en-PK"/>
+        </w:rPr>
+        <w:t xml:space="preserve"> 2000$, so we </w:t>
+      </w:r>
+      <w:proofErr w:type="spellStart"/>
+      <w:r>
+        <w:rPr>
+          <w:lang w:val="en-PK"/>
+        </w:rPr>
+        <w:t>wanna</w:t>
+      </w:r>
+      <w:proofErr w:type="spellEnd"/>
+      <w:r>
+        <w:rPr>
+          <w:lang w:val="en-PK"/>
+        </w:rPr>
+        <w:t xml:space="preserve"> check k </w:t>
+      </w:r>
+      <w:proofErr w:type="spellStart"/>
+      <w:r>
+        <w:rPr>
+          <w:lang w:val="en-PK"/>
+        </w:rPr>
+        <w:t>hmary</w:t>
+      </w:r>
+      <w:proofErr w:type="spellEnd"/>
+      <w:r>
+        <w:rPr>
+          <w:lang w:val="en-PK"/>
+        </w:rPr>
+        <w:t xml:space="preserve"> pas </w:t>
+      </w:r>
+      <w:proofErr w:type="spellStart"/>
+      <w:r>
+        <w:rPr>
+          <w:lang w:val="en-PK"/>
+        </w:rPr>
+        <w:t>sirf</w:t>
+      </w:r>
+      <w:proofErr w:type="spellEnd"/>
+      <w:r>
+        <w:rPr>
+          <w:lang w:val="en-PK"/>
+        </w:rPr>
+        <w:t xml:space="preserve"> Feb k month m </w:t>
+      </w:r>
+      <w:proofErr w:type="spellStart"/>
+      <w:r>
+        <w:rPr>
+          <w:lang w:val="en-PK"/>
+        </w:rPr>
+        <w:t>kitna</w:t>
+      </w:r>
+      <w:proofErr w:type="spellEnd"/>
+      <w:r>
+        <w:rPr>
+          <w:lang w:val="en-PK"/>
+        </w:rPr>
+        <w:t xml:space="preserve"> balance generate </w:t>
+      </w:r>
+      <w:proofErr w:type="spellStart"/>
+      <w:r>
+        <w:rPr>
+          <w:lang w:val="en-PK"/>
+        </w:rPr>
+        <w:t>hua</w:t>
+      </w:r>
+      <w:proofErr w:type="spellEnd"/>
+      <w:r>
+        <w:rPr>
+          <w:lang w:val="en-PK"/>
+        </w:rPr>
+        <w:t xml:space="preserve">, </w:t>
+      </w:r>
+      <w:proofErr w:type="spellStart"/>
+      <w:r>
+        <w:rPr>
+          <w:lang w:val="en-PK"/>
+        </w:rPr>
+        <w:t>yani</w:t>
+      </w:r>
+      <w:proofErr w:type="spellEnd"/>
+      <w:r>
+        <w:rPr>
+          <w:lang w:val="en-PK"/>
+        </w:rPr>
+        <w:t xml:space="preserve"> </w:t>
+      </w:r>
+      <w:proofErr w:type="spellStart"/>
+      <w:r>
+        <w:rPr>
+          <w:lang w:val="en-PK"/>
+        </w:rPr>
+        <w:t>jan</w:t>
+      </w:r>
+      <w:proofErr w:type="spellEnd"/>
+      <w:r>
+        <w:rPr>
+          <w:lang w:val="en-PK"/>
+        </w:rPr>
+        <w:t xml:space="preserve"> m just 1000$ and </w:t>
+      </w:r>
+      <w:proofErr w:type="spellStart"/>
+      <w:r>
+        <w:rPr>
+          <w:lang w:val="en-PK"/>
+        </w:rPr>
+        <w:t>feb</w:t>
+      </w:r>
+      <w:proofErr w:type="spellEnd"/>
+      <w:r>
+        <w:rPr>
+          <w:lang w:val="en-PK"/>
+        </w:rPr>
+        <w:t xml:space="preserve"> m 2000$ </w:t>
+      </w:r>
+      <w:proofErr w:type="spellStart"/>
+      <w:r>
+        <w:rPr>
+          <w:lang w:val="en-PK"/>
+        </w:rPr>
+        <w:t>jan</w:t>
+      </w:r>
+      <w:proofErr w:type="spellEnd"/>
+      <w:r>
+        <w:rPr>
+          <w:lang w:val="en-PK"/>
+        </w:rPr>
+        <w:t xml:space="preserve"> and </w:t>
+      </w:r>
+      <w:proofErr w:type="spellStart"/>
+      <w:r>
+        <w:rPr>
+          <w:lang w:val="en-PK"/>
+        </w:rPr>
+        <w:t>feb</w:t>
+      </w:r>
+      <w:proofErr w:type="spellEnd"/>
+      <w:r>
+        <w:rPr>
+          <w:lang w:val="en-PK"/>
+        </w:rPr>
+        <w:t xml:space="preserve"> </w:t>
+      </w:r>
+      <w:proofErr w:type="spellStart"/>
+      <w:r>
+        <w:rPr>
+          <w:lang w:val="en-PK"/>
+        </w:rPr>
+        <w:t>dono</w:t>
+      </w:r>
+      <w:proofErr w:type="spellEnd"/>
+      <w:r>
+        <w:rPr>
+          <w:lang w:val="en-PK"/>
+        </w:rPr>
+        <w:t xml:space="preserve"> ka </w:t>
+      </w:r>
+      <w:proofErr w:type="spellStart"/>
+      <w:r>
+        <w:rPr>
+          <w:lang w:val="en-PK"/>
+        </w:rPr>
+        <w:t>mila</w:t>
+      </w:r>
+      <w:proofErr w:type="spellEnd"/>
+      <w:r>
+        <w:rPr>
+          <w:lang w:val="en-PK"/>
+        </w:rPr>
+        <w:t xml:space="preserve"> </w:t>
+      </w:r>
+      <w:proofErr w:type="spellStart"/>
+      <w:r>
+        <w:rPr>
+          <w:lang w:val="en-PK"/>
+        </w:rPr>
+        <w:t>kr</w:t>
+      </w:r>
+      <w:proofErr w:type="spellEnd"/>
+      <w:r>
+        <w:rPr>
+          <w:lang w:val="en-PK"/>
+        </w:rPr>
+        <w:t xml:space="preserve"> h, </w:t>
+      </w:r>
+      <w:proofErr w:type="spellStart"/>
+      <w:r>
+        <w:rPr>
+          <w:lang w:val="en-PK"/>
+        </w:rPr>
+        <w:t>sirf</w:t>
+      </w:r>
+      <w:proofErr w:type="spellEnd"/>
+      <w:r>
+        <w:rPr>
+          <w:lang w:val="en-PK"/>
+        </w:rPr>
+        <w:t xml:space="preserve"> </w:t>
+      </w:r>
+      <w:proofErr w:type="spellStart"/>
+      <w:r>
+        <w:rPr>
+          <w:lang w:val="en-PK"/>
+        </w:rPr>
+        <w:t>feb</w:t>
+      </w:r>
+      <w:proofErr w:type="spellEnd"/>
+      <w:r>
+        <w:rPr>
+          <w:lang w:val="en-PK"/>
+        </w:rPr>
+        <w:t xml:space="preserve"> ka get </w:t>
+      </w:r>
+      <w:proofErr w:type="spellStart"/>
+      <w:r>
+        <w:rPr>
+          <w:lang w:val="en-PK"/>
+        </w:rPr>
+        <w:t>krny</w:t>
+      </w:r>
+      <w:proofErr w:type="spellEnd"/>
+      <w:r>
+        <w:rPr>
+          <w:lang w:val="en-PK"/>
+        </w:rPr>
+        <w:t xml:space="preserve"> k </w:t>
+      </w:r>
+      <w:proofErr w:type="spellStart"/>
+      <w:r>
+        <w:rPr>
+          <w:lang w:val="en-PK"/>
+        </w:rPr>
+        <w:t>liye</w:t>
+      </w:r>
+      <w:proofErr w:type="spellEnd"/>
+      <w:r>
+        <w:rPr>
+          <w:lang w:val="en-PK"/>
+        </w:rPr>
+        <w:t xml:space="preserve"> hm </w:t>
+      </w:r>
+      <w:proofErr w:type="spellStart"/>
+      <w:r>
+        <w:rPr>
+          <w:lang w:val="en-PK"/>
+        </w:rPr>
+        <w:t>fdeb</w:t>
+      </w:r>
+      <w:proofErr w:type="spellEnd"/>
+      <w:r>
+        <w:rPr>
+          <w:lang w:val="en-PK"/>
+        </w:rPr>
+        <w:t xml:space="preserve"> m s </w:t>
+      </w:r>
+      <w:proofErr w:type="spellStart"/>
+      <w:r>
+        <w:rPr>
+          <w:lang w:val="en-PK"/>
+        </w:rPr>
+        <w:t>jan</w:t>
+      </w:r>
+      <w:proofErr w:type="spellEnd"/>
+      <w:r>
+        <w:rPr>
+          <w:lang w:val="en-PK"/>
+        </w:rPr>
+        <w:t xml:space="preserve"> ka balance minus </w:t>
+      </w:r>
+      <w:proofErr w:type="spellStart"/>
+      <w:r>
+        <w:rPr>
+          <w:lang w:val="en-PK"/>
+        </w:rPr>
+        <w:t>kryn</w:t>
+      </w:r>
+      <w:proofErr w:type="spellEnd"/>
+      <w:r>
+        <w:rPr>
+          <w:lang w:val="en-PK"/>
+        </w:rPr>
+        <w:t xml:space="preserve"> </w:t>
+      </w:r>
+      <w:proofErr w:type="spellStart"/>
+      <w:r>
+        <w:rPr>
+          <w:lang w:val="en-PK"/>
+        </w:rPr>
+        <w:t>gy</w:t>
+      </w:r>
+      <w:proofErr w:type="spellEnd"/>
+      <w:r>
+        <w:rPr>
+          <w:lang w:val="en-PK"/>
+        </w:rPr>
+        <w:t xml:space="preserve">, </w:t>
+      </w:r>
+      <w:proofErr w:type="spellStart"/>
+      <w:r>
+        <w:rPr>
+          <w:lang w:val="en-PK"/>
+        </w:rPr>
+        <w:t>yani</w:t>
+      </w:r>
+      <w:proofErr w:type="spellEnd"/>
+      <w:r>
+        <w:rPr>
+          <w:lang w:val="en-PK"/>
+        </w:rPr>
+        <w:t xml:space="preserve"> </w:t>
+      </w:r>
+      <w:proofErr w:type="spellStart"/>
+      <w:r>
+        <w:rPr>
+          <w:lang w:val="en-PK"/>
+        </w:rPr>
+        <w:t>feb</w:t>
+      </w:r>
+      <w:proofErr w:type="spellEnd"/>
+      <w:r>
+        <w:rPr>
+          <w:lang w:val="en-PK"/>
+        </w:rPr>
+        <w:t xml:space="preserve"> ka opening balance is actually the closing balance of </w:t>
+      </w:r>
+      <w:proofErr w:type="spellStart"/>
+      <w:r>
+        <w:rPr>
+          <w:lang w:val="en-PK"/>
+        </w:rPr>
+        <w:t>jan</w:t>
+      </w:r>
+      <w:proofErr w:type="spellEnd"/>
+      <w:r>
+        <w:rPr>
+          <w:lang w:val="en-PK"/>
+        </w:rPr>
+        <w:t xml:space="preserve">, we </w:t>
+      </w:r>
+      <w:proofErr w:type="spellStart"/>
+      <w:r>
+        <w:rPr>
+          <w:lang w:val="en-PK"/>
+        </w:rPr>
+        <w:t>wil</w:t>
+      </w:r>
+      <w:proofErr w:type="spellEnd"/>
+      <w:r>
+        <w:rPr>
+          <w:lang w:val="en-PK"/>
+        </w:rPr>
+        <w:t xml:space="preserve"> 1st calculate the opening balance if </w:t>
+      </w:r>
+      <w:proofErr w:type="spellStart"/>
+      <w:r>
+        <w:rPr>
+          <w:lang w:val="en-PK"/>
+        </w:rPr>
+        <w:t>feb</w:t>
+      </w:r>
+      <w:proofErr w:type="spellEnd"/>
+      <w:r>
+        <w:rPr>
+          <w:lang w:val="en-PK"/>
+        </w:rPr>
+        <w:t xml:space="preserve"> (opening balance = TTD – FTP), and then is opening balance of </w:t>
+      </w:r>
+      <w:proofErr w:type="spellStart"/>
+      <w:r>
+        <w:rPr>
+          <w:lang w:val="en-PK"/>
+        </w:rPr>
+        <w:t>feb</w:t>
+      </w:r>
+      <w:proofErr w:type="spellEnd"/>
+      <w:r>
+        <w:rPr>
+          <w:lang w:val="en-PK"/>
+        </w:rPr>
+        <w:t xml:space="preserve"> m</w:t>
+      </w:r>
+      <w:r>
+        <w:rPr>
+          <w:lang w:val="en-PK"/>
+        </w:rPr>
+        <w:t xml:space="preserve"> </w:t>
+      </w:r>
+      <w:r>
+        <w:rPr>
+          <w:lang w:val="en-PK"/>
+        </w:rPr>
+        <w:t xml:space="preserve">s minus </w:t>
+      </w:r>
+      <w:proofErr w:type="spellStart"/>
+      <w:r>
+        <w:rPr>
+          <w:lang w:val="en-PK"/>
+        </w:rPr>
+        <w:t>kryn</w:t>
+      </w:r>
+      <w:proofErr w:type="spellEnd"/>
+      <w:r>
+        <w:rPr>
+          <w:lang w:val="en-PK"/>
+        </w:rPr>
+        <w:t xml:space="preserve"> </w:t>
+      </w:r>
+      <w:proofErr w:type="spellStart"/>
+      <w:r>
+        <w:rPr>
+          <w:lang w:val="en-PK"/>
+        </w:rPr>
+        <w:t>gy</w:t>
+      </w:r>
+      <w:proofErr w:type="spellEnd"/>
+      <w:r>
+        <w:rPr>
+          <w:lang w:val="en-PK"/>
+        </w:rPr>
+        <w:t xml:space="preserve"> </w:t>
+      </w:r>
+      <w:proofErr w:type="spellStart"/>
+      <w:r>
+        <w:rPr>
+          <w:lang w:val="en-PK"/>
+        </w:rPr>
+        <w:t>feb</w:t>
+      </w:r>
+      <w:proofErr w:type="spellEnd"/>
+      <w:r>
+        <w:rPr>
+          <w:lang w:val="en-PK"/>
+        </w:rPr>
+        <w:t xml:space="preserve"> ka closing balance which is 2000$ in this case,, so </w:t>
+      </w:r>
+      <w:r>
+        <w:rPr>
+          <w:lang w:val="en-PK"/>
+        </w:rPr>
+        <w:t xml:space="preserve">growth in </w:t>
+      </w:r>
+      <w:proofErr w:type="spellStart"/>
+      <w:r>
+        <w:rPr>
+          <w:lang w:val="en-PK"/>
+        </w:rPr>
+        <w:t>feb</w:t>
+      </w:r>
+      <w:proofErr w:type="spellEnd"/>
+      <w:r>
+        <w:rPr>
+          <w:lang w:val="en-PK"/>
+        </w:rPr>
+        <w:t xml:space="preserve"> = closing balance – opening balance (2000 – 1000 = 1000$)</w:t>
+      </w:r>
+      <w:r>
+        <w:rPr>
+          <w:lang w:val="en-PK"/>
+        </w:rPr>
+        <w:t>,</w:t>
+      </w:r>
+      <w:r>
+        <w:rPr>
+          <w:lang w:val="en-PK"/>
+        </w:rPr>
+        <w:t xml:space="preserve">, if we </w:t>
+      </w:r>
+      <w:proofErr w:type="spellStart"/>
+      <w:r>
+        <w:rPr>
+          <w:lang w:val="en-PK"/>
+        </w:rPr>
+        <w:t>wanna</w:t>
+      </w:r>
+      <w:proofErr w:type="spellEnd"/>
+      <w:r>
+        <w:rPr>
+          <w:lang w:val="en-PK"/>
+        </w:rPr>
+        <w:t xml:space="preserve"> get the percentage , we use formula (closing – opening)/opening, OR (current value – previous value)/previous value   ,, </w:t>
+      </w:r>
+      <w:proofErr w:type="spellStart"/>
+      <w:r>
+        <w:rPr>
+          <w:lang w:val="en-PK"/>
+        </w:rPr>
+        <w:t>yani</w:t>
+      </w:r>
+      <w:proofErr w:type="spellEnd"/>
+      <w:r>
+        <w:rPr>
+          <w:lang w:val="en-PK"/>
+        </w:rPr>
+        <w:t xml:space="preserve"> current value jo is time account m h which also include some amount from previous month and previous value is actually the value from the previous month or we can also say it as the opening value for this month and divide it with previous value because </w:t>
+      </w:r>
+      <w:r>
+        <w:rPr>
+          <w:highlight w:val="yellow"/>
+        </w:rPr>
+        <w:t xml:space="preserve">percentage k </w:t>
+      </w:r>
+      <w:proofErr w:type="spellStart"/>
+      <w:r>
+        <w:rPr>
+          <w:highlight w:val="yellow"/>
+        </w:rPr>
+        <w:t>liye</w:t>
+      </w:r>
+      <w:proofErr w:type="spellEnd"/>
+      <w:r>
+        <w:rPr>
+          <w:highlight w:val="yellow"/>
+        </w:rPr>
+        <w:t xml:space="preserve"> hm </w:t>
+      </w:r>
+      <w:r>
+        <w:rPr>
+          <w:highlight w:val="yellow"/>
+        </w:rPr>
+        <w:t xml:space="preserve">y </w:t>
+      </w:r>
+      <w:proofErr w:type="spellStart"/>
+      <w:r>
+        <w:rPr>
+          <w:highlight w:val="yellow"/>
+        </w:rPr>
+        <w:t>dekhty</w:t>
+      </w:r>
+      <w:proofErr w:type="spellEnd"/>
+      <w:r>
+        <w:rPr>
+          <w:highlight w:val="yellow"/>
+        </w:rPr>
+        <w:t xml:space="preserve"> </w:t>
+      </w:r>
+      <w:proofErr w:type="spellStart"/>
+      <w:r>
+        <w:rPr>
+          <w:highlight w:val="yellow"/>
+        </w:rPr>
+        <w:t>hn</w:t>
+      </w:r>
+      <w:proofErr w:type="spellEnd"/>
+      <w:r>
+        <w:rPr>
+          <w:highlight w:val="yellow"/>
+        </w:rPr>
+        <w:t xml:space="preserve"> k hm n </w:t>
+      </w:r>
+      <w:proofErr w:type="spellStart"/>
+      <w:r>
+        <w:rPr>
+          <w:highlight w:val="yellow"/>
+        </w:rPr>
+        <w:t>kis</w:t>
+      </w:r>
+      <w:proofErr w:type="spellEnd"/>
+      <w:r>
+        <w:rPr>
+          <w:highlight w:val="yellow"/>
+        </w:rPr>
+        <w:t xml:space="preserve"> value k </w:t>
+      </w:r>
+      <w:proofErr w:type="spellStart"/>
+      <w:r>
+        <w:rPr>
+          <w:highlight w:val="yellow"/>
+        </w:rPr>
+        <w:t>muqably</w:t>
+      </w:r>
+      <w:proofErr w:type="spellEnd"/>
+      <w:r>
+        <w:rPr>
+          <w:highlight w:val="yellow"/>
+        </w:rPr>
+        <w:t xml:space="preserve"> m amount ka change </w:t>
+      </w:r>
+      <w:proofErr w:type="spellStart"/>
+      <w:r>
+        <w:rPr>
+          <w:highlight w:val="yellow"/>
+        </w:rPr>
+        <w:t>dekhna</w:t>
+      </w:r>
+      <w:proofErr w:type="spellEnd"/>
+      <w:r>
+        <w:rPr>
+          <w:highlight w:val="yellow"/>
+        </w:rPr>
+        <w:t xml:space="preserve"> h, </w:t>
+      </w:r>
+      <w:proofErr w:type="spellStart"/>
+      <w:r>
+        <w:rPr>
+          <w:highlight w:val="yellow"/>
+        </w:rPr>
+        <w:t>yani</w:t>
+      </w:r>
+      <w:proofErr w:type="spellEnd"/>
+      <w:r>
+        <w:rPr>
+          <w:highlight w:val="yellow"/>
+        </w:rPr>
+        <w:t xml:space="preserve"> hm </w:t>
+      </w:r>
+      <w:proofErr w:type="spellStart"/>
+      <w:r>
+        <w:rPr>
+          <w:highlight w:val="yellow"/>
+        </w:rPr>
+        <w:t>chahty</w:t>
+      </w:r>
+      <w:proofErr w:type="spellEnd"/>
+      <w:r>
+        <w:rPr>
+          <w:highlight w:val="yellow"/>
+        </w:rPr>
+        <w:t xml:space="preserve"> </w:t>
+      </w:r>
+      <w:proofErr w:type="spellStart"/>
+      <w:r>
+        <w:rPr>
+          <w:highlight w:val="yellow"/>
+        </w:rPr>
+        <w:t>hn</w:t>
+      </w:r>
+      <w:proofErr w:type="spellEnd"/>
+      <w:r>
+        <w:rPr>
+          <w:highlight w:val="yellow"/>
+        </w:rPr>
+        <w:t xml:space="preserve"> k previous month ki amount k </w:t>
+      </w:r>
+      <w:proofErr w:type="spellStart"/>
+      <w:r>
+        <w:rPr>
+          <w:highlight w:val="yellow"/>
+        </w:rPr>
+        <w:t>muqably</w:t>
+      </w:r>
+      <w:proofErr w:type="spellEnd"/>
+      <w:r>
+        <w:rPr>
+          <w:highlight w:val="yellow"/>
+        </w:rPr>
+        <w:t xml:space="preserve"> m </w:t>
+      </w:r>
+      <w:proofErr w:type="spellStart"/>
+      <w:r>
+        <w:rPr>
+          <w:highlight w:val="yellow"/>
+        </w:rPr>
+        <w:t>kitna</w:t>
+      </w:r>
+      <w:proofErr w:type="spellEnd"/>
+      <w:r>
+        <w:rPr>
+          <w:highlight w:val="yellow"/>
+        </w:rPr>
+        <w:t xml:space="preserve"> change ay ga growth m is </w:t>
+      </w:r>
+      <w:proofErr w:type="spellStart"/>
+      <w:r>
+        <w:rPr>
+          <w:highlight w:val="yellow"/>
+        </w:rPr>
+        <w:t>liye</w:t>
+      </w:r>
+      <w:proofErr w:type="spellEnd"/>
+      <w:r>
+        <w:rPr>
+          <w:highlight w:val="yellow"/>
+        </w:rPr>
+        <w:t xml:space="preserve"> previous s divide </w:t>
+      </w:r>
+      <w:proofErr w:type="spellStart"/>
+      <w:r>
+        <w:rPr>
+          <w:highlight w:val="yellow"/>
+        </w:rPr>
+        <w:t>kr</w:t>
+      </w:r>
+      <w:proofErr w:type="spellEnd"/>
+      <w:r>
+        <w:rPr>
+          <w:highlight w:val="yellow"/>
+        </w:rPr>
+        <w:t xml:space="preserve"> </w:t>
+      </w:r>
+      <w:proofErr w:type="spellStart"/>
+      <w:r>
+        <w:rPr>
+          <w:highlight w:val="yellow"/>
+        </w:rPr>
+        <w:t>dia</w:t>
+      </w:r>
+      <w:proofErr w:type="spellEnd"/>
+      <w:r>
+        <w:rPr>
+          <w:lang w:val="en-PK"/>
+        </w:rPr>
+        <w:t xml:space="preserve"> </w:t>
+      </w:r>
+      <w:r>
+        <w:rPr>
+          <w:lang w:val="en-PK"/>
+        </w:rPr>
+        <w:t xml:space="preserve"> </w:t>
+      </w:r>
+      <w:r>
+        <w:rPr>
+          <w:b/>
+          <w:bCs/>
+          <w:lang w:val="en-PK"/>
+        </w:rPr>
+        <w:t>THIS</w:t>
+      </w:r>
+      <w:r>
+        <w:rPr>
+          <w:b/>
+          <w:bCs/>
+          <w:lang w:val="en-PK"/>
+        </w:rPr>
+        <w:t xml:space="preserve"> WAY</w:t>
+      </w:r>
+      <w:r>
+        <w:rPr>
+          <w:b/>
+          <w:bCs/>
+          <w:lang w:val="en-PK"/>
+        </w:rPr>
+        <w:t xml:space="preserve"> IS FOR </w:t>
+      </w:r>
+      <w:r>
+        <w:rPr>
+          <w:b/>
+          <w:bCs/>
+          <w:lang w:val="en-PK"/>
+        </w:rPr>
+        <w:t>TTD</w:t>
+      </w:r>
+      <w:r>
+        <w:rPr>
+          <w:b/>
+          <w:bCs/>
+          <w:lang w:val="en-PK"/>
+        </w:rPr>
+        <w:t>, balance sheet</w:t>
+      </w:r>
+    </w:p>
+    <w:p>
+      <w:pPr>
+        <w:rPr>
+          <w:lang w:val="en-PK"/>
+        </w:rPr>
+      </w:pPr>
+      <w:r>
+        <w:rPr>
+          <w:lang w:val="en-PK"/>
+        </w:rPr>
+        <w:t xml:space="preserve">We have used this formula: </w:t>
+      </w:r>
+      <w:proofErr w:type="spellStart"/>
+      <w:r>
+        <w:rPr>
+          <w:lang w:val="en-PK"/>
+        </w:rPr>
+        <w:t>period_on_period_growth</w:t>
+      </w:r>
+      <w:proofErr w:type="spellEnd"/>
+      <w:r>
+        <w:rPr>
+          <w:lang w:val="en-PK"/>
+        </w:rPr>
+        <w:t xml:space="preserve"> = IFERROR(([total_to_date]-[TTD_Previous_period])/[TTD_Previous_period], "")</w:t>
+      </w:r>
+    </w:p>
+    <w:p>
+      <w:pPr>
+        <w:rPr>
+          <w:lang w:val="en-PK"/>
+        </w:rPr>
+      </w:pPr>
+      <w:r>
+        <w:rPr>
+          <w:lang w:val="en-PK"/>
+        </w:rPr>
+        <w:t xml:space="preserve">IFERROR is </w:t>
+      </w:r>
+      <w:proofErr w:type="spellStart"/>
+      <w:r>
+        <w:rPr>
+          <w:lang w:val="en-PK"/>
+        </w:rPr>
+        <w:t>liye</w:t>
+      </w:r>
+      <w:proofErr w:type="spellEnd"/>
+      <w:r>
+        <w:rPr>
+          <w:lang w:val="en-PK"/>
+        </w:rPr>
+        <w:t xml:space="preserve"> </w:t>
+      </w:r>
+      <w:proofErr w:type="spellStart"/>
+      <w:r>
+        <w:rPr>
+          <w:lang w:val="en-PK"/>
+        </w:rPr>
+        <w:t>likha</w:t>
+      </w:r>
+      <w:proofErr w:type="spellEnd"/>
+      <w:r>
+        <w:rPr>
+          <w:lang w:val="en-PK"/>
+        </w:rPr>
+        <w:t xml:space="preserve"> q k </w:t>
+      </w:r>
+      <w:proofErr w:type="spellStart"/>
+      <w:r>
+        <w:rPr>
+          <w:lang w:val="en-PK"/>
+        </w:rPr>
+        <w:t>jan</w:t>
+      </w:r>
+      <w:proofErr w:type="spellEnd"/>
+      <w:r>
+        <w:rPr>
+          <w:lang w:val="en-PK"/>
+        </w:rPr>
+        <w:t xml:space="preserve"> k case m previous value 0 </w:t>
+      </w:r>
+      <w:proofErr w:type="spellStart"/>
+      <w:r>
+        <w:rPr>
+          <w:lang w:val="en-PK"/>
+        </w:rPr>
+        <w:t>thi</w:t>
+      </w:r>
+      <w:proofErr w:type="spellEnd"/>
+      <w:r>
+        <w:rPr>
+          <w:lang w:val="en-PK"/>
+        </w:rPr>
+        <w:t xml:space="preserve">, to “current value – 0 / 0” cause </w:t>
+      </w:r>
+      <w:proofErr w:type="spellStart"/>
+      <w:r>
+        <w:rPr>
+          <w:lang w:val="en-PK"/>
+        </w:rPr>
+        <w:t>inficity</w:t>
+      </w:r>
+      <w:proofErr w:type="spellEnd"/>
+      <w:r>
+        <w:rPr>
+          <w:lang w:val="en-PK"/>
+        </w:rPr>
+        <w:t xml:space="preserve"> so we use </w:t>
+      </w:r>
+      <w:proofErr w:type="spellStart"/>
+      <w:r>
+        <w:rPr>
+          <w:lang w:val="en-PK"/>
+        </w:rPr>
+        <w:t>ifferror</w:t>
+      </w:r>
+      <w:proofErr w:type="spellEnd"/>
+      <w:r>
+        <w:rPr>
+          <w:lang w:val="en-PK"/>
+        </w:rPr>
+        <w:t xml:space="preserve"> that </w:t>
+      </w:r>
+      <w:proofErr w:type="spellStart"/>
+      <w:r>
+        <w:rPr>
+          <w:lang w:val="en-PK"/>
+        </w:rPr>
+        <w:t>agr</w:t>
+      </w:r>
+      <w:proofErr w:type="spellEnd"/>
+      <w:r>
+        <w:rPr>
+          <w:lang w:val="en-PK"/>
+        </w:rPr>
+        <w:t xml:space="preserve"> </w:t>
+      </w:r>
+      <w:proofErr w:type="spellStart"/>
+      <w:r>
+        <w:rPr>
+          <w:lang w:val="en-PK"/>
+        </w:rPr>
+        <w:t>khi</w:t>
+      </w:r>
+      <w:proofErr w:type="spellEnd"/>
+      <w:r>
+        <w:rPr>
+          <w:lang w:val="en-PK"/>
+        </w:rPr>
+        <w:t xml:space="preserve"> error </w:t>
+      </w:r>
+      <w:proofErr w:type="spellStart"/>
+      <w:r>
+        <w:rPr>
+          <w:lang w:val="en-PK"/>
+        </w:rPr>
+        <w:t>aya</w:t>
+      </w:r>
+      <w:proofErr w:type="spellEnd"/>
+      <w:r>
+        <w:rPr>
+          <w:lang w:val="en-PK"/>
+        </w:rPr>
+        <w:t xml:space="preserve"> to “” s </w:t>
+      </w:r>
+      <w:proofErr w:type="gramStart"/>
+      <w:r>
+        <w:rPr>
+          <w:lang w:val="en-PK"/>
+        </w:rPr>
+        <w:t>replace</w:t>
+      </w:r>
+      <w:proofErr w:type="gramEnd"/>
+      <w:r>
+        <w:rPr>
+          <w:lang w:val="en-PK"/>
+        </w:rPr>
+        <w:t xml:space="preserve"> </w:t>
+      </w:r>
+      <w:proofErr w:type="spellStart"/>
+      <w:r>
+        <w:rPr>
+          <w:lang w:val="en-PK"/>
+        </w:rPr>
+        <w:t>kr</w:t>
+      </w:r>
+      <w:proofErr w:type="spellEnd"/>
+      <w:r>
+        <w:rPr>
+          <w:lang w:val="en-PK"/>
+        </w:rPr>
+        <w:t xml:space="preserve"> </w:t>
+      </w:r>
+      <w:proofErr w:type="spellStart"/>
+      <w:r>
+        <w:rPr>
+          <w:lang w:val="en-PK"/>
+        </w:rPr>
+        <w:t>dena</w:t>
+      </w:r>
+      <w:proofErr w:type="spellEnd"/>
+      <w:r>
+        <w:rPr>
+          <w:lang w:val="en-PK"/>
+        </w:rPr>
+        <w:t xml:space="preserve"> </w:t>
+      </w:r>
+      <w:proofErr w:type="spellStart"/>
+      <w:r>
+        <w:rPr>
+          <w:lang w:val="en-PK"/>
+        </w:rPr>
+        <w:t>yani</w:t>
+      </w:r>
+      <w:proofErr w:type="spellEnd"/>
+      <w:r>
+        <w:rPr>
+          <w:lang w:val="en-PK"/>
+        </w:rPr>
+        <w:t xml:space="preserve"> </w:t>
+      </w:r>
+      <w:proofErr w:type="spellStart"/>
+      <w:r>
+        <w:rPr>
+          <w:lang w:val="en-PK"/>
+        </w:rPr>
+        <w:t>emptly</w:t>
+      </w:r>
+      <w:proofErr w:type="spellEnd"/>
+      <w:r>
+        <w:rPr>
+          <w:lang w:val="en-PK"/>
+        </w:rPr>
+        <w:t xml:space="preserve"> s replace </w:t>
+      </w:r>
+      <w:proofErr w:type="spellStart"/>
+      <w:r>
+        <w:rPr>
+          <w:lang w:val="en-PK"/>
+        </w:rPr>
+        <w:t>kr</w:t>
+      </w:r>
+      <w:proofErr w:type="spellEnd"/>
+      <w:r>
+        <w:rPr>
+          <w:lang w:val="en-PK"/>
+        </w:rPr>
+        <w:t xml:space="preserve"> </w:t>
+      </w:r>
+      <w:proofErr w:type="spellStart"/>
+      <w:r>
+        <w:rPr>
+          <w:lang w:val="en-PK"/>
+        </w:rPr>
+        <w:t>dena</w:t>
+      </w:r>
+      <w:proofErr w:type="spellEnd"/>
+      <w:r>
+        <w:rPr>
+          <w:lang w:val="en-PK"/>
+        </w:rPr>
+        <w:t xml:space="preserve"> </w:t>
+      </w:r>
+    </w:p>
+    <w:p>
+      <w:pPr>
+        <w:rPr>
+          <w:lang w:val="en-PK"/>
+        </w:rPr>
+      </w:pPr>
+      <w:r>
+        <w:rPr>
+          <w:lang w:val="en-PK"/>
+        </w:rPr>
+        <w:t>opening balance = TTD – FTP</w:t>
+      </w:r>
+      <w:r>
+        <w:rPr>
+          <w:lang w:val="en-PK"/>
+        </w:rPr>
+        <w:t xml:space="preserve">???? Y formula </w:t>
+      </w:r>
+      <w:proofErr w:type="spellStart"/>
+      <w:r>
+        <w:rPr>
+          <w:lang w:val="en-PK"/>
+        </w:rPr>
+        <w:t>kesy</w:t>
+      </w:r>
+      <w:proofErr w:type="spellEnd"/>
+      <w:r>
+        <w:rPr>
+          <w:lang w:val="en-PK"/>
+        </w:rPr>
+        <w:t xml:space="preserve"> </w:t>
+      </w:r>
+      <w:proofErr w:type="spellStart"/>
+      <w:r>
+        <w:rPr>
+          <w:lang w:val="en-PK"/>
+        </w:rPr>
+        <w:t>bna</w:t>
+      </w:r>
+      <w:proofErr w:type="spellEnd"/>
+      <w:r>
+        <w:rPr>
+          <w:lang w:val="en-PK"/>
+        </w:rPr>
+        <w:t xml:space="preserve">? FTP is actually all the </w:t>
+      </w:r>
+      <w:proofErr w:type="spellStart"/>
+      <w:r>
+        <w:rPr>
+          <w:lang w:val="en-PK"/>
+        </w:rPr>
+        <w:t>trtansactions</w:t>
+      </w:r>
+      <w:proofErr w:type="spellEnd"/>
+      <w:r>
+        <w:rPr>
+          <w:lang w:val="en-PK"/>
+        </w:rPr>
+        <w:t xml:space="preserve"> of a specific </w:t>
+      </w:r>
+      <w:proofErr w:type="gramStart"/>
+      <w:r>
+        <w:rPr>
+          <w:lang w:val="en-PK"/>
+        </w:rPr>
+        <w:t>period,,</w:t>
+      </w:r>
+      <w:proofErr w:type="gramEnd"/>
+      <w:r>
+        <w:rPr>
+          <w:lang w:val="en-PK"/>
+        </w:rPr>
+        <w:t xml:space="preserve"> closing balance = opening balance + transactions, and we rearrange this as: opening </w:t>
+      </w:r>
+      <w:proofErr w:type="gramStart"/>
+      <w:r>
+        <w:rPr>
+          <w:lang w:val="en-PK"/>
+        </w:rPr>
+        <w:t>balance  =</w:t>
+      </w:r>
+      <w:proofErr w:type="gramEnd"/>
+      <w:r>
+        <w:rPr>
+          <w:lang w:val="en-PK"/>
+        </w:rPr>
+        <w:t xml:space="preserve"> closing balance – transactions </w:t>
+      </w:r>
+    </w:p>
+    <w:p>
+      <w:pPr>
+        <w:rPr>
+          <w:lang w:val="en-PK"/>
+        </w:rPr>
+      </w:pPr>
+      <w:r>
+        <w:rPr>
+          <w:lang w:val="en-PK"/>
+        </w:rPr>
+        <w:t xml:space="preserve">Growth for each month, </w:t>
+      </w:r>
+      <w:proofErr w:type="spellStart"/>
+      <w:r>
+        <w:rPr>
+          <w:lang w:val="en-PK"/>
+        </w:rPr>
+        <w:t>quaretr</w:t>
+      </w:r>
+      <w:proofErr w:type="spellEnd"/>
+      <w:r>
+        <w:rPr>
+          <w:lang w:val="en-PK"/>
+        </w:rPr>
+        <w:t xml:space="preserve"> etc </w:t>
+      </w:r>
+      <w:proofErr w:type="spellStart"/>
+      <w:r>
+        <w:rPr>
+          <w:lang w:val="en-PK"/>
+        </w:rPr>
+        <w:t>etc</w:t>
+      </w:r>
+      <w:proofErr w:type="spellEnd"/>
+      <w:r>
+        <w:rPr>
+          <w:lang w:val="en-PK"/>
+        </w:rPr>
+        <w:t xml:space="preserve"> is calculated differently for both balance sheet and p and L. </w:t>
+      </w:r>
+    </w:p>
+    <w:p>
+      <w:pPr>
+        <w:rPr>
+          <w:b/>
+          <w:bCs/>
+          <w:lang w:val="en-PK"/>
+        </w:rPr>
+      </w:pPr>
+      <w:r>
+        <w:rPr>
+          <w:b/>
+          <w:bCs/>
+          <w:lang w:val="en-PK"/>
+        </w:rPr>
+        <w:t>Now we talk about FTP:</w:t>
+      </w:r>
+    </w:p>
+    <w:p>
+      <w:pPr>
+        <w:rPr>
+          <w:lang w:val="en-PK"/>
+        </w:rPr>
+      </w:pPr>
+      <w:r>
+        <w:rPr>
+          <w:lang w:val="en-PK"/>
+        </w:rPr>
+        <w:t xml:space="preserve">phly TTD m </w:t>
+      </w:r>
+      <w:proofErr w:type="spellStart"/>
+      <w:r>
+        <w:rPr>
+          <w:lang w:val="en-PK"/>
+        </w:rPr>
+        <w:t>hmary</w:t>
+      </w:r>
+      <w:proofErr w:type="spellEnd"/>
+      <w:r>
+        <w:rPr>
+          <w:lang w:val="en-PK"/>
+        </w:rPr>
+        <w:t xml:space="preserve"> pas jo value ek specific month pr show </w:t>
+      </w:r>
+      <w:proofErr w:type="spellStart"/>
+      <w:r>
+        <w:rPr>
+          <w:lang w:val="en-PK"/>
+        </w:rPr>
+        <w:t>ho</w:t>
+      </w:r>
+      <w:proofErr w:type="spellEnd"/>
+      <w:r>
+        <w:rPr>
+          <w:lang w:val="en-PK"/>
+        </w:rPr>
+        <w:t xml:space="preserve"> </w:t>
+      </w:r>
+      <w:proofErr w:type="spellStart"/>
+      <w:r>
+        <w:rPr>
+          <w:lang w:val="en-PK"/>
+        </w:rPr>
+        <w:t>rhi</w:t>
+      </w:r>
+      <w:proofErr w:type="spellEnd"/>
+      <w:r>
+        <w:rPr>
+          <w:lang w:val="en-PK"/>
+        </w:rPr>
+        <w:t xml:space="preserve"> </w:t>
+      </w:r>
+      <w:proofErr w:type="spellStart"/>
+      <w:r>
+        <w:rPr>
+          <w:lang w:val="en-PK"/>
+        </w:rPr>
+        <w:t>vo</w:t>
+      </w:r>
+      <w:proofErr w:type="spellEnd"/>
+      <w:r>
+        <w:rPr>
+          <w:lang w:val="en-PK"/>
+        </w:rPr>
+        <w:t xml:space="preserve"> value actually us specific month ki amount and us s phly </w:t>
+      </w:r>
+      <w:proofErr w:type="spellStart"/>
+      <w:r>
+        <w:rPr>
+          <w:lang w:val="en-PK"/>
+        </w:rPr>
+        <w:t>jitni</w:t>
+      </w:r>
+      <w:proofErr w:type="spellEnd"/>
+      <w:r>
+        <w:rPr>
+          <w:lang w:val="en-PK"/>
+        </w:rPr>
+        <w:t xml:space="preserve"> months </w:t>
+      </w:r>
+      <w:proofErr w:type="spellStart"/>
+      <w:r>
+        <w:rPr>
+          <w:lang w:val="en-PK"/>
+        </w:rPr>
+        <w:t>guzry</w:t>
+      </w:r>
+      <w:proofErr w:type="spellEnd"/>
+      <w:r>
+        <w:rPr>
+          <w:lang w:val="en-PK"/>
+        </w:rPr>
+        <w:t xml:space="preserve"> un sab ki amount ka sum </w:t>
+      </w:r>
+      <w:proofErr w:type="spellStart"/>
+      <w:r>
+        <w:rPr>
+          <w:lang w:val="en-PK"/>
+        </w:rPr>
+        <w:t>tha</w:t>
+      </w:r>
+      <w:proofErr w:type="spellEnd"/>
+      <w:r>
+        <w:rPr>
+          <w:lang w:val="en-PK"/>
+        </w:rPr>
+        <w:t xml:space="preserve">, </w:t>
+      </w:r>
+      <w:proofErr w:type="spellStart"/>
+      <w:r>
+        <w:rPr>
+          <w:lang w:val="en-PK"/>
+        </w:rPr>
+        <w:t>phir</w:t>
+      </w:r>
+      <w:proofErr w:type="spellEnd"/>
+      <w:r>
+        <w:rPr>
+          <w:lang w:val="en-PK"/>
+        </w:rPr>
+        <w:t xml:space="preserve"> hm n us specific month ki </w:t>
+      </w:r>
+      <w:proofErr w:type="spellStart"/>
+      <w:r>
+        <w:rPr>
+          <w:lang w:val="en-PK"/>
+        </w:rPr>
+        <w:t>apni</w:t>
+      </w:r>
+      <w:proofErr w:type="spellEnd"/>
+      <w:r>
+        <w:rPr>
+          <w:lang w:val="en-PK"/>
+        </w:rPr>
+        <w:t xml:space="preserve"> value get ki </w:t>
+      </w:r>
+      <w:proofErr w:type="spellStart"/>
+      <w:r>
+        <w:rPr>
+          <w:lang w:val="en-PK"/>
+        </w:rPr>
+        <w:t>jis</w:t>
+      </w:r>
+      <w:proofErr w:type="spellEnd"/>
+      <w:r>
+        <w:rPr>
+          <w:lang w:val="en-PK"/>
+        </w:rPr>
+        <w:t xml:space="preserve"> k </w:t>
+      </w:r>
+      <w:proofErr w:type="spellStart"/>
+      <w:r>
+        <w:rPr>
+          <w:lang w:val="en-PK"/>
+        </w:rPr>
+        <w:t>liye</w:t>
+      </w:r>
+      <w:proofErr w:type="spellEnd"/>
+      <w:r>
+        <w:rPr>
+          <w:lang w:val="en-PK"/>
+        </w:rPr>
+        <w:t xml:space="preserve"> hm n us month ki opening value ko minus </w:t>
+      </w:r>
+      <w:proofErr w:type="spellStart"/>
+      <w:r>
+        <w:rPr>
+          <w:lang w:val="en-PK"/>
+        </w:rPr>
+        <w:t>kr</w:t>
+      </w:r>
+      <w:proofErr w:type="spellEnd"/>
+      <w:r>
+        <w:rPr>
+          <w:lang w:val="en-PK"/>
+        </w:rPr>
+        <w:t xml:space="preserve"> </w:t>
+      </w:r>
+      <w:proofErr w:type="spellStart"/>
+      <w:r>
+        <w:rPr>
+          <w:lang w:val="en-PK"/>
+        </w:rPr>
+        <w:t>dia</w:t>
+      </w:r>
+      <w:proofErr w:type="spellEnd"/>
+      <w:r>
+        <w:rPr>
+          <w:lang w:val="en-PK"/>
+        </w:rPr>
+        <w:t xml:space="preserve"> closing value s , opening value actually previous month ki closing value </w:t>
+      </w:r>
+      <w:proofErr w:type="spellStart"/>
+      <w:r>
+        <w:rPr>
+          <w:lang w:val="en-PK"/>
+        </w:rPr>
+        <w:t>thi</w:t>
+      </w:r>
+      <w:proofErr w:type="spellEnd"/>
+      <w:r>
+        <w:rPr>
+          <w:lang w:val="en-PK"/>
+        </w:rPr>
+        <w:t xml:space="preserve">, </w:t>
+      </w:r>
+      <w:r>
+        <w:rPr>
+          <w:lang w:val="en-PK"/>
+        </w:rPr>
+        <w:t xml:space="preserve">is s </w:t>
+      </w:r>
+      <w:proofErr w:type="spellStart"/>
+      <w:r>
+        <w:rPr>
+          <w:lang w:val="en-PK"/>
+        </w:rPr>
+        <w:t>hmy</w:t>
+      </w:r>
+      <w:proofErr w:type="spellEnd"/>
+      <w:r>
+        <w:rPr>
+          <w:lang w:val="en-PK"/>
+        </w:rPr>
+        <w:t xml:space="preserve"> us </w:t>
+      </w:r>
+      <w:proofErr w:type="spellStart"/>
+      <w:r>
+        <w:rPr>
+          <w:lang w:val="en-PK"/>
+        </w:rPr>
+        <w:t>soecific</w:t>
+      </w:r>
+      <w:proofErr w:type="spellEnd"/>
+      <w:r>
+        <w:rPr>
+          <w:lang w:val="en-PK"/>
+        </w:rPr>
+        <w:t xml:space="preserve"> month ka </w:t>
+      </w:r>
+      <w:proofErr w:type="spellStart"/>
+      <w:r>
+        <w:rPr>
+          <w:lang w:val="en-PK"/>
+        </w:rPr>
+        <w:t>apna</w:t>
+      </w:r>
+      <w:proofErr w:type="spellEnd"/>
+      <w:r>
+        <w:rPr>
+          <w:lang w:val="en-PK"/>
+        </w:rPr>
+        <w:t xml:space="preserve"> </w:t>
+      </w:r>
+      <w:proofErr w:type="spellStart"/>
+      <w:r>
+        <w:rPr>
+          <w:lang w:val="en-PK"/>
+        </w:rPr>
+        <w:t>bakance</w:t>
+      </w:r>
+      <w:proofErr w:type="spellEnd"/>
+      <w:r>
+        <w:rPr>
+          <w:lang w:val="en-PK"/>
+        </w:rPr>
+        <w:t xml:space="preserve"> mil </w:t>
+      </w:r>
+      <w:proofErr w:type="spellStart"/>
+      <w:r>
+        <w:rPr>
+          <w:lang w:val="en-PK"/>
+        </w:rPr>
+        <w:t>gya</w:t>
+      </w:r>
+      <w:proofErr w:type="spellEnd"/>
+      <w:r>
+        <w:rPr>
+          <w:lang w:val="en-PK"/>
+        </w:rPr>
+        <w:t xml:space="preserve"> and hm n growth calculate </w:t>
+      </w:r>
+      <w:proofErr w:type="spellStart"/>
+      <w:r>
+        <w:rPr>
+          <w:lang w:val="en-PK"/>
+        </w:rPr>
+        <w:t>kr</w:t>
+      </w:r>
+      <w:proofErr w:type="spellEnd"/>
+      <w:r>
+        <w:rPr>
+          <w:lang w:val="en-PK"/>
+        </w:rPr>
+        <w:t xml:space="preserve"> li</w:t>
+      </w:r>
+    </w:p>
+    <w:p>
+      <w:pPr>
+        <w:rPr>
+          <w:lang w:val="en-PK"/>
+        </w:rPr>
+      </w:pPr>
+      <w:r>
+        <w:rPr>
+          <w:lang w:val="en-PK"/>
+        </w:rPr>
+        <w:t xml:space="preserve">but here if we already have the amount for each month, </w:t>
+      </w:r>
+      <w:proofErr w:type="spellStart"/>
+      <w:r>
+        <w:rPr>
+          <w:lang w:val="en-PK"/>
+        </w:rPr>
+        <w:t>e.g</w:t>
+      </w:r>
+      <w:proofErr w:type="spellEnd"/>
+      <w:r>
+        <w:rPr>
+          <w:lang w:val="en-PK"/>
+        </w:rPr>
+        <w:t xml:space="preserve">: FTP amount, to calculate the growth, we will first calculate the amount from the previous month and for this, we will use 2 measures, </w:t>
+      </w:r>
+    </w:p>
+    <w:p>
+      <w:pPr>
+        <w:rPr>
+          <w:rFonts w:ascii="Bell MT" w:hAnsi="Bell MT"/>
+          <w:lang w:val="en-PK"/>
+        </w:rPr>
+      </w:pPr>
+      <w:proofErr w:type="spellStart"/>
+      <w:r>
+        <w:rPr>
+          <w:rFonts w:ascii="Bell MT" w:hAnsi="Bell MT"/>
+          <w:lang w:val="en-PK"/>
+        </w:rPr>
+        <w:t>totalFTP_previous_value_of_period</w:t>
+      </w:r>
+      <w:proofErr w:type="spellEnd"/>
+      <w:r>
+        <w:rPr>
+          <w:rFonts w:ascii="Bell MT" w:hAnsi="Bell MT"/>
+          <w:lang w:val="en-PK"/>
+        </w:rPr>
+        <w:t xml:space="preserve"> = CALCULATE([</w:t>
+      </w:r>
+      <w:proofErr w:type="spellStart"/>
+      <w:r>
+        <w:rPr>
+          <w:rFonts w:ascii="Bell MT" w:hAnsi="Bell MT"/>
+          <w:lang w:val="en-PK"/>
+        </w:rPr>
+        <w:t>total_FTP</w:t>
+      </w:r>
+      <w:proofErr w:type="spellEnd"/>
+      <w:r>
+        <w:rPr>
+          <w:rFonts w:ascii="Bell MT" w:hAnsi="Bell MT"/>
+          <w:lang w:val="en-PK"/>
+        </w:rPr>
+        <w:t>], DATEADD('Calendar'[Date], -1, MONTH))</w:t>
+      </w:r>
+    </w:p>
+    <w:p>
+      <w:pPr>
+        <w:rPr>
+          <w:lang w:val="en-PK"/>
+        </w:rPr>
+      </w:pPr>
+      <w:r>
+        <w:rPr>
+          <w:lang w:val="en-PK"/>
+        </w:rPr>
+        <w:t xml:space="preserve">is measure s hm just ek month peachy </w:t>
+      </w:r>
+      <w:proofErr w:type="spellStart"/>
+      <w:r>
+        <w:rPr>
+          <w:lang w:val="en-PK"/>
+        </w:rPr>
+        <w:t>chly</w:t>
+      </w:r>
+      <w:proofErr w:type="spellEnd"/>
+      <w:r>
+        <w:rPr>
+          <w:lang w:val="en-PK"/>
+        </w:rPr>
+        <w:t xml:space="preserve"> </w:t>
+      </w:r>
+      <w:proofErr w:type="spellStart"/>
+      <w:r>
+        <w:rPr>
+          <w:lang w:val="en-PK"/>
+        </w:rPr>
+        <w:t>jayn</w:t>
+      </w:r>
+      <w:proofErr w:type="spellEnd"/>
+      <w:r>
+        <w:rPr>
+          <w:lang w:val="en-PK"/>
+        </w:rPr>
+        <w:t xml:space="preserve"> </w:t>
+      </w:r>
+      <w:proofErr w:type="spellStart"/>
+      <w:r>
+        <w:rPr>
+          <w:lang w:val="en-PK"/>
+        </w:rPr>
+        <w:t>gy</w:t>
+      </w:r>
+      <w:proofErr w:type="spellEnd"/>
+      <w:r>
+        <w:rPr>
+          <w:lang w:val="en-PK"/>
+        </w:rPr>
+        <w:t xml:space="preserve">, y months ki previous value </w:t>
+      </w:r>
+      <w:proofErr w:type="spellStart"/>
+      <w:r>
+        <w:rPr>
+          <w:lang w:val="en-PK"/>
+        </w:rPr>
+        <w:t>hget</w:t>
+      </w:r>
+      <w:proofErr w:type="spellEnd"/>
+      <w:r>
+        <w:rPr>
+          <w:lang w:val="en-PK"/>
+        </w:rPr>
+        <w:t xml:space="preserve"> </w:t>
+      </w:r>
+      <w:proofErr w:type="spellStart"/>
+      <w:r>
+        <w:rPr>
+          <w:lang w:val="en-PK"/>
+        </w:rPr>
+        <w:t>krny</w:t>
+      </w:r>
+      <w:proofErr w:type="spellEnd"/>
+      <w:r>
+        <w:rPr>
+          <w:lang w:val="en-PK"/>
+        </w:rPr>
+        <w:t xml:space="preserve"> k </w:t>
+      </w:r>
+      <w:proofErr w:type="spellStart"/>
+      <w:r>
+        <w:rPr>
+          <w:lang w:val="en-PK"/>
+        </w:rPr>
+        <w:t>liye</w:t>
+      </w:r>
+      <w:proofErr w:type="spellEnd"/>
+      <w:r>
+        <w:rPr>
+          <w:lang w:val="en-PK"/>
+        </w:rPr>
+        <w:t xml:space="preserve"> to </w:t>
+      </w:r>
+      <w:proofErr w:type="spellStart"/>
+      <w:r>
+        <w:rPr>
+          <w:lang w:val="en-PK"/>
+        </w:rPr>
+        <w:t>theek</w:t>
+      </w:r>
+      <w:proofErr w:type="spellEnd"/>
+      <w:r>
+        <w:rPr>
+          <w:lang w:val="en-PK"/>
+        </w:rPr>
+        <w:t xml:space="preserve"> h, </w:t>
+      </w:r>
+      <w:proofErr w:type="spellStart"/>
+      <w:r>
+        <w:rPr>
+          <w:lang w:val="en-PK"/>
+        </w:rPr>
+        <w:t>lekin</w:t>
+      </w:r>
+      <w:proofErr w:type="spellEnd"/>
+      <w:r>
+        <w:rPr>
+          <w:lang w:val="en-PK"/>
+        </w:rPr>
+        <w:t xml:space="preserve"> quarter ki previous value k </w:t>
+      </w:r>
+      <w:proofErr w:type="spellStart"/>
+      <w:r>
+        <w:rPr>
+          <w:lang w:val="en-PK"/>
+        </w:rPr>
+        <w:t>liye</w:t>
+      </w:r>
+      <w:proofErr w:type="spellEnd"/>
+      <w:r>
+        <w:rPr>
+          <w:lang w:val="en-PK"/>
+        </w:rPr>
+        <w:t xml:space="preserve"> </w:t>
+      </w:r>
+      <w:proofErr w:type="spellStart"/>
+      <w:r>
+        <w:rPr>
+          <w:lang w:val="en-PK"/>
+        </w:rPr>
+        <w:t>hmy</w:t>
+      </w:r>
+      <w:proofErr w:type="spellEnd"/>
+      <w:r>
+        <w:rPr>
+          <w:lang w:val="en-PK"/>
+        </w:rPr>
+        <w:t xml:space="preserve"> 3 months </w:t>
+      </w:r>
+      <w:proofErr w:type="spellStart"/>
+      <w:r>
+        <w:rPr>
+          <w:lang w:val="en-PK"/>
+        </w:rPr>
+        <w:t>pichli</w:t>
+      </w:r>
+      <w:proofErr w:type="spellEnd"/>
+      <w:r>
+        <w:rPr>
+          <w:lang w:val="en-PK"/>
+        </w:rPr>
+        <w:t xml:space="preserve"> value </w:t>
+      </w:r>
+      <w:proofErr w:type="spellStart"/>
+      <w:r>
+        <w:rPr>
+          <w:lang w:val="en-PK"/>
+        </w:rPr>
+        <w:t>chahye</w:t>
+      </w:r>
+      <w:proofErr w:type="spellEnd"/>
+      <w:r>
+        <w:rPr>
+          <w:lang w:val="en-PK"/>
+        </w:rPr>
+        <w:t xml:space="preserve"> and year ki previous value k </w:t>
+      </w:r>
+      <w:proofErr w:type="spellStart"/>
+      <w:r>
+        <w:rPr>
+          <w:lang w:val="en-PK"/>
+        </w:rPr>
+        <w:lastRenderedPageBreak/>
+        <w:t>liye</w:t>
+      </w:r>
+      <w:proofErr w:type="spellEnd"/>
+      <w:r>
+        <w:rPr>
+          <w:lang w:val="en-PK"/>
+        </w:rPr>
+        <w:t xml:space="preserve"> </w:t>
+      </w:r>
+      <w:proofErr w:type="spellStart"/>
+      <w:r>
+        <w:rPr>
+          <w:lang w:val="en-PK"/>
+        </w:rPr>
+        <w:t>hmy</w:t>
+      </w:r>
+      <w:proofErr w:type="spellEnd"/>
+      <w:r>
+        <w:rPr>
+          <w:lang w:val="en-PK"/>
+        </w:rPr>
+        <w:t xml:space="preserve"> 12 months previous value </w:t>
+      </w:r>
+      <w:proofErr w:type="spellStart"/>
+      <w:r>
+        <w:rPr>
+          <w:lang w:val="en-PK"/>
+        </w:rPr>
+        <w:t>chahye</w:t>
+      </w:r>
+      <w:proofErr w:type="spellEnd"/>
+      <w:r>
+        <w:rPr>
+          <w:lang w:val="en-PK"/>
+        </w:rPr>
+        <w:t xml:space="preserve">, is k </w:t>
+      </w:r>
+      <w:proofErr w:type="spellStart"/>
+      <w:r>
+        <w:rPr>
+          <w:lang w:val="en-PK"/>
+        </w:rPr>
+        <w:t>liye</w:t>
+      </w:r>
+      <w:proofErr w:type="spellEnd"/>
+      <w:r>
+        <w:rPr>
+          <w:lang w:val="en-PK"/>
+        </w:rPr>
+        <w:t xml:space="preserve"> hm n </w:t>
+      </w:r>
+      <w:proofErr w:type="spellStart"/>
+      <w:r>
+        <w:rPr>
+          <w:lang w:val="en-PK"/>
+        </w:rPr>
+        <w:t>jhan</w:t>
+      </w:r>
+      <w:proofErr w:type="spellEnd"/>
+      <w:r>
+        <w:rPr>
+          <w:lang w:val="en-PK"/>
+        </w:rPr>
+        <w:t xml:space="preserve"> -1 </w:t>
+      </w:r>
+      <w:proofErr w:type="spellStart"/>
+      <w:r>
+        <w:rPr>
+          <w:lang w:val="en-PK"/>
+        </w:rPr>
+        <w:t>likha</w:t>
+      </w:r>
+      <w:proofErr w:type="spellEnd"/>
+      <w:r>
+        <w:rPr>
+          <w:lang w:val="en-PK"/>
+        </w:rPr>
+        <w:t xml:space="preserve"> h </w:t>
+      </w:r>
+      <w:proofErr w:type="spellStart"/>
+      <w:r>
+        <w:rPr>
+          <w:lang w:val="en-PK"/>
+        </w:rPr>
+        <w:t>vhna</w:t>
+      </w:r>
+      <w:proofErr w:type="spellEnd"/>
+      <w:r>
+        <w:rPr>
+          <w:lang w:val="en-PK"/>
+        </w:rPr>
+        <w:t xml:space="preserve"> </w:t>
+      </w:r>
+      <w:proofErr w:type="spellStart"/>
+      <w:r>
+        <w:rPr>
+          <w:lang w:val="en-PK"/>
+        </w:rPr>
+        <w:t>kuch</w:t>
+      </w:r>
+      <w:proofErr w:type="spellEnd"/>
+      <w:r>
+        <w:rPr>
+          <w:lang w:val="en-PK"/>
+        </w:rPr>
+        <w:t xml:space="preserve"> </w:t>
+      </w:r>
+      <w:proofErr w:type="spellStart"/>
+      <w:r>
+        <w:rPr>
+          <w:lang w:val="en-PK"/>
+        </w:rPr>
+        <w:t>esa</w:t>
+      </w:r>
+      <w:proofErr w:type="spellEnd"/>
+      <w:r>
+        <w:rPr>
+          <w:lang w:val="en-PK"/>
+        </w:rPr>
+        <w:t xml:space="preserve"> </w:t>
+      </w:r>
+      <w:proofErr w:type="spellStart"/>
+      <w:r>
+        <w:rPr>
+          <w:lang w:val="en-PK"/>
+        </w:rPr>
+        <w:t>ho</w:t>
+      </w:r>
+      <w:proofErr w:type="spellEnd"/>
+      <w:r>
+        <w:rPr>
+          <w:lang w:val="en-PK"/>
+        </w:rPr>
+        <w:t xml:space="preserve"> k </w:t>
+      </w:r>
+      <w:proofErr w:type="spellStart"/>
+      <w:r>
+        <w:rPr>
+          <w:lang w:val="en-PK"/>
+        </w:rPr>
+        <w:t>agr</w:t>
+      </w:r>
+      <w:proofErr w:type="spellEnd"/>
+      <w:r>
+        <w:rPr>
+          <w:lang w:val="en-PK"/>
+        </w:rPr>
+        <w:t xml:space="preserve"> hm year pr </w:t>
+      </w:r>
+      <w:proofErr w:type="spellStart"/>
+      <w:r>
+        <w:rPr>
+          <w:lang w:val="en-PK"/>
+        </w:rPr>
+        <w:t>jayn</w:t>
+      </w:r>
+      <w:proofErr w:type="spellEnd"/>
+      <w:r>
+        <w:rPr>
+          <w:lang w:val="en-PK"/>
+        </w:rPr>
+        <w:t xml:space="preserve"> to automatically 12 </w:t>
+      </w:r>
+      <w:proofErr w:type="spellStart"/>
+      <w:r>
+        <w:rPr>
+          <w:lang w:val="en-PK"/>
+        </w:rPr>
+        <w:t>likha</w:t>
+      </w:r>
+      <w:proofErr w:type="spellEnd"/>
+      <w:r>
+        <w:rPr>
+          <w:lang w:val="en-PK"/>
+        </w:rPr>
+        <w:t xml:space="preserve"> a jay, jab hm quarter pr </w:t>
+      </w:r>
+      <w:proofErr w:type="spellStart"/>
+      <w:r>
+        <w:rPr>
+          <w:lang w:val="en-PK"/>
+        </w:rPr>
+        <w:t>jayn</w:t>
+      </w:r>
+      <w:proofErr w:type="spellEnd"/>
+      <w:r>
+        <w:rPr>
+          <w:lang w:val="en-PK"/>
+        </w:rPr>
+        <w:t xml:space="preserve"> to 3 </w:t>
+      </w:r>
+      <w:proofErr w:type="spellStart"/>
+      <w:r>
+        <w:rPr>
+          <w:lang w:val="en-PK"/>
+        </w:rPr>
+        <w:t>likha</w:t>
+      </w:r>
+      <w:proofErr w:type="spellEnd"/>
+      <w:r>
+        <w:rPr>
+          <w:lang w:val="en-PK"/>
+        </w:rPr>
+        <w:t xml:space="preserve"> a jay, is </w:t>
+      </w:r>
+      <w:proofErr w:type="spellStart"/>
+      <w:r>
+        <w:rPr>
+          <w:lang w:val="en-PK"/>
+        </w:rPr>
+        <w:t>liye</w:t>
+      </w:r>
+      <w:proofErr w:type="spellEnd"/>
+      <w:r>
+        <w:rPr>
+          <w:lang w:val="en-PK"/>
+        </w:rPr>
+        <w:t xml:space="preserve"> we will use measure </w:t>
+      </w:r>
+    </w:p>
+    <w:p>
+      <w:pPr>
+        <w:rPr>
+          <w:rFonts w:ascii="Bell MT" w:hAnsi="Bell MT"/>
+          <w:lang w:val="en-PK"/>
+        </w:rPr>
+      </w:pPr>
+      <w:proofErr w:type="spellStart"/>
+      <w:r>
+        <w:rPr>
+          <w:rFonts w:ascii="Bell MT" w:hAnsi="Bell MT"/>
+          <w:lang w:val="en-PK"/>
+        </w:rPr>
+        <w:t>no_of_month</w:t>
+      </w:r>
+      <w:proofErr w:type="spellEnd"/>
+      <w:r>
+        <w:rPr>
+          <w:rFonts w:ascii="Bell MT" w:hAnsi="Bell MT"/>
+          <w:lang w:val="en-PK"/>
+        </w:rPr>
+        <w:t xml:space="preserve"> = DISTINCTCOUNT('Calendar'[Month])</w:t>
+      </w:r>
+    </w:p>
+    <w:p>
+      <w:pPr>
+        <w:rPr>
+          <w:rFonts w:ascii="Bell MT" w:hAnsi="Bell MT"/>
+          <w:lang w:val="en-PK"/>
+        </w:rPr>
+      </w:pPr>
+      <w:proofErr w:type="spellStart"/>
+      <w:r>
+        <w:rPr>
+          <w:rFonts w:ascii="Bell MT" w:hAnsi="Bell MT"/>
+          <w:lang w:val="en-PK"/>
+        </w:rPr>
+        <w:t>totalFTP_previous_value_of_period</w:t>
+      </w:r>
+      <w:proofErr w:type="spellEnd"/>
+      <w:r>
+        <w:rPr>
+          <w:rFonts w:ascii="Bell MT" w:hAnsi="Bell MT"/>
+          <w:lang w:val="en-PK"/>
+        </w:rPr>
+        <w:t xml:space="preserve"> = CALCULATE([</w:t>
+      </w:r>
+      <w:proofErr w:type="spellStart"/>
+      <w:r>
+        <w:rPr>
+          <w:rFonts w:ascii="Bell MT" w:hAnsi="Bell MT"/>
+          <w:lang w:val="en-PK"/>
+        </w:rPr>
+        <w:t>total_FTP</w:t>
+      </w:r>
+      <w:proofErr w:type="spellEnd"/>
+      <w:r>
+        <w:rPr>
+          <w:rFonts w:ascii="Bell MT" w:hAnsi="Bell MT"/>
+          <w:lang w:val="en-PK"/>
+        </w:rPr>
+        <w:t xml:space="preserve">], DATEADD('Calendar'[Date], </w:t>
+      </w:r>
+      <w:r>
+        <w:rPr>
+          <w:rFonts w:ascii="Bell MT" w:hAnsi="Bell MT"/>
+          <w:lang w:val="en-PK"/>
+        </w:rPr>
+        <w:t xml:space="preserve">- </w:t>
+      </w:r>
+      <w:proofErr w:type="spellStart"/>
+      <w:r>
+        <w:rPr>
+          <w:rFonts w:ascii="Bell MT" w:hAnsi="Bell MT"/>
+          <w:lang w:val="en-PK"/>
+        </w:rPr>
+        <w:t>no_of_month</w:t>
+      </w:r>
+      <w:proofErr w:type="spellEnd"/>
+      <w:r>
+        <w:rPr>
+          <w:rFonts w:ascii="Bell MT" w:hAnsi="Bell MT"/>
+          <w:lang w:val="en-PK"/>
+        </w:rPr>
+        <w:t>, MONTH))</w:t>
+      </w:r>
+    </w:p>
+    <w:p>
+      <w:pPr>
+        <w:rPr>
+          <w:rFonts w:cstheme="minorHAnsi"/>
+          <w:lang w:val="en-PK"/>
+        </w:rPr>
+      </w:pPr>
+      <w:r>
+        <w:rPr>
+          <w:rFonts w:cstheme="minorHAnsi"/>
+          <w:lang w:val="en-PK"/>
+        </w:rPr>
+        <w:t>-[</w:t>
+      </w:r>
+      <w:proofErr w:type="spellStart"/>
+      <w:r>
+        <w:rPr>
+          <w:rFonts w:cstheme="minorHAnsi"/>
+          <w:lang w:val="en-PK"/>
+        </w:rPr>
+        <w:t>no_of_month</w:t>
+      </w:r>
+      <w:proofErr w:type="spellEnd"/>
+      <w:r>
+        <w:rPr>
+          <w:rFonts w:cstheme="minorHAnsi"/>
+          <w:lang w:val="en-PK"/>
+        </w:rPr>
+        <w:t xml:space="preserve">], </w:t>
+      </w:r>
+      <w:proofErr w:type="spellStart"/>
+      <w:r>
+        <w:rPr>
+          <w:rFonts w:cstheme="minorHAnsi"/>
+          <w:lang w:val="en-PK"/>
+        </w:rPr>
+        <w:t>yani</w:t>
+      </w:r>
+      <w:proofErr w:type="spellEnd"/>
+      <w:r>
+        <w:rPr>
+          <w:rFonts w:cstheme="minorHAnsi"/>
+          <w:lang w:val="en-PK"/>
+        </w:rPr>
+        <w:t xml:space="preserve"> </w:t>
+      </w:r>
+      <w:proofErr w:type="spellStart"/>
+      <w:r>
+        <w:rPr>
+          <w:rFonts w:cstheme="minorHAnsi"/>
+          <w:lang w:val="en-PK"/>
+        </w:rPr>
+        <w:t>itny</w:t>
+      </w:r>
+      <w:proofErr w:type="spellEnd"/>
+      <w:r>
+        <w:rPr>
+          <w:rFonts w:cstheme="minorHAnsi"/>
+          <w:lang w:val="en-PK"/>
+        </w:rPr>
+        <w:t xml:space="preserve"> months peachy </w:t>
+      </w:r>
+      <w:proofErr w:type="spellStart"/>
+      <w:r>
+        <w:rPr>
+          <w:rFonts w:cstheme="minorHAnsi"/>
+          <w:lang w:val="en-PK"/>
+        </w:rPr>
+        <w:t>jao</w:t>
+      </w:r>
+      <w:proofErr w:type="spellEnd"/>
+      <w:r>
+        <w:rPr>
+          <w:rFonts w:cstheme="minorHAnsi"/>
+          <w:lang w:val="en-PK"/>
+        </w:rPr>
+        <w:t xml:space="preserve"> </w:t>
+      </w:r>
+      <w:proofErr w:type="spellStart"/>
+      <w:r>
+        <w:rPr>
+          <w:rFonts w:cstheme="minorHAnsi"/>
+          <w:lang w:val="en-PK"/>
+        </w:rPr>
+        <w:t>jitni</w:t>
+      </w:r>
+      <w:proofErr w:type="spellEnd"/>
+      <w:r>
+        <w:rPr>
+          <w:rFonts w:cstheme="minorHAnsi"/>
+          <w:lang w:val="en-PK"/>
+        </w:rPr>
+        <w:t xml:space="preserve"> value y measure </w:t>
+      </w:r>
+      <w:proofErr w:type="gramStart"/>
+      <w:r>
+        <w:rPr>
+          <w:rFonts w:cstheme="minorHAnsi"/>
+          <w:lang w:val="en-PK"/>
+        </w:rPr>
+        <w:t>show</w:t>
+      </w:r>
+      <w:proofErr w:type="gramEnd"/>
+      <w:r>
+        <w:rPr>
+          <w:rFonts w:cstheme="minorHAnsi"/>
+          <w:lang w:val="en-PK"/>
+        </w:rPr>
+        <w:t xml:space="preserve"> </w:t>
+      </w:r>
+      <w:proofErr w:type="spellStart"/>
+      <w:r>
+        <w:rPr>
+          <w:rFonts w:cstheme="minorHAnsi"/>
+          <w:lang w:val="en-PK"/>
+        </w:rPr>
+        <w:t>kry</w:t>
+      </w:r>
+      <w:proofErr w:type="spellEnd"/>
+      <w:r>
+        <w:rPr>
+          <w:rFonts w:cstheme="minorHAnsi"/>
+          <w:lang w:val="en-PK"/>
+        </w:rPr>
+        <w:t xml:space="preserve"> ga </w:t>
+      </w:r>
+    </w:p>
+    <w:p>
+      <w:pPr>
+        <w:rPr>
+          <w:rFonts w:ascii="Bell MT" w:hAnsi="Bell MT" w:cstheme="minorHAnsi"/>
+          <w:lang w:val="en-PK"/>
+        </w:rPr>
+      </w:pPr>
+      <w:r>
+        <w:rPr>
+          <w:rFonts w:cstheme="minorHAnsi"/>
+          <w:lang w:val="en-PK"/>
+        </w:rPr>
+        <w:t xml:space="preserve">Then growth get </w:t>
+      </w:r>
+      <w:proofErr w:type="spellStart"/>
+      <w:r>
+        <w:rPr>
+          <w:rFonts w:cstheme="minorHAnsi"/>
+          <w:lang w:val="en-PK"/>
+        </w:rPr>
+        <w:t>krny</w:t>
+      </w:r>
+      <w:proofErr w:type="spellEnd"/>
+      <w:r>
+        <w:rPr>
+          <w:rFonts w:cstheme="minorHAnsi"/>
+          <w:lang w:val="en-PK"/>
+        </w:rPr>
+        <w:t xml:space="preserve"> k </w:t>
+      </w:r>
+      <w:proofErr w:type="spellStart"/>
+      <w:r>
+        <w:rPr>
+          <w:rFonts w:cstheme="minorHAnsi"/>
+          <w:lang w:val="en-PK"/>
+        </w:rPr>
+        <w:t>liye</w:t>
+      </w:r>
+      <w:proofErr w:type="spellEnd"/>
+      <w:r>
+        <w:rPr>
+          <w:rFonts w:ascii="Bell MT" w:hAnsi="Bell MT" w:cstheme="minorHAnsi"/>
+          <w:lang w:val="en-PK"/>
+        </w:rPr>
+        <w:t>,</w:t>
+      </w:r>
+    </w:p>
+    <w:p>
+      <w:pPr>
+        <w:rPr>
+          <w:rFonts w:ascii="Bell MT" w:hAnsi="Bell MT" w:cstheme="minorHAnsi"/>
+          <w:lang w:val="en-PK"/>
+        </w:rPr>
+      </w:pPr>
+      <w:r>
+        <w:rPr>
+          <w:rFonts w:ascii="Bell MT" w:hAnsi="Bell MT" w:cstheme="minorHAnsi"/>
+          <w:lang w:val="en-PK"/>
+        </w:rPr>
+        <w:t xml:space="preserve"> (</w:t>
+      </w:r>
+      <w:proofErr w:type="spellStart"/>
+      <w:r>
+        <w:rPr>
+          <w:rFonts w:ascii="Bell MT" w:hAnsi="Bell MT" w:cstheme="minorHAnsi"/>
+          <w:lang w:val="en-PK"/>
+        </w:rPr>
+        <w:t>total_ftp</w:t>
+      </w:r>
+      <w:proofErr w:type="spellEnd"/>
+      <w:r>
+        <w:rPr>
+          <w:rFonts w:ascii="Bell MT" w:hAnsi="Bell MT" w:cstheme="minorHAnsi"/>
+          <w:lang w:val="en-PK"/>
+        </w:rPr>
+        <w:t xml:space="preserve"> - </w:t>
+      </w:r>
+      <w:proofErr w:type="spellStart"/>
+      <w:r>
+        <w:rPr>
+          <w:rFonts w:ascii="Bell MT" w:hAnsi="Bell MT"/>
+          <w:lang w:val="en-PK"/>
+        </w:rPr>
+        <w:t>totalFTP_previous_value_of_period</w:t>
+      </w:r>
+      <w:proofErr w:type="spellEnd"/>
+      <w:r>
+        <w:rPr>
+          <w:rFonts w:ascii="Bell MT" w:hAnsi="Bell MT"/>
+          <w:lang w:val="en-PK"/>
+        </w:rPr>
+        <w:t xml:space="preserve">)/ </w:t>
+      </w:r>
+      <w:proofErr w:type="spellStart"/>
+      <w:r>
+        <w:rPr>
+          <w:rFonts w:ascii="Bell MT" w:hAnsi="Bell MT"/>
+          <w:lang w:val="en-PK"/>
+        </w:rPr>
+        <w:t>totalFTP_previous_value_of_period</w:t>
+      </w:r>
+      <w:proofErr w:type="spellEnd"/>
+    </w:p>
+    <w:p>
+      <w:pPr>
+        <w:rPr>
+          <w:lang w:val="en-PK"/>
+        </w:rPr>
+      </w:pPr>
+      <w:r>
+        <w:rPr>
+          <w:lang w:val="en-PK"/>
+        </w:rPr>
+        <w:t xml:space="preserve">Is s percentage growth a jay </w:t>
+      </w:r>
+      <w:proofErr w:type="spellStart"/>
+      <w:proofErr w:type="gramStart"/>
+      <w:r>
+        <w:rPr>
+          <w:lang w:val="en-PK"/>
+        </w:rPr>
+        <w:t>gi</w:t>
+      </w:r>
+      <w:proofErr w:type="spellEnd"/>
+      <w:r>
+        <w:rPr>
+          <w:lang w:val="en-PK"/>
+        </w:rPr>
+        <w:t>,,,,</w:t>
+      </w:r>
+      <w:proofErr w:type="gramEnd"/>
+      <w:r>
+        <w:rPr>
+          <w:lang w:val="en-PK"/>
+        </w:rPr>
+        <w:t xml:space="preserve"> we can </w:t>
+      </w:r>
+      <w:r>
+        <w:rPr>
+          <w:lang w:val="en-PK"/>
+        </w:rPr>
+        <w:t xml:space="preserve">apply filter and check growth on each level, on selecting sales to revenue growth per period, or on net profit by not selecting any </w:t>
+      </w:r>
+      <w:proofErr w:type="gramStart"/>
+      <w:r>
+        <w:rPr>
+          <w:lang w:val="en-PK"/>
+        </w:rPr>
+        <w:t>thing ,</w:t>
+      </w:r>
+      <w:proofErr w:type="gramEnd"/>
+      <w:r>
+        <w:rPr>
+          <w:lang w:val="en-PK"/>
+        </w:rPr>
+        <w:t xml:space="preserve"> just selecting profit and loss etc and so on </w:t>
+      </w:r>
+    </w:p>
+    <w:p>
+      <w:pPr>
+        <w:ind w:left="360"/>
+        <w:rPr>
+          <w:b/>
+          <w:bCs/>
+          <w:sz w:val="52"/>
+          <w:szCs w:val="52"/>
+          <w:u w:val="single"/>
+        </w:rPr>
+      </w:pPr>
+      <w:r>
+        <w:rPr>
+          <w:lang w:val="en-PK"/>
+        </w:rPr>
+        <w:t xml:space="preserve"> </w:t>
+      </w:r>
+      <w:r>
+        <w:rPr>
+          <w:b/>
+          <w:bCs/>
+          <w:sz w:val="52"/>
+          <w:szCs w:val="52"/>
+          <w:highlight w:val="green"/>
+          <w:u w:val="single"/>
+        </w:rPr>
+        <w:t xml:space="preserve">Section </w:t>
+      </w:r>
+      <w:proofErr w:type="gramStart"/>
+      <w:r>
+        <w:rPr>
+          <w:b/>
+          <w:bCs/>
+          <w:sz w:val="52"/>
+          <w:szCs w:val="52"/>
+          <w:highlight w:val="green"/>
+          <w:u w:val="single"/>
+        </w:rPr>
+        <w:t>1</w:t>
+      </w:r>
+      <w:r>
+        <w:rPr>
+          <w:b/>
+          <w:bCs/>
+          <w:sz w:val="52"/>
+          <w:szCs w:val="52"/>
+          <w:highlight w:val="green"/>
+          <w:u w:val="single"/>
+        </w:rPr>
+        <w:t>3</w:t>
+      </w:r>
+      <w:r>
+        <w:rPr>
+          <w:b/>
+          <w:bCs/>
+          <w:sz w:val="52"/>
+          <w:szCs w:val="52"/>
+          <w:highlight w:val="green"/>
+          <w:u w:val="single"/>
+        </w:rPr>
+        <w:t>:</w:t>
+      </w:r>
+      <w:r>
+        <w:rPr>
+          <w:b/>
+          <w:bCs/>
+          <w:sz w:val="52"/>
+          <w:szCs w:val="52"/>
+          <w:highlight w:val="green"/>
+          <w:u w:val="single"/>
+        </w:rPr>
+        <w:t>Horizontal</w:t>
+      </w:r>
+      <w:proofErr w:type="gramEnd"/>
+      <w:r>
+        <w:rPr>
+          <w:b/>
+          <w:bCs/>
+          <w:sz w:val="52"/>
+          <w:szCs w:val="52"/>
+          <w:highlight w:val="green"/>
+          <w:u w:val="single"/>
+        </w:rPr>
+        <w:t xml:space="preserve"> analysis of financial </w:t>
+      </w:r>
+      <w:proofErr w:type="spellStart"/>
+      <w:r>
+        <w:rPr>
+          <w:b/>
+          <w:bCs/>
+          <w:sz w:val="52"/>
+          <w:szCs w:val="52"/>
+          <w:highlight w:val="green"/>
+          <w:u w:val="single"/>
+        </w:rPr>
+        <w:t>staements</w:t>
+      </w:r>
+      <w:proofErr w:type="spellEnd"/>
+      <w:r>
+        <w:rPr>
+          <w:b/>
+          <w:bCs/>
+          <w:sz w:val="52"/>
+          <w:szCs w:val="52"/>
+          <w:highlight w:val="green"/>
+          <w:u w:val="single"/>
+        </w:rPr>
+        <w:t>:</w:t>
+      </w:r>
+    </w:p>
+    <w:p>
+      <w:pPr>
+        <w:rPr>
+          <w:b/>
+          <w:bCs/>
+          <w:i/>
+          <w:iCs/>
+          <w:u w:val="single"/>
+          <w:lang w:val="en-PK"/>
+        </w:rPr>
+      </w:pPr>
+      <w:r>
+        <w:rPr>
+          <w:b/>
+          <w:bCs/>
+          <w:i/>
+          <w:iCs/>
+          <w:u w:val="single"/>
+          <w:lang w:val="en-PK"/>
+        </w:rPr>
+        <w:t>For p and L/income statement:</w:t>
+      </w:r>
+    </w:p>
+    <w:p>
+      <w:pPr>
+        <w:rPr>
+          <w:lang w:val="en-PK"/>
+        </w:rPr>
+      </w:pPr>
+      <w:proofErr w:type="gramStart"/>
+      <w:r>
+        <w:rPr>
+          <w:lang w:val="en-PK"/>
+        </w:rPr>
+        <w:t>So</w:t>
+      </w:r>
+      <w:proofErr w:type="gramEnd"/>
+      <w:r>
+        <w:rPr>
+          <w:lang w:val="en-PK"/>
+        </w:rPr>
+        <w:t xml:space="preserve"> in horizontal analysis, we prepare year to year growth for each element of income statement, that</w:t>
+      </w:r>
+    </w:p>
+    <w:p>
+      <w:pPr>
+        <w:rPr>
+          <w:lang w:val="en-PK"/>
+        </w:rPr>
+      </w:pPr>
+      <w:proofErr w:type="gramStart"/>
+      <w:r>
+        <w:rPr>
+          <w:lang w:val="en-PK"/>
+        </w:rPr>
+        <w:t>is</w:t>
+      </w:r>
+      <w:proofErr w:type="gramEnd"/>
+      <w:r>
+        <w:rPr>
+          <w:lang w:val="en-PK"/>
+        </w:rPr>
+        <w:t xml:space="preserve"> sales, cost of sales, marketing expenses, rent or whatever is appearing on the income statement.</w:t>
+      </w:r>
+    </w:p>
+    <w:p>
+      <w:pPr>
+        <w:rPr>
+          <w:lang w:val="en-PK"/>
+        </w:rPr>
+      </w:pPr>
+      <w:proofErr w:type="gramStart"/>
+      <w:r>
+        <w:rPr>
+          <w:lang w:val="en-PK"/>
+        </w:rPr>
+        <w:t>So</w:t>
+      </w:r>
+      <w:proofErr w:type="gramEnd"/>
+      <w:r>
+        <w:rPr>
+          <w:lang w:val="en-PK"/>
+        </w:rPr>
+        <w:t xml:space="preserve"> you prepare the report in such a way that you can </w:t>
+      </w:r>
+      <w:proofErr w:type="spellStart"/>
+      <w:r>
+        <w:rPr>
+          <w:lang w:val="en-PK"/>
+        </w:rPr>
+        <w:t>analyze</w:t>
+      </w:r>
+      <w:proofErr w:type="spellEnd"/>
+      <w:r>
+        <w:rPr>
+          <w:lang w:val="en-PK"/>
+        </w:rPr>
+        <w:t xml:space="preserve"> the growth in each item of the PNL from</w:t>
+      </w:r>
+    </w:p>
+    <w:p>
+      <w:pPr>
+        <w:rPr>
+          <w:lang w:val="en-PK"/>
+        </w:rPr>
+      </w:pPr>
+      <w:r>
+        <w:rPr>
+          <w:lang w:val="en-PK"/>
+        </w:rPr>
+        <w:t>year to year, or you can say quarter to quarter or you can say month to month, and then you can pick</w:t>
+      </w:r>
+    </w:p>
+    <w:p>
+      <w:pPr>
+        <w:rPr>
+          <w:lang w:val="en-PK"/>
+        </w:rPr>
+      </w:pPr>
+      <w:r>
+        <w:rPr>
+          <w:lang w:val="en-PK"/>
+        </w:rPr>
+        <w:t>up the values where the growth is not consistent with the top line sales growth.</w:t>
+      </w:r>
+    </w:p>
+    <w:p>
+      <w:pPr>
+        <w:rPr>
+          <w:lang w:val="en-PK"/>
+        </w:rPr>
+      </w:pPr>
+      <w:r>
+        <w:rPr>
+          <w:lang w:val="en-PK"/>
+        </w:rPr>
+        <w:drawing>
+          <wp:inline distT="0" distB="0" distL="0" distR="0" wp14:anchorId="3035BF9E" wp14:editId="1F0E8D4A">
+            <wp:extent cx="3573605" cy="1828800"/>
+            <wp:effectExtent l="0" t="0" r="8255" b="0"/>
+            <wp:docPr id="1274590665" name="Picture 1"/>
+            <wp:cNvGraphicFramePr>
+              <a:graphicFrameLocks xmlns:a="http://schemas.openxmlformats.org/drawingml/2006/main" noChangeAspect="1"/>
+            </wp:cNvGraphicFramePr>
+            <a:graphic xmlns:a="http://schemas.openxmlformats.org/drawingml/2006/main">
+              <a:graphicData uri="http://schemas.openxmlformats.org/drawingml/2006/picture">
+                <pic:pic xmlns:pic="http://schemas.openxmlformats.org/drawingml/2006/picture">
+                  <pic:nvPicPr>
+                    <pic:cNvPr id="1274590665" name=""/>
+                    <pic:cNvPicPr/>
+                  </pic:nvPicPr>
+                  <pic:blipFill>
+                    <a:blip r:embed="rId13"/>
+                    <a:stretch>
+                      <a:fillRect/>
+                    </a:stretch>
+                  </pic:blipFill>
+                  <pic:spPr>
+                    <a:xfrm>
+                      <a:off x="0" y="0"/>
+                      <a:ext cx="3579541" cy="1831838"/>
+                    </a:xfrm>
+                    <a:prstGeom prst="rect">
+                      <a:avLst/>
+                    </a:prstGeom>
+                  </pic:spPr>
+                </pic:pic>
+              </a:graphicData>
+            </a:graphic>
+          </wp:inline>
+        </w:drawing>
+      </w:r>
+    </w:p>
+    <w:p>
+      <w:pPr>
+        <w:rPr>
+          <w:lang w:val="en-PK"/>
+        </w:rPr>
+      </w:pPr>
+      <w:r>
+        <w:rPr>
+          <w:lang w:val="en-PK"/>
+        </w:rPr>
+        <w:t xml:space="preserve">Ab </w:t>
+      </w:r>
+      <w:proofErr w:type="spellStart"/>
+      <w:r>
+        <w:rPr>
+          <w:lang w:val="en-PK"/>
+        </w:rPr>
+        <w:t>yhna</w:t>
+      </w:r>
+      <w:proofErr w:type="spellEnd"/>
+      <w:r>
+        <w:rPr>
+          <w:lang w:val="en-PK"/>
+        </w:rPr>
+        <w:t xml:space="preserve"> </w:t>
+      </w:r>
+      <w:proofErr w:type="spellStart"/>
+      <w:r>
+        <w:rPr>
+          <w:lang w:val="en-PK"/>
+        </w:rPr>
+        <w:t>dekha</w:t>
+      </w:r>
+      <w:proofErr w:type="spellEnd"/>
+      <w:r>
+        <w:rPr>
+          <w:lang w:val="en-PK"/>
+        </w:rPr>
+        <w:t xml:space="preserve"> </w:t>
+      </w:r>
+      <w:proofErr w:type="spellStart"/>
+      <w:r>
+        <w:rPr>
+          <w:lang w:val="en-PK"/>
+        </w:rPr>
+        <w:t>ja</w:t>
+      </w:r>
+      <w:proofErr w:type="spellEnd"/>
+      <w:r>
+        <w:rPr>
+          <w:lang w:val="en-PK"/>
+        </w:rPr>
+        <w:t xml:space="preserve"> </w:t>
+      </w:r>
+      <w:proofErr w:type="spellStart"/>
+      <w:r>
+        <w:rPr>
+          <w:lang w:val="en-PK"/>
+        </w:rPr>
+        <w:t>skta</w:t>
+      </w:r>
+      <w:proofErr w:type="spellEnd"/>
+      <w:r>
+        <w:rPr>
+          <w:lang w:val="en-PK"/>
+        </w:rPr>
+        <w:t xml:space="preserve"> h k 2019 and 2020 k sales and cost of sales ka trend opposite h, 2019 m sales to 59% </w:t>
+      </w:r>
+      <w:proofErr w:type="spellStart"/>
+      <w:r>
+        <w:rPr>
+          <w:lang w:val="en-PK"/>
+        </w:rPr>
+        <w:t>brhi</w:t>
+      </w:r>
+      <w:proofErr w:type="spellEnd"/>
+      <w:r>
+        <w:rPr>
+          <w:lang w:val="en-PK"/>
+        </w:rPr>
+        <w:t xml:space="preserve"> compared to previous year but cost of sales just 45%, </w:t>
+      </w:r>
+      <w:proofErr w:type="spellStart"/>
+      <w:r>
+        <w:rPr>
+          <w:lang w:val="en-PK"/>
+        </w:rPr>
+        <w:t>hala</w:t>
+      </w:r>
+      <w:proofErr w:type="spellEnd"/>
+      <w:r>
+        <w:rPr>
+          <w:lang w:val="en-PK"/>
+        </w:rPr>
+        <w:t xml:space="preserve"> k sales k increase </w:t>
+      </w:r>
+      <w:proofErr w:type="spellStart"/>
+      <w:r>
+        <w:rPr>
+          <w:lang w:val="en-PK"/>
+        </w:rPr>
+        <w:t>hony</w:t>
+      </w:r>
+      <w:proofErr w:type="spellEnd"/>
+      <w:r>
+        <w:rPr>
+          <w:lang w:val="en-PK"/>
+        </w:rPr>
+        <w:t xml:space="preserve"> s cost of sales increase </w:t>
+      </w:r>
+      <w:proofErr w:type="spellStart"/>
+      <w:r>
+        <w:rPr>
+          <w:lang w:val="en-PK"/>
+        </w:rPr>
+        <w:t>hoti</w:t>
+      </w:r>
+      <w:proofErr w:type="spellEnd"/>
+      <w:r>
+        <w:rPr>
+          <w:lang w:val="en-PK"/>
+        </w:rPr>
+        <w:t xml:space="preserve"> </w:t>
+      </w:r>
+      <w:proofErr w:type="spellStart"/>
+      <w:proofErr w:type="gramStart"/>
+      <w:r>
+        <w:rPr>
+          <w:lang w:val="en-PK"/>
+        </w:rPr>
+        <w:t>h,yhan</w:t>
+      </w:r>
+      <w:proofErr w:type="spellEnd"/>
+      <w:proofErr w:type="gramEnd"/>
+      <w:r>
+        <w:rPr>
+          <w:lang w:val="en-PK"/>
+        </w:rPr>
+        <w:t xml:space="preserve"> trend may be is </w:t>
+      </w:r>
+      <w:proofErr w:type="spellStart"/>
+      <w:r>
+        <w:rPr>
+          <w:lang w:val="en-PK"/>
+        </w:rPr>
+        <w:t>liye</w:t>
+      </w:r>
+      <w:proofErr w:type="spellEnd"/>
+      <w:r>
+        <w:rPr>
+          <w:lang w:val="en-PK"/>
+        </w:rPr>
+        <w:t xml:space="preserve"> </w:t>
+      </w:r>
+      <w:proofErr w:type="spellStart"/>
+      <w:r>
+        <w:rPr>
+          <w:lang w:val="en-PK"/>
+        </w:rPr>
+        <w:t>aya</w:t>
+      </w:r>
+      <w:proofErr w:type="spellEnd"/>
+      <w:r>
+        <w:rPr>
+          <w:lang w:val="en-PK"/>
+        </w:rPr>
+        <w:t xml:space="preserve"> k hm n cost controls ki </w:t>
+      </w:r>
+      <w:proofErr w:type="spellStart"/>
+      <w:r>
+        <w:rPr>
+          <w:lang w:val="en-PK"/>
+        </w:rPr>
+        <w:t>apni</w:t>
+      </w:r>
+      <w:proofErr w:type="spellEnd"/>
+      <w:r>
+        <w:rPr>
+          <w:lang w:val="en-PK"/>
+        </w:rPr>
+        <w:t xml:space="preserve">, </w:t>
+      </w:r>
+      <w:proofErr w:type="spellStart"/>
+      <w:r>
+        <w:rPr>
+          <w:lang w:val="en-PK"/>
+        </w:rPr>
+        <w:t>ya</w:t>
+      </w:r>
+      <w:proofErr w:type="spellEnd"/>
+      <w:r>
+        <w:rPr>
+          <w:lang w:val="en-PK"/>
+        </w:rPr>
+        <w:t xml:space="preserve"> hm n product ki quality km </w:t>
+      </w:r>
+      <w:proofErr w:type="spellStart"/>
+      <w:r>
+        <w:rPr>
+          <w:lang w:val="en-PK"/>
+        </w:rPr>
+        <w:t>kr</w:t>
+      </w:r>
+      <w:proofErr w:type="spellEnd"/>
+      <w:r>
+        <w:rPr>
+          <w:lang w:val="en-PK"/>
+        </w:rPr>
+        <w:t xml:space="preserve"> di </w:t>
+      </w:r>
+      <w:proofErr w:type="spellStart"/>
+      <w:r>
+        <w:rPr>
+          <w:lang w:val="en-PK"/>
+        </w:rPr>
+        <w:t>yani</w:t>
+      </w:r>
+      <w:proofErr w:type="spellEnd"/>
+      <w:r>
+        <w:rPr>
+          <w:lang w:val="en-PK"/>
+        </w:rPr>
+        <w:t xml:space="preserve"> us ko </w:t>
+      </w:r>
+      <w:proofErr w:type="spellStart"/>
+      <w:r>
+        <w:rPr>
+          <w:lang w:val="en-PK"/>
+        </w:rPr>
+        <w:t>bnany</w:t>
+      </w:r>
+      <w:proofErr w:type="spellEnd"/>
+      <w:r>
+        <w:rPr>
+          <w:lang w:val="en-PK"/>
+        </w:rPr>
+        <w:t xml:space="preserve"> ki cost km </w:t>
+      </w:r>
+      <w:proofErr w:type="spellStart"/>
+      <w:r>
+        <w:rPr>
+          <w:lang w:val="en-PK"/>
+        </w:rPr>
+        <w:t>kr</w:t>
+      </w:r>
+      <w:proofErr w:type="spellEnd"/>
+      <w:r>
+        <w:rPr>
+          <w:lang w:val="en-PK"/>
+        </w:rPr>
+        <w:t xml:space="preserve"> di </w:t>
+      </w:r>
+    </w:p>
+    <w:p>
+      <w:pPr>
+        <w:rPr>
+          <w:b/>
+          <w:bCs/>
+          <w:i/>
+          <w:iCs/>
+          <w:u w:val="single"/>
+          <w:lang w:val="en-PK"/>
+        </w:rPr>
+      </w:pPr>
+      <w:r>
+        <w:rPr>
+          <w:b/>
+          <w:bCs/>
+          <w:i/>
+          <w:iCs/>
+          <w:u w:val="single"/>
+          <w:lang w:val="en-PK"/>
+        </w:rPr>
+        <w:lastRenderedPageBreak/>
+        <w:t>For balance sheet:</w:t>
+      </w:r>
     </w:p>
     <w:p>
       <w:pPr>
@@ -25552,7 +28705,7 @@
   <w:style w:type="paragraph" w:default="1" w:styleId="Normal">
     <w:name w:val="Normal"/>
     <w:qFormat/>
-    <w:rsid w:val="00C32E00"/>
+    <w:rsid w:val="00730551"/>
   </w:style>
   <w:style w:type="paragraph" w:styleId="Heading1">
     <w:name w:val="heading 1"/>

</xml_diff>

<commit_message>
calculated PCP value and PCP growth for both PandL and BL
</commit_message>
<xml_diff>
--- a/Complete FINANCIAL REPORTING AND FINANCIAL ANALYSIS USING POWER BI.docx
+++ b/Complete FINANCIAL REPORTING AND FINANCIAL ANALYSIS USING POWER BI.docx
@@ -25765,8 +25765,9 @@
           <w:highlight w:val="green"/>
           <w:u w:val="single"/>
         </w:rPr>
-        <w:t>1</w:t>
-      </w:r>
+        <w:t>14:Vertical</w:t>
+      </w:r>
+      <w:proofErr w:type="gramEnd"/>
       <w:r>
         <w:rPr>
           <w:b/>
@@ -25776,7 +25777,7 @@
           <w:highlight w:val="green"/>
           <w:u w:val="single"/>
         </w:rPr>
-        <w:t>4</w:t>
+        <w:t xml:space="preserve"> analysis of financial statements</w:t>
       </w:r>
       <w:r>
         <w:rPr>
@@ -25789,62 +25790,6 @@
         </w:rPr>
         <w:t>:</w:t>
       </w:r>
-      <w:r>
-        <w:rPr>
-          <w:b/>
-          <w:bCs/>
-          <w:sz w:val="52"/>
-          <w:szCs w:val="52"/>
-          <w:highlight w:val="green"/>
-          <w:u w:val="single"/>
-        </w:rPr>
-        <w:t>Vertical</w:t>
-      </w:r>
-      <w:proofErr w:type="gramEnd"/>
-      <w:r>
-        <w:rPr>
-          <w:b/>
-          <w:bCs/>
-          <w:sz w:val="52"/>
-          <w:szCs w:val="52"/>
-          <w:highlight w:val="green"/>
-          <w:u w:val="single"/>
-        </w:rPr>
-        <w:t xml:space="preserve"> analysis of financial sta</w:t>
-      </w:r>
-      <w:r>
-        <w:rPr>
-          <w:b/>
-          <w:bCs/>
-          <w:sz w:val="52"/>
-          <w:szCs w:val="52"/>
-          <w:highlight w:val="green"/>
-          <w:u w:val="single"/>
-        </w:rPr>
-        <w:t>t</w:t>
-      </w:r>
-      <w:r>
-        <w:rPr>
-          <w:b/>
-          <w:bCs/>
-          <w:sz w:val="52"/>
-          <w:szCs w:val="52"/>
-          <w:highlight w:val="green"/>
-          <w:u w:val="single"/>
-        </w:rPr>
-        <w:t>ements</w:t>
-      </w:r>
-      <w:r>
-        <w:rPr>
-          <w:b/>
-          <w:bCs/>
-          <w:sz w:val="52"/>
-          <w:szCs w:val="52"/>
-          <w:highlight w:val="green"/>
-          <w:u w:val="single"/>
-        </w:rPr>
-        <w:t>:</w:t>
-      </w:r>
     </w:p>
     <w:p>
       <w:r>
@@ -26256,6 +26201,7 @@
       <w:r>
         <w:rPr>
           <w:rFonts w:cstheme="minorHAnsi"/>
+          <w:noProof/>
           <w:lang w:val="en-PK"/>
         </w:rPr>
         <w:drawing>
@@ -27431,6 +27377,710 @@
           <w:lang w:val="en-PK"/>
         </w:rPr>
         <w:t xml:space="preserve"> percent h</w:t>
+      </w:r>
+    </w:p>
+    <w:p>
+      <w:pPr>
+        <w:rPr>
+          <w:b/>
+          <w:bCs/>
+          <w:sz w:val="52"/>
+          <w:szCs w:val="52"/>
+          <w:u w:val="single"/>
+        </w:rPr>
+      </w:pPr>
+      <w:r>
+        <w:rPr>
+          <w:b/>
+          <w:bCs/>
+          <w:sz w:val="52"/>
+          <w:szCs w:val="52"/>
+          <w:highlight w:val="green"/>
+          <w:u w:val="single"/>
+        </w:rPr>
+        <w:t xml:space="preserve">Section </w:t>
+      </w:r>
+      <w:proofErr w:type="gramStart"/>
+      <w:r>
+        <w:rPr>
+          <w:b/>
+          <w:bCs/>
+          <w:sz w:val="52"/>
+          <w:szCs w:val="52"/>
+          <w:highlight w:val="green"/>
+          <w:u w:val="single"/>
+        </w:rPr>
+        <w:t>1</w:t>
+      </w:r>
+      <w:r>
+        <w:rPr>
+          <w:b/>
+          <w:bCs/>
+          <w:sz w:val="52"/>
+          <w:szCs w:val="52"/>
+          <w:highlight w:val="green"/>
+          <w:u w:val="single"/>
+        </w:rPr>
+        <w:t>5</w:t>
+      </w:r>
+      <w:r>
+        <w:rPr>
+          <w:b/>
+          <w:bCs/>
+          <w:sz w:val="52"/>
+          <w:szCs w:val="52"/>
+          <w:highlight w:val="green"/>
+          <w:u w:val="single"/>
+        </w:rPr>
+        <w:t>:</w:t>
+      </w:r>
+      <w:r>
+        <w:rPr>
+          <w:b/>
+          <w:bCs/>
+          <w:sz w:val="52"/>
+          <w:szCs w:val="52"/>
+          <w:highlight w:val="green"/>
+          <w:u w:val="single"/>
+        </w:rPr>
+        <w:t>Calculating</w:t>
+      </w:r>
+      <w:proofErr w:type="gramEnd"/>
+      <w:r>
+        <w:rPr>
+          <w:b/>
+          <w:bCs/>
+          <w:sz w:val="52"/>
+          <w:szCs w:val="52"/>
+          <w:highlight w:val="green"/>
+          <w:u w:val="single"/>
+        </w:rPr>
+        <w:t xml:space="preserve"> previous corresponding period and PCP growth</w:t>
+      </w:r>
+      <w:r>
+        <w:rPr>
+          <w:b/>
+          <w:bCs/>
+          <w:sz w:val="52"/>
+          <w:szCs w:val="52"/>
+          <w:highlight w:val="green"/>
+          <w:u w:val="single"/>
+        </w:rPr>
+        <w:t>:</w:t>
+      </w:r>
+    </w:p>
+    <w:p>
+      <w:pPr>
+        <w:rPr>
+          <w:rFonts w:cstheme="minorHAnsi"/>
+          <w:lang w:val="en-PK"/>
+        </w:rPr>
+      </w:pPr>
+      <w:r>
+        <w:rPr>
+          <w:rFonts w:cstheme="minorHAnsi"/>
+          <w:lang w:val="en-PK"/>
+        </w:rPr>
+        <w:t xml:space="preserve">This is previous corresponding period, </w:t>
+      </w:r>
+      <w:proofErr w:type="spellStart"/>
+      <w:r>
+        <w:rPr>
+          <w:rFonts w:cstheme="minorHAnsi"/>
+          <w:lang w:val="en-PK"/>
+        </w:rPr>
+        <w:t>yani</w:t>
+      </w:r>
+      <w:proofErr w:type="spellEnd"/>
+      <w:r>
+        <w:rPr>
+          <w:rFonts w:cstheme="minorHAnsi"/>
+          <w:lang w:val="en-PK"/>
+        </w:rPr>
+        <w:t xml:space="preserve"> </w:t>
+      </w:r>
+      <w:proofErr w:type="spellStart"/>
+      <w:r>
+        <w:rPr>
+          <w:rFonts w:cstheme="minorHAnsi"/>
+          <w:lang w:val="en-PK"/>
+        </w:rPr>
+        <w:t>agr</w:t>
+      </w:r>
+      <w:proofErr w:type="spellEnd"/>
+      <w:r>
+        <w:rPr>
+          <w:rFonts w:cstheme="minorHAnsi"/>
+          <w:lang w:val="en-PK"/>
+        </w:rPr>
+        <w:t xml:space="preserve"> </w:t>
+      </w:r>
+      <w:proofErr w:type="spellStart"/>
+      <w:r>
+        <w:rPr>
+          <w:rFonts w:cstheme="minorHAnsi"/>
+          <w:lang w:val="en-PK"/>
+        </w:rPr>
+        <w:t>sepetmeber</w:t>
+      </w:r>
+      <w:proofErr w:type="spellEnd"/>
+      <w:r>
+        <w:rPr>
+          <w:rFonts w:cstheme="minorHAnsi"/>
+          <w:lang w:val="en-PK"/>
+        </w:rPr>
+        <w:t xml:space="preserve"> 2020 h to is ka PCP September 2019 </w:t>
+      </w:r>
+      <w:proofErr w:type="spellStart"/>
+      <w:r>
+        <w:rPr>
+          <w:rFonts w:cstheme="minorHAnsi"/>
+          <w:lang w:val="en-PK"/>
+        </w:rPr>
+        <w:t>ho</w:t>
+      </w:r>
+      <w:proofErr w:type="spellEnd"/>
+      <w:r>
+        <w:rPr>
+          <w:rFonts w:cstheme="minorHAnsi"/>
+          <w:lang w:val="en-PK"/>
+        </w:rPr>
+        <w:t xml:space="preserve"> ga and is </w:t>
+      </w:r>
+      <w:proofErr w:type="spellStart"/>
+      <w:r>
+        <w:rPr>
+          <w:rFonts w:cstheme="minorHAnsi"/>
+          <w:lang w:val="en-PK"/>
+        </w:rPr>
+        <w:t>sep</w:t>
+      </w:r>
+      <w:proofErr w:type="spellEnd"/>
+      <w:r>
+        <w:rPr>
+          <w:rFonts w:cstheme="minorHAnsi"/>
+          <w:lang w:val="en-PK"/>
+        </w:rPr>
+        <w:t xml:space="preserve"> 2019 ka PCP sepetmber2018 </w:t>
+      </w:r>
+      <w:proofErr w:type="spellStart"/>
+      <w:r>
+        <w:rPr>
+          <w:rFonts w:cstheme="minorHAnsi"/>
+          <w:lang w:val="en-PK"/>
+        </w:rPr>
+        <w:t>ho</w:t>
+      </w:r>
+      <w:proofErr w:type="spellEnd"/>
+      <w:r>
+        <w:rPr>
+          <w:rFonts w:cstheme="minorHAnsi"/>
+          <w:lang w:val="en-PK"/>
+        </w:rPr>
+        <w:t xml:space="preserve"> </w:t>
+      </w:r>
+      <w:proofErr w:type="gramStart"/>
+      <w:r>
+        <w:rPr>
+          <w:rFonts w:cstheme="minorHAnsi"/>
+          <w:lang w:val="en-PK"/>
+        </w:rPr>
+        <w:t>ga,,</w:t>
+      </w:r>
+      <w:proofErr w:type="gramEnd"/>
+      <w:r>
+        <w:rPr>
+          <w:rFonts w:cstheme="minorHAnsi"/>
+          <w:lang w:val="en-PK"/>
+        </w:rPr>
+        <w:t xml:space="preserve"> </w:t>
+      </w:r>
+      <w:proofErr w:type="spellStart"/>
+      <w:r>
+        <w:rPr>
+          <w:rFonts w:cstheme="minorHAnsi"/>
+          <w:lang w:val="en-PK"/>
+        </w:rPr>
+        <w:t>yani</w:t>
+      </w:r>
+      <w:proofErr w:type="spellEnd"/>
+      <w:r>
+        <w:rPr>
+          <w:rFonts w:cstheme="minorHAnsi"/>
+          <w:lang w:val="en-PK"/>
+        </w:rPr>
+        <w:t xml:space="preserve"> previous period jo k corresponding </w:t>
+      </w:r>
+      <w:proofErr w:type="spellStart"/>
+      <w:r>
+        <w:rPr>
+          <w:rFonts w:cstheme="minorHAnsi"/>
+          <w:lang w:val="en-PK"/>
+        </w:rPr>
+        <w:t>bhi</w:t>
+      </w:r>
+      <w:proofErr w:type="spellEnd"/>
+      <w:r>
+        <w:rPr>
+          <w:rFonts w:cstheme="minorHAnsi"/>
+          <w:lang w:val="en-PK"/>
+        </w:rPr>
+        <w:t xml:space="preserve"> </w:t>
+      </w:r>
+      <w:proofErr w:type="spellStart"/>
+      <w:r>
+        <w:rPr>
+          <w:rFonts w:cstheme="minorHAnsi"/>
+          <w:lang w:val="en-PK"/>
+        </w:rPr>
+        <w:t>ho</w:t>
+      </w:r>
+      <w:proofErr w:type="spellEnd"/>
+      <w:r>
+        <w:rPr>
+          <w:rFonts w:cstheme="minorHAnsi"/>
+          <w:lang w:val="en-PK"/>
+        </w:rPr>
+        <w:t xml:space="preserve"> us ka, phly hm PCP ki value get </w:t>
+      </w:r>
+      <w:proofErr w:type="spellStart"/>
+      <w:r>
+        <w:rPr>
+          <w:rFonts w:cstheme="minorHAnsi"/>
+          <w:lang w:val="en-PK"/>
+        </w:rPr>
+        <w:t>krty</w:t>
+      </w:r>
+      <w:proofErr w:type="spellEnd"/>
+      <w:r>
+        <w:rPr>
+          <w:rFonts w:cstheme="minorHAnsi"/>
+          <w:lang w:val="en-PK"/>
+        </w:rPr>
+        <w:t xml:space="preserve"> </w:t>
+      </w:r>
+      <w:proofErr w:type="spellStart"/>
+      <w:r>
+        <w:rPr>
+          <w:rFonts w:cstheme="minorHAnsi"/>
+          <w:lang w:val="en-PK"/>
+        </w:rPr>
+        <w:t>hn</w:t>
+      </w:r>
+      <w:proofErr w:type="spellEnd"/>
+      <w:r>
+        <w:rPr>
+          <w:rFonts w:cstheme="minorHAnsi"/>
+          <w:lang w:val="en-PK"/>
+        </w:rPr>
+        <w:t xml:space="preserve"> and then growth </w:t>
+      </w:r>
+      <w:proofErr w:type="spellStart"/>
+      <w:r>
+        <w:rPr>
+          <w:rFonts w:cstheme="minorHAnsi"/>
+          <w:lang w:val="en-PK"/>
+        </w:rPr>
+        <w:t>dekhty</w:t>
+      </w:r>
+      <w:proofErr w:type="spellEnd"/>
+      <w:r>
+        <w:rPr>
+          <w:rFonts w:cstheme="minorHAnsi"/>
+          <w:lang w:val="en-PK"/>
+        </w:rPr>
+        <w:t xml:space="preserve"> </w:t>
+      </w:r>
+      <w:proofErr w:type="spellStart"/>
+      <w:r>
+        <w:rPr>
+          <w:rFonts w:cstheme="minorHAnsi"/>
+          <w:lang w:val="en-PK"/>
+        </w:rPr>
+        <w:t>hn</w:t>
+      </w:r>
+      <w:proofErr w:type="spellEnd"/>
+      <w:r>
+        <w:rPr>
+          <w:rFonts w:cstheme="minorHAnsi"/>
+          <w:lang w:val="en-PK"/>
+        </w:rPr>
+        <w:t xml:space="preserve"> </w:t>
+      </w:r>
+    </w:p>
+    <w:p>
+      <w:pPr>
+        <w:rPr>
+          <w:rFonts w:cstheme="minorHAnsi"/>
+          <w:lang w:val="en-PK"/>
+        </w:rPr>
+      </w:pPr>
+      <w:r>
+        <w:rPr>
+          <w:rFonts w:cstheme="minorHAnsi"/>
+          <w:lang w:val="en-PK"/>
+        </w:rPr>
+        <w:t xml:space="preserve">Is k </w:t>
+      </w:r>
+      <w:proofErr w:type="spellStart"/>
+      <w:r>
+        <w:rPr>
+          <w:rFonts w:cstheme="minorHAnsi"/>
+          <w:lang w:val="en-PK"/>
+        </w:rPr>
+        <w:t>liye</w:t>
+      </w:r>
+      <w:proofErr w:type="spellEnd"/>
+      <w:r>
+        <w:rPr>
+          <w:rFonts w:cstheme="minorHAnsi"/>
+          <w:lang w:val="en-PK"/>
+        </w:rPr>
+        <w:t xml:space="preserve"> power BI k </w:t>
+      </w:r>
+      <w:proofErr w:type="spellStart"/>
+      <w:r>
+        <w:rPr>
+          <w:rFonts w:cstheme="minorHAnsi"/>
+          <w:lang w:val="en-PK"/>
+        </w:rPr>
+        <w:t>apny</w:t>
+      </w:r>
+      <w:proofErr w:type="spellEnd"/>
+      <w:r>
+        <w:rPr>
+          <w:rFonts w:cstheme="minorHAnsi"/>
+          <w:lang w:val="en-PK"/>
+        </w:rPr>
+        <w:t xml:space="preserve"> </w:t>
+      </w:r>
+      <w:proofErr w:type="spellStart"/>
+      <w:r>
+        <w:rPr>
+          <w:rFonts w:cstheme="minorHAnsi"/>
+          <w:lang w:val="en-PK"/>
+        </w:rPr>
+        <w:t>andr</w:t>
+      </w:r>
+      <w:proofErr w:type="spellEnd"/>
+      <w:r>
+        <w:rPr>
+          <w:rFonts w:cstheme="minorHAnsi"/>
+          <w:lang w:val="en-PK"/>
+        </w:rPr>
+        <w:t xml:space="preserve"> ek function h which is </w:t>
+      </w:r>
+      <w:proofErr w:type="spellStart"/>
+      <w:r>
+        <w:rPr>
+          <w:rFonts w:cstheme="minorHAnsi"/>
+          <w:lang w:val="en-PK"/>
+        </w:rPr>
+        <w:t>sameperiodlastyear</w:t>
+      </w:r>
+      <w:proofErr w:type="spellEnd"/>
+      <w:r>
+        <w:rPr>
+          <w:rFonts w:cstheme="minorHAnsi"/>
+          <w:lang w:val="en-PK"/>
+        </w:rPr>
+        <w:t>:</w:t>
+      </w:r>
+    </w:p>
+    <w:p>
+      <w:pPr>
+        <w:rPr>
+          <w:rFonts w:ascii="Bell MT" w:hAnsi="Bell MT" w:cstheme="minorHAnsi"/>
+          <w:lang w:val="en-PK"/>
+        </w:rPr>
+      </w:pPr>
+      <w:proofErr w:type="spellStart"/>
+      <w:r>
+        <w:rPr>
+          <w:rFonts w:ascii="Bell MT" w:hAnsi="Bell MT" w:cstheme="minorHAnsi"/>
+          <w:lang w:val="en-PK"/>
+        </w:rPr>
+        <w:t>total_FTP_PCP</w:t>
+      </w:r>
+      <w:proofErr w:type="spellEnd"/>
+      <w:r>
+        <w:rPr>
+          <w:rFonts w:ascii="Bell MT" w:hAnsi="Bell MT" w:cstheme="minorHAnsi"/>
+          <w:lang w:val="en-PK"/>
+        </w:rPr>
+        <w:t xml:space="preserve"> </w:t>
+      </w:r>
+      <w:r>
+        <w:rPr>
+          <w:rFonts w:ascii="Bell MT" w:hAnsi="Bell MT" w:cstheme="minorHAnsi"/>
+          <w:lang w:val="en-PK"/>
+        </w:rPr>
+        <w:t>= CALCULATE([</w:t>
+      </w:r>
+      <w:proofErr w:type="spellStart"/>
+      <w:r>
+        <w:rPr>
+          <w:rFonts w:ascii="Bell MT" w:hAnsi="Bell MT" w:cstheme="minorHAnsi"/>
+          <w:lang w:val="en-PK"/>
+        </w:rPr>
+        <w:t>total_FTP</w:t>
+      </w:r>
+      <w:proofErr w:type="spellEnd"/>
+      <w:r>
+        <w:rPr>
+          <w:rFonts w:ascii="Bell MT" w:hAnsi="Bell MT" w:cstheme="minorHAnsi"/>
+          <w:lang w:val="en-PK"/>
+        </w:rPr>
+        <w:t>], SAMEPERIODLASTYEAR('Calendar'[Date]))</w:t>
+      </w:r>
+    </w:p>
+    <w:p>
+      <w:pPr>
+        <w:rPr>
+          <w:rFonts w:cstheme="minorHAnsi"/>
+          <w:lang w:val="en-PK"/>
+        </w:rPr>
+      </w:pPr>
+      <w:r>
+        <w:rPr>
+          <w:rFonts w:cstheme="minorHAnsi"/>
+          <w:lang w:val="en-PK"/>
+        </w:rPr>
+        <w:t xml:space="preserve">And then we calc </w:t>
+      </w:r>
+      <w:proofErr w:type="spellStart"/>
+      <w:r>
+        <w:rPr>
+          <w:rFonts w:cstheme="minorHAnsi"/>
+          <w:lang w:val="en-PK"/>
+        </w:rPr>
+        <w:t>calculategrowth</w:t>
+      </w:r>
+      <w:proofErr w:type="spellEnd"/>
+      <w:r>
+        <w:rPr>
+          <w:rFonts w:cstheme="minorHAnsi"/>
+          <w:lang w:val="en-PK"/>
+        </w:rPr>
+        <w:t xml:space="preserve"> easily:</w:t>
+      </w:r>
+    </w:p>
+    <w:p>
+      <w:pPr>
+        <w:rPr>
+          <w:rFonts w:ascii="Bell MT" w:hAnsi="Bell MT" w:cstheme="minorHAnsi"/>
+          <w:lang w:val="en-PK"/>
+        </w:rPr>
+      </w:pPr>
+      <w:proofErr w:type="spellStart"/>
+      <w:r>
+        <w:rPr>
+          <w:rFonts w:ascii="Bell MT" w:hAnsi="Bell MT" w:cstheme="minorHAnsi"/>
+          <w:lang w:val="en-PK"/>
+        </w:rPr>
+        <w:t>totalFTP_PCP_Growth</w:t>
+      </w:r>
+      <w:proofErr w:type="spellEnd"/>
+      <w:r>
+        <w:rPr>
+          <w:rFonts w:ascii="Bell MT" w:hAnsi="Bell MT" w:cstheme="minorHAnsi"/>
+          <w:lang w:val="en-PK"/>
+        </w:rPr>
+        <w:t xml:space="preserve"> = IFERROR(([</w:t>
+      </w:r>
+      <w:proofErr w:type="spellStart"/>
+      <w:r>
+        <w:rPr>
+          <w:rFonts w:ascii="Bell MT" w:hAnsi="Bell MT" w:cstheme="minorHAnsi"/>
+          <w:lang w:val="en-PK"/>
+        </w:rPr>
+        <w:t>total_FTP</w:t>
+      </w:r>
+      <w:proofErr w:type="spellEnd"/>
+      <w:r>
+        <w:rPr>
+          <w:rFonts w:ascii="Bell MT" w:hAnsi="Bell MT" w:cstheme="minorHAnsi"/>
+          <w:lang w:val="en-PK"/>
+        </w:rPr>
+        <w:t>]-[</w:t>
+      </w:r>
+      <w:proofErr w:type="spellStart"/>
+      <w:r>
+        <w:rPr>
+          <w:rFonts w:ascii="Bell MT" w:hAnsi="Bell MT" w:cstheme="minorHAnsi"/>
+          <w:lang w:val="en-PK"/>
+        </w:rPr>
+        <w:t>total_FTP_PCP</w:t>
+      </w:r>
+      <w:proofErr w:type="spellEnd"/>
+      <w:r>
+        <w:rPr>
+          <w:rFonts w:ascii="Bell MT" w:hAnsi="Bell MT" w:cstheme="minorHAnsi"/>
+          <w:lang w:val="en-PK"/>
+        </w:rPr>
+        <w:t>])/[</w:t>
+      </w:r>
+      <w:proofErr w:type="spellStart"/>
+      <w:r>
+        <w:rPr>
+          <w:rFonts w:ascii="Bell MT" w:hAnsi="Bell MT" w:cstheme="minorHAnsi"/>
+          <w:lang w:val="en-PK"/>
+        </w:rPr>
+        <w:t>total_FTP_PCP</w:t>
+      </w:r>
+      <w:proofErr w:type="spellEnd"/>
+      <w:r>
+        <w:rPr>
+          <w:rFonts w:ascii="Bell MT" w:hAnsi="Bell MT" w:cstheme="minorHAnsi"/>
+          <w:lang w:val="en-PK"/>
+        </w:rPr>
+        <w:t>],"")</w:t>
+      </w:r>
+    </w:p>
+    <w:p>
+      <w:pPr>
+        <w:rPr>
+          <w:rFonts w:cstheme="minorHAnsi"/>
+          <w:b/>
+          <w:bCs/>
+          <w:i/>
+          <w:iCs/>
+          <w:u w:val="single"/>
+          <w:lang w:val="en-PK"/>
+        </w:rPr>
+      </w:pPr>
+      <w:r>
+        <w:rPr>
+          <w:rFonts w:cstheme="minorHAnsi"/>
+          <w:b/>
+          <w:bCs/>
+          <w:i/>
+          <w:iCs/>
+          <w:u w:val="single"/>
+          <w:lang w:val="en-PK"/>
+        </w:rPr>
+        <w:t>for TTD PCP values:</w:t>
+      </w:r>
+    </w:p>
+    <w:p>
+      <w:pPr>
+        <w:rPr>
+          <w:rFonts w:cstheme="minorHAnsi"/>
+          <w:lang w:val="en-PK"/>
+        </w:rPr>
+      </w:pPr>
+      <w:r>
+        <w:rPr>
+          <w:rFonts w:cstheme="minorHAnsi"/>
+          <w:lang w:val="en-PK"/>
+        </w:rPr>
+        <w:t xml:space="preserve">almost the same formulas just like FTP, just </w:t>
+      </w:r>
+      <w:proofErr w:type="spellStart"/>
+      <w:r>
+        <w:rPr>
+          <w:rFonts w:cstheme="minorHAnsi"/>
+          <w:lang w:val="en-PK"/>
+        </w:rPr>
+        <w:t>wioth</w:t>
+      </w:r>
+      <w:proofErr w:type="spellEnd"/>
+      <w:r>
+        <w:rPr>
+          <w:rFonts w:cstheme="minorHAnsi"/>
+          <w:lang w:val="en-PK"/>
+        </w:rPr>
+        <w:t xml:space="preserve"> little bit changes, the formulas are mentioned in the file</w:t>
+      </w:r>
+    </w:p>
+    <w:p>
+      <w:pPr>
+        <w:rPr>
+          <w:b/>
+          <w:bCs/>
+          <w:sz w:val="52"/>
+          <w:szCs w:val="52"/>
+          <w:u w:val="single"/>
+        </w:rPr>
+      </w:pPr>
+      <w:r>
+        <w:rPr>
+          <w:b/>
+          <w:bCs/>
+          <w:sz w:val="52"/>
+          <w:szCs w:val="52"/>
+          <w:highlight w:val="green"/>
+          <w:u w:val="single"/>
+        </w:rPr>
+        <w:t xml:space="preserve">Section </w:t>
+      </w:r>
+      <w:proofErr w:type="gramStart"/>
+      <w:r>
+        <w:rPr>
+          <w:b/>
+          <w:bCs/>
+          <w:sz w:val="52"/>
+          <w:szCs w:val="52"/>
+          <w:highlight w:val="green"/>
+          <w:u w:val="single"/>
+        </w:rPr>
+        <w:t>1</w:t>
+      </w:r>
+      <w:r>
+        <w:rPr>
+          <w:b/>
+          <w:bCs/>
+          <w:sz w:val="52"/>
+          <w:szCs w:val="52"/>
+          <w:highlight w:val="green"/>
+          <w:u w:val="single"/>
+        </w:rPr>
+        <w:t>6</w:t>
+      </w:r>
+      <w:r>
+        <w:rPr>
+          <w:b/>
+          <w:bCs/>
+          <w:sz w:val="52"/>
+          <w:szCs w:val="52"/>
+          <w:highlight w:val="green"/>
+          <w:u w:val="single"/>
+        </w:rPr>
+        <w:t>:</w:t>
+      </w:r>
+      <w:r>
+        <w:rPr>
+          <w:b/>
+          <w:bCs/>
+          <w:sz w:val="52"/>
+          <w:szCs w:val="52"/>
+          <w:highlight w:val="green"/>
+          <w:u w:val="single"/>
+        </w:rPr>
+        <w:t>Cash</w:t>
+      </w:r>
+      <w:proofErr w:type="gramEnd"/>
+      <w:r>
+        <w:rPr>
+          <w:b/>
+          <w:bCs/>
+          <w:sz w:val="52"/>
+          <w:szCs w:val="52"/>
+          <w:highlight w:val="green"/>
+          <w:u w:val="single"/>
+        </w:rPr>
+        <w:t xml:space="preserve"> flow statement</w:t>
+      </w:r>
+      <w:r>
+        <w:rPr>
+          <w:b/>
+          <w:bCs/>
+          <w:sz w:val="52"/>
+          <w:szCs w:val="52"/>
+          <w:highlight w:val="green"/>
+          <w:u w:val="single"/>
+        </w:rPr>
+        <w:t>:</w:t>
       </w:r>
     </w:p>
     <w:p>
@@ -30341,7 +30991,7 @@
   <w:style w:type="paragraph" w:default="1" w:styleId="Normal">
     <w:name w:val="Normal"/>
     <w:qFormat/>
-    <w:rsid w:val="00730551"/>
+    <w:rsid w:val="00344127"/>
   </w:style>
   <w:style w:type="paragraph" w:styleId="Heading1">
     <w:name w:val="heading 1"/>

</xml_diff>

<commit_message>
start creating cash flow statement
</commit_message>
<xml_diff>
--- a/Complete FINANCIAL REPORTING AND FINANCIAL ANALYSIS USING POWER BI.docx
+++ b/Complete FINANCIAL REPORTING AND FINANCIAL ANALYSIS USING POWER BI.docx
@@ -27410,8 +27410,9 @@
           <w:highlight w:val="green"/>
           <w:u w:val="single"/>
         </w:rPr>
-        <w:t>1</w:t>
-      </w:r>
+        <w:t>15:Calculating</w:t>
+      </w:r>
+      <w:proofErr w:type="gramEnd"/>
       <w:r>
         <w:rPr>
           <w:b/>
@@ -27421,7 +27422,7 @@
           <w:highlight w:val="green"/>
           <w:u w:val="single"/>
         </w:rPr>
-        <w:t>5</w:t>
+        <w:t xml:space="preserve"> previous corresponding period and PCP growth</w:t>
       </w:r>
       <w:r>
         <w:rPr>
@@ -27434,6 +27435,541 @@
         </w:rPr>
         <w:t>:</w:t>
       </w:r>
+    </w:p>
+    <w:p>
+      <w:pPr>
+        <w:rPr>
+          <w:rFonts w:cstheme="minorHAnsi"/>
+          <w:lang w:val="en-PK"/>
+        </w:rPr>
+      </w:pPr>
+      <w:r>
+        <w:rPr>
+          <w:rFonts w:cstheme="minorHAnsi"/>
+          <w:lang w:val="en-PK"/>
+        </w:rPr>
+        <w:t xml:space="preserve">This is previous corresponding period, </w:t>
+      </w:r>
+      <w:proofErr w:type="spellStart"/>
+      <w:r>
+        <w:rPr>
+          <w:rFonts w:cstheme="minorHAnsi"/>
+          <w:lang w:val="en-PK"/>
+        </w:rPr>
+        <w:t>yani</w:t>
+      </w:r>
+      <w:proofErr w:type="spellEnd"/>
+      <w:r>
+        <w:rPr>
+          <w:rFonts w:cstheme="minorHAnsi"/>
+          <w:lang w:val="en-PK"/>
+        </w:rPr>
+        <w:t xml:space="preserve"> </w:t>
+      </w:r>
+      <w:proofErr w:type="spellStart"/>
+      <w:r>
+        <w:rPr>
+          <w:rFonts w:cstheme="minorHAnsi"/>
+          <w:lang w:val="en-PK"/>
+        </w:rPr>
+        <w:t>agr</w:t>
+      </w:r>
+      <w:proofErr w:type="spellEnd"/>
+      <w:r>
+        <w:rPr>
+          <w:rFonts w:cstheme="minorHAnsi"/>
+          <w:lang w:val="en-PK"/>
+        </w:rPr>
+        <w:t xml:space="preserve"> </w:t>
+      </w:r>
+      <w:proofErr w:type="spellStart"/>
+      <w:r>
+        <w:rPr>
+          <w:rFonts w:cstheme="minorHAnsi"/>
+          <w:lang w:val="en-PK"/>
+        </w:rPr>
+        <w:t>sepetmeber</w:t>
+      </w:r>
+      <w:proofErr w:type="spellEnd"/>
+      <w:r>
+        <w:rPr>
+          <w:rFonts w:cstheme="minorHAnsi"/>
+          <w:lang w:val="en-PK"/>
+        </w:rPr>
+        <w:t xml:space="preserve"> 2020 h to is ka PCP September 2019 </w:t>
+      </w:r>
+      <w:proofErr w:type="spellStart"/>
+      <w:r>
+        <w:rPr>
+          <w:rFonts w:cstheme="minorHAnsi"/>
+          <w:lang w:val="en-PK"/>
+        </w:rPr>
+        <w:t>ho</w:t>
+      </w:r>
+      <w:proofErr w:type="spellEnd"/>
+      <w:r>
+        <w:rPr>
+          <w:rFonts w:cstheme="minorHAnsi"/>
+          <w:lang w:val="en-PK"/>
+        </w:rPr>
+        <w:t xml:space="preserve"> ga and is </w:t>
+      </w:r>
+      <w:proofErr w:type="spellStart"/>
+      <w:r>
+        <w:rPr>
+          <w:rFonts w:cstheme="minorHAnsi"/>
+          <w:lang w:val="en-PK"/>
+        </w:rPr>
+        <w:t>sep</w:t>
+      </w:r>
+      <w:proofErr w:type="spellEnd"/>
+      <w:r>
+        <w:rPr>
+          <w:rFonts w:cstheme="minorHAnsi"/>
+          <w:lang w:val="en-PK"/>
+        </w:rPr>
+        <w:t xml:space="preserve"> 2019 ka PCP sepetmber2018 </w:t>
+      </w:r>
+      <w:proofErr w:type="spellStart"/>
+      <w:r>
+        <w:rPr>
+          <w:rFonts w:cstheme="minorHAnsi"/>
+          <w:lang w:val="en-PK"/>
+        </w:rPr>
+        <w:t>ho</w:t>
+      </w:r>
+      <w:proofErr w:type="spellEnd"/>
+      <w:r>
+        <w:rPr>
+          <w:rFonts w:cstheme="minorHAnsi"/>
+          <w:lang w:val="en-PK"/>
+        </w:rPr>
+        <w:t xml:space="preserve"> </w:t>
+      </w:r>
+      <w:proofErr w:type="gramStart"/>
+      <w:r>
+        <w:rPr>
+          <w:rFonts w:cstheme="minorHAnsi"/>
+          <w:lang w:val="en-PK"/>
+        </w:rPr>
+        <w:t>ga,,</w:t>
+      </w:r>
+      <w:proofErr w:type="gramEnd"/>
+      <w:r>
+        <w:rPr>
+          <w:rFonts w:cstheme="minorHAnsi"/>
+          <w:lang w:val="en-PK"/>
+        </w:rPr>
+        <w:t xml:space="preserve"> </w:t>
+      </w:r>
+      <w:proofErr w:type="spellStart"/>
+      <w:r>
+        <w:rPr>
+          <w:rFonts w:cstheme="minorHAnsi"/>
+          <w:lang w:val="en-PK"/>
+        </w:rPr>
+        <w:t>yani</w:t>
+      </w:r>
+      <w:proofErr w:type="spellEnd"/>
+      <w:r>
+        <w:rPr>
+          <w:rFonts w:cstheme="minorHAnsi"/>
+          <w:lang w:val="en-PK"/>
+        </w:rPr>
+        <w:t xml:space="preserve"> previous period jo k corresponding </w:t>
+      </w:r>
+      <w:proofErr w:type="spellStart"/>
+      <w:r>
+        <w:rPr>
+          <w:rFonts w:cstheme="minorHAnsi"/>
+          <w:lang w:val="en-PK"/>
+        </w:rPr>
+        <w:t>bhi</w:t>
+      </w:r>
+      <w:proofErr w:type="spellEnd"/>
+      <w:r>
+        <w:rPr>
+          <w:rFonts w:cstheme="minorHAnsi"/>
+          <w:lang w:val="en-PK"/>
+        </w:rPr>
+        <w:t xml:space="preserve"> </w:t>
+      </w:r>
+      <w:proofErr w:type="spellStart"/>
+      <w:r>
+        <w:rPr>
+          <w:rFonts w:cstheme="minorHAnsi"/>
+          <w:lang w:val="en-PK"/>
+        </w:rPr>
+        <w:t>ho</w:t>
+      </w:r>
+      <w:proofErr w:type="spellEnd"/>
+      <w:r>
+        <w:rPr>
+          <w:rFonts w:cstheme="minorHAnsi"/>
+          <w:lang w:val="en-PK"/>
+        </w:rPr>
+        <w:t xml:space="preserve"> us ka, phly hm PCP ki value get </w:t>
+      </w:r>
+      <w:proofErr w:type="spellStart"/>
+      <w:r>
+        <w:rPr>
+          <w:rFonts w:cstheme="minorHAnsi"/>
+          <w:lang w:val="en-PK"/>
+        </w:rPr>
+        <w:t>krty</w:t>
+      </w:r>
+      <w:proofErr w:type="spellEnd"/>
+      <w:r>
+        <w:rPr>
+          <w:rFonts w:cstheme="minorHAnsi"/>
+          <w:lang w:val="en-PK"/>
+        </w:rPr>
+        <w:t xml:space="preserve"> </w:t>
+      </w:r>
+      <w:proofErr w:type="spellStart"/>
+      <w:r>
+        <w:rPr>
+          <w:rFonts w:cstheme="minorHAnsi"/>
+          <w:lang w:val="en-PK"/>
+        </w:rPr>
+        <w:t>hn</w:t>
+      </w:r>
+      <w:proofErr w:type="spellEnd"/>
+      <w:r>
+        <w:rPr>
+          <w:rFonts w:cstheme="minorHAnsi"/>
+          <w:lang w:val="en-PK"/>
+        </w:rPr>
+        <w:t xml:space="preserve"> and then growth </w:t>
+      </w:r>
+      <w:proofErr w:type="spellStart"/>
+      <w:r>
+        <w:rPr>
+          <w:rFonts w:cstheme="minorHAnsi"/>
+          <w:lang w:val="en-PK"/>
+        </w:rPr>
+        <w:t>dekhty</w:t>
+      </w:r>
+      <w:proofErr w:type="spellEnd"/>
+      <w:r>
+        <w:rPr>
+          <w:rFonts w:cstheme="minorHAnsi"/>
+          <w:lang w:val="en-PK"/>
+        </w:rPr>
+        <w:t xml:space="preserve"> </w:t>
+      </w:r>
+      <w:proofErr w:type="spellStart"/>
+      <w:r>
+        <w:rPr>
+          <w:rFonts w:cstheme="minorHAnsi"/>
+          <w:lang w:val="en-PK"/>
+        </w:rPr>
+        <w:t>hn</w:t>
+      </w:r>
+      <w:proofErr w:type="spellEnd"/>
+      <w:r>
+        <w:rPr>
+          <w:rFonts w:cstheme="minorHAnsi"/>
+          <w:lang w:val="en-PK"/>
+        </w:rPr>
+        <w:t xml:space="preserve"> </w:t>
+      </w:r>
+    </w:p>
+    <w:p>
+      <w:pPr>
+        <w:rPr>
+          <w:rFonts w:cstheme="minorHAnsi"/>
+          <w:lang w:val="en-PK"/>
+        </w:rPr>
+      </w:pPr>
+      <w:r>
+        <w:rPr>
+          <w:rFonts w:cstheme="minorHAnsi"/>
+          <w:lang w:val="en-PK"/>
+        </w:rPr>
+        <w:t xml:space="preserve">Is k </w:t>
+      </w:r>
+      <w:proofErr w:type="spellStart"/>
+      <w:r>
+        <w:rPr>
+          <w:rFonts w:cstheme="minorHAnsi"/>
+          <w:lang w:val="en-PK"/>
+        </w:rPr>
+        <w:t>liye</w:t>
+      </w:r>
+      <w:proofErr w:type="spellEnd"/>
+      <w:r>
+        <w:rPr>
+          <w:rFonts w:cstheme="minorHAnsi"/>
+          <w:lang w:val="en-PK"/>
+        </w:rPr>
+        <w:t xml:space="preserve"> power BI k </w:t>
+      </w:r>
+      <w:proofErr w:type="spellStart"/>
+      <w:r>
+        <w:rPr>
+          <w:rFonts w:cstheme="minorHAnsi"/>
+          <w:lang w:val="en-PK"/>
+        </w:rPr>
+        <w:t>apny</w:t>
+      </w:r>
+      <w:proofErr w:type="spellEnd"/>
+      <w:r>
+        <w:rPr>
+          <w:rFonts w:cstheme="minorHAnsi"/>
+          <w:lang w:val="en-PK"/>
+        </w:rPr>
+        <w:t xml:space="preserve"> </w:t>
+      </w:r>
+      <w:proofErr w:type="spellStart"/>
+      <w:r>
+        <w:rPr>
+          <w:rFonts w:cstheme="minorHAnsi"/>
+          <w:lang w:val="en-PK"/>
+        </w:rPr>
+        <w:t>andr</w:t>
+      </w:r>
+      <w:proofErr w:type="spellEnd"/>
+      <w:r>
+        <w:rPr>
+          <w:rFonts w:cstheme="minorHAnsi"/>
+          <w:lang w:val="en-PK"/>
+        </w:rPr>
+        <w:t xml:space="preserve"> ek function h which is </w:t>
+      </w:r>
+      <w:proofErr w:type="spellStart"/>
+      <w:r>
+        <w:rPr>
+          <w:rFonts w:cstheme="minorHAnsi"/>
+          <w:lang w:val="en-PK"/>
+        </w:rPr>
+        <w:t>sameperiodlastyear</w:t>
+      </w:r>
+      <w:proofErr w:type="spellEnd"/>
+      <w:r>
+        <w:rPr>
+          <w:rFonts w:cstheme="minorHAnsi"/>
+          <w:lang w:val="en-PK"/>
+        </w:rPr>
+        <w:t>:</w:t>
+      </w:r>
+    </w:p>
+    <w:p>
+      <w:pPr>
+        <w:rPr>
+          <w:rFonts w:ascii="Bell MT" w:hAnsi="Bell MT" w:cstheme="minorHAnsi"/>
+          <w:lang w:val="en-PK"/>
+        </w:rPr>
+      </w:pPr>
+      <w:proofErr w:type="spellStart"/>
+      <w:r>
+        <w:rPr>
+          <w:rFonts w:ascii="Bell MT" w:hAnsi="Bell MT" w:cstheme="minorHAnsi"/>
+          <w:lang w:val="en-PK"/>
+        </w:rPr>
+        <w:t>total_FTP_PCP</w:t>
+      </w:r>
+      <w:proofErr w:type="spellEnd"/>
+      <w:r>
+        <w:rPr>
+          <w:rFonts w:ascii="Bell MT" w:hAnsi="Bell MT" w:cstheme="minorHAnsi"/>
+          <w:lang w:val="en-PK"/>
+        </w:rPr>
+        <w:t xml:space="preserve"> </w:t>
+      </w:r>
+      <w:r>
+        <w:rPr>
+          <w:rFonts w:ascii="Bell MT" w:hAnsi="Bell MT" w:cstheme="minorHAnsi"/>
+          <w:lang w:val="en-PK"/>
+        </w:rPr>
+        <w:t>= CALCULATE([</w:t>
+      </w:r>
+      <w:proofErr w:type="spellStart"/>
+      <w:r>
+        <w:rPr>
+          <w:rFonts w:ascii="Bell MT" w:hAnsi="Bell MT" w:cstheme="minorHAnsi"/>
+          <w:lang w:val="en-PK"/>
+        </w:rPr>
+        <w:t>total_FTP</w:t>
+      </w:r>
+      <w:proofErr w:type="spellEnd"/>
+      <w:r>
+        <w:rPr>
+          <w:rFonts w:ascii="Bell MT" w:hAnsi="Bell MT" w:cstheme="minorHAnsi"/>
+          <w:lang w:val="en-PK"/>
+        </w:rPr>
+        <w:t>], SAMEPERIODLASTYEAR('Calendar'[Date]))</w:t>
+      </w:r>
+    </w:p>
+    <w:p>
+      <w:pPr>
+        <w:rPr>
+          <w:rFonts w:cstheme="minorHAnsi"/>
+          <w:lang w:val="en-PK"/>
+        </w:rPr>
+      </w:pPr>
+      <w:r>
+        <w:rPr>
+          <w:rFonts w:cstheme="minorHAnsi"/>
+          <w:lang w:val="en-PK"/>
+        </w:rPr>
+        <w:t xml:space="preserve">And then we calc </w:t>
+      </w:r>
+      <w:proofErr w:type="spellStart"/>
+      <w:r>
+        <w:rPr>
+          <w:rFonts w:cstheme="minorHAnsi"/>
+          <w:lang w:val="en-PK"/>
+        </w:rPr>
+        <w:t>calculategrowth</w:t>
+      </w:r>
+      <w:proofErr w:type="spellEnd"/>
+      <w:r>
+        <w:rPr>
+          <w:rFonts w:cstheme="minorHAnsi"/>
+          <w:lang w:val="en-PK"/>
+        </w:rPr>
+        <w:t xml:space="preserve"> easily:</w:t>
+      </w:r>
+    </w:p>
+    <w:p>
+      <w:pPr>
+        <w:rPr>
+          <w:rFonts w:ascii="Bell MT" w:hAnsi="Bell MT" w:cstheme="minorHAnsi"/>
+          <w:lang w:val="en-PK"/>
+        </w:rPr>
+      </w:pPr>
+      <w:proofErr w:type="spellStart"/>
+      <w:r>
+        <w:rPr>
+          <w:rFonts w:ascii="Bell MT" w:hAnsi="Bell MT" w:cstheme="minorHAnsi"/>
+          <w:lang w:val="en-PK"/>
+        </w:rPr>
+        <w:t>totalFTP_PCP_Growth</w:t>
+      </w:r>
+      <w:proofErr w:type="spellEnd"/>
+      <w:r>
+        <w:rPr>
+          <w:rFonts w:ascii="Bell MT" w:hAnsi="Bell MT" w:cstheme="minorHAnsi"/>
+          <w:lang w:val="en-PK"/>
+        </w:rPr>
+        <w:t xml:space="preserve"> = IFERROR(([</w:t>
+      </w:r>
+      <w:proofErr w:type="spellStart"/>
+      <w:r>
+        <w:rPr>
+          <w:rFonts w:ascii="Bell MT" w:hAnsi="Bell MT" w:cstheme="minorHAnsi"/>
+          <w:lang w:val="en-PK"/>
+        </w:rPr>
+        <w:t>total_FTP</w:t>
+      </w:r>
+      <w:proofErr w:type="spellEnd"/>
+      <w:r>
+        <w:rPr>
+          <w:rFonts w:ascii="Bell MT" w:hAnsi="Bell MT" w:cstheme="minorHAnsi"/>
+          <w:lang w:val="en-PK"/>
+        </w:rPr>
+        <w:t>]-[</w:t>
+      </w:r>
+      <w:proofErr w:type="spellStart"/>
+      <w:r>
+        <w:rPr>
+          <w:rFonts w:ascii="Bell MT" w:hAnsi="Bell MT" w:cstheme="minorHAnsi"/>
+          <w:lang w:val="en-PK"/>
+        </w:rPr>
+        <w:t>total_FTP_PCP</w:t>
+      </w:r>
+      <w:proofErr w:type="spellEnd"/>
+      <w:r>
+        <w:rPr>
+          <w:rFonts w:ascii="Bell MT" w:hAnsi="Bell MT" w:cstheme="minorHAnsi"/>
+          <w:lang w:val="en-PK"/>
+        </w:rPr>
+        <w:t>])/[</w:t>
+      </w:r>
+      <w:proofErr w:type="spellStart"/>
+      <w:r>
+        <w:rPr>
+          <w:rFonts w:ascii="Bell MT" w:hAnsi="Bell MT" w:cstheme="minorHAnsi"/>
+          <w:lang w:val="en-PK"/>
+        </w:rPr>
+        <w:t>total_FTP_PCP</w:t>
+      </w:r>
+      <w:proofErr w:type="spellEnd"/>
+      <w:r>
+        <w:rPr>
+          <w:rFonts w:ascii="Bell MT" w:hAnsi="Bell MT" w:cstheme="minorHAnsi"/>
+          <w:lang w:val="en-PK"/>
+        </w:rPr>
+        <w:t>],"")</w:t>
+      </w:r>
+    </w:p>
+    <w:p>
+      <w:pPr>
+        <w:rPr>
+          <w:rFonts w:cstheme="minorHAnsi"/>
+          <w:b/>
+          <w:bCs/>
+          <w:i/>
+          <w:iCs/>
+          <w:u w:val="single"/>
+          <w:lang w:val="en-PK"/>
+        </w:rPr>
+      </w:pPr>
+      <w:r>
+        <w:rPr>
+          <w:rFonts w:cstheme="minorHAnsi"/>
+          <w:b/>
+          <w:bCs/>
+          <w:i/>
+          <w:iCs/>
+          <w:u w:val="single"/>
+          <w:lang w:val="en-PK"/>
+        </w:rPr>
+        <w:t>for TTD PCP values:</w:t>
+      </w:r>
+    </w:p>
+    <w:p>
+      <w:pPr>
+        <w:rPr>
+          <w:rFonts w:cstheme="minorHAnsi"/>
+          <w:lang w:val="en-PK"/>
+        </w:rPr>
+      </w:pPr>
+      <w:r>
+        <w:rPr>
+          <w:rFonts w:cstheme="minorHAnsi"/>
+          <w:lang w:val="en-PK"/>
+        </w:rPr>
+        <w:t xml:space="preserve">almost the same formulas just like FTP, just </w:t>
+      </w:r>
+      <w:proofErr w:type="spellStart"/>
+      <w:r>
+        <w:rPr>
+          <w:rFonts w:cstheme="minorHAnsi"/>
+          <w:lang w:val="en-PK"/>
+        </w:rPr>
+        <w:t>wioth</w:t>
+      </w:r>
+      <w:proofErr w:type="spellEnd"/>
+      <w:r>
+        <w:rPr>
+          <w:rFonts w:cstheme="minorHAnsi"/>
+          <w:lang w:val="en-PK"/>
+        </w:rPr>
+        <w:t xml:space="preserve"> little bit changes, the formulas are mentioned in the file</w:t>
+      </w:r>
+    </w:p>
+    <w:p>
+      <w:pPr>
+        <w:rPr>
+          <w:b/>
+          <w:bCs/>
+          <w:sz w:val="52"/>
+          <w:szCs w:val="52"/>
+          <w:u w:val="single"/>
+        </w:rPr>
+      </w:pPr>
       <w:r>
         <w:rPr>
           <w:b/>
@@ -27443,9 +27979,9 @@
           <w:highlight w:val="green"/>
           <w:u w:val="single"/>
         </w:rPr>
-        <w:t>Calculating</w:t>
-      </w:r>
-      <w:proofErr w:type="gramEnd"/>
+        <w:t xml:space="preserve">Section </w:t>
+      </w:r>
+      <w:proofErr w:type="gramStart"/>
       <w:r>
         <w:rPr>
           <w:b/>
@@ -27455,8 +27991,9 @@
           <w:highlight w:val="green"/>
           <w:u w:val="single"/>
         </w:rPr>
-        <w:t xml:space="preserve"> previous corresponding period and PCP growth</w:t>
-      </w:r>
+        <w:t>16:Cash</w:t>
+      </w:r>
+      <w:proofErr w:type="gramEnd"/>
       <w:r>
         <w:rPr>
           <w:b/>
@@ -27466,543 +28003,8 @@
           <w:highlight w:val="green"/>
           <w:u w:val="single"/>
         </w:rPr>
-        <w:t>:</w:t>
-      </w:r>
-    </w:p>
-    <w:p>
-      <w:pPr>
-        <w:rPr>
-          <w:rFonts w:cstheme="minorHAnsi"/>
-          <w:lang w:val="en-PK"/>
-        </w:rPr>
-      </w:pPr>
-      <w:r>
-        <w:rPr>
-          <w:rFonts w:cstheme="minorHAnsi"/>
-          <w:lang w:val="en-PK"/>
-        </w:rPr>
-        <w:t xml:space="preserve">This is previous corresponding period, </w:t>
-      </w:r>
-      <w:proofErr w:type="spellStart"/>
-      <w:r>
-        <w:rPr>
-          <w:rFonts w:cstheme="minorHAnsi"/>
-          <w:lang w:val="en-PK"/>
-        </w:rPr>
-        <w:t>yani</w:t>
-      </w:r>
-      <w:proofErr w:type="spellEnd"/>
-      <w:r>
-        <w:rPr>
-          <w:rFonts w:cstheme="minorHAnsi"/>
-          <w:lang w:val="en-PK"/>
-        </w:rPr>
-        <w:t xml:space="preserve"> </w:t>
-      </w:r>
-      <w:proofErr w:type="spellStart"/>
-      <w:r>
-        <w:rPr>
-          <w:rFonts w:cstheme="minorHAnsi"/>
-          <w:lang w:val="en-PK"/>
-        </w:rPr>
-        <w:t>agr</w:t>
-      </w:r>
-      <w:proofErr w:type="spellEnd"/>
-      <w:r>
-        <w:rPr>
-          <w:rFonts w:cstheme="minorHAnsi"/>
-          <w:lang w:val="en-PK"/>
-        </w:rPr>
-        <w:t xml:space="preserve"> </w:t>
-      </w:r>
-      <w:proofErr w:type="spellStart"/>
-      <w:r>
-        <w:rPr>
-          <w:rFonts w:cstheme="minorHAnsi"/>
-          <w:lang w:val="en-PK"/>
-        </w:rPr>
-        <w:t>sepetmeber</w:t>
-      </w:r>
-      <w:proofErr w:type="spellEnd"/>
-      <w:r>
-        <w:rPr>
-          <w:rFonts w:cstheme="minorHAnsi"/>
-          <w:lang w:val="en-PK"/>
-        </w:rPr>
-        <w:t xml:space="preserve"> 2020 h to is ka PCP September 2019 </w:t>
-      </w:r>
-      <w:proofErr w:type="spellStart"/>
-      <w:r>
-        <w:rPr>
-          <w:rFonts w:cstheme="minorHAnsi"/>
-          <w:lang w:val="en-PK"/>
-        </w:rPr>
-        <w:t>ho</w:t>
-      </w:r>
-      <w:proofErr w:type="spellEnd"/>
-      <w:r>
-        <w:rPr>
-          <w:rFonts w:cstheme="minorHAnsi"/>
-          <w:lang w:val="en-PK"/>
-        </w:rPr>
-        <w:t xml:space="preserve"> ga and is </w:t>
-      </w:r>
-      <w:proofErr w:type="spellStart"/>
-      <w:r>
-        <w:rPr>
-          <w:rFonts w:cstheme="minorHAnsi"/>
-          <w:lang w:val="en-PK"/>
-        </w:rPr>
-        <w:t>sep</w:t>
-      </w:r>
-      <w:proofErr w:type="spellEnd"/>
-      <w:r>
-        <w:rPr>
-          <w:rFonts w:cstheme="minorHAnsi"/>
-          <w:lang w:val="en-PK"/>
-        </w:rPr>
-        <w:t xml:space="preserve"> 2019 ka PCP sepetmber2018 </w:t>
-      </w:r>
-      <w:proofErr w:type="spellStart"/>
-      <w:r>
-        <w:rPr>
-          <w:rFonts w:cstheme="minorHAnsi"/>
-          <w:lang w:val="en-PK"/>
-        </w:rPr>
-        <w:t>ho</w:t>
-      </w:r>
-      <w:proofErr w:type="spellEnd"/>
-      <w:r>
-        <w:rPr>
-          <w:rFonts w:cstheme="minorHAnsi"/>
-          <w:lang w:val="en-PK"/>
-        </w:rPr>
-        <w:t xml:space="preserve"> </w:t>
-      </w:r>
-      <w:proofErr w:type="gramStart"/>
-      <w:r>
-        <w:rPr>
-          <w:rFonts w:cstheme="minorHAnsi"/>
-          <w:lang w:val="en-PK"/>
-        </w:rPr>
-        <w:t>ga,,</w:t>
-      </w:r>
-      <w:proofErr w:type="gramEnd"/>
-      <w:r>
-        <w:rPr>
-          <w:rFonts w:cstheme="minorHAnsi"/>
-          <w:lang w:val="en-PK"/>
-        </w:rPr>
-        <w:t xml:space="preserve"> </w:t>
-      </w:r>
-      <w:proofErr w:type="spellStart"/>
-      <w:r>
-        <w:rPr>
-          <w:rFonts w:cstheme="minorHAnsi"/>
-          <w:lang w:val="en-PK"/>
-        </w:rPr>
-        <w:t>yani</w:t>
-      </w:r>
-      <w:proofErr w:type="spellEnd"/>
-      <w:r>
-        <w:rPr>
-          <w:rFonts w:cstheme="minorHAnsi"/>
-          <w:lang w:val="en-PK"/>
-        </w:rPr>
-        <w:t xml:space="preserve"> previous period jo k corresponding </w:t>
-      </w:r>
-      <w:proofErr w:type="spellStart"/>
-      <w:r>
-        <w:rPr>
-          <w:rFonts w:cstheme="minorHAnsi"/>
-          <w:lang w:val="en-PK"/>
-        </w:rPr>
-        <w:t>bhi</w:t>
-      </w:r>
-      <w:proofErr w:type="spellEnd"/>
-      <w:r>
-        <w:rPr>
-          <w:rFonts w:cstheme="minorHAnsi"/>
-          <w:lang w:val="en-PK"/>
-        </w:rPr>
-        <w:t xml:space="preserve"> </w:t>
-      </w:r>
-      <w:proofErr w:type="spellStart"/>
-      <w:r>
-        <w:rPr>
-          <w:rFonts w:cstheme="minorHAnsi"/>
-          <w:lang w:val="en-PK"/>
-        </w:rPr>
-        <w:t>ho</w:t>
-      </w:r>
-      <w:proofErr w:type="spellEnd"/>
-      <w:r>
-        <w:rPr>
-          <w:rFonts w:cstheme="minorHAnsi"/>
-          <w:lang w:val="en-PK"/>
-        </w:rPr>
-        <w:t xml:space="preserve"> us ka, phly hm PCP ki value get </w:t>
-      </w:r>
-      <w:proofErr w:type="spellStart"/>
-      <w:r>
-        <w:rPr>
-          <w:rFonts w:cstheme="minorHAnsi"/>
-          <w:lang w:val="en-PK"/>
-        </w:rPr>
-        <w:t>krty</w:t>
-      </w:r>
-      <w:proofErr w:type="spellEnd"/>
-      <w:r>
-        <w:rPr>
-          <w:rFonts w:cstheme="minorHAnsi"/>
-          <w:lang w:val="en-PK"/>
-        </w:rPr>
-        <w:t xml:space="preserve"> </w:t>
-      </w:r>
-      <w:proofErr w:type="spellStart"/>
-      <w:r>
-        <w:rPr>
-          <w:rFonts w:cstheme="minorHAnsi"/>
-          <w:lang w:val="en-PK"/>
-        </w:rPr>
-        <w:t>hn</w:t>
-      </w:r>
-      <w:proofErr w:type="spellEnd"/>
-      <w:r>
-        <w:rPr>
-          <w:rFonts w:cstheme="minorHAnsi"/>
-          <w:lang w:val="en-PK"/>
-        </w:rPr>
-        <w:t xml:space="preserve"> and then growth </w:t>
-      </w:r>
-      <w:proofErr w:type="spellStart"/>
-      <w:r>
-        <w:rPr>
-          <w:rFonts w:cstheme="minorHAnsi"/>
-          <w:lang w:val="en-PK"/>
-        </w:rPr>
-        <w:t>dekhty</w:t>
-      </w:r>
-      <w:proofErr w:type="spellEnd"/>
-      <w:r>
-        <w:rPr>
-          <w:rFonts w:cstheme="minorHAnsi"/>
-          <w:lang w:val="en-PK"/>
-        </w:rPr>
-        <w:t xml:space="preserve"> </w:t>
-      </w:r>
-      <w:proofErr w:type="spellStart"/>
-      <w:r>
-        <w:rPr>
-          <w:rFonts w:cstheme="minorHAnsi"/>
-          <w:lang w:val="en-PK"/>
-        </w:rPr>
-        <w:t>hn</w:t>
-      </w:r>
-      <w:proofErr w:type="spellEnd"/>
-      <w:r>
-        <w:rPr>
-          <w:rFonts w:cstheme="minorHAnsi"/>
-          <w:lang w:val="en-PK"/>
-        </w:rPr>
-        <w:t xml:space="preserve"> </w:t>
-      </w:r>
-    </w:p>
-    <w:p>
-      <w:pPr>
-        <w:rPr>
-          <w:rFonts w:cstheme="minorHAnsi"/>
-          <w:lang w:val="en-PK"/>
-        </w:rPr>
-      </w:pPr>
-      <w:r>
-        <w:rPr>
-          <w:rFonts w:cstheme="minorHAnsi"/>
-          <w:lang w:val="en-PK"/>
-        </w:rPr>
-        <w:t xml:space="preserve">Is k </w:t>
-      </w:r>
-      <w:proofErr w:type="spellStart"/>
-      <w:r>
-        <w:rPr>
-          <w:rFonts w:cstheme="minorHAnsi"/>
-          <w:lang w:val="en-PK"/>
-        </w:rPr>
-        <w:t>liye</w:t>
-      </w:r>
-      <w:proofErr w:type="spellEnd"/>
-      <w:r>
-        <w:rPr>
-          <w:rFonts w:cstheme="minorHAnsi"/>
-          <w:lang w:val="en-PK"/>
-        </w:rPr>
-        <w:t xml:space="preserve"> power BI k </w:t>
-      </w:r>
-      <w:proofErr w:type="spellStart"/>
-      <w:r>
-        <w:rPr>
-          <w:rFonts w:cstheme="minorHAnsi"/>
-          <w:lang w:val="en-PK"/>
-        </w:rPr>
-        <w:t>apny</w:t>
-      </w:r>
-      <w:proofErr w:type="spellEnd"/>
-      <w:r>
-        <w:rPr>
-          <w:rFonts w:cstheme="minorHAnsi"/>
-          <w:lang w:val="en-PK"/>
-        </w:rPr>
-        <w:t xml:space="preserve"> </w:t>
-      </w:r>
-      <w:proofErr w:type="spellStart"/>
-      <w:r>
-        <w:rPr>
-          <w:rFonts w:cstheme="minorHAnsi"/>
-          <w:lang w:val="en-PK"/>
-        </w:rPr>
-        <w:t>andr</w:t>
-      </w:r>
-      <w:proofErr w:type="spellEnd"/>
-      <w:r>
-        <w:rPr>
-          <w:rFonts w:cstheme="minorHAnsi"/>
-          <w:lang w:val="en-PK"/>
-        </w:rPr>
-        <w:t xml:space="preserve"> ek function h which is </w:t>
-      </w:r>
-      <w:proofErr w:type="spellStart"/>
-      <w:r>
-        <w:rPr>
-          <w:rFonts w:cstheme="minorHAnsi"/>
-          <w:lang w:val="en-PK"/>
-        </w:rPr>
-        <w:t>sameperiodlastyear</w:t>
-      </w:r>
-      <w:proofErr w:type="spellEnd"/>
-      <w:r>
-        <w:rPr>
-          <w:rFonts w:cstheme="minorHAnsi"/>
-          <w:lang w:val="en-PK"/>
-        </w:rPr>
-        <w:t>:</w:t>
-      </w:r>
-    </w:p>
-    <w:p>
-      <w:pPr>
-        <w:rPr>
-          <w:rFonts w:ascii="Bell MT" w:hAnsi="Bell MT" w:cstheme="minorHAnsi"/>
-          <w:lang w:val="en-PK"/>
-        </w:rPr>
-      </w:pPr>
-      <w:proofErr w:type="spellStart"/>
-      <w:r>
-        <w:rPr>
-          <w:rFonts w:ascii="Bell MT" w:hAnsi="Bell MT" w:cstheme="minorHAnsi"/>
-          <w:lang w:val="en-PK"/>
-        </w:rPr>
-        <w:t>total_FTP_PCP</w:t>
-      </w:r>
-      <w:proofErr w:type="spellEnd"/>
-      <w:r>
-        <w:rPr>
-          <w:rFonts w:ascii="Bell MT" w:hAnsi="Bell MT" w:cstheme="minorHAnsi"/>
-          <w:lang w:val="en-PK"/>
-        </w:rPr>
-        <w:t xml:space="preserve"> </w:t>
-      </w:r>
-      <w:r>
-        <w:rPr>
-          <w:rFonts w:ascii="Bell MT" w:hAnsi="Bell MT" w:cstheme="minorHAnsi"/>
-          <w:lang w:val="en-PK"/>
-        </w:rPr>
-        <w:t>= CALCULATE([</w:t>
-      </w:r>
-      <w:proofErr w:type="spellStart"/>
-      <w:r>
-        <w:rPr>
-          <w:rFonts w:ascii="Bell MT" w:hAnsi="Bell MT" w:cstheme="minorHAnsi"/>
-          <w:lang w:val="en-PK"/>
-        </w:rPr>
-        <w:t>total_FTP</w:t>
-      </w:r>
-      <w:proofErr w:type="spellEnd"/>
-      <w:r>
-        <w:rPr>
-          <w:rFonts w:ascii="Bell MT" w:hAnsi="Bell MT" w:cstheme="minorHAnsi"/>
-          <w:lang w:val="en-PK"/>
-        </w:rPr>
-        <w:t>], SAMEPERIODLASTYEAR('Calendar'[Date]))</w:t>
-      </w:r>
-    </w:p>
-    <w:p>
-      <w:pPr>
-        <w:rPr>
-          <w:rFonts w:cstheme="minorHAnsi"/>
-          <w:lang w:val="en-PK"/>
-        </w:rPr>
-      </w:pPr>
-      <w:r>
-        <w:rPr>
-          <w:rFonts w:cstheme="minorHAnsi"/>
-          <w:lang w:val="en-PK"/>
-        </w:rPr>
-        <w:t xml:space="preserve">And then we calc </w:t>
-      </w:r>
-      <w:proofErr w:type="spellStart"/>
-      <w:r>
-        <w:rPr>
-          <w:rFonts w:cstheme="minorHAnsi"/>
-          <w:lang w:val="en-PK"/>
-        </w:rPr>
-        <w:t>calculategrowth</w:t>
-      </w:r>
-      <w:proofErr w:type="spellEnd"/>
-      <w:r>
-        <w:rPr>
-          <w:rFonts w:cstheme="minorHAnsi"/>
-          <w:lang w:val="en-PK"/>
-        </w:rPr>
-        <w:t xml:space="preserve"> easily:</w:t>
-      </w:r>
-    </w:p>
-    <w:p>
-      <w:pPr>
-        <w:rPr>
-          <w:rFonts w:ascii="Bell MT" w:hAnsi="Bell MT" w:cstheme="minorHAnsi"/>
-          <w:lang w:val="en-PK"/>
-        </w:rPr>
-      </w:pPr>
-      <w:proofErr w:type="spellStart"/>
-      <w:r>
-        <w:rPr>
-          <w:rFonts w:ascii="Bell MT" w:hAnsi="Bell MT" w:cstheme="minorHAnsi"/>
-          <w:lang w:val="en-PK"/>
-        </w:rPr>
-        <w:t>totalFTP_PCP_Growth</w:t>
-      </w:r>
-      <w:proofErr w:type="spellEnd"/>
-      <w:r>
-        <w:rPr>
-          <w:rFonts w:ascii="Bell MT" w:hAnsi="Bell MT" w:cstheme="minorHAnsi"/>
-          <w:lang w:val="en-PK"/>
-        </w:rPr>
-        <w:t xml:space="preserve"> = IFERROR(([</w:t>
-      </w:r>
-      <w:proofErr w:type="spellStart"/>
-      <w:r>
-        <w:rPr>
-          <w:rFonts w:ascii="Bell MT" w:hAnsi="Bell MT" w:cstheme="minorHAnsi"/>
-          <w:lang w:val="en-PK"/>
-        </w:rPr>
-        <w:t>total_FTP</w:t>
-      </w:r>
-      <w:proofErr w:type="spellEnd"/>
-      <w:r>
-        <w:rPr>
-          <w:rFonts w:ascii="Bell MT" w:hAnsi="Bell MT" w:cstheme="minorHAnsi"/>
-          <w:lang w:val="en-PK"/>
-        </w:rPr>
-        <w:t>]-[</w:t>
-      </w:r>
-      <w:proofErr w:type="spellStart"/>
-      <w:r>
-        <w:rPr>
-          <w:rFonts w:ascii="Bell MT" w:hAnsi="Bell MT" w:cstheme="minorHAnsi"/>
-          <w:lang w:val="en-PK"/>
-        </w:rPr>
-        <w:t>total_FTP_PCP</w:t>
-      </w:r>
-      <w:proofErr w:type="spellEnd"/>
-      <w:r>
-        <w:rPr>
-          <w:rFonts w:ascii="Bell MT" w:hAnsi="Bell MT" w:cstheme="minorHAnsi"/>
-          <w:lang w:val="en-PK"/>
-        </w:rPr>
-        <w:t>])/[</w:t>
-      </w:r>
-      <w:proofErr w:type="spellStart"/>
-      <w:r>
-        <w:rPr>
-          <w:rFonts w:ascii="Bell MT" w:hAnsi="Bell MT" w:cstheme="minorHAnsi"/>
-          <w:lang w:val="en-PK"/>
-        </w:rPr>
-        <w:t>total_FTP_PCP</w:t>
-      </w:r>
-      <w:proofErr w:type="spellEnd"/>
-      <w:r>
-        <w:rPr>
-          <w:rFonts w:ascii="Bell MT" w:hAnsi="Bell MT" w:cstheme="minorHAnsi"/>
-          <w:lang w:val="en-PK"/>
-        </w:rPr>
-        <w:t>],"")</w:t>
-      </w:r>
-    </w:p>
-    <w:p>
-      <w:pPr>
-        <w:rPr>
-          <w:rFonts w:cstheme="minorHAnsi"/>
-          <w:b/>
-          <w:bCs/>
-          <w:i/>
-          <w:iCs/>
-          <w:u w:val="single"/>
-          <w:lang w:val="en-PK"/>
-        </w:rPr>
-      </w:pPr>
-      <w:r>
-        <w:rPr>
-          <w:rFonts w:cstheme="minorHAnsi"/>
-          <w:b/>
-          <w:bCs/>
-          <w:i/>
-          <w:iCs/>
-          <w:u w:val="single"/>
-          <w:lang w:val="en-PK"/>
-        </w:rPr>
-        <w:t>for TTD PCP values:</w:t>
-      </w:r>
-    </w:p>
-    <w:p>
-      <w:pPr>
-        <w:rPr>
-          <w:rFonts w:cstheme="minorHAnsi"/>
-          <w:lang w:val="en-PK"/>
-        </w:rPr>
-      </w:pPr>
-      <w:r>
-        <w:rPr>
-          <w:rFonts w:cstheme="minorHAnsi"/>
-          <w:lang w:val="en-PK"/>
-        </w:rPr>
-        <w:t xml:space="preserve">almost the same formulas just like FTP, just </w:t>
-      </w:r>
-      <w:proofErr w:type="spellStart"/>
-      <w:r>
-        <w:rPr>
-          <w:rFonts w:cstheme="minorHAnsi"/>
-          <w:lang w:val="en-PK"/>
-        </w:rPr>
-        <w:t>wioth</w:t>
-      </w:r>
-      <w:proofErr w:type="spellEnd"/>
-      <w:r>
-        <w:rPr>
-          <w:rFonts w:cstheme="minorHAnsi"/>
-          <w:lang w:val="en-PK"/>
-        </w:rPr>
-        <w:t xml:space="preserve"> little bit changes, the formulas are mentioned in the file</w:t>
-      </w:r>
-    </w:p>
-    <w:p>
-      <w:pPr>
-        <w:rPr>
-          <w:b/>
-          <w:bCs/>
-          <w:sz w:val="52"/>
-          <w:szCs w:val="52"/>
-          <w:u w:val="single"/>
-        </w:rPr>
-      </w:pPr>
+        <w:t xml:space="preserve"> flow statement</w:t>
+      </w:r>
       <w:r>
         <w:rPr>
           <w:b/>
@@ -28012,75 +28014,529 @@
           <w:highlight w:val="green"/>
           <w:u w:val="single"/>
         </w:rPr>
-        <w:t xml:space="preserve">Section </w:t>
+        <w:t>:</w:t>
+      </w:r>
+    </w:p>
+    <w:p>
+      <w:pPr>
+        <w:rPr>
+          <w:rFonts w:cstheme="minorHAnsi"/>
+          <w:lang w:val="en-PK"/>
+        </w:rPr>
+      </w:pPr>
+      <w:r>
+        <w:rPr>
+          <w:rFonts w:cstheme="minorHAnsi"/>
+          <w:lang w:val="en-PK"/>
+        </w:rPr>
+        <w:t>Learn some concepts first:</w:t>
+      </w:r>
+    </w:p>
+    <w:p>
+      <w:pPr>
+        <w:pStyle w:val="ListParagraph"/>
+        <w:numPr>
+          <w:ilvl w:val="0"/>
+          <w:numId w:val="1"/>
+        </w:numPr>
+        <w:rPr>
+          <w:rFonts w:cstheme="minorHAnsi"/>
+          <w:lang w:val="en-PK"/>
+        </w:rPr>
+      </w:pPr>
+      <w:r>
+        <w:rPr>
+          <w:rFonts w:cstheme="minorHAnsi"/>
+          <w:lang w:val="en-PK"/>
+        </w:rPr>
+        <w:t xml:space="preserve"> Profit ≠ Cash, because sometimes a company generates profit but does not receive that profit in cash immediately.</w:t>
+      </w:r>
+      <w:r>
+        <w:rPr>
+          <w:rFonts w:cstheme="minorHAnsi"/>
+          <w:lang w:val="en-PK"/>
+        </w:rPr>
+        <w:br/>
+        <w:t xml:space="preserve">For example: a company sells products to a customer on credit. The Income Statement will include those sales in revenue and profit, but in </w:t>
       </w:r>
       <w:proofErr w:type="gramStart"/>
       <w:r>
         <w:rPr>
-          <w:b/>
-          <w:bCs/>
-          <w:sz w:val="52"/>
-          <w:szCs w:val="52"/>
-          <w:highlight w:val="green"/>
-          <w:u w:val="single"/>
-        </w:rPr>
-        <w:t>1</w:t>
-      </w:r>
-      <w:r>
-        <w:rPr>
-          <w:b/>
-          <w:bCs/>
-          <w:sz w:val="52"/>
-          <w:szCs w:val="52"/>
-          <w:highlight w:val="green"/>
-          <w:u w:val="single"/>
-        </w:rPr>
-        <w:t>6</w:t>
-      </w:r>
-      <w:r>
-        <w:rPr>
-          <w:b/>
-          <w:bCs/>
-          <w:sz w:val="52"/>
-          <w:szCs w:val="52"/>
-          <w:highlight w:val="green"/>
-          <w:u w:val="single"/>
-        </w:rPr>
-        <w:t>:</w:t>
-      </w:r>
-      <w:r>
-        <w:rPr>
-          <w:b/>
-          <w:bCs/>
-          <w:sz w:val="52"/>
-          <w:szCs w:val="52"/>
-          <w:highlight w:val="green"/>
-          <w:u w:val="single"/>
-        </w:rPr>
-        <w:t>Cash</w:t>
+          <w:rFonts w:cstheme="minorHAnsi"/>
+          <w:lang w:val="en-PK"/>
+        </w:rPr>
+        <w:t>reality</w:t>
       </w:r>
       <w:proofErr w:type="gramEnd"/>
       <w:r>
         <w:rPr>
-          <w:b/>
-          <w:bCs/>
-          <w:sz w:val="52"/>
-          <w:szCs w:val="52"/>
-          <w:highlight w:val="green"/>
-          <w:u w:val="single"/>
-        </w:rPr>
-        <w:t xml:space="preserve"> flow statement</w:t>
-      </w:r>
-      <w:r>
-        <w:rPr>
-          <w:b/>
-          <w:bCs/>
-          <w:sz w:val="52"/>
-          <w:szCs w:val="52"/>
-          <w:highlight w:val="green"/>
-          <w:u w:val="single"/>
-        </w:rPr>
-        <w:t>:</w:t>
+          <w:rFonts w:cstheme="minorHAnsi"/>
+          <w:lang w:val="en-PK"/>
+        </w:rPr>
+        <w:t xml:space="preserve"> the company has not yet received the cash. Therefore, this increase in receivables means cash has not been received yet, so in the operating section of the Cash Flow Statement we subtract the increase in receivables.</w:t>
+      </w:r>
+      <w:r>
+        <w:rPr>
+          <w:rFonts w:cstheme="minorHAnsi"/>
+          <w:lang w:val="en-PK"/>
+        </w:rPr>
+        <w:t xml:space="preserve"> </w:t>
+      </w:r>
+    </w:p>
+    <w:p>
+      <w:pPr>
+        <w:pStyle w:val="ListParagraph"/>
+        <w:rPr>
+          <w:rFonts w:cstheme="minorHAnsi"/>
+          <w:lang w:val="en-PK"/>
+        </w:rPr>
+      </w:pPr>
+      <w:r>
+        <w:rPr>
+          <w:rFonts w:cstheme="minorHAnsi"/>
+          <w:lang w:val="en-PK"/>
+        </w:rPr>
+        <w:t>Similarly, there may be some bills or expenses that the company has recorded but has not yet paid. These expenses reduce profit in the income statement, but the cash has not yet gone out of the company, so an increase in payables is added back in the cash flow statement because the cash has not left yet.</w:t>
+      </w:r>
+    </w:p>
+    <w:p>
+      <w:pPr>
+        <w:pStyle w:val="ListParagraph"/>
+        <w:rPr>
+          <w:rFonts w:cstheme="minorHAnsi"/>
+          <w:lang w:val="en-PK"/>
+        </w:rPr>
+      </w:pPr>
+    </w:p>
+    <w:p>
+      <w:pPr>
+        <w:pStyle w:val="ListParagraph"/>
+        <w:numPr>
+          <w:ilvl w:val="0"/>
+          <w:numId w:val="1"/>
+        </w:numPr>
+        <w:rPr>
+          <w:rFonts w:cstheme="minorHAnsi"/>
+          <w:lang w:val="en-PK"/>
+        </w:rPr>
+      </w:pPr>
+      <w:r>
+        <w:rPr>
+          <w:rFonts w:cstheme="minorHAnsi"/>
+          <w:lang w:val="en-PK"/>
+        </w:rPr>
+        <w:t xml:space="preserve">Cash flow statement </w:t>
+      </w:r>
+      <w:proofErr w:type="spellStart"/>
+      <w:r>
+        <w:rPr>
+          <w:rFonts w:cstheme="minorHAnsi"/>
+          <w:lang w:val="en-PK"/>
+        </w:rPr>
+        <w:t>bnaty</w:t>
+      </w:r>
+      <w:proofErr w:type="spellEnd"/>
+      <w:r>
+        <w:rPr>
+          <w:rFonts w:cstheme="minorHAnsi"/>
+          <w:lang w:val="en-PK"/>
+        </w:rPr>
+        <w:t xml:space="preserve"> </w:t>
+      </w:r>
+      <w:proofErr w:type="spellStart"/>
+      <w:r>
+        <w:rPr>
+          <w:rFonts w:cstheme="minorHAnsi"/>
+          <w:lang w:val="en-PK"/>
+        </w:rPr>
+        <w:t>huy</w:t>
+      </w:r>
+      <w:proofErr w:type="spellEnd"/>
+      <w:r>
+        <w:rPr>
+          <w:rFonts w:cstheme="minorHAnsi"/>
+          <w:lang w:val="en-PK"/>
+        </w:rPr>
+        <w:t xml:space="preserve"> just remember 2 questions:</w:t>
+      </w:r>
+    </w:p>
+    <w:p>
+      <w:pPr>
+        <w:pStyle w:val="ListParagraph"/>
+        <w:ind w:left="1440"/>
+        <w:rPr>
+          <w:rFonts w:cstheme="minorHAnsi"/>
+          <w:lang w:val="en-PK"/>
+        </w:rPr>
+      </w:pPr>
+    </w:p>
+    <w:p>
+      <w:pPr>
+        <w:pStyle w:val="ListParagraph"/>
+        <w:numPr>
+          <w:ilvl w:val="1"/>
+          <w:numId w:val="13"/>
+        </w:numPr>
+        <w:rPr>
+          <w:rFonts w:cstheme="minorHAnsi"/>
+          <w:highlight w:val="cyan"/>
+          <w:lang w:val="en-PK"/>
+        </w:rPr>
+      </w:pPr>
+      <w:r>
+        <w:rPr>
+          <w:rFonts w:cstheme="minorHAnsi"/>
+          <w:lang w:val="en-PK"/>
+        </w:rPr>
+        <w:t xml:space="preserve"> </w:t>
+      </w:r>
+      <w:r>
+        <w:rPr>
+          <w:rFonts w:cstheme="minorHAnsi"/>
+          <w:highlight w:val="cyan"/>
+          <w:lang w:val="en-PK"/>
+        </w:rPr>
+        <w:t>Did this reduce/increase profit but no cash actually moved?</w:t>
+      </w:r>
+    </w:p>
+    <w:p>
+      <w:pPr>
+        <w:ind w:left="720" w:firstLine="720"/>
+        <w:rPr>
+          <w:rFonts w:cstheme="minorHAnsi"/>
+          <w:lang w:val="en-PK"/>
+        </w:rPr>
+      </w:pPr>
+      <w:r>
+        <w:rPr>
+          <w:rFonts w:cstheme="minorHAnsi"/>
+          <w:lang w:val="en-PK"/>
+        </w:rPr>
+        <w:lastRenderedPageBreak/>
+        <w:t>If something changed profit but no cash actually moved, then we adjust it.</w:t>
+      </w:r>
+    </w:p>
+    <w:p>
+      <w:pPr>
+        <w:ind w:left="1440"/>
+        <w:rPr>
+          <w:rFonts w:cstheme="minorHAnsi"/>
+          <w:lang w:val="en-PK"/>
+        </w:rPr>
+      </w:pPr>
+      <w:r>
+        <w:rPr>
+          <w:rFonts w:cstheme="minorHAnsi"/>
+          <w:lang w:val="en-PK"/>
+        </w:rPr>
+        <w:t>For example, depreciation reduces profit but does not involve any cash payment in the current period, so we add it back when starting from profit (indirect method).</w:t>
+      </w:r>
+    </w:p>
+    <w:p>
+      <w:pPr>
+        <w:ind w:left="1440"/>
+        <w:rPr>
+          <w:rFonts w:cstheme="minorHAnsi"/>
+          <w:lang w:val="en-PK"/>
+        </w:rPr>
+      </w:pPr>
+      <w:r>
+        <w:rPr>
+          <w:rFonts w:cstheme="minorHAnsi"/>
+          <w:lang w:val="en-PK"/>
+        </w:rPr>
+        <w:t>Also, if profit increased because of credit sales (increase in receivables), then cash has not been received yet, so we subtract that increase from profit in the operating section.</w:t>
+      </w:r>
+    </w:p>
+    <w:p>
+      <w:pPr>
+        <w:pStyle w:val="ListParagraph"/>
+        <w:numPr>
+          <w:ilvl w:val="1"/>
+          <w:numId w:val="13"/>
+        </w:numPr>
+        <w:rPr>
+          <w:rFonts w:cstheme="minorHAnsi"/>
+          <w:highlight w:val="cyan"/>
+          <w:lang w:val="en-PK"/>
+        </w:rPr>
+      </w:pPr>
+      <w:r>
+        <w:rPr>
+          <w:rFonts w:cstheme="minorHAnsi"/>
+          <w:highlight w:val="cyan"/>
+          <w:lang w:val="en-PK"/>
+        </w:rPr>
+        <w:t xml:space="preserve">Did this </w:t>
+      </w:r>
+      <w:proofErr w:type="gramStart"/>
+      <w:r>
+        <w:rPr>
+          <w:rFonts w:cstheme="minorHAnsi"/>
+          <w:highlight w:val="cyan"/>
+          <w:lang w:val="en-PK"/>
+        </w:rPr>
+        <w:t>affect</w:t>
+      </w:r>
+      <w:proofErr w:type="gramEnd"/>
+      <w:r>
+        <w:rPr>
+          <w:rFonts w:cstheme="minorHAnsi"/>
+          <w:highlight w:val="cyan"/>
+          <w:lang w:val="en-PK"/>
+        </w:rPr>
+        <w:t xml:space="preserve"> profit but it actually belongs to another cash flow section?</w:t>
+      </w:r>
+    </w:p>
+    <w:p>
+      <w:pPr>
+        <w:ind w:left="720"/>
+        <w:rPr>
+          <w:rFonts w:cstheme="minorHAnsi"/>
+          <w:lang w:val="en-PK"/>
+        </w:rPr>
+      </w:pPr>
+      <w:r>
+        <w:rPr>
+          <w:rFonts w:cstheme="minorHAnsi"/>
+          <w:lang w:val="en-PK"/>
+        </w:rPr>
+        <w:t>Sometimes an item affects profit but actually belongs to another section of the Cash Flow Statement.</w:t>
+      </w:r>
+    </w:p>
+    <w:p>
+      <w:pPr>
+        <w:ind w:firstLine="720"/>
+        <w:rPr>
+          <w:rFonts w:cstheme="minorHAnsi"/>
+          <w:lang w:val="en-PK"/>
+        </w:rPr>
+      </w:pPr>
+      <w:r>
+        <w:rPr>
+          <w:rFonts w:cstheme="minorHAnsi"/>
+          <w:lang w:val="en-PK"/>
+        </w:rPr>
+        <w:t>The three sections are:</w:t>
+      </w:r>
+    </w:p>
+    <w:p>
+      <w:pPr>
+        <w:numPr>
+          <w:ilvl w:val="0"/>
+          <w:numId w:val="18"/>
+        </w:numPr>
+        <w:rPr>
+          <w:rFonts w:cstheme="minorHAnsi"/>
+          <w:lang w:val="en-PK"/>
+        </w:rPr>
+      </w:pPr>
+      <w:r>
+        <w:rPr>
+          <w:rFonts w:cstheme="minorHAnsi"/>
+          <w:lang w:val="en-PK"/>
+        </w:rPr>
+        <w:t>Cash Flow from Operating Activities</w:t>
+      </w:r>
+    </w:p>
+    <w:p>
+      <w:pPr>
+        <w:numPr>
+          <w:ilvl w:val="0"/>
+          <w:numId w:val="18"/>
+        </w:numPr>
+        <w:rPr>
+          <w:rFonts w:cstheme="minorHAnsi"/>
+          <w:lang w:val="en-PK"/>
+        </w:rPr>
+      </w:pPr>
+      <w:r>
+        <w:rPr>
+          <w:rFonts w:cstheme="minorHAnsi"/>
+          <w:lang w:val="en-PK"/>
+        </w:rPr>
+        <w:t>Cash Flow from Investing Activities</w:t>
+      </w:r>
+    </w:p>
+    <w:p>
+      <w:pPr>
+        <w:numPr>
+          <w:ilvl w:val="0"/>
+          <w:numId w:val="18"/>
+        </w:numPr>
+        <w:rPr>
+          <w:rFonts w:cstheme="minorHAnsi"/>
+          <w:lang w:val="en-PK"/>
+        </w:rPr>
+      </w:pPr>
+      <w:r>
+        <w:rPr>
+          <w:rFonts w:cstheme="minorHAnsi"/>
+          <w:lang w:val="en-PK"/>
+        </w:rPr>
+        <w:t>Cash Flow from Financing Activities</w:t>
+      </w:r>
+    </w:p>
+    <w:p>
+      <w:pPr>
+        <w:ind w:left="720"/>
+        <w:rPr>
+          <w:rFonts w:cstheme="minorHAnsi"/>
+          <w:lang w:val="en-PK"/>
+        </w:rPr>
+      </w:pPr>
+      <w:r>
+        <w:rPr>
+          <w:rFonts w:cstheme="minorHAnsi"/>
+          <w:lang w:val="en-PK"/>
+        </w:rPr>
+        <w:t>For example, when we prepare the operating section using the indirect method, we start with Profit Before Tax from the Income Statement.</w:t>
+      </w:r>
+    </w:p>
+    <w:p>
+      <w:pPr>
+        <w:ind w:firstLine="720"/>
+        <w:rPr>
+          <w:rFonts w:cstheme="minorHAnsi"/>
+          <w:lang w:val="en-PK"/>
+        </w:rPr>
+      </w:pPr>
+      <w:r>
+        <w:rPr>
+          <w:rFonts w:cstheme="minorHAnsi"/>
+          <w:lang w:val="en-PK"/>
+        </w:rPr>
+        <w:t>But this profit includes non-operating items, such as:</w:t>
+      </w:r>
+    </w:p>
+    <w:p>
+      <w:pPr>
+        <w:numPr>
+          <w:ilvl w:val="0"/>
+          <w:numId w:val="19"/>
+        </w:numPr>
+        <w:rPr>
+          <w:rFonts w:cstheme="minorHAnsi"/>
+          <w:lang w:val="en-PK"/>
+        </w:rPr>
+      </w:pPr>
+      <w:r>
+        <w:rPr>
+          <w:rFonts w:cstheme="minorHAnsi"/>
+          <w:lang w:val="en-PK"/>
+        </w:rPr>
+        <w:t>dividend income</w:t>
+      </w:r>
+    </w:p>
+    <w:p>
+      <w:pPr>
+        <w:numPr>
+          <w:ilvl w:val="0"/>
+          <w:numId w:val="19"/>
+        </w:numPr>
+        <w:rPr>
+          <w:rFonts w:cstheme="minorHAnsi"/>
+          <w:lang w:val="en-PK"/>
+        </w:rPr>
+      </w:pPr>
+      <w:r>
+        <w:rPr>
+          <w:rFonts w:cstheme="minorHAnsi"/>
+          <w:lang w:val="en-PK"/>
+        </w:rPr>
+        <w:t>interest income</w:t>
+      </w:r>
+    </w:p>
+    <w:p>
+      <w:pPr>
+        <w:numPr>
+          <w:ilvl w:val="0"/>
+          <w:numId w:val="19"/>
+        </w:numPr>
+        <w:rPr>
+          <w:rFonts w:cstheme="minorHAnsi"/>
+          <w:lang w:val="en-PK"/>
+        </w:rPr>
+      </w:pPr>
+      <w:r>
+        <w:rPr>
+          <w:rFonts w:cstheme="minorHAnsi"/>
+          <w:lang w:val="en-PK"/>
+        </w:rPr>
+        <w:t>gain or loss on sale of assets</w:t>
+      </w:r>
+    </w:p>
+    <w:p>
+      <w:pPr>
+        <w:ind w:left="720"/>
+        <w:rPr>
+          <w:rFonts w:cstheme="minorHAnsi"/>
+          <w:lang w:val="en-PK"/>
+        </w:rPr>
+      </w:pPr>
+      <w:r>
+        <w:rPr>
+          <w:rFonts w:cstheme="minorHAnsi"/>
+          <w:lang w:val="en-PK"/>
+        </w:rPr>
+        <w:t>Since these items do not belong to operating activities, we remove them from the operating section.</w:t>
+      </w:r>
+    </w:p>
+    <w:p>
+      <w:pPr>
+        <w:ind w:left="720"/>
+        <w:rPr>
+          <w:rFonts w:cstheme="minorHAnsi"/>
+          <w:lang w:val="en-PK"/>
+        </w:rPr>
+      </w:pPr>
+      <w:r>
+        <w:rPr>
+          <w:rFonts w:cstheme="minorHAnsi"/>
+          <w:lang w:val="en-PK"/>
+        </w:rPr>
+        <w:t>For example, if dividend income increased profit, we subtract it from the operating section, because it will appear in the investing activities section of the Cash Flow Statement.</w:t>
+      </w:r>
+    </w:p>
+    <w:p>
+      <w:pPr>
+        <w:ind w:firstLine="720"/>
+        <w:rPr>
+          <w:rFonts w:cstheme="minorHAnsi"/>
+          <w:lang w:val="en-PK"/>
+        </w:rPr>
+      </w:pPr>
+      <w:proofErr w:type="gramStart"/>
+      <w:r>
+        <w:rPr>
+          <w:rFonts w:cstheme="minorHAnsi"/>
+          <w:lang w:val="en-PK"/>
+        </w:rPr>
+        <w:t>So</w:t>
+      </w:r>
+      <w:proofErr w:type="gramEnd"/>
+      <w:r>
+        <w:rPr>
+          <w:rFonts w:cstheme="minorHAnsi"/>
+          <w:lang w:val="en-PK"/>
+        </w:rPr>
+        <w:t xml:space="preserve"> the rule is:</w:t>
+      </w:r>
+    </w:p>
+    <w:p>
+      <w:pPr>
+        <w:ind w:left="720"/>
+        <w:rPr>
+          <w:rFonts w:cstheme="minorHAnsi"/>
+          <w:lang w:val="en-PK"/>
+        </w:rPr>
+      </w:pPr>
+      <w:r>
+        <w:rPr>
+          <w:rFonts w:cstheme="minorHAnsi"/>
+          <w:lang w:val="en-PK"/>
+        </w:rPr>
+        <w:t>If something affects profit but belongs to another cash flow category, we remove it from this section and it will appear in its correct section (investing or financing).</w:t>
       </w:r>
     </w:p>
     <w:p>
@@ -28551,9 +29007,9 @@
     </w:lvl>
   </w:abstractNum>
   <w:abstractNum w:abstractNumId="3" w15:restartNumberingAfterBreak="0">
-    <w:nsid w:val="1E903123"/>
+    <w:nsid w:val="1B803791"/>
     <w:multiLevelType w:val="multilevel"/>
-    <w:tmpl w:val="701C78CC"/>
+    <w:tmpl w:val="0D82A61C"/>
     <w:lvl w:ilvl="0">
       <w:start w:val="1"/>
       <w:numFmt w:val="bullet"/>
@@ -28700,9 +29156,9 @@
     </w:lvl>
   </w:abstractNum>
   <w:abstractNum w:abstractNumId="4" w15:restartNumberingAfterBreak="0">
-    <w:nsid w:val="1ED33ADC"/>
+    <w:nsid w:val="1E903123"/>
     <w:multiLevelType w:val="multilevel"/>
-    <w:tmpl w:val="B1D270E4"/>
+    <w:tmpl w:val="701C78CC"/>
     <w:lvl w:ilvl="0">
       <w:start w:val="1"/>
       <w:numFmt w:val="bullet"/>
@@ -28849,6 +29305,151 @@
     </w:lvl>
   </w:abstractNum>
   <w:abstractNum w:abstractNumId="5" w15:restartNumberingAfterBreak="0">
+    <w:nsid w:val="1ED33ADC"/>
+    <w:multiLevelType w:val="multilevel"/>
+    <w:tmpl w:val="8C44851A"/>
+    <w:lvl w:ilvl="0">
+      <w:start w:val="1"/>
+      <w:numFmt w:val="bullet"/>
+      <w:lvlText w:val=""/>
+      <w:lvlJc w:val="left"/>
+      <w:pPr>
+        <w:tabs>
+          <w:tab w:val="num" w:pos="720"/>
+        </w:tabs>
+        <w:ind w:left="720" w:hanging="360"/>
+      </w:pPr>
+      <w:rPr>
+        <w:rFonts w:ascii="Symbol" w:hAnsi="Symbol" w:hint="default"/>
+        <w:sz w:val="20"/>
+      </w:rPr>
+    </w:lvl>
+    <w:lvl w:ilvl="1">
+      <w:start w:val="1"/>
+      <w:numFmt w:val="decimal"/>
+      <w:lvlText w:val="%2-"/>
+      <w:lvlJc w:val="left"/>
+      <w:pPr>
+        <w:ind w:left="1440" w:hanging="360"/>
+      </w:pPr>
+      <w:rPr>
+        <w:rFonts w:hint="default"/>
+      </w:rPr>
+    </w:lvl>
+    <w:lvl w:ilvl="2" w:tentative="1">
+      <w:start w:val="1"/>
+      <w:numFmt w:val="bullet"/>
+      <w:lvlText w:val=""/>
+      <w:lvlJc w:val="left"/>
+      <w:pPr>
+        <w:tabs>
+          <w:tab w:val="num" w:pos="2160"/>
+        </w:tabs>
+        <w:ind w:left="2160" w:hanging="360"/>
+      </w:pPr>
+      <w:rPr>
+        <w:rFonts w:ascii="Wingdings" w:hAnsi="Wingdings" w:hint="default"/>
+        <w:sz w:val="20"/>
+      </w:rPr>
+    </w:lvl>
+    <w:lvl w:ilvl="3" w:tentative="1">
+      <w:start w:val="1"/>
+      <w:numFmt w:val="bullet"/>
+      <w:lvlText w:val=""/>
+      <w:lvlJc w:val="left"/>
+      <w:pPr>
+        <w:tabs>
+          <w:tab w:val="num" w:pos="2880"/>
+        </w:tabs>
+        <w:ind w:left="2880" w:hanging="360"/>
+      </w:pPr>
+      <w:rPr>
+        <w:rFonts w:ascii="Wingdings" w:hAnsi="Wingdings" w:hint="default"/>
+        <w:sz w:val="20"/>
+      </w:rPr>
+    </w:lvl>
+    <w:lvl w:ilvl="4" w:tentative="1">
+      <w:start w:val="1"/>
+      <w:numFmt w:val="bullet"/>
+      <w:lvlText w:val=""/>
+      <w:lvlJc w:val="left"/>
+      <w:pPr>
+        <w:tabs>
+          <w:tab w:val="num" w:pos="3600"/>
+        </w:tabs>
+        <w:ind w:left="3600" w:hanging="360"/>
+      </w:pPr>
+      <w:rPr>
+        <w:rFonts w:ascii="Wingdings" w:hAnsi="Wingdings" w:hint="default"/>
+        <w:sz w:val="20"/>
+      </w:rPr>
+    </w:lvl>
+    <w:lvl w:ilvl="5" w:tentative="1">
+      <w:start w:val="1"/>
+      <w:numFmt w:val="bullet"/>
+      <w:lvlText w:val=""/>
+      <w:lvlJc w:val="left"/>
+      <w:pPr>
+        <w:tabs>
+          <w:tab w:val="num" w:pos="4320"/>
+        </w:tabs>
+        <w:ind w:left="4320" w:hanging="360"/>
+      </w:pPr>
+      <w:rPr>
+        <w:rFonts w:ascii="Wingdings" w:hAnsi="Wingdings" w:hint="default"/>
+        <w:sz w:val="20"/>
+      </w:rPr>
+    </w:lvl>
+    <w:lvl w:ilvl="6" w:tentative="1">
+      <w:start w:val="1"/>
+      <w:numFmt w:val="bullet"/>
+      <w:lvlText w:val=""/>
+      <w:lvlJc w:val="left"/>
+      <w:pPr>
+        <w:tabs>
+          <w:tab w:val="num" w:pos="5040"/>
+        </w:tabs>
+        <w:ind w:left="5040" w:hanging="360"/>
+      </w:pPr>
+      <w:rPr>
+        <w:rFonts w:ascii="Wingdings" w:hAnsi="Wingdings" w:hint="default"/>
+        <w:sz w:val="20"/>
+      </w:rPr>
+    </w:lvl>
+    <w:lvl w:ilvl="7" w:tentative="1">
+      <w:start w:val="1"/>
+      <w:numFmt w:val="bullet"/>
+      <w:lvlText w:val=""/>
+      <w:lvlJc w:val="left"/>
+      <w:pPr>
+        <w:tabs>
+          <w:tab w:val="num" w:pos="5760"/>
+        </w:tabs>
+        <w:ind w:left="5760" w:hanging="360"/>
+      </w:pPr>
+      <w:rPr>
+        <w:rFonts w:ascii="Wingdings" w:hAnsi="Wingdings" w:hint="default"/>
+        <w:sz w:val="20"/>
+      </w:rPr>
+    </w:lvl>
+    <w:lvl w:ilvl="8" w:tentative="1">
+      <w:start w:val="1"/>
+      <w:numFmt w:val="bullet"/>
+      <w:lvlText w:val=""/>
+      <w:lvlJc w:val="left"/>
+      <w:pPr>
+        <w:tabs>
+          <w:tab w:val="num" w:pos="6480"/>
+        </w:tabs>
+        <w:ind w:left="6480" w:hanging="360"/>
+      </w:pPr>
+      <w:rPr>
+        <w:rFonts w:ascii="Wingdings" w:hAnsi="Wingdings" w:hint="default"/>
+        <w:sz w:val="20"/>
+      </w:rPr>
+    </w:lvl>
+  </w:abstractNum>
+  <w:abstractNum w:abstractNumId="6" w15:restartNumberingAfterBreak="0">
     <w:nsid w:val="22607610"/>
     <w:multiLevelType w:val="multilevel"/>
     <w:tmpl w:val="3AFC4E1A"/>
@@ -28997,7 +29598,7 @@
       </w:rPr>
     </w:lvl>
   </w:abstractNum>
-  <w:abstractNum w:abstractNumId="6" w15:restartNumberingAfterBreak="0">
+  <w:abstractNum w:abstractNumId="7" w15:restartNumberingAfterBreak="0">
     <w:nsid w:val="249061E5"/>
     <w:multiLevelType w:val="hybridMultilevel"/>
     <w:tmpl w:val="EB244D7C"/>
@@ -29109,7 +29710,7 @@
       </w:rPr>
     </w:lvl>
   </w:abstractNum>
-  <w:abstractNum w:abstractNumId="7" w15:restartNumberingAfterBreak="0">
+  <w:abstractNum w:abstractNumId="8" w15:restartNumberingAfterBreak="0">
     <w:nsid w:val="273426B3"/>
     <w:multiLevelType w:val="multilevel"/>
     <w:tmpl w:val="91B2F8D0"/>
@@ -29258,7 +29859,7 @@
       </w:rPr>
     </w:lvl>
   </w:abstractNum>
-  <w:abstractNum w:abstractNumId="8" w15:restartNumberingAfterBreak="0">
+  <w:abstractNum w:abstractNumId="9" w15:restartNumberingAfterBreak="0">
     <w:nsid w:val="280C0E1E"/>
     <w:multiLevelType w:val="hybridMultilevel"/>
     <w:tmpl w:val="28C0A814"/>
@@ -29347,7 +29948,7 @@
       </w:pPr>
     </w:lvl>
   </w:abstractNum>
-  <w:abstractNum w:abstractNumId="9" w15:restartNumberingAfterBreak="0">
+  <w:abstractNum w:abstractNumId="10" w15:restartNumberingAfterBreak="0">
     <w:nsid w:val="344626FD"/>
     <w:multiLevelType w:val="multilevel"/>
     <w:tmpl w:val="CDA2478A"/>
@@ -29496,10 +30097,10 @@
       </w:rPr>
     </w:lvl>
   </w:abstractNum>
-  <w:abstractNum w:abstractNumId="10" w15:restartNumberingAfterBreak="0">
-    <w:nsid w:val="40607527"/>
+  <w:abstractNum w:abstractNumId="11" w15:restartNumberingAfterBreak="0">
+    <w:nsid w:val="38A9702C"/>
     <w:multiLevelType w:val="multilevel"/>
-    <w:tmpl w:val="65168E26"/>
+    <w:tmpl w:val="4A9A5634"/>
     <w:lvl w:ilvl="0">
       <w:start w:val="1"/>
       <w:numFmt w:val="bullet"/>
@@ -29645,10 +30246,10 @@
       </w:rPr>
     </w:lvl>
   </w:abstractNum>
-  <w:abstractNum w:abstractNumId="11" w15:restartNumberingAfterBreak="0">
-    <w:nsid w:val="42AE40BC"/>
+  <w:abstractNum w:abstractNumId="12" w15:restartNumberingAfterBreak="0">
+    <w:nsid w:val="40607527"/>
     <w:multiLevelType w:val="multilevel"/>
-    <w:tmpl w:val="5812FB9A"/>
+    <w:tmpl w:val="65168E26"/>
     <w:lvl w:ilvl="0">
       <w:start w:val="1"/>
       <w:numFmt w:val="bullet"/>
@@ -29794,10 +30395,10 @@
       </w:rPr>
     </w:lvl>
   </w:abstractNum>
-  <w:abstractNum w:abstractNumId="12" w15:restartNumberingAfterBreak="0">
-    <w:nsid w:val="48B46654"/>
+  <w:abstractNum w:abstractNumId="13" w15:restartNumberingAfterBreak="0">
+    <w:nsid w:val="42AE40BC"/>
     <w:multiLevelType w:val="multilevel"/>
-    <w:tmpl w:val="C5DE5C36"/>
+    <w:tmpl w:val="5812FB9A"/>
     <w:lvl w:ilvl="0">
       <w:start w:val="1"/>
       <w:numFmt w:val="bullet"/>
@@ -29943,10 +30544,10 @@
       </w:rPr>
     </w:lvl>
   </w:abstractNum>
-  <w:abstractNum w:abstractNumId="13" w15:restartNumberingAfterBreak="0">
-    <w:nsid w:val="48DB490E"/>
+  <w:abstractNum w:abstractNumId="14" w15:restartNumberingAfterBreak="0">
+    <w:nsid w:val="48B46654"/>
     <w:multiLevelType w:val="multilevel"/>
-    <w:tmpl w:val="D86E882A"/>
+    <w:tmpl w:val="C5DE5C36"/>
     <w:lvl w:ilvl="0">
       <w:start w:val="1"/>
       <w:numFmt w:val="bullet"/>
@@ -30092,10 +30693,10 @@
       </w:rPr>
     </w:lvl>
   </w:abstractNum>
-  <w:abstractNum w:abstractNumId="14" w15:restartNumberingAfterBreak="0">
-    <w:nsid w:val="740A61BA"/>
+  <w:abstractNum w:abstractNumId="15" w15:restartNumberingAfterBreak="0">
+    <w:nsid w:val="48DB490E"/>
     <w:multiLevelType w:val="multilevel"/>
-    <w:tmpl w:val="D3807B20"/>
+    <w:tmpl w:val="D86E882A"/>
     <w:lvl w:ilvl="0">
       <w:start w:val="1"/>
       <w:numFmt w:val="bullet"/>
@@ -30241,7 +30842,156 @@
       </w:rPr>
     </w:lvl>
   </w:abstractNum>
-  <w:abstractNum w:abstractNumId="15" w15:restartNumberingAfterBreak="0">
+  <w:abstractNum w:abstractNumId="16" w15:restartNumberingAfterBreak="0">
+    <w:nsid w:val="740A61BA"/>
+    <w:multiLevelType w:val="multilevel"/>
+    <w:tmpl w:val="D3807B20"/>
+    <w:lvl w:ilvl="0">
+      <w:start w:val="1"/>
+      <w:numFmt w:val="bullet"/>
+      <w:lvlText w:val=""/>
+      <w:lvlJc w:val="left"/>
+      <w:pPr>
+        <w:tabs>
+          <w:tab w:val="num" w:pos="720"/>
+        </w:tabs>
+        <w:ind w:left="720" w:hanging="360"/>
+      </w:pPr>
+      <w:rPr>
+        <w:rFonts w:ascii="Symbol" w:hAnsi="Symbol" w:hint="default"/>
+        <w:sz w:val="20"/>
+      </w:rPr>
+    </w:lvl>
+    <w:lvl w:ilvl="1" w:tentative="1">
+      <w:start w:val="1"/>
+      <w:numFmt w:val="bullet"/>
+      <w:lvlText w:val="o"/>
+      <w:lvlJc w:val="left"/>
+      <w:pPr>
+        <w:tabs>
+          <w:tab w:val="num" w:pos="1440"/>
+        </w:tabs>
+        <w:ind w:left="1440" w:hanging="360"/>
+      </w:pPr>
+      <w:rPr>
+        <w:rFonts w:ascii="Courier New" w:hAnsi="Courier New" w:hint="default"/>
+        <w:sz w:val="20"/>
+      </w:rPr>
+    </w:lvl>
+    <w:lvl w:ilvl="2" w:tentative="1">
+      <w:start w:val="1"/>
+      <w:numFmt w:val="bullet"/>
+      <w:lvlText w:val=""/>
+      <w:lvlJc w:val="left"/>
+      <w:pPr>
+        <w:tabs>
+          <w:tab w:val="num" w:pos="2160"/>
+        </w:tabs>
+        <w:ind w:left="2160" w:hanging="360"/>
+      </w:pPr>
+      <w:rPr>
+        <w:rFonts w:ascii="Wingdings" w:hAnsi="Wingdings" w:hint="default"/>
+        <w:sz w:val="20"/>
+      </w:rPr>
+    </w:lvl>
+    <w:lvl w:ilvl="3" w:tentative="1">
+      <w:start w:val="1"/>
+      <w:numFmt w:val="bullet"/>
+      <w:lvlText w:val=""/>
+      <w:lvlJc w:val="left"/>
+      <w:pPr>
+        <w:tabs>
+          <w:tab w:val="num" w:pos="2880"/>
+        </w:tabs>
+        <w:ind w:left="2880" w:hanging="360"/>
+      </w:pPr>
+      <w:rPr>
+        <w:rFonts w:ascii="Wingdings" w:hAnsi="Wingdings" w:hint="default"/>
+        <w:sz w:val="20"/>
+      </w:rPr>
+    </w:lvl>
+    <w:lvl w:ilvl="4" w:tentative="1">
+      <w:start w:val="1"/>
+      <w:numFmt w:val="bullet"/>
+      <w:lvlText w:val=""/>
+      <w:lvlJc w:val="left"/>
+      <w:pPr>
+        <w:tabs>
+          <w:tab w:val="num" w:pos="3600"/>
+        </w:tabs>
+        <w:ind w:left="3600" w:hanging="360"/>
+      </w:pPr>
+      <w:rPr>
+        <w:rFonts w:ascii="Wingdings" w:hAnsi="Wingdings" w:hint="default"/>
+        <w:sz w:val="20"/>
+      </w:rPr>
+    </w:lvl>
+    <w:lvl w:ilvl="5" w:tentative="1">
+      <w:start w:val="1"/>
+      <w:numFmt w:val="bullet"/>
+      <w:lvlText w:val=""/>
+      <w:lvlJc w:val="left"/>
+      <w:pPr>
+        <w:tabs>
+          <w:tab w:val="num" w:pos="4320"/>
+        </w:tabs>
+        <w:ind w:left="4320" w:hanging="360"/>
+      </w:pPr>
+      <w:rPr>
+        <w:rFonts w:ascii="Wingdings" w:hAnsi="Wingdings" w:hint="default"/>
+        <w:sz w:val="20"/>
+      </w:rPr>
+    </w:lvl>
+    <w:lvl w:ilvl="6" w:tentative="1">
+      <w:start w:val="1"/>
+      <w:numFmt w:val="bullet"/>
+      <w:lvlText w:val=""/>
+      <w:lvlJc w:val="left"/>
+      <w:pPr>
+        <w:tabs>
+          <w:tab w:val="num" w:pos="5040"/>
+        </w:tabs>
+        <w:ind w:left="5040" w:hanging="360"/>
+      </w:pPr>
+      <w:rPr>
+        <w:rFonts w:ascii="Wingdings" w:hAnsi="Wingdings" w:hint="default"/>
+        <w:sz w:val="20"/>
+      </w:rPr>
+    </w:lvl>
+    <w:lvl w:ilvl="7" w:tentative="1">
+      <w:start w:val="1"/>
+      <w:numFmt w:val="bullet"/>
+      <w:lvlText w:val=""/>
+      <w:lvlJc w:val="left"/>
+      <w:pPr>
+        <w:tabs>
+          <w:tab w:val="num" w:pos="5760"/>
+        </w:tabs>
+        <w:ind w:left="5760" w:hanging="360"/>
+      </w:pPr>
+      <w:rPr>
+        <w:rFonts w:ascii="Wingdings" w:hAnsi="Wingdings" w:hint="default"/>
+        <w:sz w:val="20"/>
+      </w:rPr>
+    </w:lvl>
+    <w:lvl w:ilvl="8" w:tentative="1">
+      <w:start w:val="1"/>
+      <w:numFmt w:val="bullet"/>
+      <w:lvlText w:val=""/>
+      <w:lvlJc w:val="left"/>
+      <w:pPr>
+        <w:tabs>
+          <w:tab w:val="num" w:pos="6480"/>
+        </w:tabs>
+        <w:ind w:left="6480" w:hanging="360"/>
+      </w:pPr>
+      <w:rPr>
+        <w:rFonts w:ascii="Wingdings" w:hAnsi="Wingdings" w:hint="default"/>
+        <w:sz w:val="20"/>
+      </w:rPr>
+    </w:lvl>
+  </w:abstractNum>
+  <w:abstractNum w:abstractNumId="17" w15:restartNumberingAfterBreak="0">
     <w:nsid w:val="78407CD1"/>
     <w:multiLevelType w:val="multilevel"/>
     <w:tmpl w:val="7C2AFB40"/>
@@ -30390,7 +31140,7 @@
       </w:rPr>
     </w:lvl>
   </w:abstractNum>
-  <w:abstractNum w:abstractNumId="16" w15:restartNumberingAfterBreak="0">
+  <w:abstractNum w:abstractNumId="18" w15:restartNumberingAfterBreak="0">
     <w:nsid w:val="7CA46DDA"/>
     <w:multiLevelType w:val="multilevel"/>
     <w:tmpl w:val="3C3A0DE8"/>
@@ -30540,55 +31290,61 @@
     </w:lvl>
   </w:abstractNum>
   <w:num w:numId="1" w16cid:durableId="266549831">
-    <w:abstractNumId w:val="6"/>
+    <w:abstractNumId w:val="7"/>
   </w:num>
   <w:num w:numId="2" w16cid:durableId="1458403793">
-    <w:abstractNumId w:val="8"/>
+    <w:abstractNumId w:val="9"/>
   </w:num>
   <w:num w:numId="3" w16cid:durableId="216285181">
-    <w:abstractNumId w:val="13"/>
+    <w:abstractNumId w:val="15"/>
   </w:num>
   <w:num w:numId="4" w16cid:durableId="2086102072">
-    <w:abstractNumId w:val="16"/>
+    <w:abstractNumId w:val="18"/>
   </w:num>
   <w:num w:numId="5" w16cid:durableId="1385056839">
     <w:abstractNumId w:val="1"/>
   </w:num>
   <w:num w:numId="6" w16cid:durableId="1970546841">
-    <w:abstractNumId w:val="12"/>
+    <w:abstractNumId w:val="14"/>
   </w:num>
   <w:num w:numId="7" w16cid:durableId="1806316291">
-    <w:abstractNumId w:val="7"/>
+    <w:abstractNumId w:val="8"/>
   </w:num>
   <w:num w:numId="8" w16cid:durableId="1658723508">
-    <w:abstractNumId w:val="9"/>
+    <w:abstractNumId w:val="10"/>
   </w:num>
   <w:num w:numId="9" w16cid:durableId="2065565178">
-    <w:abstractNumId w:val="14"/>
+    <w:abstractNumId w:val="16"/>
   </w:num>
   <w:num w:numId="10" w16cid:durableId="895975205">
     <w:abstractNumId w:val="2"/>
   </w:num>
   <w:num w:numId="11" w16cid:durableId="971978470">
-    <w:abstractNumId w:val="15"/>
+    <w:abstractNumId w:val="17"/>
   </w:num>
   <w:num w:numId="12" w16cid:durableId="47728691">
-    <w:abstractNumId w:val="11"/>
+    <w:abstractNumId w:val="13"/>
   </w:num>
   <w:num w:numId="13" w16cid:durableId="551233112">
-    <w:abstractNumId w:val="4"/>
+    <w:abstractNumId w:val="5"/>
   </w:num>
   <w:num w:numId="14" w16cid:durableId="1979457364">
-    <w:abstractNumId w:val="10"/>
+    <w:abstractNumId w:val="12"/>
   </w:num>
   <w:num w:numId="15" w16cid:durableId="1264803429">
-    <w:abstractNumId w:val="5"/>
+    <w:abstractNumId w:val="6"/>
   </w:num>
   <w:num w:numId="16" w16cid:durableId="1489978061">
-    <w:abstractNumId w:val="3"/>
+    <w:abstractNumId w:val="4"/>
   </w:num>
   <w:num w:numId="17" w16cid:durableId="1400716140">
     <w:abstractNumId w:val="0"/>
+  </w:num>
+  <w:num w:numId="18" w16cid:durableId="853763849">
+    <w:abstractNumId w:val="11"/>
+  </w:num>
+  <w:num w:numId="19" w16cid:durableId="1948459296">
+    <w:abstractNumId w:val="3"/>
   </w:num>
 </w:numbering>
 </file>

</xml_diff>

<commit_message>
start creating balance sheet with trial balance
</commit_message>
<xml_diff>
--- a/Complete FINANCIAL REPORTING AND FINANCIAL ANALYSIS USING POWER BI.docx
+++ b/Complete FINANCIAL REPORTING AND FINANCIAL ANALYSIS USING POWER BI.docx
@@ -8353,6 +8353,193 @@
     </w:p>
     <w:p>
       <w:pPr>
+        <w:rPr>
+          <w:highlight w:val="magenta"/>
+          <w:lang w:val="en-PK"/>
+        </w:rPr>
+      </w:pPr>
+    </w:p>
+    <w:p>
+      <w:pPr>
+        <w:rPr>
+          <w:highlight w:val="magenta"/>
+          <w:lang w:val="en-PK"/>
+        </w:rPr>
+      </w:pPr>
+    </w:p>
+    <w:tbl>
+      <w:tblPr>
+        <w:tblStyle w:val="TableGrid"/>
+        <w:tblW w:w="0" w:type="auto"/>
+        <w:tblLook w:val="04A0" w:firstRow="1" w:lastRow="0" w:firstColumn="1" w:lastColumn="0" w:noHBand="0" w:noVBand="1"/>
+      </w:tblPr>
+      <w:tblGrid>
+        <w:gridCol w:w="2551"/>
+        <w:gridCol w:w="2029"/>
+      </w:tblGrid>
+      <w:tr>
+        <w:tc>
+          <w:tcPr>
+            <w:tcW w:w="0" w:type="auto"/>
+            <w:hideMark/>
+          </w:tcPr>
+          <w:p>
+            <w:pPr>
+              <w:spacing w:after="160" w:line="259" w:lineRule="auto"/>
+              <w:rPr>
+                <w:rFonts w:cstheme="minorHAnsi"/>
+                <w:b/>
+                <w:bCs/>
+                <w:lang w:val="en-PK"/>
+              </w:rPr>
+            </w:pPr>
+            <w:r>
+              <w:rPr>
+                <w:rFonts w:cstheme="minorHAnsi"/>
+                <w:b/>
+                <w:bCs/>
+                <w:lang w:val="en-PK"/>
+              </w:rPr>
+              <w:lastRenderedPageBreak/>
+              <w:t>Level</w:t>
+            </w:r>
+          </w:p>
+        </w:tc>
+        <w:tc>
+          <w:tcPr>
+            <w:tcW w:w="0" w:type="auto"/>
+            <w:hideMark/>
+          </w:tcPr>
+          <w:p>
+            <w:pPr>
+              <w:spacing w:after="160" w:line="259" w:lineRule="auto"/>
+              <w:rPr>
+                <w:rFonts w:cstheme="minorHAnsi"/>
+                <w:b/>
+                <w:bCs/>
+                <w:lang w:val="en-PK"/>
+              </w:rPr>
+            </w:pPr>
+            <w:r>
+              <w:rPr>
+                <w:rFonts w:cstheme="minorHAnsi"/>
+                <w:b/>
+                <w:bCs/>
+                <w:lang w:val="en-PK"/>
+              </w:rPr>
+              <w:t>What it is</w:t>
+            </w:r>
+          </w:p>
+        </w:tc>
+      </w:tr>
+      <w:tr>
+        <w:tc>
+          <w:tcPr>
+            <w:tcW w:w="0" w:type="auto"/>
+            <w:hideMark/>
+          </w:tcPr>
+          <w:p>
+            <w:pPr>
+              <w:spacing w:after="160" w:line="259" w:lineRule="auto"/>
+              <w:rPr>
+                <w:rFonts w:cstheme="minorHAnsi"/>
+                <w:lang w:val="en-PK"/>
+              </w:rPr>
+            </w:pPr>
+            <w:r>
+              <w:rPr>
+                <w:rFonts w:cstheme="minorHAnsi"/>
+                <w:lang w:val="en-PK"/>
+              </w:rPr>
+              <w:t>Assets / Liabilities / Equity</w:t>
+            </w:r>
+          </w:p>
+        </w:tc>
+        <w:tc>
+          <w:tcPr>
+            <w:tcW w:w="0" w:type="auto"/>
+            <w:hideMark/>
+          </w:tcPr>
+          <w:p>
+            <w:pPr>
+              <w:spacing w:after="160" w:line="259" w:lineRule="auto"/>
+              <w:rPr>
+                <w:rFonts w:cstheme="minorHAnsi"/>
+                <w:lang w:val="en-PK"/>
+              </w:rPr>
+            </w:pPr>
+            <w:r>
+              <w:rPr>
+                <w:rFonts w:cstheme="minorHAnsi"/>
+                <w:b/>
+                <w:bCs/>
+                <w:lang w:val="en-PK"/>
+              </w:rPr>
+              <w:t>Categories (Groups)</w:t>
+            </w:r>
+          </w:p>
+        </w:tc>
+      </w:tr>
+      <w:tr>
+        <w:tc>
+          <w:tcPr>
+            <w:tcW w:w="0" w:type="auto"/>
+            <w:hideMark/>
+          </w:tcPr>
+          <w:p>
+            <w:pPr>
+              <w:spacing w:after="160" w:line="259" w:lineRule="auto"/>
+              <w:rPr>
+                <w:rFonts w:cstheme="minorHAnsi"/>
+                <w:lang w:val="en-PK"/>
+              </w:rPr>
+            </w:pPr>
+            <w:r>
+              <w:rPr>
+                <w:rFonts w:cstheme="minorHAnsi"/>
+                <w:lang w:val="en-PK"/>
+              </w:rPr>
+              <w:t>Cash, Loan, Capital etc.</w:t>
+            </w:r>
+          </w:p>
+        </w:tc>
+        <w:tc>
+          <w:tcPr>
+            <w:tcW w:w="0" w:type="auto"/>
+            <w:hideMark/>
+          </w:tcPr>
+          <w:p>
+            <w:pPr>
+              <w:spacing w:after="160" w:line="259" w:lineRule="auto"/>
+              <w:rPr>
+                <w:rFonts w:cstheme="minorHAnsi"/>
+                <w:lang w:val="en-PK"/>
+              </w:rPr>
+            </w:pPr>
+            <w:r>
+              <w:rPr>
+                <w:rFonts w:cstheme="minorHAnsi"/>
+                <w:b/>
+                <w:bCs/>
+                <w:lang w:val="en-PK"/>
+              </w:rPr>
+              <w:t>Ledgers (Accounts)</w:t>
+            </w:r>
+          </w:p>
+        </w:tc>
+      </w:tr>
+    </w:tbl>
+    <w:p>
+      <w:pPr>
+        <w:ind w:left="720"/>
+        <w:rPr>
+          <w:highlight w:val="magenta"/>
+          <w:lang w:val="en-PK"/>
+        </w:rPr>
+      </w:pPr>
+    </w:p>
+    <w:p>
+      <w:pPr>
         <w:ind w:left="360"/>
         <w:rPr>
           <w:lang w:val="en-PK"/>
@@ -8432,14 +8619,7 @@
         <w:rPr>
           <w:lang w:val="en-PK"/>
         </w:rPr>
-        <w:t xml:space="preserve">: CREDIT and DEBIT,,, If the category is </w:t>
-      </w:r>
-      <w:r>
-        <w:rPr>
-          <w:lang w:val="en-PK"/>
-        </w:rPr>
-        <w:lastRenderedPageBreak/>
-        <w:t xml:space="preserve">DEBIT means expenses or assets of the company </w:t>
+        <w:t xml:space="preserve">: CREDIT and DEBIT,,, If the category is DEBIT means expenses or assets of the company </w:t>
       </w:r>
       <w:proofErr w:type="spellStart"/>
       <w:r>
@@ -8831,21 +9011,7 @@
         <w:rPr>
           <w:lang w:val="en-PK"/>
         </w:rPr>
-        <w:t xml:space="preserve"> </w:t>
-      </w:r>
-      <w:proofErr w:type="spellStart"/>
-      <w:r>
-        <w:rPr>
-          <w:lang w:val="en-PK"/>
-        </w:rPr>
-        <w:t>systme</w:t>
-      </w:r>
-      <w:proofErr w:type="spellEnd"/>
-      <w:r>
-        <w:rPr>
-          <w:lang w:val="en-PK"/>
-        </w:rPr>
-        <w:t xml:space="preserve"> m debit k </w:t>
+        <w:t xml:space="preserve"> systme m debit k </w:t>
       </w:r>
       <w:proofErr w:type="spellStart"/>
       <w:r>
@@ -9362,6 +9528,7 @@
           <w:sz w:val="40"/>
           <w:szCs w:val="40"/>
         </w:rPr>
+        <w:lastRenderedPageBreak/>
         <w:t>Foolproof</w:t>
       </w:r>
       <w:r>
@@ -9419,11 +9586,7 @@
       </w:r>
       <w:proofErr w:type="spellEnd"/>
       <w:r>
-        <w:t xml:space="preserve"> to alphabetically sort ho jay ga but </w:t>
-      </w:r>
-      <w:r>
-        <w:lastRenderedPageBreak/>
-        <w:t xml:space="preserve">class-level sorting disturb ho jay </w:t>
+        <w:t xml:space="preserve"> to alphabetically sort ho jay ga but class-level sorting disturb ho jay </w:t>
       </w:r>
       <w:proofErr w:type="spellStart"/>
       <w:r>
@@ -10669,7 +10832,14 @@
         <w:rPr>
           <w:lang w:val="en-PK"/>
         </w:rPr>
-        <w:t xml:space="preserve"> 2018 s le </w:t>
+        <w:t xml:space="preserve"> </w:t>
+      </w:r>
+      <w:r>
+        <w:rPr>
+          <w:lang w:val="en-PK"/>
+        </w:rPr>
+        <w:lastRenderedPageBreak/>
+        <w:t xml:space="preserve">2018 s le </w:t>
       </w:r>
       <w:proofErr w:type="spellStart"/>
       <w:r>
@@ -10911,7 +11081,6 @@
           <w:highlight w:val="yellow"/>
           <w:lang w:val="en-PK"/>
         </w:rPr>
-        <w:lastRenderedPageBreak/>
         <w:t>Assets = Liabilities + equity</w:t>
       </w:r>
       <w:proofErr w:type="gramStart"/>
@@ -12002,6 +12171,7 @@
         <w:rPr>
           <w:lang w:val="en-PK"/>
         </w:rPr>
+        <w:lastRenderedPageBreak/>
         <w:t xml:space="preserve">Cash (highest liquidity), bank balance (high liquidity), </w:t>
       </w:r>
       <w:r>
@@ -12294,7 +12464,6 @@
         <w:rPr>
           <w:lang w:val="en-PK"/>
         </w:rPr>
-        <w:lastRenderedPageBreak/>
         <w:t xml:space="preserve">Determines whether a company can pay its </w:t>
       </w:r>
       <w:proofErr w:type="gramStart"/>
@@ -12884,6 +13053,7 @@
         <w:rPr>
           <w:lang w:val="en-PK"/>
         </w:rPr>
+        <w:lastRenderedPageBreak/>
         <w:t xml:space="preserve">It is a relationship between debt and equity, it tells how much of company’s financing comes from debt compared to owner’s equity, means k company debts pr </w:t>
       </w:r>
       <w:proofErr w:type="spellStart"/>
@@ -13236,7 +13406,6 @@
           <w:highlight w:val="blue"/>
           <w:lang w:val="en-PK"/>
         </w:rPr>
-        <w:lastRenderedPageBreak/>
         <w:t xml:space="preserve">Assets turnover = sales or revenue / assets </w:t>
       </w:r>
     </w:p>
@@ -13773,6 +13942,7 @@
         <w:rPr>
           <w:lang w:val="en-PK"/>
         </w:rPr>
+        <w:lastRenderedPageBreak/>
         <w:t xml:space="preserve">Hr </w:t>
       </w:r>
       <w:proofErr w:type="spellStart"/>
@@ -14319,7 +14489,6 @@
           <w:u w:val="single"/>
           <w:lang w:val="en-PK"/>
         </w:rPr>
-        <w:lastRenderedPageBreak/>
         <w:t>Interest cover</w:t>
       </w:r>
       <w:r>
@@ -16023,6 +16192,7 @@
         <w:rPr>
           <w:lang w:val="en-PK"/>
         </w:rPr>
+        <w:lastRenderedPageBreak/>
         <w:t xml:space="preserve">  </w:t>
       </w:r>
       <w:r>
@@ -16442,7 +16612,6 @@
         <w:rPr>
           <w:lang w:val="en-PK"/>
         </w:rPr>
-        <w:lastRenderedPageBreak/>
         <w:t>A higher payable period is not always bad.</w:t>
       </w:r>
       <w:r>
@@ -16912,6 +17081,7 @@
       </w:r>
       <w:proofErr w:type="spellStart"/>
       <w:r>
+        <w:lastRenderedPageBreak/>
         <w:t>kisi</w:t>
       </w:r>
       <w:proofErr w:type="spellEnd"/>
@@ -17219,154 +17389,154 @@
         <w:ind w:left="360"/>
       </w:pPr>
       <w:r>
+        <w:t>It is basically a summary of the General Ledger.</w:t>
+      </w:r>
+    </w:p>
+    <w:p>
+      <w:pPr>
+        <w:ind w:left="360"/>
+      </w:pPr>
+      <w:r>
+        <w:t>In the General Ledger, we have all the individual transactions (each sale, expense, payment, etc.).</w:t>
+      </w:r>
+    </w:p>
+    <w:p>
+      <w:pPr>
+        <w:ind w:left="360"/>
+      </w:pPr>
+      <w:r>
+        <w:t xml:space="preserve">The Trial Balance collects those transactions and shows only the final balance of each </w:t>
+      </w:r>
+      <w:proofErr w:type="gramStart"/>
+      <w:r>
+        <w:t xml:space="preserve">account.   </w:t>
+      </w:r>
+      <w:proofErr w:type="gramEnd"/>
+      <w:r>
+        <w:t xml:space="preserve">,, </w:t>
+      </w:r>
+      <w:proofErr w:type="spellStart"/>
+      <w:r>
+        <w:t>e.g</w:t>
+      </w:r>
+      <w:proofErr w:type="spellEnd"/>
+      <w:r>
+        <w:t xml:space="preserve">: chart of account m jo </w:t>
+      </w:r>
+      <w:proofErr w:type="spellStart"/>
+      <w:r>
+        <w:t>saari</w:t>
+      </w:r>
+      <w:proofErr w:type="spellEnd"/>
+      <w:r>
+        <w:t xml:space="preserve"> subclasses mention </w:t>
+      </w:r>
+      <w:proofErr w:type="spellStart"/>
+      <w:r>
+        <w:t>thi</w:t>
+      </w:r>
+      <w:proofErr w:type="spellEnd"/>
+      <w:r>
+        <w:t xml:space="preserve">, such as assets, liabilities, </w:t>
+      </w:r>
+      <w:proofErr w:type="spellStart"/>
+      <w:proofErr w:type="gramStart"/>
+      <w:r>
+        <w:t>owners</w:t>
+      </w:r>
+      <w:proofErr w:type="spellEnd"/>
+      <w:proofErr w:type="gramEnd"/>
+      <w:r>
+        <w:t xml:space="preserve"> equity, sales </w:t>
+      </w:r>
+      <w:proofErr w:type="spellStart"/>
+      <w:r>
+        <w:t>etc</w:t>
+      </w:r>
+      <w:proofErr w:type="spellEnd"/>
+      <w:r>
+        <w:t xml:space="preserve"> </w:t>
+      </w:r>
+      <w:proofErr w:type="spellStart"/>
+      <w:r>
+        <w:t>etc</w:t>
+      </w:r>
+      <w:proofErr w:type="spellEnd"/>
+      <w:r>
+        <w:t xml:space="preserve">, and </w:t>
+      </w:r>
+      <w:r>
+        <w:t>In the General Ledger, each account key has many transaction amounts. In a trial balance, we summarize all those transactions and show one total balance for each account, so we can quickly see all accounts and their balances..</w:t>
+      </w:r>
+      <w:r>
+        <w:t xml:space="preserve"> ,, y just accounts and their balance </w:t>
+      </w:r>
+      <w:proofErr w:type="spellStart"/>
+      <w:r>
+        <w:t>tk</w:t>
+      </w:r>
+      <w:proofErr w:type="spellEnd"/>
+      <w:r>
+        <w:t xml:space="preserve"> ki limited </w:t>
+      </w:r>
+      <w:proofErr w:type="spellStart"/>
+      <w:r>
+        <w:t>nhi</w:t>
+      </w:r>
+      <w:proofErr w:type="spellEnd"/>
+      <w:r>
+        <w:t xml:space="preserve"> h, we can create trial balance report even with report level, class level, subclass </w:t>
+      </w:r>
+      <w:proofErr w:type="spellStart"/>
+      <w:r>
+        <w:t>elevel</w:t>
+      </w:r>
+      <w:proofErr w:type="spellEnd"/>
+      <w:r>
+        <w:t xml:space="preserve"> </w:t>
+      </w:r>
+      <w:proofErr w:type="spellStart"/>
+      <w:r>
+        <w:t>etc</w:t>
+      </w:r>
+      <w:proofErr w:type="spellEnd"/>
+      <w:r>
+        <w:t xml:space="preserve"> </w:t>
+      </w:r>
+      <w:proofErr w:type="spellStart"/>
+      <w:r>
+        <w:t>etc</w:t>
+      </w:r>
+      <w:proofErr w:type="spellEnd"/>
+      <w:r>
+        <w:t xml:space="preserve"> and then can also add slicer for country and year as well,,,,, is it correct</w:t>
+      </w:r>
+    </w:p>
+    <w:p>
+      <w:pPr>
+        <w:rPr>
+          <w:lang w:val="en-PK"/>
+        </w:rPr>
+      </w:pPr>
+      <w:r>
+        <w:rPr>
+          <w:lang w:val="en-PK"/>
+        </w:rPr>
+        <w:t>In our trail balance we have created following report:</w:t>
+      </w:r>
+    </w:p>
+    <w:p>
+      <w:pPr>
+        <w:rPr>
+          <w:lang w:val="en-PK"/>
+        </w:rPr>
+      </w:pPr>
+      <w:r>
+        <w:rPr>
+          <w:noProof/>
+          <w:lang w:val="en-PK"/>
+        </w:rPr>
         <w:lastRenderedPageBreak/>
-        <w:t>It is basically a summary of the General Ledger.</w:t>
-      </w:r>
-    </w:p>
-    <w:p>
-      <w:pPr>
-        <w:ind w:left="360"/>
-      </w:pPr>
-      <w:r>
-        <w:t>In the General Ledger, we have all the individual transactions (each sale, expense, payment, etc.).</w:t>
-      </w:r>
-    </w:p>
-    <w:p>
-      <w:pPr>
-        <w:ind w:left="360"/>
-      </w:pPr>
-      <w:r>
-        <w:t xml:space="preserve">The Trial Balance collects those transactions and shows only the final balance of each </w:t>
-      </w:r>
-      <w:proofErr w:type="gramStart"/>
-      <w:r>
-        <w:t xml:space="preserve">account.   </w:t>
-      </w:r>
-      <w:proofErr w:type="gramEnd"/>
-      <w:r>
-        <w:t xml:space="preserve">,, </w:t>
-      </w:r>
-      <w:proofErr w:type="spellStart"/>
-      <w:r>
-        <w:t>e.g</w:t>
-      </w:r>
-      <w:proofErr w:type="spellEnd"/>
-      <w:r>
-        <w:t xml:space="preserve">: chart of account m jo </w:t>
-      </w:r>
-      <w:proofErr w:type="spellStart"/>
-      <w:r>
-        <w:t>saari</w:t>
-      </w:r>
-      <w:proofErr w:type="spellEnd"/>
-      <w:r>
-        <w:t xml:space="preserve"> subclasses mention </w:t>
-      </w:r>
-      <w:proofErr w:type="spellStart"/>
-      <w:r>
-        <w:t>thi</w:t>
-      </w:r>
-      <w:proofErr w:type="spellEnd"/>
-      <w:r>
-        <w:t xml:space="preserve">, such as assets, liabilities, </w:t>
-      </w:r>
-      <w:proofErr w:type="spellStart"/>
-      <w:proofErr w:type="gramStart"/>
-      <w:r>
-        <w:t>owners</w:t>
-      </w:r>
-      <w:proofErr w:type="spellEnd"/>
-      <w:proofErr w:type="gramEnd"/>
-      <w:r>
-        <w:t xml:space="preserve"> equity, sales </w:t>
-      </w:r>
-      <w:proofErr w:type="spellStart"/>
-      <w:r>
-        <w:t>etc</w:t>
-      </w:r>
-      <w:proofErr w:type="spellEnd"/>
-      <w:r>
-        <w:t xml:space="preserve"> </w:t>
-      </w:r>
-      <w:proofErr w:type="spellStart"/>
-      <w:r>
-        <w:t>etc</w:t>
-      </w:r>
-      <w:proofErr w:type="spellEnd"/>
-      <w:r>
-        <w:t xml:space="preserve">, and </w:t>
-      </w:r>
-      <w:r>
-        <w:t>In the General Ledger, each account key has many transaction amounts. In a trial balance, we summarize all those transactions and show one total balance for each account, so we can quickly see all accounts and their balances..</w:t>
-      </w:r>
-      <w:r>
-        <w:t xml:space="preserve"> ,, y just accounts and their balance </w:t>
-      </w:r>
-      <w:proofErr w:type="spellStart"/>
-      <w:r>
-        <w:t>tk</w:t>
-      </w:r>
-      <w:proofErr w:type="spellEnd"/>
-      <w:r>
-        <w:t xml:space="preserve"> ki limited </w:t>
-      </w:r>
-      <w:proofErr w:type="spellStart"/>
-      <w:r>
-        <w:t>nhi</w:t>
-      </w:r>
-      <w:proofErr w:type="spellEnd"/>
-      <w:r>
-        <w:t xml:space="preserve"> h, we can create trial balance report even with report level, class level, subclass </w:t>
-      </w:r>
-      <w:proofErr w:type="spellStart"/>
-      <w:r>
-        <w:t>elevel</w:t>
-      </w:r>
-      <w:proofErr w:type="spellEnd"/>
-      <w:r>
-        <w:t xml:space="preserve"> </w:t>
-      </w:r>
-      <w:proofErr w:type="spellStart"/>
-      <w:r>
-        <w:t>etc</w:t>
-      </w:r>
-      <w:proofErr w:type="spellEnd"/>
-      <w:r>
-        <w:t xml:space="preserve"> </w:t>
-      </w:r>
-      <w:proofErr w:type="spellStart"/>
-      <w:r>
-        <w:t>etc</w:t>
-      </w:r>
-      <w:proofErr w:type="spellEnd"/>
-      <w:r>
-        <w:t xml:space="preserve"> and then can also add slicer for country and year as well,,,,, is it correct</w:t>
-      </w:r>
-    </w:p>
-    <w:p>
-      <w:pPr>
-        <w:rPr>
-          <w:lang w:val="en-PK"/>
-        </w:rPr>
-      </w:pPr>
-      <w:r>
-        <w:rPr>
-          <w:lang w:val="en-PK"/>
-        </w:rPr>
-        <w:t>In our trail balance we have created following report:</w:t>
-      </w:r>
-    </w:p>
-    <w:p>
-      <w:pPr>
-        <w:rPr>
-          <w:lang w:val="en-PK"/>
-        </w:rPr>
-      </w:pPr>
-      <w:r>
-        <w:rPr>
-          <w:noProof/>
-          <w:lang w:val="en-PK"/>
-        </w:rPr>
         <w:drawing>
           <wp:inline distT="0" distB="0" distL="0" distR="0" wp14:anchorId="0973A2FE" wp14:editId="3E16C166">
             <wp:extent cx="5943600" cy="4874895"/>
@@ -17483,544 +17653,544 @@
           <w:rFonts w:ascii="Bell MT" w:hAnsi="Bell MT"/>
           <w:lang w:val="en-PK"/>
         </w:rPr>
+        <w:t>total_value_alternate</w:t>
+      </w:r>
+      <w:proofErr w:type="spellEnd"/>
+      <w:r>
+        <w:rPr>
+          <w:rFonts w:ascii="Bell MT" w:hAnsi="Bell MT"/>
+          <w:lang w:val="en-PK"/>
+        </w:rPr>
+        <w:t xml:space="preserve"> = </w:t>
+      </w:r>
+      <w:proofErr w:type="gramStart"/>
+      <w:r>
+        <w:rPr>
+          <w:rFonts w:ascii="Bell MT" w:hAnsi="Bell MT"/>
+          <w:lang w:val="en-PK"/>
+        </w:rPr>
+        <w:t>COALESCE(</w:t>
+      </w:r>
+      <w:proofErr w:type="gramEnd"/>
+    </w:p>
+    <w:p>
+      <w:pPr>
+        <w:rPr>
+          <w:rFonts w:ascii="Bell MT" w:hAnsi="Bell MT"/>
+          <w:lang w:val="en-PK"/>
+        </w:rPr>
+      </w:pPr>
+      <w:r>
+        <w:rPr>
+          <w:rFonts w:ascii="Bell MT" w:hAnsi="Bell MT"/>
+          <w:lang w:val="en-PK"/>
+        </w:rPr>
+        <w:t xml:space="preserve"> CALCULATE([</w:t>
+      </w:r>
+      <w:proofErr w:type="spellStart"/>
+      <w:r>
+        <w:rPr>
+          <w:rFonts w:ascii="Bell MT" w:hAnsi="Bell MT"/>
+          <w:lang w:val="en-PK"/>
+        </w:rPr>
+        <w:t>total_to_date</w:t>
+      </w:r>
+      <w:proofErr w:type="spellEnd"/>
+      <w:r>
+        <w:rPr>
+          <w:rFonts w:ascii="Bell MT" w:hAnsi="Bell MT"/>
+          <w:lang w:val="en-PK"/>
+        </w:rPr>
+        <w:t>], 'Chart of Accounts'[Report] = "Balance Sheet"),</w:t>
+      </w:r>
+    </w:p>
+    <w:p>
+      <w:pPr>
+        <w:rPr>
+          <w:rFonts w:ascii="Bell MT" w:hAnsi="Bell MT"/>
+          <w:lang w:val="en-PK"/>
+        </w:rPr>
+      </w:pPr>
+      <w:r>
+        <w:rPr>
+          <w:rFonts w:ascii="Bell MT" w:hAnsi="Bell MT"/>
+          <w:lang w:val="en-PK"/>
+        </w:rPr>
+        <w:t xml:space="preserve"> CALCULATE([</w:t>
+      </w:r>
+      <w:proofErr w:type="spellStart"/>
+      <w:r>
+        <w:rPr>
+          <w:rFonts w:ascii="Bell MT" w:hAnsi="Bell MT"/>
+          <w:lang w:val="en-PK"/>
+        </w:rPr>
+        <w:t>total_FTP</w:t>
+      </w:r>
+      <w:proofErr w:type="spellEnd"/>
+      <w:r>
+        <w:rPr>
+          <w:rFonts w:ascii="Bell MT" w:hAnsi="Bell MT"/>
+          <w:lang w:val="en-PK"/>
+        </w:rPr>
+        <w:t>], 'Chart of Accounts'[Report] = "Profit and Loss")</w:t>
+      </w:r>
+    </w:p>
+    <w:p>
+      <w:pPr>
+        <w:rPr>
+          <w:rFonts w:ascii="Bell MT" w:hAnsi="Bell MT"/>
+          <w:lang w:val="en-PK"/>
+        </w:rPr>
+      </w:pPr>
+      <w:r>
+        <w:rPr>
+          <w:rFonts w:ascii="Bell MT" w:hAnsi="Bell MT"/>
+          <w:lang w:val="en-PK"/>
+        </w:rPr>
+        <w:t>)</w:t>
+      </w:r>
+    </w:p>
+    <w:p>
+      <w:pPr>
+        <w:rPr>
+          <w:rFonts w:cstheme="minorHAnsi"/>
+          <w:lang w:val="en-PK"/>
+        </w:rPr>
+      </w:pPr>
+      <w:r>
+        <w:rPr>
+          <w:lang w:val="en-PK"/>
+        </w:rPr>
+        <w:t xml:space="preserve">Coalesce is used when we have to use 2 measures together. This </w:t>
+      </w:r>
+      <w:proofErr w:type="spellStart"/>
+      <w:r>
+        <w:rPr>
+          <w:lang w:val="en-PK"/>
+        </w:rPr>
+        <w:t>formuyal</w:t>
+      </w:r>
+      <w:proofErr w:type="spellEnd"/>
+      <w:r>
+        <w:rPr>
+          <w:lang w:val="en-PK"/>
+        </w:rPr>
+        <w:t xml:space="preserve"> will give an error actually because of </w:t>
+      </w:r>
+      <w:proofErr w:type="spellStart"/>
+      <w:r>
+        <w:rPr>
+          <w:lang w:val="en-PK"/>
+        </w:rPr>
+        <w:t>total_to_date</w:t>
+      </w:r>
+      <w:proofErr w:type="spellEnd"/>
+      <w:r>
+        <w:rPr>
+          <w:lang w:val="en-PK"/>
+        </w:rPr>
+        <w:t xml:space="preserve"> k </w:t>
+      </w:r>
+      <w:proofErr w:type="spellStart"/>
+      <w:r>
+        <w:rPr>
+          <w:lang w:val="en-PK"/>
+        </w:rPr>
+        <w:t>andr</w:t>
+      </w:r>
+      <w:proofErr w:type="spellEnd"/>
+      <w:r>
+        <w:rPr>
+          <w:lang w:val="en-PK"/>
+        </w:rPr>
+        <w:t xml:space="preserve"> hm n </w:t>
+      </w:r>
+      <w:proofErr w:type="spellStart"/>
+      <w:r>
+        <w:rPr>
+          <w:rFonts w:ascii="Bell MT" w:hAnsi="Bell MT"/>
+          <w:lang w:val="en-PK"/>
+        </w:rPr>
+        <w:t>total_to_date</w:t>
+      </w:r>
+      <w:proofErr w:type="spellEnd"/>
+      <w:r>
+        <w:rPr>
+          <w:rFonts w:ascii="Bell MT" w:hAnsi="Bell MT"/>
+          <w:lang w:val="en-PK"/>
+        </w:rPr>
+        <w:t xml:space="preserve"> = CALCULATE(SUM(GL[Amount]), DATESBETWEEN('Calendar'[Date].[Date], [</w:t>
+      </w:r>
+      <w:proofErr w:type="spellStart"/>
+      <w:r>
+        <w:rPr>
+          <w:rFonts w:ascii="Bell MT" w:hAnsi="Bell MT"/>
+          <w:lang w:val="en-PK"/>
+        </w:rPr>
+        <w:t>min_date_across</w:t>
+      </w:r>
+      <w:proofErr w:type="spellEnd"/>
+      <w:r>
+        <w:rPr>
+          <w:rFonts w:ascii="Bell MT" w:hAnsi="Bell MT"/>
+          <w:lang w:val="en-PK"/>
+        </w:rPr>
+        <w:t>], [</w:t>
+      </w:r>
+      <w:proofErr w:type="spellStart"/>
+      <w:r>
+        <w:rPr>
+          <w:rFonts w:ascii="Bell MT" w:hAnsi="Bell MT"/>
+          <w:lang w:val="en-PK"/>
+        </w:rPr>
+        <w:t>max_date</w:t>
+      </w:r>
+      <w:proofErr w:type="spellEnd"/>
+      <w:r>
+        <w:rPr>
+          <w:rFonts w:ascii="Bell MT" w:hAnsi="Bell MT"/>
+          <w:lang w:val="en-PK"/>
+        </w:rPr>
+        <w:t>]))</w:t>
+      </w:r>
+      <w:r>
+        <w:rPr>
+          <w:rFonts w:ascii="Bell MT" w:hAnsi="Bell MT"/>
+          <w:lang w:val="en-PK"/>
+        </w:rPr>
+        <w:t xml:space="preserve"> </w:t>
+      </w:r>
+      <w:r>
+        <w:rPr>
+          <w:rFonts w:cstheme="minorHAnsi"/>
+          <w:lang w:val="en-PK"/>
+        </w:rPr>
+        <w:t xml:space="preserve">y formula </w:t>
+      </w:r>
+      <w:proofErr w:type="spellStart"/>
+      <w:r>
+        <w:rPr>
+          <w:rFonts w:cstheme="minorHAnsi"/>
+          <w:lang w:val="en-PK"/>
+        </w:rPr>
+        <w:t>lgaya</w:t>
+      </w:r>
+      <w:proofErr w:type="spellEnd"/>
+      <w:r>
+        <w:rPr>
+          <w:rFonts w:cstheme="minorHAnsi"/>
+          <w:lang w:val="en-PK"/>
+        </w:rPr>
+        <w:t xml:space="preserve"> </w:t>
+      </w:r>
+      <w:proofErr w:type="spellStart"/>
+      <w:r>
+        <w:rPr>
+          <w:rFonts w:cstheme="minorHAnsi"/>
+          <w:lang w:val="en-PK"/>
+        </w:rPr>
+        <w:t>hua</w:t>
+      </w:r>
+      <w:proofErr w:type="spellEnd"/>
+      <w:r>
+        <w:rPr>
+          <w:rFonts w:cstheme="minorHAnsi"/>
+          <w:lang w:val="en-PK"/>
+        </w:rPr>
+        <w:t xml:space="preserve"> h and DATE.DATE issue create </w:t>
+      </w:r>
+      <w:proofErr w:type="spellStart"/>
+      <w:r>
+        <w:rPr>
+          <w:rFonts w:cstheme="minorHAnsi"/>
+          <w:lang w:val="en-PK"/>
+        </w:rPr>
+        <w:t>kr</w:t>
+      </w:r>
+      <w:proofErr w:type="spellEnd"/>
+      <w:r>
+        <w:rPr>
+          <w:rFonts w:cstheme="minorHAnsi"/>
+          <w:lang w:val="en-PK"/>
+        </w:rPr>
+        <w:t xml:space="preserve"> </w:t>
+      </w:r>
+      <w:proofErr w:type="spellStart"/>
+      <w:r>
+        <w:rPr>
+          <w:rFonts w:cstheme="minorHAnsi"/>
+          <w:lang w:val="en-PK"/>
+        </w:rPr>
+        <w:t>rha</w:t>
+      </w:r>
+      <w:proofErr w:type="spellEnd"/>
+      <w:r>
+        <w:rPr>
+          <w:rFonts w:cstheme="minorHAnsi"/>
+          <w:lang w:val="en-PK"/>
+        </w:rPr>
+        <w:t xml:space="preserve"> h, is </w:t>
+      </w:r>
+      <w:proofErr w:type="spellStart"/>
+      <w:r>
+        <w:rPr>
+          <w:rFonts w:cstheme="minorHAnsi"/>
+          <w:lang w:val="en-PK"/>
+        </w:rPr>
+        <w:t>liye</w:t>
+      </w:r>
+      <w:proofErr w:type="spellEnd"/>
+      <w:r>
+        <w:rPr>
+          <w:rFonts w:cstheme="minorHAnsi"/>
+          <w:lang w:val="en-PK"/>
+        </w:rPr>
+        <w:t xml:space="preserve"> hm n </w:t>
+      </w:r>
+      <w:proofErr w:type="spellStart"/>
+      <w:r>
+        <w:rPr>
+          <w:rFonts w:cstheme="minorHAnsi"/>
+          <w:lang w:val="en-PK"/>
+        </w:rPr>
+        <w:t>maseed</w:t>
+      </w:r>
+      <w:proofErr w:type="spellEnd"/>
+      <w:r>
+        <w:rPr>
+          <w:rFonts w:cstheme="minorHAnsi"/>
+          <w:lang w:val="en-PK"/>
+        </w:rPr>
+        <w:t xml:space="preserve"> .[Date] ko khatam </w:t>
+      </w:r>
+      <w:proofErr w:type="spellStart"/>
+      <w:r>
+        <w:rPr>
+          <w:rFonts w:cstheme="minorHAnsi"/>
+          <w:lang w:val="en-PK"/>
+        </w:rPr>
+        <w:t>krna</w:t>
+      </w:r>
+      <w:proofErr w:type="spellEnd"/>
+      <w:r>
+        <w:rPr>
+          <w:rFonts w:cstheme="minorHAnsi"/>
+          <w:lang w:val="en-PK"/>
+        </w:rPr>
+        <w:t xml:space="preserve"> h, </w:t>
+      </w:r>
+      <w:proofErr w:type="spellStart"/>
+      <w:r>
+        <w:rPr>
+          <w:rFonts w:cstheme="minorHAnsi"/>
+          <w:lang w:val="en-PK"/>
+        </w:rPr>
+        <w:t>yhan</w:t>
+      </w:r>
+      <w:proofErr w:type="spellEnd"/>
+      <w:r>
+        <w:rPr>
+          <w:rFonts w:cstheme="minorHAnsi"/>
+          <w:lang w:val="en-PK"/>
+        </w:rPr>
+        <w:t xml:space="preserve"> s </w:t>
+      </w:r>
+      <w:proofErr w:type="spellStart"/>
+      <w:r>
+        <w:rPr>
+          <w:rFonts w:cstheme="minorHAnsi"/>
+          <w:lang w:val="en-PK"/>
+        </w:rPr>
+        <w:t>bhi</w:t>
+      </w:r>
+      <w:proofErr w:type="spellEnd"/>
+      <w:r>
+        <w:rPr>
+          <w:rFonts w:cstheme="minorHAnsi"/>
+          <w:lang w:val="en-PK"/>
+        </w:rPr>
+        <w:t xml:space="preserve"> or min date across and max date k formula s </w:t>
+      </w:r>
+      <w:proofErr w:type="spellStart"/>
+      <w:r>
+        <w:rPr>
+          <w:rFonts w:cstheme="minorHAnsi"/>
+          <w:lang w:val="en-PK"/>
+        </w:rPr>
+        <w:t>bhi</w:t>
+      </w:r>
+      <w:proofErr w:type="spellEnd"/>
+      <w:r>
+        <w:rPr>
+          <w:rFonts w:cstheme="minorHAnsi"/>
+          <w:lang w:val="en-PK"/>
+        </w:rPr>
+        <w:t>,</w:t>
+      </w:r>
+      <w:r>
+        <w:rPr>
+          <w:rFonts w:cstheme="minorHAnsi"/>
+          <w:lang w:val="en-PK"/>
+        </w:rPr>
+        <w:t xml:space="preserve"> </w:t>
+      </w:r>
+      <w:proofErr w:type="spellStart"/>
+      <w:r>
+        <w:rPr>
+          <w:rFonts w:cstheme="minorHAnsi"/>
+          <w:lang w:val="en-PK"/>
+        </w:rPr>
+        <w:t>yani</w:t>
+      </w:r>
+      <w:proofErr w:type="spellEnd"/>
+      <w:r>
+        <w:rPr>
+          <w:rFonts w:cstheme="minorHAnsi"/>
+          <w:lang w:val="en-PK"/>
+        </w:rPr>
+        <w:t xml:space="preserve"> hr </w:t>
+      </w:r>
+      <w:proofErr w:type="spellStart"/>
+      <w:r>
+        <w:rPr>
+          <w:rFonts w:cstheme="minorHAnsi"/>
+          <w:lang w:val="en-PK"/>
+        </w:rPr>
+        <w:t>jga</w:t>
+      </w:r>
+      <w:proofErr w:type="spellEnd"/>
+      <w:r>
+        <w:rPr>
+          <w:rFonts w:cstheme="minorHAnsi"/>
+          <w:lang w:val="en-PK"/>
+        </w:rPr>
+        <w:t xml:space="preserve"> s hm n </w:t>
+      </w:r>
+      <w:proofErr w:type="spellStart"/>
+      <w:r>
+        <w:rPr>
+          <w:rFonts w:cstheme="minorHAnsi"/>
+          <w:lang w:val="en-PK"/>
+        </w:rPr>
+        <w:t>date.date</w:t>
+      </w:r>
+      <w:proofErr w:type="spellEnd"/>
+      <w:r>
+        <w:rPr>
+          <w:rFonts w:cstheme="minorHAnsi"/>
+          <w:lang w:val="en-PK"/>
+        </w:rPr>
+        <w:t xml:space="preserve"> vali </w:t>
+      </w:r>
+      <w:proofErr w:type="spellStart"/>
+      <w:r>
+        <w:rPr>
+          <w:rFonts w:cstheme="minorHAnsi"/>
+          <w:lang w:val="en-PK"/>
+        </w:rPr>
+        <w:t>doosri</w:t>
+      </w:r>
+      <w:proofErr w:type="spellEnd"/>
+      <w:r>
+        <w:rPr>
+          <w:rFonts w:cstheme="minorHAnsi"/>
+          <w:lang w:val="en-PK"/>
+        </w:rPr>
+        <w:t xml:space="preserve"> date ko </w:t>
+      </w:r>
+      <w:proofErr w:type="spellStart"/>
+      <w:r>
+        <w:rPr>
+          <w:rFonts w:cstheme="minorHAnsi"/>
+          <w:lang w:val="en-PK"/>
+        </w:rPr>
+        <w:t>htana</w:t>
+      </w:r>
+      <w:proofErr w:type="spellEnd"/>
+      <w:r>
+        <w:rPr>
+          <w:rFonts w:cstheme="minorHAnsi"/>
+          <w:lang w:val="en-PK"/>
+        </w:rPr>
+        <w:t xml:space="preserve"> h</w:t>
+      </w:r>
+      <w:r>
+        <w:rPr>
+          <w:rFonts w:cstheme="minorHAnsi"/>
+          <w:lang w:val="en-PK"/>
+        </w:rPr>
+        <w:t>,</w:t>
+      </w:r>
+      <w:r>
+        <w:rPr>
+          <w:rFonts w:cstheme="minorHAnsi"/>
+          <w:lang w:val="en-PK"/>
+        </w:rPr>
+        <w:t xml:space="preserve"> then </w:t>
+      </w:r>
+      <w:proofErr w:type="spellStart"/>
+      <w:r>
+        <w:rPr>
+          <w:rFonts w:cstheme="minorHAnsi"/>
+          <w:lang w:val="en-PK"/>
+        </w:rPr>
+        <w:t>coalscene</w:t>
+      </w:r>
+      <w:proofErr w:type="spellEnd"/>
+      <w:r>
+        <w:rPr>
+          <w:rFonts w:cstheme="minorHAnsi"/>
+          <w:lang w:val="en-PK"/>
+        </w:rPr>
+        <w:t xml:space="preserve"> </w:t>
+      </w:r>
+      <w:proofErr w:type="spellStart"/>
+      <w:r>
+        <w:rPr>
+          <w:rFonts w:cstheme="minorHAnsi"/>
+          <w:lang w:val="en-PK"/>
+        </w:rPr>
+        <w:t>vala</w:t>
+      </w:r>
+      <w:proofErr w:type="spellEnd"/>
+      <w:r>
+        <w:rPr>
+          <w:rFonts w:cstheme="minorHAnsi"/>
+          <w:lang w:val="en-PK"/>
+        </w:rPr>
+        <w:t xml:space="preserve"> formula correct value return </w:t>
+      </w:r>
+      <w:proofErr w:type="spellStart"/>
+      <w:r>
+        <w:rPr>
+          <w:rFonts w:cstheme="minorHAnsi"/>
+          <w:lang w:val="en-PK"/>
+        </w:rPr>
+        <w:t>kry</w:t>
+      </w:r>
+      <w:proofErr w:type="spellEnd"/>
+      <w:r>
+        <w:rPr>
+          <w:rFonts w:cstheme="minorHAnsi"/>
+          <w:lang w:val="en-PK"/>
+        </w:rPr>
+        <w:t xml:space="preserve"> ga </w:t>
+      </w:r>
+    </w:p>
+    <w:p>
+      <w:pPr>
+        <w:rPr>
+          <w:rFonts w:cstheme="minorHAnsi"/>
+          <w:color w:val="EE0000"/>
+          <w:lang w:val="en-PK"/>
+        </w:rPr>
+      </w:pPr>
+      <w:r>
+        <w:rPr>
+          <w:rFonts w:cstheme="minorHAnsi"/>
+          <w:lang w:val="en-PK"/>
+        </w:rPr>
         <w:lastRenderedPageBreak/>
-        <w:t>total_value_alternate</w:t>
-      </w:r>
-      <w:proofErr w:type="spellEnd"/>
-      <w:r>
-        <w:rPr>
-          <w:rFonts w:ascii="Bell MT" w:hAnsi="Bell MT"/>
-          <w:lang w:val="en-PK"/>
-        </w:rPr>
-        <w:t xml:space="preserve"> = </w:t>
-      </w:r>
-      <w:proofErr w:type="gramStart"/>
-      <w:r>
-        <w:rPr>
-          <w:rFonts w:ascii="Bell MT" w:hAnsi="Bell MT"/>
-          <w:lang w:val="en-PK"/>
-        </w:rPr>
-        <w:t>COALESCE(</w:t>
-      </w:r>
-      <w:proofErr w:type="gramEnd"/>
-    </w:p>
-    <w:p>
-      <w:pPr>
-        <w:rPr>
-          <w:rFonts w:ascii="Bell MT" w:hAnsi="Bell MT"/>
-          <w:lang w:val="en-PK"/>
-        </w:rPr>
-      </w:pPr>
-      <w:r>
-        <w:rPr>
-          <w:rFonts w:ascii="Bell MT" w:hAnsi="Bell MT"/>
-          <w:lang w:val="en-PK"/>
-        </w:rPr>
-        <w:t xml:space="preserve"> CALCULATE([</w:t>
-      </w:r>
-      <w:proofErr w:type="spellStart"/>
-      <w:r>
-        <w:rPr>
-          <w:rFonts w:ascii="Bell MT" w:hAnsi="Bell MT"/>
-          <w:lang w:val="en-PK"/>
-        </w:rPr>
-        <w:t>total_to_date</w:t>
-      </w:r>
-      <w:proofErr w:type="spellEnd"/>
-      <w:r>
-        <w:rPr>
-          <w:rFonts w:ascii="Bell MT" w:hAnsi="Bell MT"/>
-          <w:lang w:val="en-PK"/>
-        </w:rPr>
-        <w:t>], 'Chart of Accounts'[Report] = "Balance Sheet"),</w:t>
-      </w:r>
-    </w:p>
-    <w:p>
-      <w:pPr>
-        <w:rPr>
-          <w:rFonts w:ascii="Bell MT" w:hAnsi="Bell MT"/>
-          <w:lang w:val="en-PK"/>
-        </w:rPr>
-      </w:pPr>
-      <w:r>
-        <w:rPr>
-          <w:rFonts w:ascii="Bell MT" w:hAnsi="Bell MT"/>
-          <w:lang w:val="en-PK"/>
-        </w:rPr>
-        <w:t xml:space="preserve"> CALCULATE([</w:t>
-      </w:r>
-      <w:proofErr w:type="spellStart"/>
-      <w:r>
-        <w:rPr>
-          <w:rFonts w:ascii="Bell MT" w:hAnsi="Bell MT"/>
-          <w:lang w:val="en-PK"/>
-        </w:rPr>
-        <w:t>total_FTP</w:t>
-      </w:r>
-      <w:proofErr w:type="spellEnd"/>
-      <w:r>
-        <w:rPr>
-          <w:rFonts w:ascii="Bell MT" w:hAnsi="Bell MT"/>
-          <w:lang w:val="en-PK"/>
-        </w:rPr>
-        <w:t>], 'Chart of Accounts'[Report] = "Profit and Loss")</w:t>
-      </w:r>
-    </w:p>
-    <w:p>
-      <w:pPr>
-        <w:rPr>
-          <w:rFonts w:ascii="Bell MT" w:hAnsi="Bell MT"/>
-          <w:lang w:val="en-PK"/>
-        </w:rPr>
-      </w:pPr>
-      <w:r>
-        <w:rPr>
-          <w:rFonts w:ascii="Bell MT" w:hAnsi="Bell MT"/>
-          <w:lang w:val="en-PK"/>
-        </w:rPr>
-        <w:t>)</w:t>
-      </w:r>
-    </w:p>
-    <w:p>
-      <w:pPr>
-        <w:rPr>
-          <w:rFonts w:cstheme="minorHAnsi"/>
-          <w:lang w:val="en-PK"/>
-        </w:rPr>
-      </w:pPr>
-      <w:r>
-        <w:rPr>
-          <w:lang w:val="en-PK"/>
-        </w:rPr>
-        <w:t xml:space="preserve">Coalesce is used when we have to use 2 measures together. This </w:t>
-      </w:r>
-      <w:proofErr w:type="spellStart"/>
-      <w:r>
-        <w:rPr>
-          <w:lang w:val="en-PK"/>
-        </w:rPr>
-        <w:t>formuyal</w:t>
-      </w:r>
-      <w:proofErr w:type="spellEnd"/>
-      <w:r>
-        <w:rPr>
-          <w:lang w:val="en-PK"/>
-        </w:rPr>
-        <w:t xml:space="preserve"> will give an error actually because of </w:t>
-      </w:r>
-      <w:proofErr w:type="spellStart"/>
-      <w:r>
-        <w:rPr>
-          <w:lang w:val="en-PK"/>
-        </w:rPr>
-        <w:t>total_to_date</w:t>
-      </w:r>
-      <w:proofErr w:type="spellEnd"/>
-      <w:r>
-        <w:rPr>
-          <w:lang w:val="en-PK"/>
-        </w:rPr>
-        <w:t xml:space="preserve"> k </w:t>
-      </w:r>
-      <w:proofErr w:type="spellStart"/>
-      <w:r>
-        <w:rPr>
-          <w:lang w:val="en-PK"/>
-        </w:rPr>
-        <w:t>andr</w:t>
-      </w:r>
-      <w:proofErr w:type="spellEnd"/>
-      <w:r>
-        <w:rPr>
-          <w:lang w:val="en-PK"/>
-        </w:rPr>
-        <w:t xml:space="preserve"> hm n </w:t>
-      </w:r>
-      <w:proofErr w:type="spellStart"/>
-      <w:r>
-        <w:rPr>
-          <w:rFonts w:ascii="Bell MT" w:hAnsi="Bell MT"/>
-          <w:lang w:val="en-PK"/>
-        </w:rPr>
-        <w:t>total_to_date</w:t>
-      </w:r>
-      <w:proofErr w:type="spellEnd"/>
-      <w:r>
-        <w:rPr>
-          <w:rFonts w:ascii="Bell MT" w:hAnsi="Bell MT"/>
-          <w:lang w:val="en-PK"/>
-        </w:rPr>
-        <w:t xml:space="preserve"> = CALCULATE(SUM(GL[Amount]), DATESBETWEEN('Calendar'[Date].[Date], [</w:t>
-      </w:r>
-      <w:proofErr w:type="spellStart"/>
-      <w:r>
-        <w:rPr>
-          <w:rFonts w:ascii="Bell MT" w:hAnsi="Bell MT"/>
-          <w:lang w:val="en-PK"/>
-        </w:rPr>
-        <w:t>min_date_across</w:t>
-      </w:r>
-      <w:proofErr w:type="spellEnd"/>
-      <w:r>
-        <w:rPr>
-          <w:rFonts w:ascii="Bell MT" w:hAnsi="Bell MT"/>
-          <w:lang w:val="en-PK"/>
-        </w:rPr>
-        <w:t>], [</w:t>
-      </w:r>
-      <w:proofErr w:type="spellStart"/>
-      <w:r>
-        <w:rPr>
-          <w:rFonts w:ascii="Bell MT" w:hAnsi="Bell MT"/>
-          <w:lang w:val="en-PK"/>
-        </w:rPr>
-        <w:t>max_date</w:t>
-      </w:r>
-      <w:proofErr w:type="spellEnd"/>
-      <w:r>
-        <w:rPr>
-          <w:rFonts w:ascii="Bell MT" w:hAnsi="Bell MT"/>
-          <w:lang w:val="en-PK"/>
-        </w:rPr>
-        <w:t>]))</w:t>
-      </w:r>
-      <w:r>
-        <w:rPr>
-          <w:rFonts w:ascii="Bell MT" w:hAnsi="Bell MT"/>
-          <w:lang w:val="en-PK"/>
-        </w:rPr>
-        <w:t xml:space="preserve"> </w:t>
-      </w:r>
-      <w:r>
-        <w:rPr>
-          <w:rFonts w:cstheme="minorHAnsi"/>
-          <w:lang w:val="en-PK"/>
-        </w:rPr>
-        <w:t xml:space="preserve">y formula </w:t>
-      </w:r>
-      <w:proofErr w:type="spellStart"/>
-      <w:r>
-        <w:rPr>
-          <w:rFonts w:cstheme="minorHAnsi"/>
-          <w:lang w:val="en-PK"/>
-        </w:rPr>
-        <w:t>lgaya</w:t>
-      </w:r>
-      <w:proofErr w:type="spellEnd"/>
-      <w:r>
-        <w:rPr>
-          <w:rFonts w:cstheme="minorHAnsi"/>
-          <w:lang w:val="en-PK"/>
-        </w:rPr>
-        <w:t xml:space="preserve"> </w:t>
-      </w:r>
-      <w:proofErr w:type="spellStart"/>
-      <w:r>
-        <w:rPr>
-          <w:rFonts w:cstheme="minorHAnsi"/>
-          <w:lang w:val="en-PK"/>
-        </w:rPr>
-        <w:t>hua</w:t>
-      </w:r>
-      <w:proofErr w:type="spellEnd"/>
-      <w:r>
-        <w:rPr>
-          <w:rFonts w:cstheme="minorHAnsi"/>
-          <w:lang w:val="en-PK"/>
-        </w:rPr>
-        <w:t xml:space="preserve"> h and DATE.DATE issue create </w:t>
-      </w:r>
-      <w:proofErr w:type="spellStart"/>
-      <w:r>
-        <w:rPr>
-          <w:rFonts w:cstheme="minorHAnsi"/>
-          <w:lang w:val="en-PK"/>
-        </w:rPr>
-        <w:t>kr</w:t>
-      </w:r>
-      <w:proofErr w:type="spellEnd"/>
-      <w:r>
-        <w:rPr>
-          <w:rFonts w:cstheme="minorHAnsi"/>
-          <w:lang w:val="en-PK"/>
-        </w:rPr>
-        <w:t xml:space="preserve"> </w:t>
-      </w:r>
-      <w:proofErr w:type="spellStart"/>
-      <w:r>
-        <w:rPr>
-          <w:rFonts w:cstheme="minorHAnsi"/>
-          <w:lang w:val="en-PK"/>
-        </w:rPr>
-        <w:t>rha</w:t>
-      </w:r>
-      <w:proofErr w:type="spellEnd"/>
-      <w:r>
-        <w:rPr>
-          <w:rFonts w:cstheme="minorHAnsi"/>
-          <w:lang w:val="en-PK"/>
-        </w:rPr>
-        <w:t xml:space="preserve"> h, is </w:t>
-      </w:r>
-      <w:proofErr w:type="spellStart"/>
-      <w:r>
-        <w:rPr>
-          <w:rFonts w:cstheme="minorHAnsi"/>
-          <w:lang w:val="en-PK"/>
-        </w:rPr>
-        <w:t>liye</w:t>
-      </w:r>
-      <w:proofErr w:type="spellEnd"/>
-      <w:r>
-        <w:rPr>
-          <w:rFonts w:cstheme="minorHAnsi"/>
-          <w:lang w:val="en-PK"/>
-        </w:rPr>
-        <w:t xml:space="preserve"> hm n </w:t>
-      </w:r>
-      <w:proofErr w:type="spellStart"/>
-      <w:r>
-        <w:rPr>
-          <w:rFonts w:cstheme="minorHAnsi"/>
-          <w:lang w:val="en-PK"/>
-        </w:rPr>
-        <w:t>maseed</w:t>
-      </w:r>
-      <w:proofErr w:type="spellEnd"/>
-      <w:r>
-        <w:rPr>
-          <w:rFonts w:cstheme="minorHAnsi"/>
-          <w:lang w:val="en-PK"/>
-        </w:rPr>
-        <w:t xml:space="preserve"> .[Date] ko khatam </w:t>
-      </w:r>
-      <w:proofErr w:type="spellStart"/>
-      <w:r>
-        <w:rPr>
-          <w:rFonts w:cstheme="minorHAnsi"/>
-          <w:lang w:val="en-PK"/>
-        </w:rPr>
-        <w:t>krna</w:t>
-      </w:r>
-      <w:proofErr w:type="spellEnd"/>
-      <w:r>
-        <w:rPr>
-          <w:rFonts w:cstheme="minorHAnsi"/>
-          <w:lang w:val="en-PK"/>
-        </w:rPr>
-        <w:t xml:space="preserve"> h, </w:t>
-      </w:r>
-      <w:proofErr w:type="spellStart"/>
-      <w:r>
-        <w:rPr>
-          <w:rFonts w:cstheme="minorHAnsi"/>
-          <w:lang w:val="en-PK"/>
-        </w:rPr>
-        <w:t>yhan</w:t>
-      </w:r>
-      <w:proofErr w:type="spellEnd"/>
-      <w:r>
-        <w:rPr>
-          <w:rFonts w:cstheme="minorHAnsi"/>
-          <w:lang w:val="en-PK"/>
-        </w:rPr>
-        <w:t xml:space="preserve"> s </w:t>
-      </w:r>
-      <w:proofErr w:type="spellStart"/>
-      <w:r>
-        <w:rPr>
-          <w:rFonts w:cstheme="minorHAnsi"/>
-          <w:lang w:val="en-PK"/>
-        </w:rPr>
-        <w:t>bhi</w:t>
-      </w:r>
-      <w:proofErr w:type="spellEnd"/>
-      <w:r>
-        <w:rPr>
-          <w:rFonts w:cstheme="minorHAnsi"/>
-          <w:lang w:val="en-PK"/>
-        </w:rPr>
-        <w:t xml:space="preserve"> or min date across and max date k formula s </w:t>
-      </w:r>
-      <w:proofErr w:type="spellStart"/>
-      <w:r>
-        <w:rPr>
-          <w:rFonts w:cstheme="minorHAnsi"/>
-          <w:lang w:val="en-PK"/>
-        </w:rPr>
-        <w:t>bhi</w:t>
-      </w:r>
-      <w:proofErr w:type="spellEnd"/>
-      <w:r>
-        <w:rPr>
-          <w:rFonts w:cstheme="minorHAnsi"/>
-          <w:lang w:val="en-PK"/>
-        </w:rPr>
-        <w:t>,</w:t>
-      </w:r>
-      <w:r>
-        <w:rPr>
-          <w:rFonts w:cstheme="minorHAnsi"/>
-          <w:lang w:val="en-PK"/>
-        </w:rPr>
-        <w:t xml:space="preserve"> </w:t>
-      </w:r>
-      <w:proofErr w:type="spellStart"/>
-      <w:r>
-        <w:rPr>
-          <w:rFonts w:cstheme="minorHAnsi"/>
-          <w:lang w:val="en-PK"/>
-        </w:rPr>
-        <w:t>yani</w:t>
-      </w:r>
-      <w:proofErr w:type="spellEnd"/>
-      <w:r>
-        <w:rPr>
-          <w:rFonts w:cstheme="minorHAnsi"/>
-          <w:lang w:val="en-PK"/>
-        </w:rPr>
-        <w:t xml:space="preserve"> hr </w:t>
-      </w:r>
-      <w:proofErr w:type="spellStart"/>
-      <w:r>
-        <w:rPr>
-          <w:rFonts w:cstheme="minorHAnsi"/>
-          <w:lang w:val="en-PK"/>
-        </w:rPr>
-        <w:t>jga</w:t>
-      </w:r>
-      <w:proofErr w:type="spellEnd"/>
-      <w:r>
-        <w:rPr>
-          <w:rFonts w:cstheme="minorHAnsi"/>
-          <w:lang w:val="en-PK"/>
-        </w:rPr>
-        <w:t xml:space="preserve"> s hm n </w:t>
-      </w:r>
-      <w:proofErr w:type="spellStart"/>
-      <w:r>
-        <w:rPr>
-          <w:rFonts w:cstheme="minorHAnsi"/>
-          <w:lang w:val="en-PK"/>
-        </w:rPr>
-        <w:t>date.date</w:t>
-      </w:r>
-      <w:proofErr w:type="spellEnd"/>
-      <w:r>
-        <w:rPr>
-          <w:rFonts w:cstheme="minorHAnsi"/>
-          <w:lang w:val="en-PK"/>
-        </w:rPr>
-        <w:t xml:space="preserve"> vali </w:t>
-      </w:r>
-      <w:proofErr w:type="spellStart"/>
-      <w:r>
-        <w:rPr>
-          <w:rFonts w:cstheme="minorHAnsi"/>
-          <w:lang w:val="en-PK"/>
-        </w:rPr>
-        <w:t>doosri</w:t>
-      </w:r>
-      <w:proofErr w:type="spellEnd"/>
-      <w:r>
-        <w:rPr>
-          <w:rFonts w:cstheme="minorHAnsi"/>
-          <w:lang w:val="en-PK"/>
-        </w:rPr>
-        <w:t xml:space="preserve"> date ko </w:t>
-      </w:r>
-      <w:proofErr w:type="spellStart"/>
-      <w:r>
-        <w:rPr>
-          <w:rFonts w:cstheme="minorHAnsi"/>
-          <w:lang w:val="en-PK"/>
-        </w:rPr>
-        <w:t>htana</w:t>
-      </w:r>
-      <w:proofErr w:type="spellEnd"/>
-      <w:r>
-        <w:rPr>
-          <w:rFonts w:cstheme="minorHAnsi"/>
-          <w:lang w:val="en-PK"/>
-        </w:rPr>
-        <w:t xml:space="preserve"> h</w:t>
-      </w:r>
-      <w:r>
-        <w:rPr>
-          <w:rFonts w:cstheme="minorHAnsi"/>
-          <w:lang w:val="en-PK"/>
-        </w:rPr>
-        <w:t>,</w:t>
-      </w:r>
-      <w:r>
-        <w:rPr>
-          <w:rFonts w:cstheme="minorHAnsi"/>
-          <w:lang w:val="en-PK"/>
-        </w:rPr>
-        <w:t xml:space="preserve"> then </w:t>
-      </w:r>
-      <w:proofErr w:type="spellStart"/>
-      <w:r>
-        <w:rPr>
-          <w:rFonts w:cstheme="minorHAnsi"/>
-          <w:lang w:val="en-PK"/>
-        </w:rPr>
-        <w:t>coalscene</w:t>
-      </w:r>
-      <w:proofErr w:type="spellEnd"/>
-      <w:r>
-        <w:rPr>
-          <w:rFonts w:cstheme="minorHAnsi"/>
-          <w:lang w:val="en-PK"/>
-        </w:rPr>
-        <w:t xml:space="preserve"> </w:t>
-      </w:r>
-      <w:proofErr w:type="spellStart"/>
-      <w:r>
-        <w:rPr>
-          <w:rFonts w:cstheme="minorHAnsi"/>
-          <w:lang w:val="en-PK"/>
-        </w:rPr>
-        <w:t>vala</w:t>
-      </w:r>
-      <w:proofErr w:type="spellEnd"/>
-      <w:r>
-        <w:rPr>
-          <w:rFonts w:cstheme="minorHAnsi"/>
-          <w:lang w:val="en-PK"/>
-        </w:rPr>
-        <w:t xml:space="preserve"> formula correct value return </w:t>
-      </w:r>
-      <w:proofErr w:type="spellStart"/>
-      <w:r>
-        <w:rPr>
-          <w:rFonts w:cstheme="minorHAnsi"/>
-          <w:lang w:val="en-PK"/>
-        </w:rPr>
-        <w:t>kry</w:t>
-      </w:r>
-      <w:proofErr w:type="spellEnd"/>
-      <w:r>
-        <w:rPr>
-          <w:rFonts w:cstheme="minorHAnsi"/>
-          <w:lang w:val="en-PK"/>
-        </w:rPr>
-        <w:t xml:space="preserve"> ga </w:t>
-      </w:r>
-    </w:p>
-    <w:p>
-      <w:pPr>
-        <w:rPr>
-          <w:rFonts w:cstheme="minorHAnsi"/>
-          <w:color w:val="EE0000"/>
-          <w:lang w:val="en-PK"/>
-        </w:rPr>
-      </w:pPr>
-      <w:r>
-        <w:rPr>
-          <w:rFonts w:cstheme="minorHAnsi"/>
-          <w:lang w:val="en-PK"/>
-        </w:rPr>
         <w:t xml:space="preserve">Lekin m n y formula khud s </w:t>
       </w:r>
       <w:proofErr w:type="spellStart"/>
@@ -18908,14 +19078,7 @@
         <w:rPr>
           <w:lang w:val="en-PK"/>
         </w:rPr>
-        <w:t xml:space="preserve"> </w:t>
-      </w:r>
-      <w:r>
-        <w:rPr>
-          <w:lang w:val="en-PK"/>
-        </w:rPr>
-        <w:lastRenderedPageBreak/>
-        <w:t xml:space="preserve">this value can be misleading because if we have on </w:t>
+        <w:t xml:space="preserve"> this value can be misleading because if we have on </w:t>
       </w:r>
       <w:proofErr w:type="spellStart"/>
       <w:r>
@@ -19484,6 +19647,12 @@
           <w:lang w:val="en-PK"/>
         </w:rPr>
         <w:br/>
+      </w:r>
+      <w:r>
+        <w:rPr>
+          <w:lang w:val="en-PK"/>
+        </w:rPr>
+        <w:lastRenderedPageBreak/>
         <w:t>Mar = 4000</w:t>
       </w:r>
       <w:r>
@@ -19971,7 +20140,6 @@
         <w:rPr>
           <w:lang w:val="en-PK"/>
         </w:rPr>
-        <w:lastRenderedPageBreak/>
         <w:t>outliers have less impact</w:t>
       </w:r>
     </w:p>
@@ -20285,6 +20453,7 @@
         <w:rPr>
           <w:lang w:val="en-PK"/>
         </w:rPr>
+        <w:lastRenderedPageBreak/>
         <w:t xml:space="preserve">We will calculate 30 day moving average: </w:t>
       </w:r>
       <w:r>
@@ -21313,7 +21482,6 @@
           <w:rFonts w:cstheme="minorHAnsi"/>
           <w:lang w:val="en-PK"/>
         </w:rPr>
-        <w:lastRenderedPageBreak/>
         <w:t>yani</w:t>
       </w:r>
       <w:proofErr w:type="spellEnd"/>
@@ -21705,7 +21873,14 @@
         <w:rPr>
           <w:lang w:val="en-PK"/>
         </w:rPr>
-        <w:t>) and the last value present in the account at the last day of the month</w:t>
+        <w:t xml:space="preserve">) and the last value present in the account at the last </w:t>
+      </w:r>
+      <w:r>
+        <w:rPr>
+          <w:lang w:val="en-PK"/>
+        </w:rPr>
+        <w:lastRenderedPageBreak/>
+        <w:t>day of the month</w:t>
       </w:r>
       <w:r>
         <w:rPr>
@@ -22720,602 +22895,602 @@
         <w:rPr>
           <w:lang w:val="en-PK"/>
         </w:rPr>
-        <w:t xml:space="preserve"> </w:t>
-      </w:r>
-      <w:r>
-        <w:rPr>
-          <w:lang w:val="en-PK"/>
+        <w:t xml:space="preserve"> pas balance </w:t>
+      </w:r>
+      <w:proofErr w:type="spellStart"/>
+      <w:r>
+        <w:rPr>
+          <w:lang w:val="en-PK"/>
+        </w:rPr>
+        <w:t>tha</w:t>
+      </w:r>
+      <w:proofErr w:type="spellEnd"/>
+      <w:r>
+        <w:rPr>
+          <w:lang w:val="en-PK"/>
+        </w:rPr>
+        <w:t xml:space="preserve"> 2000$, so we </w:t>
+      </w:r>
+      <w:proofErr w:type="spellStart"/>
+      <w:r>
+        <w:rPr>
+          <w:lang w:val="en-PK"/>
+        </w:rPr>
+        <w:t>wanna</w:t>
+      </w:r>
+      <w:proofErr w:type="spellEnd"/>
+      <w:r>
+        <w:rPr>
+          <w:lang w:val="en-PK"/>
+        </w:rPr>
+        <w:t xml:space="preserve"> check k </w:t>
+      </w:r>
+      <w:proofErr w:type="spellStart"/>
+      <w:r>
+        <w:rPr>
+          <w:lang w:val="en-PK"/>
+        </w:rPr>
+        <w:t>hmary</w:t>
+      </w:r>
+      <w:proofErr w:type="spellEnd"/>
+      <w:r>
+        <w:rPr>
+          <w:lang w:val="en-PK"/>
+        </w:rPr>
+        <w:t xml:space="preserve"> pas </w:t>
+      </w:r>
+      <w:proofErr w:type="spellStart"/>
+      <w:r>
+        <w:rPr>
+          <w:lang w:val="en-PK"/>
+        </w:rPr>
+        <w:t>sirf</w:t>
+      </w:r>
+      <w:proofErr w:type="spellEnd"/>
+      <w:r>
+        <w:rPr>
+          <w:lang w:val="en-PK"/>
+        </w:rPr>
+        <w:t xml:space="preserve"> Feb k month m </w:t>
+      </w:r>
+      <w:proofErr w:type="spellStart"/>
+      <w:r>
+        <w:rPr>
+          <w:lang w:val="en-PK"/>
+        </w:rPr>
+        <w:t>kitna</w:t>
+      </w:r>
+      <w:proofErr w:type="spellEnd"/>
+      <w:r>
+        <w:rPr>
+          <w:lang w:val="en-PK"/>
+        </w:rPr>
+        <w:t xml:space="preserve"> balance generate </w:t>
+      </w:r>
+      <w:proofErr w:type="spellStart"/>
+      <w:r>
+        <w:rPr>
+          <w:lang w:val="en-PK"/>
+        </w:rPr>
+        <w:t>hua</w:t>
+      </w:r>
+      <w:proofErr w:type="spellEnd"/>
+      <w:r>
+        <w:rPr>
+          <w:lang w:val="en-PK"/>
+        </w:rPr>
+        <w:t xml:space="preserve">, </w:t>
+      </w:r>
+      <w:proofErr w:type="spellStart"/>
+      <w:r>
+        <w:rPr>
+          <w:lang w:val="en-PK"/>
+        </w:rPr>
+        <w:t>yani</w:t>
+      </w:r>
+      <w:proofErr w:type="spellEnd"/>
+      <w:r>
+        <w:rPr>
+          <w:lang w:val="en-PK"/>
+        </w:rPr>
+        <w:t xml:space="preserve"> </w:t>
+      </w:r>
+      <w:proofErr w:type="spellStart"/>
+      <w:r>
+        <w:rPr>
+          <w:lang w:val="en-PK"/>
+        </w:rPr>
+        <w:t>jan</w:t>
+      </w:r>
+      <w:proofErr w:type="spellEnd"/>
+      <w:r>
+        <w:rPr>
+          <w:lang w:val="en-PK"/>
+        </w:rPr>
+        <w:t xml:space="preserve"> m just 1000$ and </w:t>
+      </w:r>
+      <w:proofErr w:type="spellStart"/>
+      <w:r>
+        <w:rPr>
+          <w:lang w:val="en-PK"/>
+        </w:rPr>
+        <w:t>feb</w:t>
+      </w:r>
+      <w:proofErr w:type="spellEnd"/>
+      <w:r>
+        <w:rPr>
+          <w:lang w:val="en-PK"/>
+        </w:rPr>
+        <w:t xml:space="preserve"> m 2000$ </w:t>
+      </w:r>
+      <w:proofErr w:type="spellStart"/>
+      <w:r>
+        <w:rPr>
+          <w:lang w:val="en-PK"/>
+        </w:rPr>
+        <w:t>jan</w:t>
+      </w:r>
+      <w:proofErr w:type="spellEnd"/>
+      <w:r>
+        <w:rPr>
+          <w:lang w:val="en-PK"/>
+        </w:rPr>
+        <w:t xml:space="preserve"> and </w:t>
+      </w:r>
+      <w:proofErr w:type="spellStart"/>
+      <w:r>
+        <w:rPr>
+          <w:lang w:val="en-PK"/>
+        </w:rPr>
+        <w:t>feb</w:t>
+      </w:r>
+      <w:proofErr w:type="spellEnd"/>
+      <w:r>
+        <w:rPr>
+          <w:lang w:val="en-PK"/>
+        </w:rPr>
+        <w:t xml:space="preserve"> </w:t>
+      </w:r>
+      <w:proofErr w:type="spellStart"/>
+      <w:r>
+        <w:rPr>
+          <w:lang w:val="en-PK"/>
+        </w:rPr>
+        <w:t>dono</w:t>
+      </w:r>
+      <w:proofErr w:type="spellEnd"/>
+      <w:r>
+        <w:rPr>
+          <w:lang w:val="en-PK"/>
+        </w:rPr>
+        <w:t xml:space="preserve"> ka </w:t>
+      </w:r>
+      <w:proofErr w:type="spellStart"/>
+      <w:r>
+        <w:rPr>
+          <w:lang w:val="en-PK"/>
+        </w:rPr>
+        <w:t>mila</w:t>
+      </w:r>
+      <w:proofErr w:type="spellEnd"/>
+      <w:r>
+        <w:rPr>
+          <w:lang w:val="en-PK"/>
+        </w:rPr>
+        <w:t xml:space="preserve"> </w:t>
+      </w:r>
+      <w:proofErr w:type="spellStart"/>
+      <w:r>
+        <w:rPr>
+          <w:lang w:val="en-PK"/>
+        </w:rPr>
+        <w:t>kr</w:t>
+      </w:r>
+      <w:proofErr w:type="spellEnd"/>
+      <w:r>
+        <w:rPr>
+          <w:lang w:val="en-PK"/>
+        </w:rPr>
+        <w:t xml:space="preserve"> h, </w:t>
+      </w:r>
+      <w:proofErr w:type="spellStart"/>
+      <w:r>
+        <w:rPr>
+          <w:lang w:val="en-PK"/>
+        </w:rPr>
+        <w:t>sirf</w:t>
+      </w:r>
+      <w:proofErr w:type="spellEnd"/>
+      <w:r>
+        <w:rPr>
+          <w:lang w:val="en-PK"/>
+        </w:rPr>
+        <w:t xml:space="preserve"> </w:t>
+      </w:r>
+      <w:proofErr w:type="spellStart"/>
+      <w:r>
+        <w:rPr>
+          <w:lang w:val="en-PK"/>
+        </w:rPr>
+        <w:t>feb</w:t>
+      </w:r>
+      <w:proofErr w:type="spellEnd"/>
+      <w:r>
+        <w:rPr>
+          <w:lang w:val="en-PK"/>
+        </w:rPr>
+        <w:t xml:space="preserve"> ka get </w:t>
+      </w:r>
+      <w:proofErr w:type="spellStart"/>
+      <w:r>
+        <w:rPr>
+          <w:lang w:val="en-PK"/>
+        </w:rPr>
+        <w:t>krny</w:t>
+      </w:r>
+      <w:proofErr w:type="spellEnd"/>
+      <w:r>
+        <w:rPr>
+          <w:lang w:val="en-PK"/>
+        </w:rPr>
+        <w:t xml:space="preserve"> k </w:t>
+      </w:r>
+      <w:proofErr w:type="spellStart"/>
+      <w:r>
+        <w:rPr>
+          <w:lang w:val="en-PK"/>
+        </w:rPr>
+        <w:t>liye</w:t>
+      </w:r>
+      <w:proofErr w:type="spellEnd"/>
+      <w:r>
+        <w:rPr>
+          <w:lang w:val="en-PK"/>
+        </w:rPr>
+        <w:t xml:space="preserve"> hm </w:t>
+      </w:r>
+      <w:proofErr w:type="spellStart"/>
+      <w:r>
+        <w:rPr>
+          <w:lang w:val="en-PK"/>
+        </w:rPr>
+        <w:t>fdeb</w:t>
+      </w:r>
+      <w:proofErr w:type="spellEnd"/>
+      <w:r>
+        <w:rPr>
+          <w:lang w:val="en-PK"/>
+        </w:rPr>
+        <w:t xml:space="preserve"> m s </w:t>
+      </w:r>
+      <w:proofErr w:type="spellStart"/>
+      <w:r>
+        <w:rPr>
+          <w:lang w:val="en-PK"/>
+        </w:rPr>
+        <w:t>jan</w:t>
+      </w:r>
+      <w:proofErr w:type="spellEnd"/>
+      <w:r>
+        <w:rPr>
+          <w:lang w:val="en-PK"/>
+        </w:rPr>
+        <w:t xml:space="preserve"> ka balance minus </w:t>
+      </w:r>
+      <w:proofErr w:type="spellStart"/>
+      <w:r>
+        <w:rPr>
+          <w:lang w:val="en-PK"/>
+        </w:rPr>
+        <w:t>kryn</w:t>
+      </w:r>
+      <w:proofErr w:type="spellEnd"/>
+      <w:r>
+        <w:rPr>
+          <w:lang w:val="en-PK"/>
+        </w:rPr>
+        <w:t xml:space="preserve"> </w:t>
+      </w:r>
+      <w:proofErr w:type="spellStart"/>
+      <w:r>
+        <w:rPr>
+          <w:lang w:val="en-PK"/>
+        </w:rPr>
+        <w:t>gy</w:t>
+      </w:r>
+      <w:proofErr w:type="spellEnd"/>
+      <w:r>
+        <w:rPr>
+          <w:lang w:val="en-PK"/>
+        </w:rPr>
+        <w:t xml:space="preserve">, </w:t>
+      </w:r>
+      <w:proofErr w:type="spellStart"/>
+      <w:r>
+        <w:rPr>
+          <w:lang w:val="en-PK"/>
+        </w:rPr>
+        <w:t>yani</w:t>
+      </w:r>
+      <w:proofErr w:type="spellEnd"/>
+      <w:r>
+        <w:rPr>
+          <w:lang w:val="en-PK"/>
+        </w:rPr>
+        <w:t xml:space="preserve"> </w:t>
+      </w:r>
+      <w:proofErr w:type="spellStart"/>
+      <w:r>
+        <w:rPr>
+          <w:lang w:val="en-PK"/>
+        </w:rPr>
+        <w:t>feb</w:t>
+      </w:r>
+      <w:proofErr w:type="spellEnd"/>
+      <w:r>
+        <w:rPr>
+          <w:lang w:val="en-PK"/>
+        </w:rPr>
+        <w:t xml:space="preserve"> ka opening balance is actually the closing balance of </w:t>
+      </w:r>
+      <w:proofErr w:type="spellStart"/>
+      <w:r>
+        <w:rPr>
+          <w:lang w:val="en-PK"/>
+        </w:rPr>
+        <w:t>jan</w:t>
+      </w:r>
+      <w:proofErr w:type="spellEnd"/>
+      <w:r>
+        <w:rPr>
+          <w:lang w:val="en-PK"/>
+        </w:rPr>
+        <w:t xml:space="preserve">, we </w:t>
+      </w:r>
+      <w:proofErr w:type="spellStart"/>
+      <w:r>
+        <w:rPr>
+          <w:lang w:val="en-PK"/>
+        </w:rPr>
+        <w:t>wil</w:t>
+      </w:r>
+      <w:proofErr w:type="spellEnd"/>
+      <w:r>
+        <w:rPr>
+          <w:lang w:val="en-PK"/>
+        </w:rPr>
+        <w:t xml:space="preserve"> 1st calculate the opening balance if </w:t>
+      </w:r>
+      <w:proofErr w:type="spellStart"/>
+      <w:r>
+        <w:rPr>
+          <w:lang w:val="en-PK"/>
+        </w:rPr>
+        <w:t>feb</w:t>
+      </w:r>
+      <w:proofErr w:type="spellEnd"/>
+      <w:r>
+        <w:rPr>
+          <w:lang w:val="en-PK"/>
+        </w:rPr>
+        <w:t xml:space="preserve"> (opening balance = TTD – FTP), and then is opening balance of </w:t>
+      </w:r>
+      <w:proofErr w:type="spellStart"/>
+      <w:r>
+        <w:rPr>
+          <w:lang w:val="en-PK"/>
+        </w:rPr>
+        <w:t>feb</w:t>
+      </w:r>
+      <w:proofErr w:type="spellEnd"/>
+      <w:r>
+        <w:rPr>
+          <w:lang w:val="en-PK"/>
+        </w:rPr>
+        <w:t xml:space="preserve"> m</w:t>
+      </w:r>
+      <w:r>
+        <w:rPr>
+          <w:lang w:val="en-PK"/>
+        </w:rPr>
+        <w:t xml:space="preserve"> </w:t>
+      </w:r>
+      <w:r>
+        <w:rPr>
+          <w:lang w:val="en-PK"/>
+        </w:rPr>
+        <w:t xml:space="preserve">s minus </w:t>
+      </w:r>
+      <w:proofErr w:type="spellStart"/>
+      <w:r>
+        <w:rPr>
+          <w:lang w:val="en-PK"/>
+        </w:rPr>
+        <w:t>kryn</w:t>
+      </w:r>
+      <w:proofErr w:type="spellEnd"/>
+      <w:r>
+        <w:rPr>
+          <w:lang w:val="en-PK"/>
+        </w:rPr>
+        <w:t xml:space="preserve"> </w:t>
+      </w:r>
+      <w:proofErr w:type="spellStart"/>
+      <w:r>
+        <w:rPr>
+          <w:lang w:val="en-PK"/>
+        </w:rPr>
+        <w:t>gy</w:t>
+      </w:r>
+      <w:proofErr w:type="spellEnd"/>
+      <w:r>
+        <w:rPr>
+          <w:lang w:val="en-PK"/>
+        </w:rPr>
+        <w:t xml:space="preserve"> </w:t>
+      </w:r>
+      <w:proofErr w:type="spellStart"/>
+      <w:r>
+        <w:rPr>
+          <w:lang w:val="en-PK"/>
+        </w:rPr>
+        <w:t>feb</w:t>
+      </w:r>
+      <w:proofErr w:type="spellEnd"/>
+      <w:r>
+        <w:rPr>
+          <w:lang w:val="en-PK"/>
+        </w:rPr>
+        <w:t xml:space="preserve"> ka closing balance which is 2000$ in this case,, so </w:t>
+      </w:r>
+      <w:r>
+        <w:rPr>
+          <w:lang w:val="en-PK"/>
+        </w:rPr>
+        <w:t xml:space="preserve">growth in </w:t>
+      </w:r>
+      <w:proofErr w:type="spellStart"/>
+      <w:r>
+        <w:rPr>
+          <w:lang w:val="en-PK"/>
+        </w:rPr>
+        <w:t>feb</w:t>
+      </w:r>
+      <w:proofErr w:type="spellEnd"/>
+      <w:r>
+        <w:rPr>
+          <w:lang w:val="en-PK"/>
+        </w:rPr>
+        <w:t xml:space="preserve"> = closing balance – opening balance (2000 – 1000 = 1000$)</w:t>
+      </w:r>
+      <w:r>
+        <w:rPr>
+          <w:lang w:val="en-PK"/>
+        </w:rPr>
+        <w:t>,</w:t>
+      </w:r>
+      <w:r>
+        <w:rPr>
+          <w:lang w:val="en-PK"/>
+        </w:rPr>
+        <w:t xml:space="preserve">, if we </w:t>
+      </w:r>
+      <w:proofErr w:type="spellStart"/>
+      <w:r>
+        <w:rPr>
+          <w:lang w:val="en-PK"/>
+        </w:rPr>
+        <w:t>wanna</w:t>
+      </w:r>
+      <w:proofErr w:type="spellEnd"/>
+      <w:r>
+        <w:rPr>
+          <w:lang w:val="en-PK"/>
+        </w:rPr>
+        <w:t xml:space="preserve"> get the percentage , we use formula (closing – opening)/opening, OR (current value – previous value)/previous value   ,, </w:t>
+      </w:r>
+      <w:proofErr w:type="spellStart"/>
+      <w:r>
+        <w:rPr>
+          <w:lang w:val="en-PK"/>
+        </w:rPr>
+        <w:t>yani</w:t>
+      </w:r>
+      <w:proofErr w:type="spellEnd"/>
+      <w:r>
+        <w:rPr>
+          <w:lang w:val="en-PK"/>
+        </w:rPr>
+        <w:t xml:space="preserve"> current value jo is time account m h which also include some amount from previous month and previous value is actually the value from the previous month or we can also say it as the opening value for this month and divide it with previous value because </w:t>
+      </w:r>
+      <w:r>
+        <w:rPr>
+          <w:highlight w:val="yellow"/>
+        </w:rPr>
+        <w:t xml:space="preserve">percentage k </w:t>
+      </w:r>
+      <w:proofErr w:type="spellStart"/>
+      <w:r>
+        <w:rPr>
+          <w:highlight w:val="yellow"/>
+        </w:rPr>
+        <w:t>liye</w:t>
+      </w:r>
+      <w:proofErr w:type="spellEnd"/>
+      <w:r>
+        <w:rPr>
+          <w:highlight w:val="yellow"/>
+        </w:rPr>
+        <w:t xml:space="preserve"> hm </w:t>
+      </w:r>
+      <w:r>
+        <w:rPr>
+          <w:highlight w:val="yellow"/>
+        </w:rPr>
+        <w:t xml:space="preserve">y </w:t>
+      </w:r>
+      <w:proofErr w:type="spellStart"/>
+      <w:r>
+        <w:rPr>
+          <w:highlight w:val="yellow"/>
+        </w:rPr>
+        <w:t>dekhty</w:t>
+      </w:r>
+      <w:proofErr w:type="spellEnd"/>
+      <w:r>
+        <w:rPr>
+          <w:highlight w:val="yellow"/>
+        </w:rPr>
+        <w:t xml:space="preserve"> </w:t>
+      </w:r>
+      <w:proofErr w:type="spellStart"/>
+      <w:r>
+        <w:rPr>
+          <w:highlight w:val="yellow"/>
+        </w:rPr>
+        <w:t>hn</w:t>
+      </w:r>
+      <w:proofErr w:type="spellEnd"/>
+      <w:r>
+        <w:rPr>
+          <w:highlight w:val="yellow"/>
+        </w:rPr>
+        <w:t xml:space="preserve"> k hm n </w:t>
+      </w:r>
+      <w:proofErr w:type="spellStart"/>
+      <w:r>
+        <w:rPr>
+          <w:highlight w:val="yellow"/>
+        </w:rPr>
+        <w:t>kis</w:t>
+      </w:r>
+      <w:proofErr w:type="spellEnd"/>
+      <w:r>
+        <w:rPr>
+          <w:highlight w:val="yellow"/>
+        </w:rPr>
+        <w:t xml:space="preserve"> value k </w:t>
+      </w:r>
+      <w:proofErr w:type="spellStart"/>
+      <w:r>
+        <w:rPr>
+          <w:highlight w:val="yellow"/>
+        </w:rPr>
+        <w:t>muqably</w:t>
+      </w:r>
+      <w:proofErr w:type="spellEnd"/>
+      <w:r>
+        <w:rPr>
+          <w:highlight w:val="yellow"/>
+        </w:rPr>
+        <w:t xml:space="preserve"> m amount ka </w:t>
+      </w:r>
+      <w:r>
+        <w:rPr>
+          <w:highlight w:val="yellow"/>
         </w:rPr>
         <w:lastRenderedPageBreak/>
-        <w:t xml:space="preserve">pas balance </w:t>
-      </w:r>
-      <w:proofErr w:type="spellStart"/>
-      <w:r>
-        <w:rPr>
-          <w:lang w:val="en-PK"/>
-        </w:rPr>
-        <w:t>tha</w:t>
-      </w:r>
-      <w:proofErr w:type="spellEnd"/>
-      <w:r>
-        <w:rPr>
-          <w:lang w:val="en-PK"/>
-        </w:rPr>
-        <w:t xml:space="preserve"> 2000$, so we </w:t>
-      </w:r>
-      <w:proofErr w:type="spellStart"/>
-      <w:r>
-        <w:rPr>
-          <w:lang w:val="en-PK"/>
-        </w:rPr>
-        <w:t>wanna</w:t>
-      </w:r>
-      <w:proofErr w:type="spellEnd"/>
-      <w:r>
-        <w:rPr>
-          <w:lang w:val="en-PK"/>
-        </w:rPr>
-        <w:t xml:space="preserve"> check k </w:t>
-      </w:r>
-      <w:proofErr w:type="spellStart"/>
-      <w:r>
-        <w:rPr>
-          <w:lang w:val="en-PK"/>
-        </w:rPr>
-        <w:t>hmary</w:t>
-      </w:r>
-      <w:proofErr w:type="spellEnd"/>
-      <w:r>
-        <w:rPr>
-          <w:lang w:val="en-PK"/>
-        </w:rPr>
-        <w:t xml:space="preserve"> pas </w:t>
-      </w:r>
-      <w:proofErr w:type="spellStart"/>
-      <w:r>
-        <w:rPr>
-          <w:lang w:val="en-PK"/>
-        </w:rPr>
-        <w:t>sirf</w:t>
-      </w:r>
-      <w:proofErr w:type="spellEnd"/>
-      <w:r>
-        <w:rPr>
-          <w:lang w:val="en-PK"/>
-        </w:rPr>
-        <w:t xml:space="preserve"> Feb k month m </w:t>
-      </w:r>
-      <w:proofErr w:type="spellStart"/>
-      <w:r>
-        <w:rPr>
-          <w:lang w:val="en-PK"/>
-        </w:rPr>
-        <w:t>kitna</w:t>
-      </w:r>
-      <w:proofErr w:type="spellEnd"/>
-      <w:r>
-        <w:rPr>
-          <w:lang w:val="en-PK"/>
-        </w:rPr>
-        <w:t xml:space="preserve"> balance generate </w:t>
-      </w:r>
-      <w:proofErr w:type="spellStart"/>
-      <w:r>
-        <w:rPr>
-          <w:lang w:val="en-PK"/>
-        </w:rPr>
-        <w:t>hua</w:t>
-      </w:r>
-      <w:proofErr w:type="spellEnd"/>
-      <w:r>
-        <w:rPr>
-          <w:lang w:val="en-PK"/>
-        </w:rPr>
-        <w:t xml:space="preserve">, </w:t>
-      </w:r>
-      <w:proofErr w:type="spellStart"/>
-      <w:r>
-        <w:rPr>
-          <w:lang w:val="en-PK"/>
-        </w:rPr>
-        <w:t>yani</w:t>
-      </w:r>
-      <w:proofErr w:type="spellEnd"/>
-      <w:r>
-        <w:rPr>
-          <w:lang w:val="en-PK"/>
-        </w:rPr>
-        <w:t xml:space="preserve"> </w:t>
-      </w:r>
-      <w:proofErr w:type="spellStart"/>
-      <w:r>
-        <w:rPr>
-          <w:lang w:val="en-PK"/>
-        </w:rPr>
-        <w:t>jan</w:t>
-      </w:r>
-      <w:proofErr w:type="spellEnd"/>
-      <w:r>
-        <w:rPr>
-          <w:lang w:val="en-PK"/>
-        </w:rPr>
-        <w:t xml:space="preserve"> m just 1000$ and </w:t>
-      </w:r>
-      <w:proofErr w:type="spellStart"/>
-      <w:r>
-        <w:rPr>
-          <w:lang w:val="en-PK"/>
-        </w:rPr>
-        <w:t>feb</w:t>
-      </w:r>
-      <w:proofErr w:type="spellEnd"/>
-      <w:r>
-        <w:rPr>
-          <w:lang w:val="en-PK"/>
-        </w:rPr>
-        <w:t xml:space="preserve"> m 2000$ </w:t>
-      </w:r>
-      <w:proofErr w:type="spellStart"/>
-      <w:r>
-        <w:rPr>
-          <w:lang w:val="en-PK"/>
-        </w:rPr>
-        <w:t>jan</w:t>
-      </w:r>
-      <w:proofErr w:type="spellEnd"/>
-      <w:r>
-        <w:rPr>
-          <w:lang w:val="en-PK"/>
-        </w:rPr>
-        <w:t xml:space="preserve"> and </w:t>
-      </w:r>
-      <w:proofErr w:type="spellStart"/>
-      <w:r>
-        <w:rPr>
-          <w:lang w:val="en-PK"/>
-        </w:rPr>
-        <w:t>feb</w:t>
-      </w:r>
-      <w:proofErr w:type="spellEnd"/>
-      <w:r>
-        <w:rPr>
-          <w:lang w:val="en-PK"/>
-        </w:rPr>
-        <w:t xml:space="preserve"> </w:t>
-      </w:r>
-      <w:proofErr w:type="spellStart"/>
-      <w:r>
-        <w:rPr>
-          <w:lang w:val="en-PK"/>
-        </w:rPr>
-        <w:t>dono</w:t>
-      </w:r>
-      <w:proofErr w:type="spellEnd"/>
-      <w:r>
-        <w:rPr>
-          <w:lang w:val="en-PK"/>
-        </w:rPr>
-        <w:t xml:space="preserve"> ka </w:t>
-      </w:r>
-      <w:proofErr w:type="spellStart"/>
-      <w:r>
-        <w:rPr>
-          <w:lang w:val="en-PK"/>
-        </w:rPr>
-        <w:t>mila</w:t>
-      </w:r>
-      <w:proofErr w:type="spellEnd"/>
-      <w:r>
-        <w:rPr>
-          <w:lang w:val="en-PK"/>
-        </w:rPr>
-        <w:t xml:space="preserve"> </w:t>
-      </w:r>
-      <w:proofErr w:type="spellStart"/>
-      <w:r>
-        <w:rPr>
-          <w:lang w:val="en-PK"/>
-        </w:rPr>
-        <w:t>kr</w:t>
-      </w:r>
-      <w:proofErr w:type="spellEnd"/>
-      <w:r>
-        <w:rPr>
-          <w:lang w:val="en-PK"/>
-        </w:rPr>
-        <w:t xml:space="preserve"> h, </w:t>
-      </w:r>
-      <w:proofErr w:type="spellStart"/>
-      <w:r>
-        <w:rPr>
-          <w:lang w:val="en-PK"/>
-        </w:rPr>
-        <w:t>sirf</w:t>
-      </w:r>
-      <w:proofErr w:type="spellEnd"/>
-      <w:r>
-        <w:rPr>
-          <w:lang w:val="en-PK"/>
-        </w:rPr>
-        <w:t xml:space="preserve"> </w:t>
-      </w:r>
-      <w:proofErr w:type="spellStart"/>
-      <w:r>
-        <w:rPr>
-          <w:lang w:val="en-PK"/>
-        </w:rPr>
-        <w:t>feb</w:t>
-      </w:r>
-      <w:proofErr w:type="spellEnd"/>
-      <w:r>
-        <w:rPr>
-          <w:lang w:val="en-PK"/>
-        </w:rPr>
-        <w:t xml:space="preserve"> ka get </w:t>
-      </w:r>
-      <w:proofErr w:type="spellStart"/>
-      <w:r>
-        <w:rPr>
-          <w:lang w:val="en-PK"/>
-        </w:rPr>
-        <w:t>krny</w:t>
-      </w:r>
-      <w:proofErr w:type="spellEnd"/>
-      <w:r>
-        <w:rPr>
-          <w:lang w:val="en-PK"/>
-        </w:rPr>
-        <w:t xml:space="preserve"> k </w:t>
-      </w:r>
-      <w:proofErr w:type="spellStart"/>
-      <w:r>
-        <w:rPr>
-          <w:lang w:val="en-PK"/>
-        </w:rPr>
-        <w:t>liye</w:t>
-      </w:r>
-      <w:proofErr w:type="spellEnd"/>
-      <w:r>
-        <w:rPr>
-          <w:lang w:val="en-PK"/>
-        </w:rPr>
-        <w:t xml:space="preserve"> hm </w:t>
-      </w:r>
-      <w:proofErr w:type="spellStart"/>
-      <w:r>
-        <w:rPr>
-          <w:lang w:val="en-PK"/>
-        </w:rPr>
-        <w:t>fdeb</w:t>
-      </w:r>
-      <w:proofErr w:type="spellEnd"/>
-      <w:r>
-        <w:rPr>
-          <w:lang w:val="en-PK"/>
-        </w:rPr>
-        <w:t xml:space="preserve"> m s </w:t>
-      </w:r>
-      <w:proofErr w:type="spellStart"/>
-      <w:r>
-        <w:rPr>
-          <w:lang w:val="en-PK"/>
-        </w:rPr>
-        <w:t>jan</w:t>
-      </w:r>
-      <w:proofErr w:type="spellEnd"/>
-      <w:r>
-        <w:rPr>
-          <w:lang w:val="en-PK"/>
-        </w:rPr>
-        <w:t xml:space="preserve"> ka balance minus </w:t>
-      </w:r>
-      <w:proofErr w:type="spellStart"/>
-      <w:r>
-        <w:rPr>
-          <w:lang w:val="en-PK"/>
-        </w:rPr>
-        <w:t>kryn</w:t>
-      </w:r>
-      <w:proofErr w:type="spellEnd"/>
-      <w:r>
-        <w:rPr>
-          <w:lang w:val="en-PK"/>
-        </w:rPr>
-        <w:t xml:space="preserve"> </w:t>
-      </w:r>
-      <w:proofErr w:type="spellStart"/>
-      <w:r>
-        <w:rPr>
-          <w:lang w:val="en-PK"/>
-        </w:rPr>
-        <w:t>gy</w:t>
-      </w:r>
-      <w:proofErr w:type="spellEnd"/>
-      <w:r>
-        <w:rPr>
-          <w:lang w:val="en-PK"/>
-        </w:rPr>
-        <w:t xml:space="preserve">, </w:t>
-      </w:r>
-      <w:proofErr w:type="spellStart"/>
-      <w:r>
-        <w:rPr>
-          <w:lang w:val="en-PK"/>
-        </w:rPr>
-        <w:t>yani</w:t>
-      </w:r>
-      <w:proofErr w:type="spellEnd"/>
-      <w:r>
-        <w:rPr>
-          <w:lang w:val="en-PK"/>
-        </w:rPr>
-        <w:t xml:space="preserve"> </w:t>
-      </w:r>
-      <w:proofErr w:type="spellStart"/>
-      <w:r>
-        <w:rPr>
-          <w:lang w:val="en-PK"/>
-        </w:rPr>
-        <w:t>feb</w:t>
-      </w:r>
-      <w:proofErr w:type="spellEnd"/>
-      <w:r>
-        <w:rPr>
-          <w:lang w:val="en-PK"/>
-        </w:rPr>
-        <w:t xml:space="preserve"> ka opening balance is actually the closing balance of </w:t>
-      </w:r>
-      <w:proofErr w:type="spellStart"/>
-      <w:r>
-        <w:rPr>
-          <w:lang w:val="en-PK"/>
-        </w:rPr>
-        <w:t>jan</w:t>
-      </w:r>
-      <w:proofErr w:type="spellEnd"/>
-      <w:r>
-        <w:rPr>
-          <w:lang w:val="en-PK"/>
-        </w:rPr>
-        <w:t xml:space="preserve">, we </w:t>
-      </w:r>
-      <w:proofErr w:type="spellStart"/>
-      <w:r>
-        <w:rPr>
-          <w:lang w:val="en-PK"/>
-        </w:rPr>
-        <w:t>wil</w:t>
-      </w:r>
-      <w:proofErr w:type="spellEnd"/>
-      <w:r>
-        <w:rPr>
-          <w:lang w:val="en-PK"/>
-        </w:rPr>
-        <w:t xml:space="preserve"> 1st calculate the opening balance if </w:t>
-      </w:r>
-      <w:proofErr w:type="spellStart"/>
-      <w:r>
-        <w:rPr>
-          <w:lang w:val="en-PK"/>
-        </w:rPr>
-        <w:t>feb</w:t>
-      </w:r>
-      <w:proofErr w:type="spellEnd"/>
-      <w:r>
-        <w:rPr>
-          <w:lang w:val="en-PK"/>
-        </w:rPr>
-        <w:t xml:space="preserve"> (opening balance = TTD – FTP), and then is opening balance of </w:t>
-      </w:r>
-      <w:proofErr w:type="spellStart"/>
-      <w:r>
-        <w:rPr>
-          <w:lang w:val="en-PK"/>
-        </w:rPr>
-        <w:t>feb</w:t>
-      </w:r>
-      <w:proofErr w:type="spellEnd"/>
-      <w:r>
-        <w:rPr>
-          <w:lang w:val="en-PK"/>
-        </w:rPr>
-        <w:t xml:space="preserve"> m</w:t>
-      </w:r>
-      <w:r>
-        <w:rPr>
-          <w:lang w:val="en-PK"/>
-        </w:rPr>
-        <w:t xml:space="preserve"> </w:t>
-      </w:r>
-      <w:r>
-        <w:rPr>
-          <w:lang w:val="en-PK"/>
-        </w:rPr>
-        <w:t xml:space="preserve">s minus </w:t>
-      </w:r>
-      <w:proofErr w:type="spellStart"/>
-      <w:r>
-        <w:rPr>
-          <w:lang w:val="en-PK"/>
-        </w:rPr>
-        <w:t>kryn</w:t>
-      </w:r>
-      <w:proofErr w:type="spellEnd"/>
-      <w:r>
-        <w:rPr>
-          <w:lang w:val="en-PK"/>
-        </w:rPr>
-        <w:t xml:space="preserve"> </w:t>
-      </w:r>
-      <w:proofErr w:type="spellStart"/>
-      <w:r>
-        <w:rPr>
-          <w:lang w:val="en-PK"/>
-        </w:rPr>
-        <w:t>gy</w:t>
-      </w:r>
-      <w:proofErr w:type="spellEnd"/>
-      <w:r>
-        <w:rPr>
-          <w:lang w:val="en-PK"/>
-        </w:rPr>
-        <w:t xml:space="preserve"> </w:t>
-      </w:r>
-      <w:proofErr w:type="spellStart"/>
-      <w:r>
-        <w:rPr>
-          <w:lang w:val="en-PK"/>
-        </w:rPr>
-        <w:t>feb</w:t>
-      </w:r>
-      <w:proofErr w:type="spellEnd"/>
-      <w:r>
-        <w:rPr>
-          <w:lang w:val="en-PK"/>
-        </w:rPr>
-        <w:t xml:space="preserve"> ka closing balance which is 2000$ in this case,, so </w:t>
-      </w:r>
-      <w:r>
-        <w:rPr>
-          <w:lang w:val="en-PK"/>
-        </w:rPr>
-        <w:t xml:space="preserve">growth in </w:t>
-      </w:r>
-      <w:proofErr w:type="spellStart"/>
-      <w:r>
-        <w:rPr>
-          <w:lang w:val="en-PK"/>
-        </w:rPr>
-        <w:t>feb</w:t>
-      </w:r>
-      <w:proofErr w:type="spellEnd"/>
-      <w:r>
-        <w:rPr>
-          <w:lang w:val="en-PK"/>
-        </w:rPr>
-        <w:t xml:space="preserve"> = closing balance – opening balance (2000 – 1000 = 1000$)</w:t>
-      </w:r>
-      <w:r>
-        <w:rPr>
-          <w:lang w:val="en-PK"/>
-        </w:rPr>
-        <w:t>,</w:t>
-      </w:r>
-      <w:r>
-        <w:rPr>
-          <w:lang w:val="en-PK"/>
-        </w:rPr>
-        <w:t xml:space="preserve">, if we </w:t>
-      </w:r>
-      <w:proofErr w:type="spellStart"/>
-      <w:r>
-        <w:rPr>
-          <w:lang w:val="en-PK"/>
-        </w:rPr>
-        <w:t>wanna</w:t>
-      </w:r>
-      <w:proofErr w:type="spellEnd"/>
-      <w:r>
-        <w:rPr>
-          <w:lang w:val="en-PK"/>
-        </w:rPr>
-        <w:t xml:space="preserve"> get the percentage , we use formula (closing – opening)/opening, OR (current value – previous value)/previous value   ,, </w:t>
-      </w:r>
-      <w:proofErr w:type="spellStart"/>
-      <w:r>
-        <w:rPr>
-          <w:lang w:val="en-PK"/>
-        </w:rPr>
-        <w:t>yani</w:t>
-      </w:r>
-      <w:proofErr w:type="spellEnd"/>
-      <w:r>
-        <w:rPr>
-          <w:lang w:val="en-PK"/>
-        </w:rPr>
-        <w:t xml:space="preserve"> current value jo is time account m h which also include some amount from previous month and previous value is actually the value from the previous month or we can also say it as the opening value for this month and divide it with previous value because </w:t>
-      </w:r>
-      <w:r>
-        <w:rPr>
-          <w:highlight w:val="yellow"/>
-        </w:rPr>
-        <w:t xml:space="preserve">percentage k </w:t>
-      </w:r>
-      <w:proofErr w:type="spellStart"/>
-      <w:r>
-        <w:rPr>
-          <w:highlight w:val="yellow"/>
-        </w:rPr>
-        <w:t>liye</w:t>
-      </w:r>
-      <w:proofErr w:type="spellEnd"/>
-      <w:r>
-        <w:rPr>
-          <w:highlight w:val="yellow"/>
-        </w:rPr>
-        <w:t xml:space="preserve"> hm </w:t>
-      </w:r>
-      <w:r>
-        <w:rPr>
-          <w:highlight w:val="yellow"/>
-        </w:rPr>
-        <w:t xml:space="preserve">y </w:t>
-      </w:r>
-      <w:proofErr w:type="spellStart"/>
-      <w:r>
-        <w:rPr>
-          <w:highlight w:val="yellow"/>
-        </w:rPr>
-        <w:t>dekhty</w:t>
-      </w:r>
-      <w:proofErr w:type="spellEnd"/>
-      <w:r>
-        <w:rPr>
-          <w:highlight w:val="yellow"/>
-        </w:rPr>
-        <w:t xml:space="preserve"> </w:t>
-      </w:r>
-      <w:proofErr w:type="spellStart"/>
-      <w:r>
-        <w:rPr>
-          <w:highlight w:val="yellow"/>
-        </w:rPr>
-        <w:t>hn</w:t>
-      </w:r>
-      <w:proofErr w:type="spellEnd"/>
-      <w:r>
-        <w:rPr>
-          <w:highlight w:val="yellow"/>
-        </w:rPr>
-        <w:t xml:space="preserve"> k hm n </w:t>
-      </w:r>
-      <w:proofErr w:type="spellStart"/>
-      <w:r>
-        <w:rPr>
-          <w:highlight w:val="yellow"/>
-        </w:rPr>
-        <w:t>kis</w:t>
-      </w:r>
-      <w:proofErr w:type="spellEnd"/>
-      <w:r>
-        <w:rPr>
-          <w:highlight w:val="yellow"/>
-        </w:rPr>
-        <w:t xml:space="preserve"> value k </w:t>
-      </w:r>
-      <w:proofErr w:type="spellStart"/>
-      <w:r>
-        <w:rPr>
-          <w:highlight w:val="yellow"/>
-        </w:rPr>
-        <w:t>muqably</w:t>
-      </w:r>
-      <w:proofErr w:type="spellEnd"/>
-      <w:r>
-        <w:rPr>
-          <w:highlight w:val="yellow"/>
-        </w:rPr>
-        <w:t xml:space="preserve"> m amount ka change </w:t>
+        <w:t xml:space="preserve">change </w:t>
       </w:r>
       <w:proofErr w:type="spellStart"/>
       <w:r>
@@ -23778,21 +23953,7 @@
         <w:rPr>
           <w:lang w:val="en-PK"/>
         </w:rPr>
-        <w:t xml:space="preserve"> </w:t>
-      </w:r>
-      <w:proofErr w:type="spellStart"/>
-      <w:r>
-        <w:rPr>
-          <w:lang w:val="en-PK"/>
-        </w:rPr>
-        <w:t>bna</w:t>
-      </w:r>
-      <w:proofErr w:type="spellEnd"/>
-      <w:r>
-        <w:rPr>
-          <w:lang w:val="en-PK"/>
-        </w:rPr>
-        <w:t xml:space="preserve">? FTP is actually all the </w:t>
+        <w:t xml:space="preserve"> bna? FTP is actually all the </w:t>
       </w:r>
       <w:proofErr w:type="spellStart"/>
       <w:r>
@@ -24876,7 +25037,6 @@
           <w:rFonts w:cstheme="minorHAnsi"/>
           <w:lang w:val="en-PK"/>
         </w:rPr>
-        <w:lastRenderedPageBreak/>
         <w:t xml:space="preserve">Then growth get </w:t>
       </w:r>
       <w:proofErr w:type="spellStart"/>
@@ -25038,6 +25198,7 @@
         <w:rPr>
           <w:lang w:val="en-PK"/>
         </w:rPr>
+        <w:lastRenderedPageBreak/>
         <w:t xml:space="preserve"> </w:t>
       </w:r>
       <w:r>
@@ -25588,7 +25749,6 @@
           <w:highlight w:val="green"/>
           <w:u w:val="single"/>
         </w:rPr>
-        <w:lastRenderedPageBreak/>
         <w:t xml:space="preserve">Section </w:t>
       </w:r>
       <w:proofErr w:type="gramStart"/>
@@ -25676,7 +25836,11 @@
       </w:r>
       <w:proofErr w:type="spellEnd"/>
       <w:r>
-        <w:t xml:space="preserve"> koi specific percentage of amount le ga revenue s, although y expenses hm </w:t>
+        <w:t xml:space="preserve"> koi specific </w:t>
+      </w:r>
+      <w:r>
+        <w:lastRenderedPageBreak/>
+        <w:t xml:space="preserve">percentage of amount le ga revenue s, although y expenses hm </w:t>
       </w:r>
       <w:proofErr w:type="spellStart"/>
       <w:r>
@@ -27115,7 +27279,6 @@
           <w:rFonts w:cstheme="minorHAnsi"/>
           <w:lang w:val="en-PK"/>
         </w:rPr>
-        <w:lastRenderedPageBreak/>
         <w:t xml:space="preserve">Just like p and l, we will calculate on the basis of assets </w:t>
       </w:r>
       <w:proofErr w:type="spellStart"/>
@@ -27523,6 +27686,7 @@
           <w:rFonts w:cstheme="minorHAnsi"/>
           <w:lang w:val="en-PK"/>
         </w:rPr>
+        <w:lastRenderedPageBreak/>
         <w:t xml:space="preserve">Is k </w:t>
       </w:r>
       <w:proofErr w:type="spellStart"/>
@@ -28073,7 +28237,6 @@
           <w:rFonts w:cstheme="minorHAnsi"/>
           <w:lang w:val="en-PK"/>
         </w:rPr>
-        <w:lastRenderedPageBreak/>
         <w:t>Also, if profit increased because of credit sales (increase in receivables), then cash has not been received yet, so we subtract that increase from profit in the operating section.</w:t>
       </w:r>
     </w:p>
@@ -28203,6 +28366,7 @@
           <w:rFonts w:cstheme="minorHAnsi"/>
           <w:lang w:val="en-PK"/>
         </w:rPr>
+        <w:lastRenderedPageBreak/>
         <w:t>Cash Flow from Financing Activities</w:t>
       </w:r>
     </w:p>
@@ -28948,7 +29112,6 @@
           <w:rFonts w:cstheme="minorHAnsi"/>
           <w:lang w:val="en-PK"/>
         </w:rPr>
-        <w:lastRenderedPageBreak/>
         <w:t xml:space="preserve">ab </w:t>
       </w:r>
       <w:r>
@@ -29838,6 +30001,7 @@
           <w:rFonts w:cstheme="minorHAnsi"/>
           <w:lang w:val="en-PK"/>
         </w:rPr>
+        <w:lastRenderedPageBreak/>
         <w:t xml:space="preserve"> </w:t>
       </w:r>
       <w:r>
@@ -42650,6 +42814,7 @@
       <w:r>
         <w:rPr>
           <w:rFonts w:cstheme="minorHAnsi"/>
+          <w:noProof/>
           <w:lang w:val="en-PK"/>
         </w:rPr>
         <w:lastRenderedPageBreak/>
@@ -42893,6 +43058,653 @@
           <w:lang w:val="en-PK"/>
         </w:rPr>
       </w:pPr>
+      <w:r>
+        <w:rPr>
+          <w:rFonts w:cstheme="minorHAnsi"/>
+          <w:lang w:val="en-PK"/>
+        </w:rPr>
+        <w:t>WE WILL USE:</w:t>
+      </w:r>
+    </w:p>
+    <w:p>
+      <w:pPr>
+        <w:rPr>
+          <w:rFonts w:cstheme="minorHAnsi"/>
+          <w:lang w:val="en-PK"/>
+        </w:rPr>
+      </w:pPr>
+      <w:proofErr w:type="gramStart"/>
+      <w:r>
+        <w:rPr>
+          <w:rFonts w:cstheme="minorHAnsi"/>
+          <w:lang w:val="en-PK"/>
+        </w:rPr>
+        <w:t>CALCULATE(</w:t>
+      </w:r>
+      <w:proofErr w:type="gramEnd"/>
+    </w:p>
+    <w:p>
+      <w:pPr>
+        <w:rPr>
+          <w:rFonts w:cstheme="minorHAnsi"/>
+          <w:lang w:val="en-PK"/>
+        </w:rPr>
+      </w:pPr>
+      <w:r>
+        <w:rPr>
+          <w:rFonts w:cstheme="minorHAnsi"/>
+          <w:lang w:val="en-PK"/>
+        </w:rPr>
+        <w:t xml:space="preserve">    </w:t>
+      </w:r>
+      <w:proofErr w:type="gramStart"/>
+      <w:r>
+        <w:rPr>
+          <w:rFonts w:cstheme="minorHAnsi"/>
+          <w:lang w:val="en-PK"/>
+        </w:rPr>
+        <w:t>SUM(</w:t>
+      </w:r>
+      <w:proofErr w:type="gramEnd"/>
+      <w:r>
+        <w:rPr>
+          <w:rFonts w:cstheme="minorHAnsi"/>
+          <w:lang w:val="en-PK"/>
+        </w:rPr>
+        <w:t>amount),</w:t>
+      </w:r>
+    </w:p>
+    <w:p>
+      <w:pPr>
+        <w:rPr>
+          <w:rFonts w:cstheme="minorHAnsi"/>
+          <w:lang w:val="en-PK"/>
+        </w:rPr>
+      </w:pPr>
+      <w:r>
+        <w:rPr>
+          <w:rFonts w:cstheme="minorHAnsi"/>
+          <w:lang w:val="en-PK"/>
+        </w:rPr>
+        <w:t xml:space="preserve">    </w:t>
+      </w:r>
+      <w:proofErr w:type="gramStart"/>
+      <w:r>
+        <w:rPr>
+          <w:rFonts w:cstheme="minorHAnsi"/>
+          <w:lang w:val="en-PK"/>
+        </w:rPr>
+        <w:t>FILTER(</w:t>
+      </w:r>
+      <w:proofErr w:type="gramEnd"/>
+      <w:r>
+        <w:rPr>
+          <w:rFonts w:cstheme="minorHAnsi"/>
+          <w:lang w:val="en-PK"/>
+        </w:rPr>
+        <w:t xml:space="preserve">calendar, date = </w:t>
+      </w:r>
+      <w:proofErr w:type="gramStart"/>
+      <w:r>
+        <w:rPr>
+          <w:rFonts w:cstheme="minorHAnsi"/>
+          <w:lang w:val="en-PK"/>
+        </w:rPr>
+        <w:t>MAX(</w:t>
+      </w:r>
+      <w:proofErr w:type="gramEnd"/>
+      <w:r>
+        <w:rPr>
+          <w:rFonts w:cstheme="minorHAnsi"/>
+          <w:lang w:val="en-PK"/>
+        </w:rPr>
+        <w:t>date))</w:t>
+      </w:r>
+    </w:p>
+    <w:p>
+      <w:pPr>
+        <w:rPr>
+          <w:rFonts w:cstheme="minorHAnsi"/>
+          <w:lang w:val="en-PK"/>
+        </w:rPr>
+      </w:pPr>
+      <w:r>
+        <w:rPr>
+          <w:rFonts w:cstheme="minorHAnsi"/>
+          <w:lang w:val="en-PK"/>
+        </w:rPr>
+        <w:t>)</w:t>
+      </w:r>
+    </w:p>
+    <w:p>
+      <w:pPr>
+        <w:rPr>
+          <w:rFonts w:cstheme="minorHAnsi"/>
+          <w:lang w:val="en-PK"/>
+        </w:rPr>
+      </w:pPr>
+      <w:r>
+        <w:rPr>
+          <w:rFonts w:cstheme="minorHAnsi"/>
+          <w:lang w:val="en-PK"/>
+        </w:rPr>
+        <w:t xml:space="preserve">YHAN FILTER Y KAAM KRY GA K JUST MAXIMUM VALUE UTHAY GA Q K FEB K ANDR ALREADY JAN + FEB KI AMOUNT H AND MARCH K ANDR JAN+FEB+MARCH KI AMOUNT H, </w:t>
+      </w:r>
+      <w:r>
+        <w:rPr>
+          <w:rFonts w:cstheme="minorHAnsi"/>
+          <w:lang w:val="en-PK"/>
+        </w:rPr>
+        <w:t xml:space="preserve">AB AGR HM N Y CHECK KRNA H K </w:t>
+      </w:r>
+      <w:r>
+        <w:rPr>
+          <w:rFonts w:cstheme="minorHAnsi"/>
+          <w:lang w:val="en-PK"/>
+        </w:rPr>
+        <w:t>1ST QUARTER M HMY KIA AMOUNT THI, TO HMY JUST MARCH KI MAXIMUM VALUE PR JO AMOUNT PRI THI VO UTHA LENI H</w:t>
+      </w:r>
+    </w:p>
+    <w:p>
+      <w:pPr>
+        <w:rPr>
+          <w:rFonts w:cstheme="minorHAnsi"/>
+          <w:lang w:val="en-PK"/>
+        </w:rPr>
+      </w:pPr>
+      <w:r>
+        <w:rPr>
+          <w:rFonts w:cstheme="minorHAnsi"/>
+          <w:lang w:val="en-PK"/>
+        </w:rPr>
+        <w:t xml:space="preserve">FILTER FUNCTION JUST MAXIMUM VALUE DE RHA H , JAB HM MATRIX M Y E.G: FILTER VALA DATA DAALYN GY TO HMY HR </w:t>
+      </w:r>
+      <w:proofErr w:type="spellStart"/>
+      <w:r>
+        <w:rPr>
+          <w:rFonts w:cstheme="minorHAnsi"/>
+          <w:lang w:val="en-PK"/>
+        </w:rPr>
+        <w:t>HR</w:t>
+      </w:r>
+      <w:proofErr w:type="spellEnd"/>
+      <w:r>
+        <w:rPr>
+          <w:rFonts w:cstheme="minorHAnsi"/>
+          <w:lang w:val="en-PK"/>
+        </w:rPr>
+        <w:t xml:space="preserve"> PERIOD KI MAXIMUM DATE MIL GY ,, E.G: WE TALK ABOUT 1ST QUARTER, THEN FILTER WILL GIVE DATE 31ST MARCH,, NOW TALK SUM(), SUM HR </w:t>
+      </w:r>
+      <w:proofErr w:type="spellStart"/>
+      <w:r>
+        <w:rPr>
+          <w:rFonts w:cstheme="minorHAnsi"/>
+          <w:lang w:val="en-PK"/>
+        </w:rPr>
+        <w:t>HR</w:t>
+      </w:r>
+      <w:proofErr w:type="spellEnd"/>
+      <w:r>
+        <w:rPr>
+          <w:rFonts w:cstheme="minorHAnsi"/>
+          <w:lang w:val="en-PK"/>
+        </w:rPr>
+        <w:t xml:space="preserve"> ACCOUNT (E.G: CASH AT BANK, CASH AT HAND ETC ETC) KI VALUE JO K US MAXIUM DATE PR PRI HN UN KO SUM KR DE GA, E.G: CAHS AT BANK 31ST MATRCH KO HMARY PAS 200$ TH AND 31ST MARCH KO CASH AT BANK 300$, THEN SUM WILL GIVE 500$, ISI TRAH MATRIX M Y FILTERDAALNY OR HR </w:t>
+      </w:r>
+      <w:proofErr w:type="spellStart"/>
+      <w:r>
+        <w:rPr>
+          <w:rFonts w:cstheme="minorHAnsi"/>
+          <w:lang w:val="en-PK"/>
+        </w:rPr>
+        <w:t>HR</w:t>
+      </w:r>
+      <w:proofErr w:type="spellEnd"/>
+      <w:r>
+        <w:rPr>
+          <w:rFonts w:cstheme="minorHAnsi"/>
+          <w:lang w:val="en-PK"/>
+        </w:rPr>
+        <w:t xml:space="preserve"> RESPECTIVE LEDGER (JESY K HM IS TIME ASSETS KI BAAT KR RHY HN) KI OVERALL AMOUNT SUM KR K DE DEGA</w:t>
+      </w:r>
+    </w:p>
+    <w:p>
+      <w:pPr>
+        <w:rPr>
+          <w:rFonts w:cstheme="minorHAnsi"/>
+          <w:lang w:val="en-PK"/>
+        </w:rPr>
+      </w:pPr>
+      <w:r>
+        <w:rPr>
+          <w:rFonts w:cstheme="minorHAnsi"/>
+          <w:b/>
+          <w:bCs/>
+          <w:lang w:val="en-PK"/>
+        </w:rPr>
+        <w:t xml:space="preserve">SUM </w:t>
+      </w:r>
+      <w:proofErr w:type="spellStart"/>
+      <w:r>
+        <w:rPr>
+          <w:rFonts w:cstheme="minorHAnsi"/>
+          <w:b/>
+          <w:bCs/>
+          <w:lang w:val="en-PK"/>
+        </w:rPr>
+        <w:t>kya</w:t>
+      </w:r>
+      <w:proofErr w:type="spellEnd"/>
+      <w:r>
+        <w:rPr>
+          <w:rFonts w:cstheme="minorHAnsi"/>
+          <w:b/>
+          <w:bCs/>
+          <w:lang w:val="en-PK"/>
+        </w:rPr>
+        <w:t xml:space="preserve"> </w:t>
+      </w:r>
+      <w:proofErr w:type="spellStart"/>
+      <w:r>
+        <w:rPr>
+          <w:rFonts w:cstheme="minorHAnsi"/>
+          <w:b/>
+          <w:bCs/>
+          <w:lang w:val="en-PK"/>
+        </w:rPr>
+        <w:t>karta</w:t>
+      </w:r>
+      <w:proofErr w:type="spellEnd"/>
+      <w:r>
+        <w:rPr>
+          <w:rFonts w:cstheme="minorHAnsi"/>
+          <w:b/>
+          <w:bCs/>
+          <w:lang w:val="en-PK"/>
+        </w:rPr>
+        <w:t xml:space="preserve"> </w:t>
+      </w:r>
+      <w:proofErr w:type="spellStart"/>
+      <w:r>
+        <w:rPr>
+          <w:rFonts w:cstheme="minorHAnsi"/>
+          <w:b/>
+          <w:bCs/>
+          <w:lang w:val="en-PK"/>
+        </w:rPr>
+        <w:t>hai</w:t>
+      </w:r>
+      <w:proofErr w:type="spellEnd"/>
+      <w:r>
+        <w:rPr>
+          <w:rFonts w:cstheme="minorHAnsi"/>
+          <w:b/>
+          <w:bCs/>
+          <w:lang w:val="en-PK"/>
+        </w:rPr>
+        <w:t>:</w:t>
+      </w:r>
+    </w:p>
+    <w:p>
+      <w:pPr>
+        <w:rPr>
+          <w:rFonts w:cstheme="minorHAnsi"/>
+          <w:lang w:val="en-PK"/>
+        </w:rPr>
+      </w:pPr>
+      <w:r>
+        <w:rPr>
+          <w:rFonts w:ascii="Segoe UI Symbol" w:hAnsi="Segoe UI Symbol" w:cs="Segoe UI Symbol"/>
+          <w:lang w:val="en-PK"/>
+        </w:rPr>
+        <w:t>✔</w:t>
+      </w:r>
+      <w:r>
+        <w:rPr>
+          <w:rFonts w:cstheme="minorHAnsi"/>
+          <w:lang w:val="en-PK"/>
+        </w:rPr>
+        <w:t xml:space="preserve"> Us </w:t>
+      </w:r>
+      <w:r>
+        <w:rPr>
+          <w:rFonts w:cstheme="minorHAnsi"/>
+          <w:b/>
+          <w:bCs/>
+          <w:lang w:val="en-PK"/>
+        </w:rPr>
+        <w:t xml:space="preserve">maximum date par </w:t>
+      </w:r>
+      <w:proofErr w:type="spellStart"/>
+      <w:r>
+        <w:rPr>
+          <w:rFonts w:cstheme="minorHAnsi"/>
+          <w:b/>
+          <w:bCs/>
+          <w:lang w:val="en-PK"/>
+        </w:rPr>
+        <w:t>jitne</w:t>
+      </w:r>
+      <w:proofErr w:type="spellEnd"/>
+      <w:r>
+        <w:rPr>
+          <w:rFonts w:cstheme="minorHAnsi"/>
+          <w:b/>
+          <w:bCs/>
+          <w:lang w:val="en-PK"/>
+        </w:rPr>
+        <w:t xml:space="preserve"> </w:t>
+      </w:r>
+      <w:proofErr w:type="spellStart"/>
+      <w:r>
+        <w:rPr>
+          <w:rFonts w:cstheme="minorHAnsi"/>
+          <w:b/>
+          <w:bCs/>
+          <w:lang w:val="en-PK"/>
+        </w:rPr>
+        <w:t>bhi</w:t>
+      </w:r>
+      <w:proofErr w:type="spellEnd"/>
+      <w:r>
+        <w:rPr>
+          <w:rFonts w:cstheme="minorHAnsi"/>
+          <w:b/>
+          <w:bCs/>
+          <w:lang w:val="en-PK"/>
+        </w:rPr>
+        <w:t xml:space="preserve"> accounts (ledgers)</w:t>
+      </w:r>
+      <w:r>
+        <w:rPr>
+          <w:rFonts w:cstheme="minorHAnsi"/>
+          <w:lang w:val="en-PK"/>
+        </w:rPr>
+        <w:t xml:space="preserve"> </w:t>
+      </w:r>
+      <w:proofErr w:type="spellStart"/>
+      <w:r>
+        <w:rPr>
+          <w:rFonts w:cstheme="minorHAnsi"/>
+          <w:lang w:val="en-PK"/>
+        </w:rPr>
+        <w:t>hain</w:t>
+      </w:r>
+      <w:proofErr w:type="spellEnd"/>
+      <w:r>
+        <w:rPr>
+          <w:rFonts w:cstheme="minorHAnsi"/>
+          <w:lang w:val="en-PK"/>
+        </w:rPr>
+        <w:t>:</w:t>
+      </w:r>
+    </w:p>
+    <w:p>
+      <w:pPr>
+        <w:numPr>
+          <w:ilvl w:val="0"/>
+          <w:numId w:val="20"/>
+        </w:numPr>
+        <w:rPr>
+          <w:rFonts w:cstheme="minorHAnsi"/>
+          <w:lang w:val="en-PK"/>
+        </w:rPr>
+      </w:pPr>
+      <w:r>
+        <w:rPr>
+          <w:rFonts w:cstheme="minorHAnsi"/>
+          <w:lang w:val="en-PK"/>
+        </w:rPr>
+        <w:t xml:space="preserve">Cash at bank </w:t>
+      </w:r>
+    </w:p>
+    <w:p>
+      <w:pPr>
+        <w:numPr>
+          <w:ilvl w:val="0"/>
+          <w:numId w:val="20"/>
+        </w:numPr>
+        <w:rPr>
+          <w:rFonts w:cstheme="minorHAnsi"/>
+          <w:lang w:val="en-PK"/>
+        </w:rPr>
+      </w:pPr>
+      <w:r>
+        <w:rPr>
+          <w:rFonts w:cstheme="minorHAnsi"/>
+          <w:lang w:val="en-PK"/>
+        </w:rPr>
+        <w:t xml:space="preserve">Cash at hand </w:t>
+      </w:r>
+    </w:p>
+    <w:p>
+      <w:pPr>
+        <w:numPr>
+          <w:ilvl w:val="0"/>
+          <w:numId w:val="20"/>
+        </w:numPr>
+        <w:rPr>
+          <w:rFonts w:cstheme="minorHAnsi"/>
+          <w:lang w:val="en-PK"/>
+        </w:rPr>
+      </w:pPr>
+      <w:r>
+        <w:rPr>
+          <w:rFonts w:cstheme="minorHAnsi"/>
+          <w:lang w:val="en-PK"/>
+        </w:rPr>
+        <w:lastRenderedPageBreak/>
+        <w:t xml:space="preserve">Inventory </w:t>
+      </w:r>
+    </w:p>
+    <w:p>
+      <w:pPr>
+        <w:numPr>
+          <w:ilvl w:val="0"/>
+          <w:numId w:val="20"/>
+        </w:numPr>
+        <w:rPr>
+          <w:rFonts w:cstheme="minorHAnsi"/>
+          <w:lang w:val="en-PK"/>
+        </w:rPr>
+      </w:pPr>
+      <w:r>
+        <w:rPr>
+          <w:rFonts w:cstheme="minorHAnsi"/>
+          <w:lang w:val="en-PK"/>
+        </w:rPr>
+        <w:t xml:space="preserve">etc </w:t>
+      </w:r>
+    </w:p>
+    <w:p>
+      <w:pPr>
+        <w:rPr>
+          <w:rFonts w:cstheme="minorHAnsi"/>
+          <w:lang w:val="en-PK"/>
+        </w:rPr>
+      </w:pPr>
+      <w:r>
+        <w:rPr>
+          <w:rFonts w:ascii="Segoe UI Emoji" w:hAnsi="Segoe UI Emoji" w:cs="Segoe UI Emoji"/>
+          <w:lang w:val="en-PK"/>
+        </w:rPr>
+        <w:t>👉</w:t>
+      </w:r>
+      <w:r>
+        <w:rPr>
+          <w:rFonts w:cstheme="minorHAnsi"/>
+          <w:lang w:val="en-PK"/>
+        </w:rPr>
+        <w:t xml:space="preserve"> </w:t>
+      </w:r>
+      <w:r>
+        <w:rPr>
+          <w:rFonts w:cstheme="minorHAnsi"/>
+          <w:b/>
+          <w:bCs/>
+          <w:lang w:val="en-PK"/>
+        </w:rPr>
+        <w:t xml:space="preserve">un sab ki values ko add </w:t>
+      </w:r>
+      <w:proofErr w:type="spellStart"/>
+      <w:r>
+        <w:rPr>
+          <w:rFonts w:cstheme="minorHAnsi"/>
+          <w:b/>
+          <w:bCs/>
+          <w:lang w:val="en-PK"/>
+        </w:rPr>
+        <w:t>karta</w:t>
+      </w:r>
+      <w:proofErr w:type="spellEnd"/>
+      <w:r>
+        <w:rPr>
+          <w:rFonts w:cstheme="minorHAnsi"/>
+          <w:b/>
+          <w:bCs/>
+          <w:lang w:val="en-PK"/>
+        </w:rPr>
+        <w:t xml:space="preserve"> </w:t>
+      </w:r>
+      <w:proofErr w:type="spellStart"/>
+      <w:r>
+        <w:rPr>
+          <w:rFonts w:cstheme="minorHAnsi"/>
+          <w:b/>
+          <w:bCs/>
+          <w:lang w:val="en-PK"/>
+        </w:rPr>
+        <w:t>hai</w:t>
+      </w:r>
+      <w:proofErr w:type="spellEnd"/>
+    </w:p>
+    <w:p>
+      <w:pPr>
+        <w:rPr>
+          <w:rFonts w:cstheme="minorHAnsi"/>
+          <w:lang w:val="en-PK"/>
+        </w:rPr>
+      </w:pPr>
+      <w:r>
+        <w:rPr>
+          <w:rFonts w:cstheme="minorHAnsi"/>
+        </w:rPr>
+        <w:t xml:space="preserve">FILTER last date </w:t>
+      </w:r>
+      <w:proofErr w:type="gramStart"/>
+      <w:r>
+        <w:rPr>
+          <w:rFonts w:cstheme="minorHAnsi"/>
+        </w:rPr>
+        <w:t>select</w:t>
+      </w:r>
+      <w:proofErr w:type="gramEnd"/>
+      <w:r>
+        <w:rPr>
+          <w:rFonts w:cstheme="minorHAnsi"/>
+        </w:rPr>
+        <w:t xml:space="preserve"> </w:t>
+      </w:r>
+      <w:proofErr w:type="spellStart"/>
+      <w:r>
+        <w:rPr>
+          <w:rFonts w:cstheme="minorHAnsi"/>
+        </w:rPr>
+        <w:t>karta</w:t>
+      </w:r>
+      <w:proofErr w:type="spellEnd"/>
+      <w:r>
+        <w:rPr>
+          <w:rFonts w:cstheme="minorHAnsi"/>
+        </w:rPr>
+        <w:t xml:space="preserve"> </w:t>
+      </w:r>
+      <w:proofErr w:type="spellStart"/>
+      <w:r>
+        <w:rPr>
+          <w:rFonts w:cstheme="minorHAnsi"/>
+        </w:rPr>
+        <w:t>hai</w:t>
+      </w:r>
+      <w:proofErr w:type="spellEnd"/>
+      <w:r>
+        <w:rPr>
+          <w:rFonts w:cstheme="minorHAnsi"/>
+        </w:rPr>
+        <w:t xml:space="preserve">, aur SUM us date par </w:t>
+      </w:r>
+      <w:proofErr w:type="spellStart"/>
+      <w:r>
+        <w:rPr>
+          <w:rFonts w:cstheme="minorHAnsi"/>
+        </w:rPr>
+        <w:t>maujood</w:t>
+      </w:r>
+      <w:proofErr w:type="spellEnd"/>
+      <w:r>
+        <w:rPr>
+          <w:rFonts w:cstheme="minorHAnsi"/>
+        </w:rPr>
+        <w:t xml:space="preserve"> </w:t>
+      </w:r>
+      <w:proofErr w:type="spellStart"/>
+      <w:r>
+        <w:rPr>
+          <w:rFonts w:cstheme="minorHAnsi"/>
+        </w:rPr>
+        <w:t>tamam</w:t>
+      </w:r>
+      <w:proofErr w:type="spellEnd"/>
+      <w:r>
+        <w:rPr>
+          <w:rFonts w:cstheme="minorHAnsi"/>
+        </w:rPr>
+        <w:t xml:space="preserve"> accounts ki values ko add </w:t>
+      </w:r>
+      <w:proofErr w:type="spellStart"/>
+      <w:r>
+        <w:rPr>
+          <w:rFonts w:cstheme="minorHAnsi"/>
+        </w:rPr>
+        <w:t>karta</w:t>
+      </w:r>
+      <w:proofErr w:type="spellEnd"/>
+      <w:r>
+        <w:rPr>
+          <w:rFonts w:cstheme="minorHAnsi"/>
+        </w:rPr>
+        <w:t xml:space="preserve"> </w:t>
+      </w:r>
+      <w:proofErr w:type="spellStart"/>
+      <w:r>
+        <w:rPr>
+          <w:rFonts w:cstheme="minorHAnsi"/>
+        </w:rPr>
+        <w:t>hai</w:t>
+      </w:r>
+      <w:proofErr w:type="spellEnd"/>
+      <w:r>
+        <w:rPr>
+          <w:rFonts w:cstheme="minorHAnsi"/>
+        </w:rPr>
+        <w:t>.</w:t>
+      </w:r>
+    </w:p>
+    <w:p>
+      <w:pPr>
+        <w:rPr>
+          <w:rFonts w:cstheme="minorHAnsi"/>
+          <w:lang w:val="en-PK"/>
+        </w:rPr>
+      </w:pPr>
+    </w:p>
+    <w:p>
+      <w:pPr>
+        <w:rPr>
+          <w:rFonts w:cstheme="minorHAnsi"/>
+          <w:lang w:val="en-PK"/>
+        </w:rPr>
+      </w:pPr>
     </w:p>
     <w:p>
       <w:pPr>
@@ -44066,9 +44878,9 @@
     </w:lvl>
   </w:abstractNum>
   <w:abstractNum w:abstractNumId="8" w15:restartNumberingAfterBreak="0">
-    <w:nsid w:val="273426B3"/>
+    <w:nsid w:val="252C308A"/>
     <w:multiLevelType w:val="multilevel"/>
-    <w:tmpl w:val="91B2F8D0"/>
+    <w:tmpl w:val="AE349EFE"/>
     <w:lvl w:ilvl="0">
       <w:start w:val="1"/>
       <w:numFmt w:val="bullet"/>
@@ -44215,98 +45027,9 @@
     </w:lvl>
   </w:abstractNum>
   <w:abstractNum w:abstractNumId="9" w15:restartNumberingAfterBreak="0">
-    <w:nsid w:val="280C0E1E"/>
-    <w:multiLevelType w:val="hybridMultilevel"/>
-    <w:tmpl w:val="28C0A814"/>
-    <w:lvl w:ilvl="0" w:tplc="4AB45E5A">
-      <w:start w:val="1"/>
-      <w:numFmt w:val="decimal"/>
-      <w:lvlText w:val="%1-"/>
-      <w:lvlJc w:val="left"/>
-      <w:pPr>
-        <w:ind w:left="720" w:hanging="360"/>
-      </w:pPr>
-      <w:rPr>
-        <w:rFonts w:hint="default"/>
-      </w:rPr>
-    </w:lvl>
-    <w:lvl w:ilvl="1" w:tplc="20000019" w:tentative="1">
-      <w:start w:val="1"/>
-      <w:numFmt w:val="lowerLetter"/>
-      <w:lvlText w:val="%2."/>
-      <w:lvlJc w:val="left"/>
-      <w:pPr>
-        <w:ind w:left="1440" w:hanging="360"/>
-      </w:pPr>
-    </w:lvl>
-    <w:lvl w:ilvl="2" w:tplc="2000001B" w:tentative="1">
-      <w:start w:val="1"/>
-      <w:numFmt w:val="lowerRoman"/>
-      <w:lvlText w:val="%3."/>
-      <w:lvlJc w:val="right"/>
-      <w:pPr>
-        <w:ind w:left="2160" w:hanging="180"/>
-      </w:pPr>
-    </w:lvl>
-    <w:lvl w:ilvl="3" w:tplc="2000000F" w:tentative="1">
-      <w:start w:val="1"/>
-      <w:numFmt w:val="decimal"/>
-      <w:lvlText w:val="%4."/>
-      <w:lvlJc w:val="left"/>
-      <w:pPr>
-        <w:ind w:left="2880" w:hanging="360"/>
-      </w:pPr>
-    </w:lvl>
-    <w:lvl w:ilvl="4" w:tplc="20000019" w:tentative="1">
-      <w:start w:val="1"/>
-      <w:numFmt w:val="lowerLetter"/>
-      <w:lvlText w:val="%5."/>
-      <w:lvlJc w:val="left"/>
-      <w:pPr>
-        <w:ind w:left="3600" w:hanging="360"/>
-      </w:pPr>
-    </w:lvl>
-    <w:lvl w:ilvl="5" w:tplc="2000001B" w:tentative="1">
-      <w:start w:val="1"/>
-      <w:numFmt w:val="lowerRoman"/>
-      <w:lvlText w:val="%6."/>
-      <w:lvlJc w:val="right"/>
-      <w:pPr>
-        <w:ind w:left="4320" w:hanging="180"/>
-      </w:pPr>
-    </w:lvl>
-    <w:lvl w:ilvl="6" w:tplc="2000000F" w:tentative="1">
-      <w:start w:val="1"/>
-      <w:numFmt w:val="decimal"/>
-      <w:lvlText w:val="%7."/>
-      <w:lvlJc w:val="left"/>
-      <w:pPr>
-        <w:ind w:left="5040" w:hanging="360"/>
-      </w:pPr>
-    </w:lvl>
-    <w:lvl w:ilvl="7" w:tplc="20000019" w:tentative="1">
-      <w:start w:val="1"/>
-      <w:numFmt w:val="lowerLetter"/>
-      <w:lvlText w:val="%8."/>
-      <w:lvlJc w:val="left"/>
-      <w:pPr>
-        <w:ind w:left="5760" w:hanging="360"/>
-      </w:pPr>
-    </w:lvl>
-    <w:lvl w:ilvl="8" w:tplc="2000001B" w:tentative="1">
-      <w:start w:val="1"/>
-      <w:numFmt w:val="lowerRoman"/>
-      <w:lvlText w:val="%9."/>
-      <w:lvlJc w:val="right"/>
-      <w:pPr>
-        <w:ind w:left="6480" w:hanging="180"/>
-      </w:pPr>
-    </w:lvl>
-  </w:abstractNum>
-  <w:abstractNum w:abstractNumId="10" w15:restartNumberingAfterBreak="0">
-    <w:nsid w:val="344626FD"/>
+    <w:nsid w:val="273426B3"/>
     <w:multiLevelType w:val="multilevel"/>
-    <w:tmpl w:val="CDA2478A"/>
+    <w:tmpl w:val="91B2F8D0"/>
     <w:lvl w:ilvl="0">
       <w:start w:val="1"/>
       <w:numFmt w:val="bullet"/>
@@ -44452,10 +45175,99 @@
       </w:rPr>
     </w:lvl>
   </w:abstractNum>
+  <w:abstractNum w:abstractNumId="10" w15:restartNumberingAfterBreak="0">
+    <w:nsid w:val="280C0E1E"/>
+    <w:multiLevelType w:val="hybridMultilevel"/>
+    <w:tmpl w:val="28C0A814"/>
+    <w:lvl w:ilvl="0" w:tplc="4AB45E5A">
+      <w:start w:val="1"/>
+      <w:numFmt w:val="decimal"/>
+      <w:lvlText w:val="%1-"/>
+      <w:lvlJc w:val="left"/>
+      <w:pPr>
+        <w:ind w:left="720" w:hanging="360"/>
+      </w:pPr>
+      <w:rPr>
+        <w:rFonts w:hint="default"/>
+      </w:rPr>
+    </w:lvl>
+    <w:lvl w:ilvl="1" w:tplc="20000019" w:tentative="1">
+      <w:start w:val="1"/>
+      <w:numFmt w:val="lowerLetter"/>
+      <w:lvlText w:val="%2."/>
+      <w:lvlJc w:val="left"/>
+      <w:pPr>
+        <w:ind w:left="1440" w:hanging="360"/>
+      </w:pPr>
+    </w:lvl>
+    <w:lvl w:ilvl="2" w:tplc="2000001B" w:tentative="1">
+      <w:start w:val="1"/>
+      <w:numFmt w:val="lowerRoman"/>
+      <w:lvlText w:val="%3."/>
+      <w:lvlJc w:val="right"/>
+      <w:pPr>
+        <w:ind w:left="2160" w:hanging="180"/>
+      </w:pPr>
+    </w:lvl>
+    <w:lvl w:ilvl="3" w:tplc="2000000F" w:tentative="1">
+      <w:start w:val="1"/>
+      <w:numFmt w:val="decimal"/>
+      <w:lvlText w:val="%4."/>
+      <w:lvlJc w:val="left"/>
+      <w:pPr>
+        <w:ind w:left="2880" w:hanging="360"/>
+      </w:pPr>
+    </w:lvl>
+    <w:lvl w:ilvl="4" w:tplc="20000019" w:tentative="1">
+      <w:start w:val="1"/>
+      <w:numFmt w:val="lowerLetter"/>
+      <w:lvlText w:val="%5."/>
+      <w:lvlJc w:val="left"/>
+      <w:pPr>
+        <w:ind w:left="3600" w:hanging="360"/>
+      </w:pPr>
+    </w:lvl>
+    <w:lvl w:ilvl="5" w:tplc="2000001B" w:tentative="1">
+      <w:start w:val="1"/>
+      <w:numFmt w:val="lowerRoman"/>
+      <w:lvlText w:val="%6."/>
+      <w:lvlJc w:val="right"/>
+      <w:pPr>
+        <w:ind w:left="4320" w:hanging="180"/>
+      </w:pPr>
+    </w:lvl>
+    <w:lvl w:ilvl="6" w:tplc="2000000F" w:tentative="1">
+      <w:start w:val="1"/>
+      <w:numFmt w:val="decimal"/>
+      <w:lvlText w:val="%7."/>
+      <w:lvlJc w:val="left"/>
+      <w:pPr>
+        <w:ind w:left="5040" w:hanging="360"/>
+      </w:pPr>
+    </w:lvl>
+    <w:lvl w:ilvl="7" w:tplc="20000019" w:tentative="1">
+      <w:start w:val="1"/>
+      <w:numFmt w:val="lowerLetter"/>
+      <w:lvlText w:val="%8."/>
+      <w:lvlJc w:val="left"/>
+      <w:pPr>
+        <w:ind w:left="5760" w:hanging="360"/>
+      </w:pPr>
+    </w:lvl>
+    <w:lvl w:ilvl="8" w:tplc="2000001B" w:tentative="1">
+      <w:start w:val="1"/>
+      <w:numFmt w:val="lowerRoman"/>
+      <w:lvlText w:val="%9."/>
+      <w:lvlJc w:val="right"/>
+      <w:pPr>
+        <w:ind w:left="6480" w:hanging="180"/>
+      </w:pPr>
+    </w:lvl>
+  </w:abstractNum>
   <w:abstractNum w:abstractNumId="11" w15:restartNumberingAfterBreak="0">
-    <w:nsid w:val="38A9702C"/>
+    <w:nsid w:val="344626FD"/>
     <w:multiLevelType w:val="multilevel"/>
-    <w:tmpl w:val="4A9A5634"/>
+    <w:tmpl w:val="CDA2478A"/>
     <w:lvl w:ilvl="0">
       <w:start w:val="1"/>
       <w:numFmt w:val="bullet"/>
@@ -44602,9 +45414,9 @@
     </w:lvl>
   </w:abstractNum>
   <w:abstractNum w:abstractNumId="12" w15:restartNumberingAfterBreak="0">
-    <w:nsid w:val="40607527"/>
+    <w:nsid w:val="38A9702C"/>
     <w:multiLevelType w:val="multilevel"/>
-    <w:tmpl w:val="65168E26"/>
+    <w:tmpl w:val="4A9A5634"/>
     <w:lvl w:ilvl="0">
       <w:start w:val="1"/>
       <w:numFmt w:val="bullet"/>
@@ -44751,9 +45563,9 @@
     </w:lvl>
   </w:abstractNum>
   <w:abstractNum w:abstractNumId="13" w15:restartNumberingAfterBreak="0">
-    <w:nsid w:val="42AE40BC"/>
+    <w:nsid w:val="40607527"/>
     <w:multiLevelType w:val="multilevel"/>
-    <w:tmpl w:val="5812FB9A"/>
+    <w:tmpl w:val="65168E26"/>
     <w:lvl w:ilvl="0">
       <w:start w:val="1"/>
       <w:numFmt w:val="bullet"/>
@@ -44900,9 +45712,9 @@
     </w:lvl>
   </w:abstractNum>
   <w:abstractNum w:abstractNumId="14" w15:restartNumberingAfterBreak="0">
-    <w:nsid w:val="48B46654"/>
+    <w:nsid w:val="42AE40BC"/>
     <w:multiLevelType w:val="multilevel"/>
-    <w:tmpl w:val="C5DE5C36"/>
+    <w:tmpl w:val="5812FB9A"/>
     <w:lvl w:ilvl="0">
       <w:start w:val="1"/>
       <w:numFmt w:val="bullet"/>
@@ -45049,9 +45861,9 @@
     </w:lvl>
   </w:abstractNum>
   <w:abstractNum w:abstractNumId="15" w15:restartNumberingAfterBreak="0">
-    <w:nsid w:val="48DB490E"/>
+    <w:nsid w:val="48B46654"/>
     <w:multiLevelType w:val="multilevel"/>
-    <w:tmpl w:val="D86E882A"/>
+    <w:tmpl w:val="C5DE5C36"/>
     <w:lvl w:ilvl="0">
       <w:start w:val="1"/>
       <w:numFmt w:val="bullet"/>
@@ -45198,9 +46010,9 @@
     </w:lvl>
   </w:abstractNum>
   <w:abstractNum w:abstractNumId="16" w15:restartNumberingAfterBreak="0">
-    <w:nsid w:val="740A61BA"/>
+    <w:nsid w:val="48DB490E"/>
     <w:multiLevelType w:val="multilevel"/>
-    <w:tmpl w:val="D3807B20"/>
+    <w:tmpl w:val="D86E882A"/>
     <w:lvl w:ilvl="0">
       <w:start w:val="1"/>
       <w:numFmt w:val="bullet"/>
@@ -45347,6 +46159,155 @@
     </w:lvl>
   </w:abstractNum>
   <w:abstractNum w:abstractNumId="17" w15:restartNumberingAfterBreak="0">
+    <w:nsid w:val="740A61BA"/>
+    <w:multiLevelType w:val="multilevel"/>
+    <w:tmpl w:val="D3807B20"/>
+    <w:lvl w:ilvl="0">
+      <w:start w:val="1"/>
+      <w:numFmt w:val="bullet"/>
+      <w:lvlText w:val=""/>
+      <w:lvlJc w:val="left"/>
+      <w:pPr>
+        <w:tabs>
+          <w:tab w:val="num" w:pos="720"/>
+        </w:tabs>
+        <w:ind w:left="720" w:hanging="360"/>
+      </w:pPr>
+      <w:rPr>
+        <w:rFonts w:ascii="Symbol" w:hAnsi="Symbol" w:hint="default"/>
+        <w:sz w:val="20"/>
+      </w:rPr>
+    </w:lvl>
+    <w:lvl w:ilvl="1" w:tentative="1">
+      <w:start w:val="1"/>
+      <w:numFmt w:val="bullet"/>
+      <w:lvlText w:val="o"/>
+      <w:lvlJc w:val="left"/>
+      <w:pPr>
+        <w:tabs>
+          <w:tab w:val="num" w:pos="1440"/>
+        </w:tabs>
+        <w:ind w:left="1440" w:hanging="360"/>
+      </w:pPr>
+      <w:rPr>
+        <w:rFonts w:ascii="Courier New" w:hAnsi="Courier New" w:hint="default"/>
+        <w:sz w:val="20"/>
+      </w:rPr>
+    </w:lvl>
+    <w:lvl w:ilvl="2" w:tentative="1">
+      <w:start w:val="1"/>
+      <w:numFmt w:val="bullet"/>
+      <w:lvlText w:val=""/>
+      <w:lvlJc w:val="left"/>
+      <w:pPr>
+        <w:tabs>
+          <w:tab w:val="num" w:pos="2160"/>
+        </w:tabs>
+        <w:ind w:left="2160" w:hanging="360"/>
+      </w:pPr>
+      <w:rPr>
+        <w:rFonts w:ascii="Wingdings" w:hAnsi="Wingdings" w:hint="default"/>
+        <w:sz w:val="20"/>
+      </w:rPr>
+    </w:lvl>
+    <w:lvl w:ilvl="3" w:tentative="1">
+      <w:start w:val="1"/>
+      <w:numFmt w:val="bullet"/>
+      <w:lvlText w:val=""/>
+      <w:lvlJc w:val="left"/>
+      <w:pPr>
+        <w:tabs>
+          <w:tab w:val="num" w:pos="2880"/>
+        </w:tabs>
+        <w:ind w:left="2880" w:hanging="360"/>
+      </w:pPr>
+      <w:rPr>
+        <w:rFonts w:ascii="Wingdings" w:hAnsi="Wingdings" w:hint="default"/>
+        <w:sz w:val="20"/>
+      </w:rPr>
+    </w:lvl>
+    <w:lvl w:ilvl="4" w:tentative="1">
+      <w:start w:val="1"/>
+      <w:numFmt w:val="bullet"/>
+      <w:lvlText w:val=""/>
+      <w:lvlJc w:val="left"/>
+      <w:pPr>
+        <w:tabs>
+          <w:tab w:val="num" w:pos="3600"/>
+        </w:tabs>
+        <w:ind w:left="3600" w:hanging="360"/>
+      </w:pPr>
+      <w:rPr>
+        <w:rFonts w:ascii="Wingdings" w:hAnsi="Wingdings" w:hint="default"/>
+        <w:sz w:val="20"/>
+      </w:rPr>
+    </w:lvl>
+    <w:lvl w:ilvl="5" w:tentative="1">
+      <w:start w:val="1"/>
+      <w:numFmt w:val="bullet"/>
+      <w:lvlText w:val=""/>
+      <w:lvlJc w:val="left"/>
+      <w:pPr>
+        <w:tabs>
+          <w:tab w:val="num" w:pos="4320"/>
+        </w:tabs>
+        <w:ind w:left="4320" w:hanging="360"/>
+      </w:pPr>
+      <w:rPr>
+        <w:rFonts w:ascii="Wingdings" w:hAnsi="Wingdings" w:hint="default"/>
+        <w:sz w:val="20"/>
+      </w:rPr>
+    </w:lvl>
+    <w:lvl w:ilvl="6" w:tentative="1">
+      <w:start w:val="1"/>
+      <w:numFmt w:val="bullet"/>
+      <w:lvlText w:val=""/>
+      <w:lvlJc w:val="left"/>
+      <w:pPr>
+        <w:tabs>
+          <w:tab w:val="num" w:pos="5040"/>
+        </w:tabs>
+        <w:ind w:left="5040" w:hanging="360"/>
+      </w:pPr>
+      <w:rPr>
+        <w:rFonts w:ascii="Wingdings" w:hAnsi="Wingdings" w:hint="default"/>
+        <w:sz w:val="20"/>
+      </w:rPr>
+    </w:lvl>
+    <w:lvl w:ilvl="7" w:tentative="1">
+      <w:start w:val="1"/>
+      <w:numFmt w:val="bullet"/>
+      <w:lvlText w:val=""/>
+      <w:lvlJc w:val="left"/>
+      <w:pPr>
+        <w:tabs>
+          <w:tab w:val="num" w:pos="5760"/>
+        </w:tabs>
+        <w:ind w:left="5760" w:hanging="360"/>
+      </w:pPr>
+      <w:rPr>
+        <w:rFonts w:ascii="Wingdings" w:hAnsi="Wingdings" w:hint="default"/>
+        <w:sz w:val="20"/>
+      </w:rPr>
+    </w:lvl>
+    <w:lvl w:ilvl="8" w:tentative="1">
+      <w:start w:val="1"/>
+      <w:numFmt w:val="bullet"/>
+      <w:lvlText w:val=""/>
+      <w:lvlJc w:val="left"/>
+      <w:pPr>
+        <w:tabs>
+          <w:tab w:val="num" w:pos="6480"/>
+        </w:tabs>
+        <w:ind w:left="6480" w:hanging="360"/>
+      </w:pPr>
+      <w:rPr>
+        <w:rFonts w:ascii="Wingdings" w:hAnsi="Wingdings" w:hint="default"/>
+        <w:sz w:val="20"/>
+      </w:rPr>
+    </w:lvl>
+  </w:abstractNum>
+  <w:abstractNum w:abstractNumId="18" w15:restartNumberingAfterBreak="0">
     <w:nsid w:val="78407CD1"/>
     <w:multiLevelType w:val="multilevel"/>
     <w:tmpl w:val="7C2AFB40"/>
@@ -45495,7 +46456,7 @@
       </w:rPr>
     </w:lvl>
   </w:abstractNum>
-  <w:abstractNum w:abstractNumId="18" w15:restartNumberingAfterBreak="0">
+  <w:abstractNum w:abstractNumId="19" w15:restartNumberingAfterBreak="0">
     <w:nsid w:val="7CA46DDA"/>
     <w:multiLevelType w:val="multilevel"/>
     <w:tmpl w:val="3C3A0DE8"/>
@@ -45648,43 +46609,43 @@
     <w:abstractNumId w:val="7"/>
   </w:num>
   <w:num w:numId="2" w16cid:durableId="1458403793">
-    <w:abstractNumId w:val="9"/>
+    <w:abstractNumId w:val="10"/>
   </w:num>
   <w:num w:numId="3" w16cid:durableId="216285181">
-    <w:abstractNumId w:val="15"/>
+    <w:abstractNumId w:val="16"/>
   </w:num>
   <w:num w:numId="4" w16cid:durableId="2086102072">
-    <w:abstractNumId w:val="18"/>
+    <w:abstractNumId w:val="19"/>
   </w:num>
   <w:num w:numId="5" w16cid:durableId="1385056839">
     <w:abstractNumId w:val="1"/>
   </w:num>
   <w:num w:numId="6" w16cid:durableId="1970546841">
-    <w:abstractNumId w:val="14"/>
+    <w:abstractNumId w:val="15"/>
   </w:num>
   <w:num w:numId="7" w16cid:durableId="1806316291">
-    <w:abstractNumId w:val="8"/>
+    <w:abstractNumId w:val="9"/>
   </w:num>
   <w:num w:numId="8" w16cid:durableId="1658723508">
-    <w:abstractNumId w:val="10"/>
+    <w:abstractNumId w:val="11"/>
   </w:num>
   <w:num w:numId="9" w16cid:durableId="2065565178">
-    <w:abstractNumId w:val="16"/>
+    <w:abstractNumId w:val="17"/>
   </w:num>
   <w:num w:numId="10" w16cid:durableId="895975205">
     <w:abstractNumId w:val="2"/>
   </w:num>
   <w:num w:numId="11" w16cid:durableId="971978470">
-    <w:abstractNumId w:val="17"/>
+    <w:abstractNumId w:val="18"/>
   </w:num>
   <w:num w:numId="12" w16cid:durableId="47728691">
-    <w:abstractNumId w:val="13"/>
+    <w:abstractNumId w:val="14"/>
   </w:num>
   <w:num w:numId="13" w16cid:durableId="551233112">
     <w:abstractNumId w:val="5"/>
   </w:num>
   <w:num w:numId="14" w16cid:durableId="1979457364">
-    <w:abstractNumId w:val="12"/>
+    <w:abstractNumId w:val="13"/>
   </w:num>
   <w:num w:numId="15" w16cid:durableId="1264803429">
     <w:abstractNumId w:val="6"/>
@@ -45696,10 +46657,13 @@
     <w:abstractNumId w:val="0"/>
   </w:num>
   <w:num w:numId="18" w16cid:durableId="853763849">
-    <w:abstractNumId w:val="11"/>
+    <w:abstractNumId w:val="12"/>
   </w:num>
   <w:num w:numId="19" w16cid:durableId="1948459296">
     <w:abstractNumId w:val="3"/>
+  </w:num>
+  <w:num w:numId="20" w16cid:durableId="263921772">
+    <w:abstractNumId w:val="8"/>
   </w:num>
 </w:numbering>
 </file>

</xml_diff>

<commit_message>
enter a new GL having no closing entry
</commit_message>
<xml_diff>
--- a/Complete FINANCIAL REPORTING AND FINANCIAL ANALYSIS USING POWER BI.docx
+++ b/Complete FINANCIAL REPORTING AND FINANCIAL ANALYSIS USING POWER BI.docx
@@ -4130,6 +4130,195 @@
         </w:rPr>
       </w:pPr>
     </w:p>
+    <w:p>
+      <w:pPr>
+        <w:rPr>
+          <w:b/>
+          <w:bCs/>
+          <w:highlight w:val="magenta"/>
+          <w:lang w:val="en-PK"/>
+        </w:rPr>
+      </w:pPr>
+      <w:r>
+        <w:rPr>
+          <w:rFonts w:ascii="Segoe UI Emoji" w:hAnsi="Segoe UI Emoji" w:cs="Segoe UI Emoji"/>
+          <w:b/>
+          <w:bCs/>
+          <w:highlight w:val="magenta"/>
+          <w:lang w:val="en-PK"/>
+        </w:rPr>
+        <w:lastRenderedPageBreak/>
+        <w:t>👉</w:t>
+      </w:r>
+      <w:r>
+        <w:rPr>
+          <w:b/>
+          <w:bCs/>
+          <w:highlight w:val="magenta"/>
+          <w:lang w:val="en-PK"/>
+        </w:rPr>
+        <w:t xml:space="preserve"> Total Debit = Total Credit </w:t>
+      </w:r>
+      <w:r>
+        <w:rPr>
+          <w:rFonts w:ascii="Segoe UI Symbol" w:hAnsi="Segoe UI Symbol" w:cs="Segoe UI Symbol"/>
+          <w:b/>
+          <w:bCs/>
+          <w:highlight w:val="magenta"/>
+          <w:lang w:val="en-PK"/>
+        </w:rPr>
+        <w:t>✔</w:t>
+      </w:r>
+      <w:r>
+        <w:rPr>
+          <w:b/>
+          <w:bCs/>
+          <w:highlight w:val="magenta"/>
+          <w:lang w:val="en-PK"/>
+        </w:rPr>
+        <w:br/>
+      </w:r>
+      <w:r>
+        <w:rPr>
+          <w:rFonts w:ascii="Segoe UI Emoji" w:hAnsi="Segoe UI Emoji" w:cs="Segoe UI Emoji"/>
+          <w:b/>
+          <w:bCs/>
+          <w:highlight w:val="magenta"/>
+          <w:lang w:val="en-PK"/>
+        </w:rPr>
+        <w:t>👉</w:t>
+      </w:r>
+      <w:r>
+        <w:rPr>
+          <w:b/>
+          <w:bCs/>
+          <w:highlight w:val="magenta"/>
+          <w:lang w:val="en-PK"/>
+        </w:rPr>
+        <w:t xml:space="preserve"> OR</w:t>
+      </w:r>
+      <w:r>
+        <w:rPr>
+          <w:b/>
+          <w:bCs/>
+          <w:highlight w:val="magenta"/>
+          <w:lang w:val="en-PK"/>
+        </w:rPr>
+        <w:br/>
+      </w:r>
+      <w:r>
+        <w:rPr>
+          <w:rFonts w:ascii="Segoe UI Emoji" w:hAnsi="Segoe UI Emoji" w:cs="Segoe UI Emoji"/>
+          <w:b/>
+          <w:bCs/>
+          <w:highlight w:val="magenta"/>
+          <w:lang w:val="en-PK"/>
+        </w:rPr>
+        <w:t>👉</w:t>
+      </w:r>
+      <w:r>
+        <w:rPr>
+          <w:b/>
+          <w:bCs/>
+          <w:highlight w:val="magenta"/>
+          <w:lang w:val="en-PK"/>
+        </w:rPr>
+        <w:t xml:space="preserve"> Sum of all entries in a transaction = 0 </w:t>
+      </w:r>
+      <w:r>
+        <w:rPr>
+          <w:rFonts w:ascii="Segoe UI Symbol" w:hAnsi="Segoe UI Symbol" w:cs="Segoe UI Symbol"/>
+          <w:b/>
+          <w:bCs/>
+          <w:highlight w:val="magenta"/>
+          <w:lang w:val="en-PK"/>
+        </w:rPr>
+        <w:t>✔</w:t>
+      </w:r>
+    </w:p>
+    <w:p>
+      <w:pPr>
+        <w:rPr>
+          <w:b/>
+          <w:bCs/>
+          <w:highlight w:val="magenta"/>
+          <w:lang w:val="en-PK"/>
+        </w:rPr>
+      </w:pPr>
+      <w:r>
+        <w:rPr>
+          <w:rFonts w:ascii="Segoe UI Symbol" w:hAnsi="Segoe UI Symbol" w:cs="Segoe UI Symbol"/>
+          <w:b/>
+          <w:bCs/>
+          <w:highlight w:val="magenta"/>
+          <w:lang w:val="en-PK"/>
+        </w:rPr>
+        <w:t>✔</w:t>
+      </w:r>
+      <w:r>
+        <w:rPr>
+          <w:b/>
+          <w:bCs/>
+          <w:highlight w:val="magenta"/>
+          <w:lang w:val="en-PK"/>
+        </w:rPr>
+        <w:t xml:space="preserve"> This part of your statement is 100% correct</w:t>
+      </w:r>
+    </w:p>
+    <w:p>
+      <w:pPr>
+        <w:rPr>
+          <w:b/>
+          <w:bCs/>
+          <w:highlight w:val="magenta"/>
+        </w:rPr>
+      </w:pPr>
+      <w:r>
+        <w:rPr>
+          <w:rFonts w:ascii="Segoe UI Emoji" w:hAnsi="Segoe UI Emoji" w:cs="Segoe UI Emoji"/>
+          <w:highlight w:val="magenta"/>
+        </w:rPr>
+        <w:t>👉</w:t>
+      </w:r>
+      <w:r>
+        <w:rPr>
+          <w:highlight w:val="magenta"/>
+        </w:rPr>
+        <w:t xml:space="preserve"> </w:t>
+      </w:r>
+      <w:r>
+        <w:rPr>
+          <w:b/>
+          <w:bCs/>
+          <w:highlight w:val="magenta"/>
+        </w:rPr>
+        <w:t>“In every transaction, total debit equals total credit. However, increase or decrease depends on the type of account, not on debit or credit itself.”</w:t>
+      </w:r>
+    </w:p>
+    <w:p>
+      <w:pPr>
+        <w:rPr>
+          <w:highlight w:val="magenta"/>
+          <w:lang w:val="en-PK"/>
+        </w:rPr>
+      </w:pPr>
+      <w:r>
+        <w:rPr>
+          <w:b/>
+          <w:bCs/>
+          <w:highlight w:val="magenta"/>
+        </w:rPr>
+        <w:t>SOMETIMES CREDIT INCRESAE AND DEBIT DECSREASE HOTA H BUT KISI KISIS TRANSACTION SM DONO INCRESE YA DONO DECSREASE HO RHY HOTY HN</w:t>
+      </w:r>
+    </w:p>
+    <w:p>
+      <w:pPr>
+        <w:rPr>
+          <w:highlight w:val="magenta"/>
+          <w:lang w:val="en-PK"/>
+        </w:rPr>
+      </w:pPr>
+    </w:p>
     <w:tbl>
       <w:tblPr>
         <w:tblStyle w:val="TableGrid"/>
@@ -4163,7 +4352,6 @@
                 <w:bCs/>
                 <w:lang w:val="en-PK"/>
               </w:rPr>
-              <w:lastRenderedPageBreak/>
               <w:t>Level</w:t>
             </w:r>
           </w:p>
@@ -4368,6 +4556,7 @@
         <w:rPr>
           <w:noProof/>
         </w:rPr>
+        <w:lastRenderedPageBreak/>
         <w:drawing>
           <wp:inline distT="0" distB="0" distL="0" distR="0" wp14:anchorId="550BAAFE" wp14:editId="06C7FC00">
             <wp:extent cx="5943600" cy="2066925"/>
@@ -4430,7 +4619,6 @@
           <w:sz w:val="40"/>
           <w:szCs w:val="40"/>
         </w:rPr>
-        <w:lastRenderedPageBreak/>
         <w:t>Foolproof</w:t>
       </w:r>
       <w:r>
@@ -4497,6 +4685,7 @@
           <w:highlight w:val="green"/>
           <w:u w:val="single"/>
         </w:rPr>
+        <w:lastRenderedPageBreak/>
         <w:t>BALANCE SHEET:</w:t>
       </w:r>
     </w:p>
@@ -4550,10 +4739,37 @@
         </w:rPr>
         <w:t>min_date_across = CALCULATE([min_date], FILTER((ALL('Calendar'[Date])), 'Calendar'[Date]))</w:t>
       </w:r>
+      <w:r>
+        <w:rPr>
+          <w:lang w:val="en-PK"/>
+        </w:rPr>
+        <w:t xml:space="preserve">   or </w:t>
+      </w:r>
+      <w:r>
+        <w:rPr>
+          <w:highlight w:val="green"/>
+          <w:lang w:val="en-PK"/>
+        </w:rPr>
+        <w:t>min_date_across = CALCULATE([min_date], ALL(tbl_Calendar))</w:t>
+      </w:r>
+      <w:r>
+        <w:rPr>
+          <w:lang w:val="en-PK"/>
+        </w:rPr>
+        <w:t xml:space="preserve">  (easy one)</w:t>
+      </w:r>
     </w:p>
     <w:p>
       <w:pPr>
         <w:ind w:left="360"/>
+        <w:rPr>
+          <w:lang w:val="en-PK"/>
+        </w:rPr>
+      </w:pPr>
+    </w:p>
+    <w:p>
+      <w:pPr>
+        <w:ind w:left="360"/>
       </w:pPr>
       <w:r>
         <w:t xml:space="preserve">ALL() will remove </w:t>
@@ -4588,14 +4804,7 @@
         <w:rPr>
           <w:lang w:val="en-PK"/>
         </w:rPr>
-        <w:t xml:space="preserve">,, to yhan pr ALL() saary k saary filters hi khatam kr de ga, yani matrix k hr value m hmy date 1st jan </w:t>
-      </w:r>
-      <w:r>
-        <w:rPr>
-          <w:lang w:val="en-PK"/>
-        </w:rPr>
-        <w:lastRenderedPageBreak/>
-        <w:t xml:space="preserve">2018 s le kr 31 dec 2020 tk ka data de gi, but hmy hr value 1st jan 2018 s le kr us respenctive year tk show krni h, is liye filter lgana zruri h </w:t>
+        <w:t xml:space="preserve">,, to yhan pr ALL() saary k saary filters hi khatam kr de ga, yani matrix k hr value m hmy date 1st jan 2018 s le kr 31 dec 2020 tk ka data de gi, but hmy hr value 1st jan 2018 s le kr us respenctive year tk show krni h, is liye filter lgana zruri h </w:t>
       </w:r>
       <w:r>
         <w:rPr>
@@ -4859,7 +5068,14 @@
         <w:rPr>
           <w:lang w:val="en-PK"/>
         </w:rPr>
-        <w:t xml:space="preserve">legend m subclass (liability, assets, equity) daal dia, and details m sublcass2 daal dia, to liability m jo jo maseed cheezy thi jo k subclass2 m show ho rhi thi such as current liabilities and long term liabilities, y dono </w:t>
+        <w:t xml:space="preserve">legend m subclass (liability, assets, equity) daal dia, and details m sublcass2 daal dia, to liability m jo jo maseed cheezy thi jo k subclass2 m show ho rhi thi </w:t>
+      </w:r>
+      <w:r>
+        <w:rPr>
+          <w:lang w:val="en-PK"/>
+        </w:rPr>
+        <w:lastRenderedPageBreak/>
+        <w:t xml:space="preserve">such as current liabilities and long term liabilities, y dono </w:t>
       </w:r>
       <w:r>
         <w:rPr>
@@ -5033,7 +5249,6 @@
         <w:rPr>
           <w:lang w:val="en-PK"/>
         </w:rPr>
-        <w:lastRenderedPageBreak/>
         <w:t xml:space="preserve">Cash (highest liquidity), bank balance (high liquidity), </w:t>
       </w:r>
       <w:r>
@@ -5328,7 +5543,14 @@
         <w:rPr>
           <w:lang w:val="en-PK"/>
         </w:rPr>
-        <w:t xml:space="preserve">, so we are removing it and then dividing the value with current liability, means bs yhi check krna h k kia high liquid assets k zrye hm apni </w:t>
+        <w:t xml:space="preserve">, so we are removing it and then dividing the value with current liability, </w:t>
+      </w:r>
+      <w:r>
+        <w:rPr>
+          <w:lang w:val="en-PK"/>
+        </w:rPr>
+        <w:lastRenderedPageBreak/>
+        <w:t xml:space="preserve">means bs yhi check krna h k kia high liquid assets k zrye hm apni </w:t>
       </w:r>
       <w:r>
         <w:rPr>
@@ -5493,7 +5715,6 @@
         <w:rPr>
           <w:lang w:val="en-PK"/>
         </w:rPr>
-        <w:lastRenderedPageBreak/>
         <w:t>It is a relationship between debt and equity, it tells how much of company’s financing comes from debt compared to owner’s equity, means k company debts pr kitni dependent h</w:t>
       </w:r>
     </w:p>
@@ -5833,6 +6054,7 @@
         <w:rPr>
           <w:lang w:val="en-PK"/>
         </w:rPr>
+        <w:lastRenderedPageBreak/>
         <w:t xml:space="preserve">Conceptualy it combines 2 things: </w:t>
       </w:r>
       <w:r>
@@ -5972,7 +6194,6 @@
         <w:rPr>
           <w:lang w:val="en-PK"/>
         </w:rPr>
-        <w:lastRenderedPageBreak/>
         <w:t>Hr doller jo stakeholder n invest kia, us pr kitna profit mila,, this is different from ROCE as ROCE m hm total capital employed (equity +longterm debt) ki base proprofoit dekha jata h k kitna total capital profit generate kr rha h but yhan ROE m just stakeholder ki investement ko</w:t>
       </w:r>
       <w:r>
@@ -6333,6 +6554,7 @@
           <w:u w:val="single"/>
           <w:lang w:val="en-PK"/>
         </w:rPr>
+        <w:lastRenderedPageBreak/>
         <w:t>Receivable collection period</w:t>
       </w:r>
       <w:r>
@@ -6513,7 +6735,6 @@
         <w:rPr>
           <w:lang w:val="en-PK"/>
         </w:rPr>
-        <w:lastRenderedPageBreak/>
         <w:t xml:space="preserve">  </w:t>
       </w:r>
       <w:r>
@@ -6787,6 +7008,7 @@
     </w:p>
     <w:p>
       <w:r>
+        <w:lastRenderedPageBreak/>
         <w:t>Inventory turnover period = inventory / cost of sales * 365</w:t>
       </w:r>
     </w:p>
@@ -6843,11 +7065,7 @@
         <w:t>Hm ek page bnay gy, lets say its name as A, jis pr hm bhhtt s tables, graphs, slicers etc etc lga den gy and us page pr right side pr drill through k option m cross report ko on kr k vo vo columns daal den gy jin pr hm chahty hn k click kia jay to y A vala page open ho, and is A valy m usi s related information ho</w:t>
       </w:r>
       <w:r>
-        <w:t xml:space="preserve">,, ab hm </w:t>
-      </w:r>
-      <w:r>
-        <w:lastRenderedPageBreak/>
-        <w:t xml:space="preserve">kisi or page pr jayn gy and un columns m s (vo columns jo hm cross report on kr k daaly hn) kisi column or right click kr k drill through m ja kr A ko click kryn gy to A open ho ga jis m saari info just us column s related hi ho gi </w:t>
+        <w:t xml:space="preserve">,, ab hm kisi or page pr jayn gy and un columns m s (vo columns jo hm cross report on kr k daaly hn) kisi column or right click kr k drill through m ja kr A ko click kryn gy to A open ho ga jis m saari info just us column s related hi ho gi </w:t>
       </w:r>
     </w:p>
     <w:p>
@@ -15045,6 +15263,441 @@
           <w:lang w:val="en-PK"/>
         </w:rPr>
       </w:pPr>
+      <w:r>
+        <w:rPr>
+          <w:rFonts w:cstheme="minorHAnsi"/>
+          <w:lang w:val="en-PK"/>
+        </w:rPr>
+        <w:t xml:space="preserve">In case of balance sheet values, we put </w:t>
+      </w:r>
+      <w:r>
+        <w:rPr>
+          <w:rFonts w:cstheme="minorHAnsi"/>
+          <w:lang w:val="en-PK"/>
+        </w:rPr>
+        <w:t>outlier threshold to 3%</w:t>
+      </w:r>
+      <w:r>
+        <w:rPr>
+          <w:rFonts w:cstheme="minorHAnsi"/>
+          <w:lang w:val="en-PK"/>
+        </w:rPr>
+        <w:t xml:space="preserve">,,,, </w:t>
+      </w:r>
+    </w:p>
+    <w:p>
+      <w:pPr>
+        <w:rPr>
+          <w:rFonts w:cstheme="minorHAnsi"/>
+          <w:lang w:val="en-PK"/>
+        </w:rPr>
+      </w:pPr>
+      <w:r>
+        <w:rPr>
+          <w:rFonts w:cstheme="minorHAnsi"/>
+          <w:lang w:val="en-PK"/>
+        </w:rPr>
+        <w:t>NOW WE HAVE JUST COMPARED P AND L AND BL WITH BUDGET AMOUNT, YOU CAN NOW COMPARE ALL RATIOS WITH BUDGETED RATIOS</w:t>
+      </w:r>
+    </w:p>
+    <w:p>
+      <w:pPr>
+        <w:ind w:left="360"/>
+        <w:rPr>
+          <w:rFonts w:cstheme="minorHAnsi"/>
+          <w:b/>
+          <w:bCs/>
+          <w:sz w:val="52"/>
+          <w:szCs w:val="52"/>
+          <w:u w:val="single"/>
+        </w:rPr>
+      </w:pPr>
+      <w:r>
+        <w:rPr>
+          <w:rFonts w:cstheme="minorHAnsi"/>
+          <w:b/>
+          <w:bCs/>
+          <w:sz w:val="52"/>
+          <w:szCs w:val="52"/>
+          <w:highlight w:val="green"/>
+          <w:u w:val="single"/>
+        </w:rPr>
+        <w:lastRenderedPageBreak/>
+        <w:t xml:space="preserve">Section </w:t>
+      </w:r>
+      <w:r>
+        <w:rPr>
+          <w:rFonts w:cstheme="minorHAnsi"/>
+          <w:b/>
+          <w:bCs/>
+          <w:sz w:val="52"/>
+          <w:szCs w:val="52"/>
+          <w:highlight w:val="green"/>
+          <w:u w:val="single"/>
+        </w:rPr>
+        <w:t>2</w:t>
+      </w:r>
+      <w:r>
+        <w:rPr>
+          <w:rFonts w:cstheme="minorHAnsi"/>
+          <w:b/>
+          <w:bCs/>
+          <w:sz w:val="52"/>
+          <w:szCs w:val="52"/>
+          <w:highlight w:val="green"/>
+          <w:u w:val="single"/>
+        </w:rPr>
+        <w:t>1</w:t>
+      </w:r>
+      <w:r>
+        <w:rPr>
+          <w:rFonts w:cstheme="minorHAnsi"/>
+          <w:b/>
+          <w:bCs/>
+          <w:sz w:val="52"/>
+          <w:szCs w:val="52"/>
+          <w:highlight w:val="green"/>
+          <w:u w:val="single"/>
+        </w:rPr>
+        <w:t xml:space="preserve"> : </w:t>
+      </w:r>
+      <w:r>
+        <w:rPr>
+          <w:rFonts w:cstheme="minorHAnsi"/>
+          <w:b/>
+          <w:bCs/>
+          <w:sz w:val="52"/>
+          <w:szCs w:val="52"/>
+          <w:highlight w:val="green"/>
+          <w:u w:val="single"/>
+        </w:rPr>
+        <w:t xml:space="preserve">Working with GL with no closing entry </w:t>
+      </w:r>
+    </w:p>
+    <w:p>
+      <w:pPr>
+        <w:rPr>
+          <w:rFonts w:cstheme="minorHAnsi"/>
+          <w:lang w:val="en-PK"/>
+        </w:rPr>
+      </w:pPr>
+      <w:r>
+        <w:rPr>
+          <w:rFonts w:cstheme="minorHAnsi"/>
+          <w:lang w:val="en-PK"/>
+        </w:rPr>
+        <w:t>P AND L k andr net profit hota h and y amount balance sheet k andr owner’s equity k andr retained earnings valy portion m jata h, q k simple bhi dekha jay to net profit actually owner’s equity m hi to count kia jata h, retained earnings hua (“opening retained earnings” + net profit) – dividends paid,,</w:t>
+      </w:r>
+    </w:p>
+    <w:p>
+      <w:pPr>
+        <w:rPr>
+          <w:rFonts w:cstheme="minorHAnsi"/>
+          <w:lang w:val="en-PK"/>
+        </w:rPr>
+      </w:pPr>
+      <w:r>
+        <w:rPr>
+          <w:rFonts w:cstheme="minorHAnsi"/>
+          <w:lang w:val="en-PK"/>
+        </w:rPr>
+        <w:t>Ab closing entry s murad net profit ko utha kr retained earnings m move krna h,</w:t>
+      </w:r>
+      <w:r>
+        <w:rPr>
+          <w:rFonts w:cstheme="minorHAnsi"/>
+          <w:lang w:val="en-PK"/>
+        </w:rPr>
+        <w:t xml:space="preserve"> (agr retained earnings m closing entry na daali jay to balance sheet ki values bhi ghalat dikhyn gi</w:t>
+      </w:r>
+      <w:r>
+        <w:rPr>
+          <w:rFonts w:cstheme="minorHAnsi"/>
+          <w:lang w:val="en-PK"/>
+        </w:rPr>
+        <w:t xml:space="preserve"> q k equity incomplete ho gi</w:t>
+      </w:r>
+      <w:r>
+        <w:rPr>
+          <w:rFonts w:cstheme="minorHAnsi"/>
+          <w:lang w:val="en-PK"/>
+        </w:rPr>
+        <w:t>),</w:t>
+      </w:r>
+      <w:r>
+        <w:rPr>
+          <w:rFonts w:cstheme="minorHAnsi"/>
+          <w:lang w:val="en-PK"/>
+        </w:rPr>
+        <w:t xml:space="preserve"> </w:t>
+      </w:r>
+      <w:r>
+        <w:rPr>
+          <w:rFonts w:cstheme="minorHAnsi"/>
+          <w:lang w:val="en-PK"/>
+        </w:rPr>
+        <w:t xml:space="preserve">ab sometimes is GL k andr equity valy ledger m </w:t>
+      </w:r>
+      <w:r>
+        <w:rPr>
+          <w:rFonts w:cstheme="minorHAnsi"/>
+          <w:lang w:val="en-PK"/>
+        </w:rPr>
+        <w:t xml:space="preserve">jo </w:t>
+      </w:r>
+      <w:r>
+        <w:rPr>
+          <w:rFonts w:cstheme="minorHAnsi"/>
+          <w:lang w:val="en-PK"/>
+        </w:rPr>
+        <w:t xml:space="preserve">retained earnings account </w:t>
+      </w:r>
+      <w:r>
+        <w:rPr>
+          <w:rFonts w:cstheme="minorHAnsi"/>
+          <w:lang w:val="en-PK"/>
+        </w:rPr>
+        <w:t xml:space="preserve">h us </w:t>
+      </w:r>
+      <w:r>
+        <w:rPr>
+          <w:rFonts w:cstheme="minorHAnsi"/>
+          <w:lang w:val="en-PK"/>
+        </w:rPr>
+        <w:t xml:space="preserve">k andr </w:t>
+      </w:r>
+      <w:r>
+        <w:rPr>
+          <w:rFonts w:cstheme="minorHAnsi"/>
+          <w:lang w:val="en-PK"/>
+        </w:rPr>
+        <w:t>y net profit add nhi hua hota,, is ko add krty k 3 ways hn:</w:t>
+      </w:r>
+    </w:p>
+    <w:p>
+      <w:pPr>
+        <w:pStyle w:val="ListParagraph"/>
+        <w:numPr>
+          <w:ilvl w:val="1"/>
+          <w:numId w:val="12"/>
+        </w:numPr>
+        <w:rPr>
+          <w:rFonts w:cstheme="minorHAnsi"/>
+          <w:lang w:val="en-PK"/>
+        </w:rPr>
+      </w:pPr>
+      <w:r>
+        <w:rPr>
+          <w:rFonts w:cstheme="minorHAnsi"/>
+          <w:lang w:val="en-PK"/>
+        </w:rPr>
+        <w:t>ya to accountant manually add kry, esa phly hota tha jab accounting k liye accounting softwares ko use nhi kia jata tha</w:t>
+      </w:r>
+    </w:p>
+    <w:p>
+      <w:pPr>
+        <w:pStyle w:val="ListParagraph"/>
+        <w:numPr>
+          <w:ilvl w:val="1"/>
+          <w:numId w:val="12"/>
+        </w:numPr>
+        <w:rPr>
+          <w:rFonts w:cstheme="minorHAnsi"/>
+          <w:lang w:val="en-PK"/>
+        </w:rPr>
+      </w:pPr>
+      <w:r>
+        <w:rPr>
+          <w:rFonts w:cstheme="minorHAnsi"/>
+          <w:lang w:val="en-PK"/>
+        </w:rPr>
+        <w:t>accounting softwares automatically add kr de</w:t>
+      </w:r>
+    </w:p>
+    <w:p>
+      <w:pPr>
+        <w:pStyle w:val="ListParagraph"/>
+        <w:numPr>
+          <w:ilvl w:val="1"/>
+          <w:numId w:val="12"/>
+        </w:numPr>
+        <w:rPr>
+          <w:rFonts w:cstheme="minorHAnsi"/>
+          <w:lang w:val="en-PK"/>
+        </w:rPr>
+      </w:pPr>
+      <w:r>
+        <w:rPr>
+          <w:rFonts w:cstheme="minorHAnsi"/>
+          <w:lang w:val="en-PK"/>
+        </w:rPr>
+        <w:t>GL m entry na kro but phir bhi correct numbers dikhty hn</w:t>
+      </w:r>
+      <w:r>
+        <w:rPr>
+          <w:rFonts w:cstheme="minorHAnsi"/>
+          <w:lang w:val="en-PK"/>
+        </w:rPr>
+        <w:t xml:space="preserve"> q k reports bnaty huy hm command de dety hn k net profit ko retained earnings m add kro</w:t>
+      </w:r>
+    </w:p>
+    <w:p>
+      <w:pPr>
+        <w:rPr>
+          <w:rFonts w:cstheme="minorHAnsi"/>
+          <w:lang w:val="en-PK"/>
+        </w:rPr>
+      </w:pPr>
+      <w:r>
+        <w:rPr>
+          <w:rFonts w:cstheme="minorHAnsi"/>
+          <w:lang w:val="en-PK"/>
+        </w:rPr>
+        <w:t>ERP softwares k andr y automatically add ho jatih but POWER BI m manually add krna prta h</w:t>
+      </w:r>
+    </w:p>
+    <w:p>
+      <w:pPr>
+        <w:rPr>
+          <w:rFonts w:cstheme="minorHAnsi"/>
+          <w:lang w:val="en-PK"/>
+        </w:rPr>
+      </w:pPr>
+      <w:r>
+        <w:rPr>
+          <w:rFonts w:cstheme="minorHAnsi"/>
+          <w:lang w:val="en-PK"/>
+        </w:rPr>
+        <w:t xml:space="preserve">Ab tk hm n </w:t>
+      </w:r>
+      <w:r>
+        <w:rPr>
+          <w:rFonts w:cstheme="minorHAnsi"/>
+          <w:lang w:val="en-PK"/>
+        </w:rPr>
+        <w:t>jo kam kia h us m GL k equity account m already retained earnings m net profit add hua hua h, we will do the 3rd thing by using the dataset where there is no closing entry and we will correct the retained earnings amount at the time of creating balance sheet</w:t>
+      </w:r>
+    </w:p>
+    <w:p>
+      <w:pPr>
+        <w:rPr>
+          <w:rFonts w:cstheme="minorHAnsi"/>
+          <w:lang w:val="en-PK"/>
+        </w:rPr>
+      </w:pPr>
+      <w:r>
+        <w:rPr>
+          <w:rFonts w:cstheme="minorHAnsi"/>
+          <w:lang w:val="en-PK"/>
+        </w:rPr>
+        <w:t xml:space="preserve">Every time in GL, there is double entry for a single transaction and the amount is kept balanced using double entry, </w:t>
+      </w:r>
+      <w:r>
+        <w:rPr>
+          <w:rFonts w:cstheme="minorHAnsi"/>
+          <w:lang w:val="en-PK"/>
+        </w:rPr>
+        <w:t xml:space="preserve">e.g: if we have made a purchase then cash decrease (-) but asset increase(+), means balance, </w:t>
+      </w:r>
+      <w:r>
+        <w:rPr>
+          <w:rFonts w:cstheme="minorHAnsi"/>
+          <w:lang w:val="en-PK"/>
+        </w:rPr>
+        <w:t xml:space="preserve">jo GL hmary pas h us m bhi double entry h hr cheez ki and this happened always in each GL table in any dataset, buty chatgot k according hmary dataset m amount credit and debit ki base or + and – nhi ho rhi bal k amount k izafy ko + and decrease ko – show kia hua h, but jo bhi ho ,now we are gonna prepare our dataset to remove </w:t>
+      </w:r>
+      <w:r>
+        <w:rPr>
+          <w:rFonts w:cstheme="minorHAnsi"/>
+          <w:lang w:val="en-PK"/>
+        </w:rPr>
+        <w:t>net profit from retained earnings</w:t>
+      </w:r>
+      <w:r>
+        <w:rPr>
+          <w:rFonts w:cstheme="minorHAnsi"/>
+          <w:lang w:val="en-PK"/>
+        </w:rPr>
+        <w:t xml:space="preserve"> (for practice of course)</w:t>
+      </w:r>
+      <w:r>
+        <w:rPr>
+          <w:rFonts w:cstheme="minorHAnsi"/>
+          <w:lang w:val="en-PK"/>
+        </w:rPr>
+        <w:t>,</w:t>
+      </w:r>
+      <w:r>
+        <w:rPr>
+          <w:rFonts w:cstheme="minorHAnsi"/>
+          <w:lang w:val="en-PK"/>
+        </w:rPr>
+        <w:t xml:space="preserve"> </w:t>
+      </w:r>
+      <w:r>
+        <w:rPr>
+          <w:rFonts w:cstheme="minorHAnsi"/>
+          <w:lang w:val="en-PK"/>
+        </w:rPr>
+        <w:t>in chart of account retained earnings have account key 200 and 210, 210 valy m retained earnings m s dividensd to – minus k k jho amount ai vo m,ention h, so we wi</w:t>
+      </w:r>
+      <w:r>
+        <w:rPr>
+          <w:rFonts w:cstheme="minorHAnsi"/>
+          <w:lang w:val="en-PK"/>
+        </w:rPr>
+        <w:t>l</w:t>
+      </w:r>
+      <w:r>
+        <w:rPr>
+          <w:rFonts w:cstheme="minorHAnsi"/>
+          <w:lang w:val="en-PK"/>
+        </w:rPr>
+        <w:t xml:space="preserve">l proceed with only 200, GL m is account key pr description “net profit add to retained earnings” h, we will not only just remove </w:t>
+      </w:r>
+      <w:r>
+        <w:rPr>
+          <w:rFonts w:cstheme="minorHAnsi"/>
+          <w:lang w:val="en-PK"/>
+        </w:rPr>
+        <w:t>these rows but also search for its 2nd leg of entry (because GL m ek transaction pr 2 entries hoti hn) isi descrition ko filter kryn gy and dusra account 1010 jis pr yhi descrition thi, dono ko delete kry gy</w:t>
+      </w:r>
+      <w:r>
+        <w:rPr>
+          <w:rFonts w:cstheme="minorHAnsi"/>
+          <w:lang w:val="en-PK"/>
+        </w:rPr>
+        <w:t xml:space="preserve"> and then import klry gy dataset ko</w:t>
+      </w:r>
+    </w:p>
+    <w:p>
+      <w:pPr>
+        <w:rPr>
+          <w:rFonts w:cstheme="minorHAnsi"/>
+          <w:lang w:val="en-PK"/>
+        </w:rPr>
+      </w:pPr>
+      <w:r>
+        <w:rPr>
+          <w:rFonts w:cstheme="minorHAnsi"/>
+          <w:lang w:val="en-PK"/>
+        </w:rPr>
+        <w:t xml:space="preserve">AB JAB HM ESY CLOSING ENTRY K BAGHER BL CREATE KRYN GY TO HMARY PAS BL CORRECT NHI HO GI Q K </w:t>
+      </w:r>
+      <w:r>
+        <w:rPr>
+          <w:rFonts w:cstheme="minorHAnsi"/>
+          <w:lang w:val="en-PK"/>
+        </w:rPr>
+        <w:t xml:space="preserve">assets and ower’s equity ki net amount equal nhi ay gi, </w:t>
+      </w:r>
+      <w:r>
+        <w:rPr>
+          <w:rFonts w:cstheme="minorHAnsi"/>
+          <w:lang w:val="en-PK"/>
+        </w:rPr>
+        <w:t>and retained earning m retained earning khali a rhi h</w:t>
+      </w:r>
     </w:p>
     <w:sectPr>
       <w:pgSz w:w="12240" w:h="15840"/>
@@ -17046,7 +17699,7 @@
   <w:abstractNum w:abstractNumId="14" w15:restartNumberingAfterBreak="0">
     <w:nsid w:val="42AE40BC"/>
     <w:multiLevelType w:val="multilevel"/>
-    <w:tmpl w:val="5812FB9A"/>
+    <w:tmpl w:val="6A9447F4"/>
     <w:lvl w:ilvl="0">
       <w:start w:val="1"/>
       <w:numFmt w:val="bullet"/>
@@ -17063,20 +17716,16 @@
         <w:sz w:val="20"/>
       </w:rPr>
     </w:lvl>
-    <w:lvl w:ilvl="1" w:tentative="1">
+    <w:lvl w:ilvl="1">
       <w:start w:val="1"/>
-      <w:numFmt w:val="bullet"/>
-      <w:lvlText w:val="o"/>
+      <w:numFmt w:val="decimal"/>
+      <w:lvlText w:val="%2-"/>
       <w:lvlJc w:val="left"/>
       <w:pPr>
-        <w:tabs>
-          <w:tab w:val="num" w:pos="1440"/>
-        </w:tabs>
         <w:ind w:left="1440" w:hanging="360"/>
       </w:pPr>
       <w:rPr>
-        <w:rFonts w:ascii="Courier New" w:hAnsi="Courier New" w:hint="default"/>
-        <w:sz w:val="20"/>
+        <w:rFonts w:hint="default"/>
       </w:rPr>
     </w:lvl>
     <w:lvl w:ilvl="2" w:tentative="1">
@@ -18398,7 +19047,7 @@
   <w:style w:type="paragraph" w:default="1" w:styleId="Normal">
     <w:name w:val="Normal"/>
     <w:qFormat/>
-    <w:rsid w:val="00AC6AA2"/>
+    <w:rsid w:val="00F75B23"/>
   </w:style>
   <w:style w:type="paragraph" w:styleId="Heading1">
     <w:name w:val="heading 1"/>

</xml_diff>

<commit_message>
make a final conclusion for credit and bedit entry
</commit_message>
<xml_diff>
--- a/Complete FINANCIAL REPORTING AND FINANCIAL ANALYSIS USING POWER BI.docx
+++ b/Complete FINANCIAL REPORTING AND FINANCIAL ANALYSIS USING POWER BI.docx
@@ -55758,6 +55758,1718 @@
           <w:lang w:val="en-PK"/>
         </w:rPr>
       </w:pPr>
+      <w:r>
+        <w:rPr>
+          <w:rFonts w:cstheme="minorHAnsi"/>
+          <w:lang w:val="en-PK"/>
+        </w:rPr>
+        <w:t>CONCLUSION:</w:t>
+      </w:r>
+    </w:p>
+    <w:p>
+      <w:pPr>
+        <w:rPr>
+          <w:rFonts w:cstheme="minorHAnsi"/>
+          <w:lang w:val="en-PK"/>
+        </w:rPr>
+      </w:pPr>
+      <w:proofErr w:type="gramStart"/>
+      <w:r>
+        <w:rPr>
+          <w:rFonts w:cstheme="minorHAnsi"/>
+          <w:lang w:val="en-PK"/>
+        </w:rPr>
+        <w:t>so</w:t>
+      </w:r>
+      <w:proofErr w:type="gramEnd"/>
+      <w:r>
+        <w:rPr>
+          <w:rFonts w:cstheme="minorHAnsi"/>
+          <w:lang w:val="en-PK"/>
+        </w:rPr>
+        <w:t xml:space="preserve"> conclusion is </w:t>
+      </w:r>
+      <w:r>
+        <w:rPr>
+          <w:rFonts w:cstheme="minorHAnsi"/>
+          <w:lang w:val="en-PK"/>
+        </w:rPr>
+        <w:t xml:space="preserve">that </w:t>
+      </w:r>
+      <w:r>
+        <w:rPr>
+          <w:rFonts w:cstheme="minorHAnsi"/>
+          <w:lang w:val="en-PK"/>
+        </w:rPr>
+        <w:t xml:space="preserve">in </w:t>
+      </w:r>
+      <w:proofErr w:type="spellStart"/>
+      <w:r>
+        <w:rPr>
+          <w:rFonts w:cstheme="minorHAnsi"/>
+          <w:lang w:val="en-PK"/>
+        </w:rPr>
+        <w:t>normall</w:t>
+      </w:r>
+      <w:proofErr w:type="spellEnd"/>
+      <w:r>
+        <w:rPr>
+          <w:rFonts w:cstheme="minorHAnsi"/>
+          <w:lang w:val="en-PK"/>
+        </w:rPr>
+        <w:t xml:space="preserve"> accounting, we have 2 columns name credit and debit to show the amount such as like that: </w:t>
+      </w:r>
+    </w:p>
+    <w:p>
+      <w:pPr>
+        <w:ind w:left="720" w:hanging="720"/>
+        <w:rPr>
+          <w:rFonts w:cstheme="minorHAnsi"/>
+          <w:lang w:val="en-PK"/>
+        </w:rPr>
+      </w:pPr>
+      <w:r>
+        <w:rPr>
+          <w:rFonts w:cstheme="minorHAnsi"/>
+          <w:lang w:val="en-PK"/>
+        </w:rPr>
+        <w:t xml:space="preserve">Debit | Credit </w:t>
+      </w:r>
+    </w:p>
+    <w:p>
+      <w:pPr>
+        <w:ind w:left="720" w:hanging="720"/>
+        <w:rPr>
+          <w:rFonts w:cstheme="minorHAnsi"/>
+          <w:lang w:val="en-PK"/>
+        </w:rPr>
+      </w:pPr>
+      <w:r>
+        <w:rPr>
+          <w:rFonts w:cstheme="minorHAnsi"/>
+          <w:lang w:val="en-PK"/>
+        </w:rPr>
+        <w:t>100   | 0</w:t>
+      </w:r>
+    </w:p>
+    <w:p>
+      <w:pPr>
+        <w:ind w:left="720" w:hanging="720"/>
+        <w:rPr>
+          <w:rFonts w:cstheme="minorHAnsi"/>
+          <w:lang w:val="en-PK"/>
+        </w:rPr>
+      </w:pPr>
+      <w:r>
+        <w:rPr>
+          <w:rFonts w:cstheme="minorHAnsi"/>
+          <w:lang w:val="en-PK"/>
+        </w:rPr>
+        <w:t>0     | 100</w:t>
+      </w:r>
+    </w:p>
+    <w:p>
+      <w:pPr>
+        <w:rPr>
+          <w:rFonts w:cstheme="minorHAnsi"/>
+          <w:lang w:val="en-PK"/>
+        </w:rPr>
+      </w:pPr>
+      <w:r>
+        <w:rPr>
+          <w:rFonts w:cstheme="minorHAnsi"/>
+          <w:lang w:val="en-PK"/>
+        </w:rPr>
+        <w:t xml:space="preserve">sometimes datasets also show like that, but sometimes, amount present in a single column in which both credit and debit entries are made, in general entry, for each transaction there should be a double entry, one for credit and other for debit. We can convert these 2 columns into one column using either approach from </w:t>
+      </w:r>
+      <w:proofErr w:type="spellStart"/>
+      <w:r>
+        <w:rPr>
+          <w:rFonts w:cstheme="minorHAnsi"/>
+          <w:lang w:val="en-PK"/>
+        </w:rPr>
+        <w:t>follwoing</w:t>
+      </w:r>
+      <w:proofErr w:type="spellEnd"/>
+      <w:r>
+        <w:rPr>
+          <w:rFonts w:cstheme="minorHAnsi"/>
+          <w:lang w:val="en-PK"/>
+        </w:rPr>
+        <w:t xml:space="preserve">, but </w:t>
+      </w:r>
+      <w:proofErr w:type="spellStart"/>
+      <w:r>
+        <w:rPr>
+          <w:rFonts w:cstheme="minorHAnsi"/>
+          <w:lang w:val="en-PK"/>
+        </w:rPr>
+        <w:t>khial</w:t>
+      </w:r>
+      <w:proofErr w:type="spellEnd"/>
+      <w:r>
+        <w:rPr>
+          <w:rFonts w:cstheme="minorHAnsi"/>
+          <w:lang w:val="en-PK"/>
+        </w:rPr>
+        <w:t xml:space="preserve"> </w:t>
+      </w:r>
+      <w:proofErr w:type="spellStart"/>
+      <w:r>
+        <w:rPr>
+          <w:rFonts w:cstheme="minorHAnsi"/>
+          <w:lang w:val="en-PK"/>
+        </w:rPr>
+        <w:t>rhy</w:t>
+      </w:r>
+      <w:proofErr w:type="spellEnd"/>
+      <w:r>
+        <w:rPr>
+          <w:rFonts w:cstheme="minorHAnsi"/>
+          <w:lang w:val="en-PK"/>
+        </w:rPr>
+        <w:t xml:space="preserve"> k </w:t>
+      </w:r>
+      <w:proofErr w:type="spellStart"/>
+      <w:r>
+        <w:rPr>
+          <w:rFonts w:cstheme="minorHAnsi"/>
+          <w:lang w:val="en-PK"/>
+        </w:rPr>
+        <w:t>pury</w:t>
+      </w:r>
+      <w:proofErr w:type="spellEnd"/>
+      <w:r>
+        <w:rPr>
+          <w:rFonts w:cstheme="minorHAnsi"/>
+          <w:lang w:val="en-PK"/>
+        </w:rPr>
+        <w:t xml:space="preserve"> dataset m approach consistent </w:t>
+      </w:r>
+      <w:proofErr w:type="spellStart"/>
+      <w:r>
+        <w:rPr>
+          <w:rFonts w:cstheme="minorHAnsi"/>
+          <w:lang w:val="en-PK"/>
+        </w:rPr>
+        <w:t>rhy</w:t>
+      </w:r>
+      <w:proofErr w:type="spellEnd"/>
+      <w:r>
+        <w:rPr>
+          <w:rFonts w:cstheme="minorHAnsi"/>
+          <w:lang w:val="en-PK"/>
+        </w:rPr>
+        <w:t xml:space="preserve"> </w:t>
+      </w:r>
+      <w:proofErr w:type="spellStart"/>
+      <w:r>
+        <w:rPr>
+          <w:rFonts w:cstheme="minorHAnsi"/>
+          <w:lang w:val="en-PK"/>
+        </w:rPr>
+        <w:t>gi</w:t>
+      </w:r>
+      <w:proofErr w:type="spellEnd"/>
+    </w:p>
+    <w:p>
+      <w:pPr>
+        <w:rPr>
+          <w:rFonts w:cstheme="minorHAnsi"/>
+          <w:lang w:val="en-PK"/>
+        </w:rPr>
+      </w:pPr>
+      <w:r>
+        <w:rPr>
+          <w:rFonts w:cstheme="minorHAnsi"/>
+          <w:lang w:val="en-PK"/>
+        </w:rPr>
+        <w:t xml:space="preserve">1-      in this </w:t>
+      </w:r>
+      <w:proofErr w:type="spellStart"/>
+      <w:r>
+        <w:rPr>
+          <w:rFonts w:cstheme="minorHAnsi"/>
+          <w:lang w:val="en-PK"/>
+        </w:rPr>
+        <w:t>datset</w:t>
+      </w:r>
+      <w:proofErr w:type="spellEnd"/>
+      <w:r>
+        <w:rPr>
+          <w:rFonts w:cstheme="minorHAnsi"/>
+          <w:lang w:val="en-PK"/>
+        </w:rPr>
+        <w:t xml:space="preserve"> and in these lectures or in this project, we have converted the credit and debit 2 columns into 1 column using this concept such that k </w:t>
+      </w:r>
+      <w:proofErr w:type="spellStart"/>
+      <w:r>
+        <w:rPr>
+          <w:rFonts w:cstheme="minorHAnsi"/>
+          <w:lang w:val="en-PK"/>
+        </w:rPr>
+        <w:t>paancho</w:t>
+      </w:r>
+      <w:proofErr w:type="spellEnd"/>
+      <w:r>
+        <w:rPr>
+          <w:rFonts w:cstheme="minorHAnsi"/>
+          <w:lang w:val="en-PK"/>
+        </w:rPr>
+        <w:t xml:space="preserve"> accounts (assets, expense, liability, income, equity), in m s expense k </w:t>
+      </w:r>
+      <w:proofErr w:type="spellStart"/>
+      <w:r>
+        <w:rPr>
+          <w:rFonts w:cstheme="minorHAnsi"/>
+          <w:lang w:val="en-PK"/>
+        </w:rPr>
+        <w:t>ilava</w:t>
+      </w:r>
+      <w:proofErr w:type="spellEnd"/>
+      <w:r>
+        <w:rPr>
+          <w:rFonts w:cstheme="minorHAnsi"/>
+          <w:lang w:val="en-PK"/>
+        </w:rPr>
+        <w:t xml:space="preserve"> </w:t>
+      </w:r>
+      <w:proofErr w:type="spellStart"/>
+      <w:r>
+        <w:rPr>
+          <w:rFonts w:cstheme="minorHAnsi"/>
+          <w:lang w:val="en-PK"/>
+        </w:rPr>
+        <w:t>agr</w:t>
+      </w:r>
+      <w:proofErr w:type="spellEnd"/>
+      <w:r>
+        <w:rPr>
+          <w:rFonts w:cstheme="minorHAnsi"/>
+          <w:lang w:val="en-PK"/>
+        </w:rPr>
+        <w:t xml:space="preserve"> </w:t>
+      </w:r>
+      <w:proofErr w:type="spellStart"/>
+      <w:r>
+        <w:rPr>
+          <w:rFonts w:cstheme="minorHAnsi"/>
+          <w:lang w:val="en-PK"/>
+        </w:rPr>
+        <w:t>kuch</w:t>
+      </w:r>
+      <w:proofErr w:type="spellEnd"/>
+      <w:r>
+        <w:rPr>
+          <w:rFonts w:cstheme="minorHAnsi"/>
+          <w:lang w:val="en-PK"/>
+        </w:rPr>
+        <w:t xml:space="preserve"> increase </w:t>
+      </w:r>
+      <w:proofErr w:type="spellStart"/>
+      <w:r>
+        <w:rPr>
+          <w:rFonts w:cstheme="minorHAnsi"/>
+          <w:lang w:val="en-PK"/>
+        </w:rPr>
+        <w:t>hua</w:t>
+      </w:r>
+      <w:proofErr w:type="spellEnd"/>
+      <w:r>
+        <w:rPr>
+          <w:rFonts w:cstheme="minorHAnsi"/>
+          <w:lang w:val="en-PK"/>
+        </w:rPr>
+        <w:t xml:space="preserve"> to hm amount k </w:t>
+      </w:r>
+      <w:proofErr w:type="spellStart"/>
+      <w:r>
+        <w:rPr>
+          <w:rFonts w:cstheme="minorHAnsi"/>
+          <w:lang w:val="en-PK"/>
+        </w:rPr>
+        <w:t>saath</w:t>
+      </w:r>
+      <w:proofErr w:type="spellEnd"/>
+      <w:r>
+        <w:rPr>
+          <w:rFonts w:cstheme="minorHAnsi"/>
+          <w:lang w:val="en-PK"/>
+        </w:rPr>
+        <w:t xml:space="preserve"> + sign </w:t>
+      </w:r>
+      <w:proofErr w:type="spellStart"/>
+      <w:r>
+        <w:rPr>
+          <w:rFonts w:cstheme="minorHAnsi"/>
+          <w:lang w:val="en-PK"/>
+        </w:rPr>
+        <w:t>lgayn</w:t>
+      </w:r>
+      <w:proofErr w:type="spellEnd"/>
+      <w:r>
+        <w:rPr>
+          <w:rFonts w:cstheme="minorHAnsi"/>
+          <w:lang w:val="en-PK"/>
+        </w:rPr>
+        <w:t xml:space="preserve"> </w:t>
+      </w:r>
+      <w:proofErr w:type="spellStart"/>
+      <w:r>
+        <w:rPr>
+          <w:rFonts w:cstheme="minorHAnsi"/>
+          <w:lang w:val="en-PK"/>
+        </w:rPr>
+        <w:t>gy</w:t>
+      </w:r>
+      <w:proofErr w:type="spellEnd"/>
+      <w:r>
+        <w:rPr>
+          <w:rFonts w:cstheme="minorHAnsi"/>
+          <w:lang w:val="en-PK"/>
+        </w:rPr>
+        <w:t xml:space="preserve"> and </w:t>
+      </w:r>
+      <w:proofErr w:type="spellStart"/>
+      <w:r>
+        <w:rPr>
+          <w:rFonts w:cstheme="minorHAnsi"/>
+          <w:lang w:val="en-PK"/>
+        </w:rPr>
+        <w:t>agr</w:t>
+      </w:r>
+      <w:proofErr w:type="spellEnd"/>
+      <w:r>
+        <w:rPr>
+          <w:rFonts w:cstheme="minorHAnsi"/>
+          <w:lang w:val="en-PK"/>
+        </w:rPr>
+        <w:t xml:space="preserve"> </w:t>
+      </w:r>
+      <w:proofErr w:type="spellStart"/>
+      <w:r>
+        <w:rPr>
+          <w:rFonts w:cstheme="minorHAnsi"/>
+          <w:lang w:val="en-PK"/>
+        </w:rPr>
+        <w:t>kuch</w:t>
+      </w:r>
+      <w:proofErr w:type="spellEnd"/>
+      <w:r>
+        <w:rPr>
+          <w:rFonts w:cstheme="minorHAnsi"/>
+          <w:lang w:val="en-PK"/>
+        </w:rPr>
+        <w:t xml:space="preserve"> decrease </w:t>
+      </w:r>
+      <w:proofErr w:type="spellStart"/>
+      <w:r>
+        <w:rPr>
+          <w:rFonts w:cstheme="minorHAnsi"/>
+          <w:lang w:val="en-PK"/>
+        </w:rPr>
+        <w:t>hua</w:t>
+      </w:r>
+      <w:proofErr w:type="spellEnd"/>
+      <w:r>
+        <w:rPr>
+          <w:rFonts w:cstheme="minorHAnsi"/>
+          <w:lang w:val="en-PK"/>
+        </w:rPr>
+        <w:t xml:space="preserve"> expense k </w:t>
+      </w:r>
+      <w:proofErr w:type="spellStart"/>
+      <w:r>
+        <w:rPr>
+          <w:rFonts w:cstheme="minorHAnsi"/>
+          <w:lang w:val="en-PK"/>
+        </w:rPr>
+        <w:t>ilava</w:t>
+      </w:r>
+      <w:proofErr w:type="spellEnd"/>
+      <w:r>
+        <w:rPr>
+          <w:rFonts w:cstheme="minorHAnsi"/>
+          <w:lang w:val="en-PK"/>
+        </w:rPr>
+        <w:t xml:space="preserve"> to hm negative sign </w:t>
+      </w:r>
+      <w:proofErr w:type="spellStart"/>
+      <w:r>
+        <w:rPr>
+          <w:rFonts w:cstheme="minorHAnsi"/>
+          <w:lang w:val="en-PK"/>
+        </w:rPr>
+        <w:t>lgayn</w:t>
+      </w:r>
+      <w:proofErr w:type="spellEnd"/>
+      <w:r>
+        <w:rPr>
+          <w:rFonts w:cstheme="minorHAnsi"/>
+          <w:lang w:val="en-PK"/>
+        </w:rPr>
+        <w:t xml:space="preserve"> </w:t>
+      </w:r>
+      <w:proofErr w:type="spellStart"/>
+      <w:r>
+        <w:rPr>
+          <w:rFonts w:cstheme="minorHAnsi"/>
+          <w:lang w:val="en-PK"/>
+        </w:rPr>
+        <w:t>gy</w:t>
+      </w:r>
+      <w:proofErr w:type="spellEnd"/>
+      <w:r>
+        <w:rPr>
+          <w:rFonts w:cstheme="minorHAnsi"/>
+          <w:lang w:val="en-PK"/>
+        </w:rPr>
+        <w:t xml:space="preserve">, expense k </w:t>
+      </w:r>
+      <w:proofErr w:type="spellStart"/>
+      <w:r>
+        <w:rPr>
+          <w:rFonts w:cstheme="minorHAnsi"/>
+          <w:lang w:val="en-PK"/>
+        </w:rPr>
+        <w:t>saath</w:t>
+      </w:r>
+      <w:proofErr w:type="spellEnd"/>
+      <w:r>
+        <w:rPr>
+          <w:rFonts w:cstheme="minorHAnsi"/>
+          <w:lang w:val="en-PK"/>
+        </w:rPr>
+        <w:t xml:space="preserve"> case </w:t>
+      </w:r>
+      <w:proofErr w:type="spellStart"/>
+      <w:r>
+        <w:rPr>
+          <w:rFonts w:cstheme="minorHAnsi"/>
+          <w:lang w:val="en-PK"/>
+        </w:rPr>
+        <w:t>ulta</w:t>
+      </w:r>
+      <w:proofErr w:type="spellEnd"/>
+      <w:r>
+        <w:rPr>
+          <w:rFonts w:cstheme="minorHAnsi"/>
+          <w:lang w:val="en-PK"/>
+        </w:rPr>
+        <w:t xml:space="preserve"> h, is ka increase - and decrease + sign k </w:t>
+      </w:r>
+      <w:proofErr w:type="spellStart"/>
+      <w:r>
+        <w:rPr>
+          <w:rFonts w:cstheme="minorHAnsi"/>
+          <w:lang w:val="en-PK"/>
+        </w:rPr>
+        <w:t>saath</w:t>
+      </w:r>
+      <w:proofErr w:type="spellEnd"/>
+      <w:r>
+        <w:rPr>
+          <w:rFonts w:cstheme="minorHAnsi"/>
+          <w:lang w:val="en-PK"/>
+        </w:rPr>
+        <w:t xml:space="preserve"> show </w:t>
+      </w:r>
+      <w:proofErr w:type="spellStart"/>
+      <w:r>
+        <w:rPr>
+          <w:rFonts w:cstheme="minorHAnsi"/>
+          <w:lang w:val="en-PK"/>
+        </w:rPr>
+        <w:t>ho</w:t>
+      </w:r>
+      <w:proofErr w:type="spellEnd"/>
+      <w:r>
+        <w:rPr>
+          <w:rFonts w:cstheme="minorHAnsi"/>
+          <w:lang w:val="en-PK"/>
+        </w:rPr>
+        <w:t xml:space="preserve"> ga, </w:t>
+      </w:r>
+    </w:p>
+    <w:p>
+      <w:pPr>
+        <w:rPr>
+          <w:rFonts w:cstheme="minorHAnsi"/>
+          <w:lang w:val="en-PK"/>
+        </w:rPr>
+      </w:pPr>
+      <w:r>
+        <w:rPr>
+          <w:rFonts w:cstheme="minorHAnsi"/>
+          <w:lang w:val="en-PK"/>
+        </w:rPr>
+        <w:t xml:space="preserve">2-         although expense and assets </w:t>
+      </w:r>
+      <w:proofErr w:type="spellStart"/>
+      <w:r>
+        <w:rPr>
+          <w:rFonts w:cstheme="minorHAnsi"/>
+          <w:lang w:val="en-PK"/>
+        </w:rPr>
+        <w:t>dono</w:t>
+      </w:r>
+      <w:proofErr w:type="spellEnd"/>
+      <w:r>
+        <w:rPr>
+          <w:rFonts w:cstheme="minorHAnsi"/>
+          <w:lang w:val="en-PK"/>
+        </w:rPr>
+        <w:t xml:space="preserve"> debit k under </w:t>
+      </w:r>
+      <w:proofErr w:type="spellStart"/>
+      <w:r>
+        <w:rPr>
+          <w:rFonts w:cstheme="minorHAnsi"/>
+          <w:lang w:val="en-PK"/>
+        </w:rPr>
+        <w:t>aty</w:t>
+      </w:r>
+      <w:proofErr w:type="spellEnd"/>
+      <w:r>
+        <w:rPr>
+          <w:rFonts w:cstheme="minorHAnsi"/>
+          <w:lang w:val="en-PK"/>
+        </w:rPr>
+        <w:t xml:space="preserve"> </w:t>
+      </w:r>
+      <w:proofErr w:type="spellStart"/>
+      <w:r>
+        <w:rPr>
+          <w:rFonts w:cstheme="minorHAnsi"/>
+          <w:lang w:val="en-PK"/>
+        </w:rPr>
+        <w:t>hn</w:t>
+      </w:r>
+      <w:proofErr w:type="spellEnd"/>
+      <w:r>
+        <w:rPr>
+          <w:rFonts w:cstheme="minorHAnsi"/>
+          <w:lang w:val="en-PK"/>
+        </w:rPr>
+        <w:t xml:space="preserve">, </w:t>
+      </w:r>
+      <w:proofErr w:type="spellStart"/>
+      <w:r>
+        <w:rPr>
+          <w:rFonts w:cstheme="minorHAnsi"/>
+          <w:lang w:val="en-PK"/>
+        </w:rPr>
+        <w:t>agr</w:t>
+      </w:r>
+      <w:proofErr w:type="spellEnd"/>
+      <w:r>
+        <w:rPr>
+          <w:rFonts w:cstheme="minorHAnsi"/>
+          <w:lang w:val="en-PK"/>
+        </w:rPr>
+        <w:t xml:space="preserve"> in ka increase </w:t>
+      </w:r>
+      <w:proofErr w:type="spellStart"/>
+      <w:r>
+        <w:rPr>
+          <w:rFonts w:cstheme="minorHAnsi"/>
+          <w:lang w:val="en-PK"/>
+        </w:rPr>
+        <w:t>hua</w:t>
+      </w:r>
+      <w:proofErr w:type="spellEnd"/>
+      <w:r>
+        <w:rPr>
+          <w:rFonts w:cstheme="minorHAnsi"/>
+          <w:lang w:val="en-PK"/>
+        </w:rPr>
+        <w:t xml:space="preserve"> to debit and </w:t>
+      </w:r>
+      <w:proofErr w:type="spellStart"/>
+      <w:r>
+        <w:rPr>
+          <w:rFonts w:cstheme="minorHAnsi"/>
+          <w:lang w:val="en-PK"/>
+        </w:rPr>
+        <w:t>agr</w:t>
+      </w:r>
+      <w:proofErr w:type="spellEnd"/>
+      <w:r>
+        <w:rPr>
+          <w:rFonts w:cstheme="minorHAnsi"/>
+          <w:lang w:val="en-PK"/>
+        </w:rPr>
+        <w:t xml:space="preserve"> decrease </w:t>
+      </w:r>
+      <w:proofErr w:type="spellStart"/>
+      <w:r>
+        <w:rPr>
+          <w:rFonts w:cstheme="minorHAnsi"/>
+          <w:lang w:val="en-PK"/>
+        </w:rPr>
+        <w:t>hua</w:t>
+      </w:r>
+      <w:proofErr w:type="spellEnd"/>
+      <w:r>
+        <w:rPr>
+          <w:rFonts w:cstheme="minorHAnsi"/>
+          <w:lang w:val="en-PK"/>
+        </w:rPr>
+        <w:t xml:space="preserve"> to credit, and in some datasets, debit ko hm + and credit ko hm - sign k </w:t>
+      </w:r>
+      <w:proofErr w:type="spellStart"/>
+      <w:r>
+        <w:rPr>
+          <w:rFonts w:cstheme="minorHAnsi"/>
+          <w:lang w:val="en-PK"/>
+        </w:rPr>
+        <w:t>saath</w:t>
+      </w:r>
+      <w:proofErr w:type="spellEnd"/>
+      <w:r>
+        <w:rPr>
+          <w:rFonts w:cstheme="minorHAnsi"/>
+          <w:lang w:val="en-PK"/>
+        </w:rPr>
+        <w:t xml:space="preserve"> mention </w:t>
+      </w:r>
+      <w:proofErr w:type="spellStart"/>
+      <w:r>
+        <w:rPr>
+          <w:rFonts w:cstheme="minorHAnsi"/>
+          <w:lang w:val="en-PK"/>
+        </w:rPr>
+        <w:t>krty</w:t>
+      </w:r>
+      <w:proofErr w:type="spellEnd"/>
+      <w:r>
+        <w:rPr>
+          <w:rFonts w:cstheme="minorHAnsi"/>
+          <w:lang w:val="en-PK"/>
+        </w:rPr>
+        <w:t xml:space="preserve"> </w:t>
+      </w:r>
+      <w:proofErr w:type="spellStart"/>
+      <w:r>
+        <w:rPr>
+          <w:rFonts w:cstheme="minorHAnsi"/>
+          <w:lang w:val="en-PK"/>
+        </w:rPr>
+        <w:t>hn</w:t>
+      </w:r>
+      <w:proofErr w:type="spellEnd"/>
+      <w:r>
+        <w:rPr>
+          <w:rFonts w:cstheme="minorHAnsi"/>
+          <w:lang w:val="en-PK"/>
+        </w:rPr>
+        <w:t xml:space="preserve"> (jo k 2nd approach h 2 approaches m s), ab </w:t>
+      </w:r>
+      <w:proofErr w:type="spellStart"/>
+      <w:r>
+        <w:rPr>
+          <w:rFonts w:cstheme="minorHAnsi"/>
+          <w:lang w:val="en-PK"/>
+        </w:rPr>
+        <w:t>kisi</w:t>
+      </w:r>
+      <w:proofErr w:type="spellEnd"/>
+      <w:r>
+        <w:rPr>
+          <w:rFonts w:cstheme="minorHAnsi"/>
+          <w:lang w:val="en-PK"/>
+        </w:rPr>
+        <w:t xml:space="preserve"> </w:t>
+      </w:r>
+      <w:proofErr w:type="spellStart"/>
+      <w:r>
+        <w:rPr>
+          <w:rFonts w:cstheme="minorHAnsi"/>
+          <w:lang w:val="en-PK"/>
+        </w:rPr>
+        <w:t>kisi</w:t>
+      </w:r>
+      <w:proofErr w:type="spellEnd"/>
+      <w:r>
+        <w:rPr>
+          <w:rFonts w:cstheme="minorHAnsi"/>
+          <w:lang w:val="en-PK"/>
+        </w:rPr>
+        <w:t xml:space="preserve"> m debit ko - and credit ko + k </w:t>
+      </w:r>
+      <w:proofErr w:type="spellStart"/>
+      <w:r>
+        <w:rPr>
+          <w:rFonts w:cstheme="minorHAnsi"/>
+          <w:lang w:val="en-PK"/>
+        </w:rPr>
+        <w:t>saath</w:t>
+      </w:r>
+      <w:proofErr w:type="spellEnd"/>
+      <w:r>
+        <w:rPr>
+          <w:rFonts w:cstheme="minorHAnsi"/>
+          <w:lang w:val="en-PK"/>
+        </w:rPr>
+        <w:t xml:space="preserve"> </w:t>
+      </w:r>
+      <w:proofErr w:type="spellStart"/>
+      <w:r>
+        <w:rPr>
+          <w:rFonts w:cstheme="minorHAnsi"/>
+          <w:lang w:val="en-PK"/>
+        </w:rPr>
+        <w:t>menton</w:t>
+      </w:r>
+      <w:proofErr w:type="spellEnd"/>
+      <w:r>
+        <w:rPr>
+          <w:rFonts w:cstheme="minorHAnsi"/>
+          <w:lang w:val="en-PK"/>
+        </w:rPr>
+        <w:t xml:space="preserve"> kia </w:t>
+      </w:r>
+      <w:proofErr w:type="spellStart"/>
+      <w:r>
+        <w:rPr>
+          <w:rFonts w:cstheme="minorHAnsi"/>
+          <w:lang w:val="en-PK"/>
+        </w:rPr>
+        <w:t>hota</w:t>
+      </w:r>
+      <w:proofErr w:type="spellEnd"/>
+      <w:r>
+        <w:rPr>
+          <w:rFonts w:cstheme="minorHAnsi"/>
+          <w:lang w:val="en-PK"/>
+        </w:rPr>
+        <w:t xml:space="preserve"> h, this is all just for representation, but </w:t>
+      </w:r>
+      <w:proofErr w:type="spellStart"/>
+      <w:r>
+        <w:rPr>
+          <w:rFonts w:cstheme="minorHAnsi"/>
+          <w:lang w:val="en-PK"/>
+        </w:rPr>
+        <w:t>agr</w:t>
+      </w:r>
+      <w:proofErr w:type="spellEnd"/>
+      <w:r>
+        <w:rPr>
+          <w:rFonts w:cstheme="minorHAnsi"/>
+          <w:lang w:val="en-PK"/>
+        </w:rPr>
+        <w:t xml:space="preserve"> hm is ko le </w:t>
+      </w:r>
+      <w:proofErr w:type="spellStart"/>
+      <w:r>
+        <w:rPr>
+          <w:rFonts w:cstheme="minorHAnsi"/>
+          <w:lang w:val="en-PK"/>
+        </w:rPr>
+        <w:t>kr</w:t>
+      </w:r>
+      <w:proofErr w:type="spellEnd"/>
+      <w:r>
+        <w:rPr>
+          <w:rFonts w:cstheme="minorHAnsi"/>
+          <w:lang w:val="en-PK"/>
+        </w:rPr>
+        <w:t xml:space="preserve"> </w:t>
+      </w:r>
+      <w:proofErr w:type="spellStart"/>
+      <w:r>
+        <w:rPr>
+          <w:rFonts w:cstheme="minorHAnsi"/>
+          <w:lang w:val="en-PK"/>
+        </w:rPr>
+        <w:t>chaly</w:t>
+      </w:r>
+      <w:proofErr w:type="spellEnd"/>
+      <w:r>
+        <w:rPr>
+          <w:rFonts w:cstheme="minorHAnsi"/>
+          <w:lang w:val="en-PK"/>
+        </w:rPr>
+        <w:t xml:space="preserve"> to expense and assets </w:t>
+      </w:r>
+      <w:proofErr w:type="spellStart"/>
+      <w:r>
+        <w:rPr>
+          <w:rFonts w:cstheme="minorHAnsi"/>
+          <w:lang w:val="en-PK"/>
+        </w:rPr>
+        <w:t>dono</w:t>
+      </w:r>
+      <w:proofErr w:type="spellEnd"/>
+      <w:r>
+        <w:rPr>
+          <w:rFonts w:cstheme="minorHAnsi"/>
+          <w:lang w:val="en-PK"/>
+        </w:rPr>
+        <w:t xml:space="preserve"> ka </w:t>
+      </w:r>
+      <w:proofErr w:type="spellStart"/>
+      <w:r>
+        <w:rPr>
+          <w:rFonts w:cstheme="minorHAnsi"/>
+          <w:lang w:val="en-PK"/>
+        </w:rPr>
+        <w:t>incresae</w:t>
+      </w:r>
+      <w:proofErr w:type="spellEnd"/>
+      <w:r>
+        <w:rPr>
+          <w:rFonts w:cstheme="minorHAnsi"/>
+          <w:lang w:val="en-PK"/>
+        </w:rPr>
+        <w:t xml:space="preserve"> debit and </w:t>
+      </w:r>
+      <w:proofErr w:type="spellStart"/>
+      <w:r>
+        <w:rPr>
+          <w:rFonts w:cstheme="minorHAnsi"/>
+          <w:lang w:val="en-PK"/>
+        </w:rPr>
+        <w:t>dono</w:t>
+      </w:r>
+      <w:proofErr w:type="spellEnd"/>
+      <w:r>
+        <w:rPr>
+          <w:rFonts w:cstheme="minorHAnsi"/>
+          <w:lang w:val="en-PK"/>
+        </w:rPr>
+        <w:t xml:space="preserve"> ko hm n + s hi show kia </w:t>
+      </w:r>
+      <w:proofErr w:type="spellStart"/>
+      <w:r>
+        <w:rPr>
+          <w:rFonts w:cstheme="minorHAnsi"/>
+          <w:lang w:val="en-PK"/>
+        </w:rPr>
+        <w:t>hota</w:t>
+      </w:r>
+      <w:proofErr w:type="spellEnd"/>
+      <w:r>
+        <w:rPr>
+          <w:rFonts w:cstheme="minorHAnsi"/>
+          <w:lang w:val="en-PK"/>
+        </w:rPr>
+        <w:t xml:space="preserve"> h (if we consider debit as + for representation) and is case m hm expenses ko exceptional case m </w:t>
+      </w:r>
+      <w:proofErr w:type="spellStart"/>
+      <w:r>
+        <w:rPr>
+          <w:rFonts w:cstheme="minorHAnsi"/>
+          <w:lang w:val="en-PK"/>
+        </w:rPr>
+        <w:t>nhi</w:t>
+      </w:r>
+      <w:proofErr w:type="spellEnd"/>
+      <w:r>
+        <w:rPr>
+          <w:rFonts w:cstheme="minorHAnsi"/>
+          <w:lang w:val="en-PK"/>
+        </w:rPr>
+        <w:t xml:space="preserve"> consider </w:t>
+      </w:r>
+      <w:proofErr w:type="spellStart"/>
+      <w:r>
+        <w:rPr>
+          <w:rFonts w:cstheme="minorHAnsi"/>
+          <w:lang w:val="en-PK"/>
+        </w:rPr>
+        <w:t>krty</w:t>
+      </w:r>
+      <w:proofErr w:type="spellEnd"/>
+      <w:r>
+        <w:rPr>
+          <w:rFonts w:cstheme="minorHAnsi"/>
+          <w:lang w:val="en-PK"/>
+        </w:rPr>
+        <w:t xml:space="preserve"> </w:t>
+      </w:r>
+      <w:proofErr w:type="spellStart"/>
+      <w:r>
+        <w:rPr>
+          <w:rFonts w:cstheme="minorHAnsi"/>
+          <w:lang w:val="en-PK"/>
+        </w:rPr>
+        <w:t>hn</w:t>
+      </w:r>
+      <w:proofErr w:type="spellEnd"/>
+    </w:p>
+    <w:p>
+      <w:pPr>
+        <w:rPr>
+          <w:rFonts w:cstheme="minorHAnsi"/>
+          <w:lang w:val="en-PK"/>
+        </w:rPr>
+      </w:pPr>
+      <w:r>
+        <w:rPr>
+          <w:rFonts w:cstheme="minorHAnsi"/>
+          <w:lang w:val="en-PK"/>
+        </w:rPr>
+        <w:t xml:space="preserve">--&gt; ab hm in m s koi </w:t>
+      </w:r>
+      <w:proofErr w:type="spellStart"/>
+      <w:r>
+        <w:rPr>
+          <w:rFonts w:cstheme="minorHAnsi"/>
+          <w:lang w:val="en-PK"/>
+        </w:rPr>
+        <w:t>bhi</w:t>
+      </w:r>
+      <w:proofErr w:type="spellEnd"/>
+      <w:r>
+        <w:rPr>
+          <w:rFonts w:cstheme="minorHAnsi"/>
+          <w:lang w:val="en-PK"/>
+        </w:rPr>
+        <w:t xml:space="preserve"> approach use </w:t>
+      </w:r>
+      <w:proofErr w:type="spellStart"/>
+      <w:r>
+        <w:rPr>
+          <w:rFonts w:cstheme="minorHAnsi"/>
+          <w:lang w:val="en-PK"/>
+        </w:rPr>
+        <w:t>kr</w:t>
+      </w:r>
+      <w:proofErr w:type="spellEnd"/>
+      <w:r>
+        <w:rPr>
+          <w:rFonts w:cstheme="minorHAnsi"/>
+          <w:lang w:val="en-PK"/>
+        </w:rPr>
+        <w:t xml:space="preserve"> </w:t>
+      </w:r>
+      <w:proofErr w:type="spellStart"/>
+      <w:r>
+        <w:rPr>
+          <w:rFonts w:cstheme="minorHAnsi"/>
+          <w:lang w:val="en-PK"/>
+        </w:rPr>
+        <w:t>skty</w:t>
+      </w:r>
+      <w:proofErr w:type="spellEnd"/>
+      <w:r>
+        <w:rPr>
+          <w:rFonts w:cstheme="minorHAnsi"/>
+          <w:lang w:val="en-PK"/>
+        </w:rPr>
+        <w:t xml:space="preserve"> </w:t>
+      </w:r>
+      <w:proofErr w:type="spellStart"/>
+      <w:r>
+        <w:rPr>
+          <w:rFonts w:cstheme="minorHAnsi"/>
+          <w:lang w:val="en-PK"/>
+        </w:rPr>
+        <w:t>hn</w:t>
+      </w:r>
+      <w:proofErr w:type="spellEnd"/>
+      <w:r>
+        <w:rPr>
+          <w:rFonts w:cstheme="minorHAnsi"/>
+          <w:lang w:val="en-PK"/>
+        </w:rPr>
+        <w:t xml:space="preserve">, may be expense k exception vali approach </w:t>
+      </w:r>
+      <w:proofErr w:type="spellStart"/>
+      <w:r>
+        <w:rPr>
+          <w:rFonts w:cstheme="minorHAnsi"/>
+          <w:lang w:val="en-PK"/>
+        </w:rPr>
+        <w:t>ya</w:t>
+      </w:r>
+      <w:proofErr w:type="spellEnd"/>
+      <w:r>
+        <w:rPr>
+          <w:rFonts w:cstheme="minorHAnsi"/>
+          <w:lang w:val="en-PK"/>
+        </w:rPr>
+        <w:t xml:space="preserve"> credit debit k according + </w:t>
+      </w:r>
+      <w:proofErr w:type="spellStart"/>
+      <w:r>
+        <w:rPr>
+          <w:rFonts w:cstheme="minorHAnsi"/>
+          <w:lang w:val="en-PK"/>
+        </w:rPr>
+        <w:t>ya</w:t>
+      </w:r>
+      <w:proofErr w:type="spellEnd"/>
+      <w:r>
+        <w:rPr>
+          <w:rFonts w:cstheme="minorHAnsi"/>
+          <w:lang w:val="en-PK"/>
+        </w:rPr>
+        <w:t xml:space="preserve"> - vali approach</w:t>
+      </w:r>
+    </w:p>
+    <w:p>
+      <w:pPr>
+        <w:rPr>
+          <w:rFonts w:cstheme="minorHAnsi"/>
+          <w:lang w:val="en-PK"/>
+        </w:rPr>
+      </w:pPr>
+    </w:p>
+    <w:p>
+      <w:pPr>
+        <w:rPr>
+          <w:rFonts w:cstheme="minorHAnsi"/>
+          <w:lang w:val="en-PK"/>
+        </w:rPr>
+      </w:pPr>
+      <w:r>
+        <w:rPr>
+          <w:rFonts w:cstheme="minorHAnsi"/>
+          <w:lang w:val="en-PK"/>
+        </w:rPr>
+        <w:t xml:space="preserve">Is </w:t>
+      </w:r>
+      <w:proofErr w:type="spellStart"/>
+      <w:r>
+        <w:rPr>
+          <w:rFonts w:cstheme="minorHAnsi"/>
+          <w:lang w:val="en-PK"/>
+        </w:rPr>
+        <w:t>valy</w:t>
+      </w:r>
+      <w:proofErr w:type="spellEnd"/>
+      <w:r>
+        <w:rPr>
+          <w:rFonts w:cstheme="minorHAnsi"/>
+          <w:lang w:val="en-PK"/>
+        </w:rPr>
+        <w:t xml:space="preserve"> dataset m exception vali approach use ki gai h,,  ab ek or </w:t>
+      </w:r>
+      <w:proofErr w:type="spellStart"/>
+      <w:r>
+        <w:rPr>
+          <w:rFonts w:cstheme="minorHAnsi"/>
+          <w:lang w:val="en-PK"/>
+        </w:rPr>
+        <w:t>baat</w:t>
+      </w:r>
+      <w:proofErr w:type="spellEnd"/>
+      <w:r>
+        <w:rPr>
+          <w:rFonts w:cstheme="minorHAnsi"/>
+          <w:lang w:val="en-PK"/>
+        </w:rPr>
+        <w:t xml:space="preserve"> y h k single column </w:t>
+      </w:r>
+      <w:proofErr w:type="spellStart"/>
+      <w:r>
+        <w:rPr>
+          <w:rFonts w:cstheme="minorHAnsi"/>
+          <w:lang w:val="en-PK"/>
+        </w:rPr>
+        <w:t>krty</w:t>
+      </w:r>
+      <w:proofErr w:type="spellEnd"/>
+      <w:r>
+        <w:rPr>
+          <w:rFonts w:cstheme="minorHAnsi"/>
+          <w:lang w:val="en-PK"/>
+        </w:rPr>
+        <w:t xml:space="preserve"> </w:t>
+      </w:r>
+      <w:proofErr w:type="spellStart"/>
+      <w:r>
+        <w:rPr>
+          <w:rFonts w:cstheme="minorHAnsi"/>
+          <w:lang w:val="en-PK"/>
+        </w:rPr>
+        <w:t>huy</w:t>
+      </w:r>
+      <w:proofErr w:type="spellEnd"/>
+      <w:r>
+        <w:rPr>
+          <w:rFonts w:cstheme="minorHAnsi"/>
+          <w:lang w:val="en-PK"/>
+        </w:rPr>
+        <w:t xml:space="preserve"> jab hm double entry </w:t>
+      </w:r>
+      <w:proofErr w:type="spellStart"/>
+      <w:r>
+        <w:rPr>
+          <w:rFonts w:cstheme="minorHAnsi"/>
+          <w:lang w:val="en-PK"/>
+        </w:rPr>
+        <w:t>kryn</w:t>
+      </w:r>
+      <w:proofErr w:type="spellEnd"/>
+      <w:r>
+        <w:rPr>
+          <w:rFonts w:cstheme="minorHAnsi"/>
+          <w:lang w:val="en-PK"/>
+        </w:rPr>
+        <w:t xml:space="preserve"> </w:t>
+      </w:r>
+      <w:proofErr w:type="spellStart"/>
+      <w:r>
+        <w:rPr>
+          <w:rFonts w:cstheme="minorHAnsi"/>
+          <w:lang w:val="en-PK"/>
+        </w:rPr>
+        <w:t>gy</w:t>
+      </w:r>
+      <w:proofErr w:type="spellEnd"/>
+      <w:r>
+        <w:rPr>
+          <w:rFonts w:cstheme="minorHAnsi"/>
+          <w:lang w:val="en-PK"/>
+        </w:rPr>
+        <w:t xml:space="preserve"> to </w:t>
+      </w:r>
+      <w:proofErr w:type="spellStart"/>
+      <w:r>
+        <w:rPr>
+          <w:rFonts w:cstheme="minorHAnsi"/>
+          <w:lang w:val="en-PK"/>
+        </w:rPr>
+        <w:t>labeling</w:t>
+      </w:r>
+      <w:proofErr w:type="spellEnd"/>
+      <w:r>
+        <w:rPr>
+          <w:rFonts w:cstheme="minorHAnsi"/>
+          <w:lang w:val="en-PK"/>
+        </w:rPr>
+        <w:t>/detail/</w:t>
+      </w:r>
+      <w:proofErr w:type="spellStart"/>
+      <w:r>
+        <w:rPr>
+          <w:rFonts w:cstheme="minorHAnsi"/>
+          <w:lang w:val="en-PK"/>
+        </w:rPr>
+        <w:t>descrition</w:t>
+      </w:r>
+      <w:proofErr w:type="spellEnd"/>
+      <w:r>
+        <w:rPr>
+          <w:rFonts w:cstheme="minorHAnsi"/>
+          <w:lang w:val="en-PK"/>
+        </w:rPr>
+        <w:t xml:space="preserve"> m hm account k according detail den </w:t>
+      </w:r>
+      <w:proofErr w:type="spellStart"/>
+      <w:r>
+        <w:rPr>
+          <w:rFonts w:cstheme="minorHAnsi"/>
+          <w:lang w:val="en-PK"/>
+        </w:rPr>
+        <w:t>gy</w:t>
+      </w:r>
+      <w:proofErr w:type="spellEnd"/>
+      <w:r>
+        <w:rPr>
+          <w:rFonts w:cstheme="minorHAnsi"/>
+          <w:lang w:val="en-PK"/>
+        </w:rPr>
+        <w:t xml:space="preserve">, </w:t>
+      </w:r>
+      <w:proofErr w:type="spellStart"/>
+      <w:r>
+        <w:rPr>
+          <w:rFonts w:cstheme="minorHAnsi"/>
+          <w:lang w:val="en-PK"/>
+        </w:rPr>
+        <w:t>e.g</w:t>
+      </w:r>
+      <w:proofErr w:type="spellEnd"/>
+      <w:r>
+        <w:rPr>
+          <w:rFonts w:cstheme="minorHAnsi"/>
+          <w:lang w:val="en-PK"/>
+        </w:rPr>
+        <w:t xml:space="preserve">: 2000 ki goods ki purchase ki to real accounting m </w:t>
+      </w:r>
+      <w:proofErr w:type="spellStart"/>
+      <w:r>
+        <w:rPr>
+          <w:rFonts w:cstheme="minorHAnsi"/>
+          <w:lang w:val="en-PK"/>
+        </w:rPr>
+        <w:t>esa</w:t>
+      </w:r>
+      <w:proofErr w:type="spellEnd"/>
+      <w:r>
+        <w:rPr>
+          <w:rFonts w:cstheme="minorHAnsi"/>
+          <w:lang w:val="en-PK"/>
+        </w:rPr>
+        <w:t xml:space="preserve"> </w:t>
+      </w:r>
+      <w:proofErr w:type="spellStart"/>
+      <w:r>
+        <w:rPr>
+          <w:rFonts w:cstheme="minorHAnsi"/>
+          <w:lang w:val="en-PK"/>
+        </w:rPr>
+        <w:t>ho</w:t>
+      </w:r>
+      <w:proofErr w:type="spellEnd"/>
+      <w:r>
+        <w:rPr>
+          <w:rFonts w:cstheme="minorHAnsi"/>
+          <w:lang w:val="en-PK"/>
+        </w:rPr>
+        <w:t xml:space="preserve"> ga k </w:t>
+      </w:r>
+      <w:proofErr w:type="spellStart"/>
+      <w:r>
+        <w:rPr>
+          <w:rFonts w:cstheme="minorHAnsi"/>
+          <w:lang w:val="en-PK"/>
+        </w:rPr>
+        <w:t>perchase</w:t>
+      </w:r>
+      <w:proofErr w:type="spellEnd"/>
+      <w:r>
+        <w:rPr>
+          <w:rFonts w:cstheme="minorHAnsi"/>
+          <w:lang w:val="en-PK"/>
+        </w:rPr>
+        <w:t xml:space="preserve"> kia asset </w:t>
+      </w:r>
+      <w:proofErr w:type="spellStart"/>
+      <w:r>
+        <w:rPr>
+          <w:rFonts w:cstheme="minorHAnsi"/>
+          <w:lang w:val="en-PK"/>
+        </w:rPr>
+        <w:t>brha</w:t>
+      </w:r>
+      <w:proofErr w:type="spellEnd"/>
+      <w:r>
+        <w:rPr>
+          <w:rFonts w:cstheme="minorHAnsi"/>
+          <w:lang w:val="en-PK"/>
+        </w:rPr>
+        <w:t xml:space="preserve"> </w:t>
+      </w:r>
+      <w:proofErr w:type="spellStart"/>
+      <w:r>
+        <w:rPr>
+          <w:rFonts w:cstheme="minorHAnsi"/>
+          <w:lang w:val="en-PK"/>
+        </w:rPr>
+        <w:t>yani</w:t>
+      </w:r>
+      <w:proofErr w:type="spellEnd"/>
+      <w:r>
+        <w:rPr>
+          <w:rFonts w:cstheme="minorHAnsi"/>
+          <w:lang w:val="en-PK"/>
+        </w:rPr>
+        <w:t xml:space="preserve"> debit and purchase s cash km </w:t>
+      </w:r>
+      <w:proofErr w:type="spellStart"/>
+      <w:r>
+        <w:rPr>
+          <w:rFonts w:cstheme="minorHAnsi"/>
+          <w:lang w:val="en-PK"/>
+        </w:rPr>
+        <w:t>hua</w:t>
+      </w:r>
+      <w:proofErr w:type="spellEnd"/>
+      <w:r>
+        <w:rPr>
+          <w:rFonts w:cstheme="minorHAnsi"/>
+          <w:lang w:val="en-PK"/>
+        </w:rPr>
+        <w:t xml:space="preserve"> </w:t>
+      </w:r>
+      <w:proofErr w:type="spellStart"/>
+      <w:r>
+        <w:rPr>
+          <w:rFonts w:cstheme="minorHAnsi"/>
+          <w:lang w:val="en-PK"/>
+        </w:rPr>
+        <w:t>yani</w:t>
+      </w:r>
+      <w:proofErr w:type="spellEnd"/>
+      <w:r>
+        <w:rPr>
+          <w:rFonts w:cstheme="minorHAnsi"/>
+          <w:lang w:val="en-PK"/>
+        </w:rPr>
+        <w:t xml:space="preserve"> asset km </w:t>
+      </w:r>
+      <w:proofErr w:type="spellStart"/>
+      <w:r>
+        <w:rPr>
+          <w:rFonts w:cstheme="minorHAnsi"/>
+          <w:lang w:val="en-PK"/>
+        </w:rPr>
+        <w:t>hua</w:t>
+      </w:r>
+      <w:proofErr w:type="spellEnd"/>
+      <w:r>
+        <w:rPr>
+          <w:rFonts w:cstheme="minorHAnsi"/>
+          <w:lang w:val="en-PK"/>
+        </w:rPr>
+        <w:t xml:space="preserve"> and asset ki </w:t>
+      </w:r>
+      <w:proofErr w:type="spellStart"/>
+      <w:r>
+        <w:rPr>
+          <w:rFonts w:cstheme="minorHAnsi"/>
+          <w:lang w:val="en-PK"/>
+        </w:rPr>
+        <w:t>kmi</w:t>
+      </w:r>
+      <w:proofErr w:type="spellEnd"/>
+      <w:r>
+        <w:rPr>
+          <w:rFonts w:cstheme="minorHAnsi"/>
+          <w:lang w:val="en-PK"/>
+        </w:rPr>
+        <w:t xml:space="preserve"> credit, but </w:t>
+      </w:r>
+      <w:proofErr w:type="spellStart"/>
+      <w:r>
+        <w:rPr>
+          <w:rFonts w:cstheme="minorHAnsi"/>
+          <w:lang w:val="en-PK"/>
+        </w:rPr>
+        <w:t>agr</w:t>
+      </w:r>
+      <w:proofErr w:type="spellEnd"/>
+      <w:r>
+        <w:rPr>
+          <w:rFonts w:cstheme="minorHAnsi"/>
+          <w:lang w:val="en-PK"/>
+        </w:rPr>
+        <w:t xml:space="preserve"> single column m convert </w:t>
+      </w:r>
+      <w:proofErr w:type="spellStart"/>
+      <w:r>
+        <w:rPr>
+          <w:rFonts w:cstheme="minorHAnsi"/>
+          <w:lang w:val="en-PK"/>
+        </w:rPr>
+        <w:t>kryn</w:t>
+      </w:r>
+      <w:proofErr w:type="spellEnd"/>
+      <w:r>
+        <w:rPr>
+          <w:rFonts w:cstheme="minorHAnsi"/>
+          <w:lang w:val="en-PK"/>
+        </w:rPr>
+        <w:t xml:space="preserve"> </w:t>
+      </w:r>
+      <w:proofErr w:type="spellStart"/>
+      <w:r>
+        <w:rPr>
+          <w:rFonts w:cstheme="minorHAnsi"/>
+          <w:lang w:val="en-PK"/>
+        </w:rPr>
+        <w:t>gy</w:t>
+      </w:r>
+      <w:proofErr w:type="spellEnd"/>
+      <w:r>
+        <w:rPr>
+          <w:rFonts w:cstheme="minorHAnsi"/>
+          <w:lang w:val="en-PK"/>
+        </w:rPr>
+        <w:t xml:space="preserve"> to hm detail m ek </w:t>
+      </w:r>
+      <w:proofErr w:type="spellStart"/>
+      <w:r>
+        <w:rPr>
+          <w:rFonts w:cstheme="minorHAnsi"/>
+          <w:lang w:val="en-PK"/>
+        </w:rPr>
+        <w:t>dfa</w:t>
+      </w:r>
+      <w:proofErr w:type="spellEnd"/>
+      <w:r>
+        <w:rPr>
+          <w:rFonts w:cstheme="minorHAnsi"/>
+          <w:lang w:val="en-PK"/>
+        </w:rPr>
+        <w:t xml:space="preserve"> </w:t>
+      </w:r>
+      <w:proofErr w:type="spellStart"/>
+      <w:r>
+        <w:rPr>
+          <w:rFonts w:cstheme="minorHAnsi"/>
+          <w:lang w:val="en-PK"/>
+        </w:rPr>
+        <w:t>likhy</w:t>
+      </w:r>
+      <w:proofErr w:type="spellEnd"/>
+      <w:r>
+        <w:rPr>
+          <w:rFonts w:cstheme="minorHAnsi"/>
+          <w:lang w:val="en-PK"/>
+        </w:rPr>
+        <w:t xml:space="preserve"> </w:t>
+      </w:r>
+      <w:proofErr w:type="spellStart"/>
+      <w:r>
+        <w:rPr>
+          <w:rFonts w:cstheme="minorHAnsi"/>
+          <w:lang w:val="en-PK"/>
+        </w:rPr>
+        <w:t>gy</w:t>
+      </w:r>
+      <w:proofErr w:type="spellEnd"/>
+      <w:r>
+        <w:rPr>
+          <w:rFonts w:cstheme="minorHAnsi"/>
+          <w:lang w:val="en-PK"/>
+        </w:rPr>
+        <w:t xml:space="preserve"> "cash account" </w:t>
+      </w:r>
+      <w:proofErr w:type="spellStart"/>
+      <w:r>
+        <w:rPr>
+          <w:rFonts w:cstheme="minorHAnsi"/>
+          <w:lang w:val="en-PK"/>
+        </w:rPr>
+        <w:t>agy</w:t>
+      </w:r>
+      <w:proofErr w:type="spellEnd"/>
+      <w:r>
+        <w:rPr>
+          <w:rFonts w:cstheme="minorHAnsi"/>
+          <w:lang w:val="en-PK"/>
+        </w:rPr>
+        <w:t xml:space="preserve"> amount m -2000 (q k cash decrease </w:t>
+      </w:r>
+      <w:proofErr w:type="spellStart"/>
+      <w:r>
+        <w:rPr>
+          <w:rFonts w:cstheme="minorHAnsi"/>
+          <w:lang w:val="en-PK"/>
+        </w:rPr>
+        <w:t>hua</w:t>
+      </w:r>
+      <w:proofErr w:type="spellEnd"/>
+      <w:r>
+        <w:rPr>
+          <w:rFonts w:cstheme="minorHAnsi"/>
+          <w:lang w:val="en-PK"/>
+        </w:rPr>
+        <w:t xml:space="preserve"> and expense k </w:t>
+      </w:r>
+      <w:proofErr w:type="spellStart"/>
+      <w:r>
+        <w:rPr>
+          <w:rFonts w:cstheme="minorHAnsi"/>
+          <w:lang w:val="en-PK"/>
+        </w:rPr>
+        <w:t>ilava</w:t>
+      </w:r>
+      <w:proofErr w:type="spellEnd"/>
+      <w:r>
+        <w:rPr>
+          <w:rFonts w:cstheme="minorHAnsi"/>
+          <w:lang w:val="en-PK"/>
+        </w:rPr>
+        <w:t xml:space="preserve"> hr decrease negative h) and "</w:t>
+      </w:r>
+      <w:proofErr w:type="spellStart"/>
+      <w:r>
+        <w:rPr>
+          <w:rFonts w:cstheme="minorHAnsi"/>
+          <w:lang w:val="en-PK"/>
+        </w:rPr>
+        <w:t>perchase</w:t>
+      </w:r>
+      <w:proofErr w:type="spellEnd"/>
+      <w:r>
+        <w:rPr>
+          <w:rFonts w:cstheme="minorHAnsi"/>
+          <w:lang w:val="en-PK"/>
+        </w:rPr>
+        <w:t xml:space="preserve"> account" </w:t>
+      </w:r>
+      <w:proofErr w:type="spellStart"/>
+      <w:r>
+        <w:rPr>
+          <w:rFonts w:cstheme="minorHAnsi"/>
+          <w:lang w:val="en-PK"/>
+        </w:rPr>
+        <w:t>agy</w:t>
+      </w:r>
+      <w:proofErr w:type="spellEnd"/>
+      <w:r>
+        <w:rPr>
+          <w:rFonts w:cstheme="minorHAnsi"/>
+          <w:lang w:val="en-PK"/>
+        </w:rPr>
+        <w:t xml:space="preserve"> amount m </w:t>
+      </w:r>
+      <w:proofErr w:type="spellStart"/>
+      <w:r>
+        <w:rPr>
+          <w:rFonts w:cstheme="minorHAnsi"/>
+          <w:lang w:val="en-PK"/>
+        </w:rPr>
+        <w:t>lilhy</w:t>
+      </w:r>
+      <w:proofErr w:type="spellEnd"/>
+      <w:r>
+        <w:rPr>
+          <w:rFonts w:cstheme="minorHAnsi"/>
+          <w:lang w:val="en-PK"/>
+        </w:rPr>
+        <w:t xml:space="preserve"> </w:t>
+      </w:r>
+      <w:proofErr w:type="spellStart"/>
+      <w:r>
+        <w:rPr>
+          <w:rFonts w:cstheme="minorHAnsi"/>
+          <w:lang w:val="en-PK"/>
+        </w:rPr>
+        <w:t>gy</w:t>
+      </w:r>
+      <w:proofErr w:type="spellEnd"/>
+      <w:r>
+        <w:rPr>
+          <w:rFonts w:cstheme="minorHAnsi"/>
+          <w:lang w:val="en-PK"/>
+        </w:rPr>
+        <w:t xml:space="preserve"> -2000 ( q k purchase kia, </w:t>
+      </w:r>
+      <w:proofErr w:type="spellStart"/>
+      <w:r>
+        <w:rPr>
+          <w:rFonts w:cstheme="minorHAnsi"/>
+          <w:lang w:val="en-PK"/>
+        </w:rPr>
+        <w:t>yani</w:t>
+      </w:r>
+      <w:proofErr w:type="spellEnd"/>
+      <w:r>
+        <w:rPr>
+          <w:rFonts w:cstheme="minorHAnsi"/>
+          <w:lang w:val="en-PK"/>
+        </w:rPr>
+        <w:t xml:space="preserve"> expense increase and expense ka increase -</w:t>
+      </w:r>
+      <w:proofErr w:type="spellStart"/>
+      <w:r>
+        <w:rPr>
+          <w:rFonts w:cstheme="minorHAnsi"/>
+          <w:lang w:val="en-PK"/>
+        </w:rPr>
+        <w:t>ve</w:t>
+      </w:r>
+      <w:proofErr w:type="spellEnd"/>
+      <w:r>
+        <w:rPr>
+          <w:rFonts w:cstheme="minorHAnsi"/>
+          <w:lang w:val="en-PK"/>
+        </w:rPr>
+        <w:t xml:space="preserve"> ),, but is dataset m </w:t>
+      </w:r>
+      <w:proofErr w:type="spellStart"/>
+      <w:r>
+        <w:rPr>
+          <w:rFonts w:cstheme="minorHAnsi"/>
+          <w:lang w:val="en-PK"/>
+        </w:rPr>
+        <w:t>dono</w:t>
+      </w:r>
+      <w:proofErr w:type="spellEnd"/>
+      <w:r>
+        <w:rPr>
+          <w:rFonts w:cstheme="minorHAnsi"/>
+          <w:lang w:val="en-PK"/>
+        </w:rPr>
+        <w:t xml:space="preserve"> </w:t>
+      </w:r>
+      <w:proofErr w:type="spellStart"/>
+      <w:r>
+        <w:rPr>
+          <w:rFonts w:cstheme="minorHAnsi"/>
+          <w:lang w:val="en-PK"/>
+        </w:rPr>
+        <w:t>dfa</w:t>
+      </w:r>
+      <w:proofErr w:type="spellEnd"/>
+      <w:r>
+        <w:rPr>
+          <w:rFonts w:cstheme="minorHAnsi"/>
+          <w:lang w:val="en-PK"/>
+        </w:rPr>
+        <w:t xml:space="preserve"> detail same hi mention h, this is just for poor </w:t>
+      </w:r>
+      <w:proofErr w:type="spellStart"/>
+      <w:r>
+        <w:rPr>
+          <w:rFonts w:cstheme="minorHAnsi"/>
+          <w:lang w:val="en-PK"/>
+        </w:rPr>
+        <w:t>naming,implified</w:t>
+      </w:r>
+      <w:proofErr w:type="spellEnd"/>
+      <w:r>
+        <w:rPr>
+          <w:rFonts w:cstheme="minorHAnsi"/>
+          <w:lang w:val="en-PK"/>
+        </w:rPr>
+        <w:t xml:space="preserve"> dataset</w:t>
+      </w:r>
+    </w:p>
+    <w:p>
+      <w:pPr>
+        <w:rPr>
+          <w:rFonts w:cstheme="minorHAnsi"/>
+          <w:lang w:val="en-PK"/>
+        </w:rPr>
+      </w:pPr>
+      <w:r>
+        <w:rPr>
+          <w:rFonts w:cstheme="minorHAnsi"/>
+          <w:lang w:val="en-PK"/>
+        </w:rPr>
+        <w:lastRenderedPageBreak/>
+        <w:t>grouped accounts</w:t>
+      </w:r>
+    </w:p>
+    <w:p>
+      <w:pPr>
+        <w:rPr>
+          <w:rFonts w:cstheme="minorHAnsi"/>
+          <w:lang w:val="en-PK"/>
+        </w:rPr>
+      </w:pPr>
+      <w:r>
+        <w:rPr>
+          <w:rFonts w:cstheme="minorHAnsi"/>
+          <w:lang w:val="en-PK"/>
+        </w:rPr>
+        <w:t>reporting-level mapping</w:t>
+      </w:r>
+    </w:p>
+    <w:p>
+      <w:pPr>
+        <w:rPr>
+          <w:rFonts w:cstheme="minorHAnsi"/>
+          <w:lang w:val="en-PK"/>
+        </w:rPr>
+      </w:pPr>
+      <w:r>
+        <w:rPr>
+          <w:rFonts w:cstheme="minorHAnsi"/>
+          <w:lang w:val="en-PK"/>
+        </w:rPr>
+        <w:t xml:space="preserve">not always “wrong”, but not detailed </w:t>
+      </w:r>
     </w:p>
     <w:p>
       <w:pPr>

</xml_diff>